<commit_message>
zero-call audits close both pending claim items: propagated headroom 5.00/4.50/5.40/5.06pp (4.1pp void), evidence-diagnosis B-arm Q=0/25 with non-reproducible coverage claim + first-time ERv2 scoring 8/8/5/8%
</commit_message>
<xml_diff>
--- a/r3_own_pool/paper_method_feedback_aware_dag/最终整合_20260921/论文完整草稿.docx
+++ b/r3_own_pool/paper_method_feedback_aware_dag/最终整合_20260921/论文完整草稿.docx
@@ -4400,7 +4400,28 @@
         <w:t xml:space="preserve">”</w:t>
       </w:r>
       <w:r>
-        <w:t xml:space="preserve">。下一节通过固定推理者、更换上游来源提供更直接的机制证据。</w:t>
+        <w:t xml:space="preserve">。零调用审计（</w:t>
+      </w:r>
+      <w:r>
+        <w:rPr>
+          <w:rStyle w:val="VerbatimChar"/>
+        </w:rPr>
+        <w:t xml:space="preserve">REASONER_ROW_ORACLE_AUDIT.json</w:t>
+      </w:r>
+      <w:r>
+        <w:t xml:space="preserve">，冻结评分器逐任务重算）给出各面板的传播 headroom：900 题开发集 5.00pp、Conf-200 4.50pp、Conf-500 5.40pp、合并 1,600 题 5.06pp；共同失败占比 77.0%／76.5%／76.2%／76.7%。本文统一引用上述审计值；此前口径外的</w:t>
+      </w:r>
+      <w:r>
+        <w:t xml:space="preserve">“</w:t>
+      </w:r>
+      <w:r>
+        <w:t xml:space="preserve">传播后 4.1pp</w:t>
+      </w:r>
+      <w:r>
+        <w:t xml:space="preserve">”</w:t>
+      </w:r>
+      <w:r>
+        <w:t xml:space="preserve">说法查无冻结来源，作废。下一节通过固定推理者、更换上游来源提供更直接的机制证据。</w:t>
       </w:r>
     </w:p>
     <w:p>
@@ -8577,31 +8598,61 @@
         <w:pStyle w:val="FirstParagraph"/>
       </w:pPr>
       <w:r>
-        <w:t xml:space="preserve">已有结构感知解析诊断关注原同模型链共同失败的开发子集。25 条结构事实记录均标记必要操作数出现在 top-30 候选中，而对应结构推理结果列表没有正确答案。这表明</w:t>
-      </w:r>
-      <w:r>
+        <w:t xml:space="preserve">已有结构感知解析诊断关注原同模型链共同失败的开发子集。零调用审计（</w:t>
+      </w:r>
+      <w:r>
+        <w:rPr>
+          <w:rStyle w:val="VerbatimChar"/>
+        </w:rPr>
+        <w:t xml:space="preserve">EVIDENCE_DIAGNOSIS_AUDIT.json</w:t>
+      </w:r>
+      <w:r>
+        <w:t xml:space="preserve">，含 commit 与全部输入哈希）给出其可复核边界：25 个结构推理应答全部可解析，按冻结评分器重打分 Q = 0/25，与保存的评分汇总一致；</w:t>
+      </w:r>
+      <w:r>
+        <w:rPr>
+          <w:b/>
+        </w:rPr>
+        <w:t xml:space="preserve">但</w:t>
+      </w:r>
+      <w:r>
+        <w:rPr>
+          <w:b/>
+        </w:rPr>
         <w:t xml:space="preserve">“</w:t>
       </w:r>
       <w:r>
-        <w:t xml:space="preserve">候选中存在所需数值</w:t>
-      </w:r>
-      <w:r>
+        <w:rPr>
+          <w:b/>
+        </w:rPr>
+        <w:t xml:space="preserve">25 条记录均覆盖必要操作数</w:t>
+      </w:r>
+      <w:r>
+        <w:rPr>
+          <w:b/>
+        </w:rPr>
         <w:t xml:space="preserve">”</w:t>
       </w:r>
       <w:r>
-        <w:t xml:space="preserve">与</w:t>
+        <w:rPr>
+          <w:b/>
+        </w:rPr>
+        <w:t xml:space="preserve">这一早期工件不可复现</w:t>
+      </w:r>
+      <w:r>
+        <w:t xml:space="preserve">——以当前版本化代码重算，top-30 候选对 gold 操作数的覆盖为 0/25 任务、全量解析事实为 14/25（原生成代码未版本化，早期覆盖数字不具审计效力，不予引用）。可审计的结论因此收窄为：结构化解析未产生任何正确答案，且其</w:t>
       </w:r>
       <w:r>
         <w:t xml:space="preserve">“</w:t>
       </w:r>
       <w:r>
-        <w:t xml:space="preserve">模型能够正确选择、绑定实体期间并形成表达式</w:t>
+        <w:t xml:space="preserve">覆盖恢复</w:t>
       </w:r>
       <w:r>
         <w:t xml:space="preserve">”</w:t>
       </w:r>
       <w:r>
-        <w:t xml:space="preserve">并不等价。</w:t>
+        <w:t xml:space="preserve">前提本身无法复核。</w:t>
       </w:r>
     </w:p>
     <w:p>
@@ -8609,7 +8660,7 @@
         <w:pStyle w:val="BodyText"/>
       </w:pPr>
       <w:r>
-        <w:t xml:space="preserve">这一结果按探索性诊断报告：标准操作数用于离线覆盖核验，不应进入可部署选择；部分原诊断代码将表达式可构造性当作质量代理，不能作为实际成功率。已保存 D2—D4 原始调用，但完整配对输入、版本化评分汇总未在本轮材料中定位，因此不报告未经核实的全套诊断百分比，也不将另一节点基准的 31% 移植为该 all-fail 子集的标准事实成功率。</w:t>
+        <w:t xml:space="preserve">对 D2—D4 变体：保存应答各 25/25 可解析，但配对输入未冻结，成功率不可重算，本文不报告任何来自会话记录的百分比；D0、D1 与 Dev-25 上的 gold-facts 臂没有已定位的冻结输出，相应口头数字（0%、4%）同样无审计工件支持。节点基准条件口径的 medium 推理 Q = 31% 属另一测量，不移植为该子集的成功率。作为补充，对 100 个 large 抽取→medium 推理失败任务上已冻结但此前未评分的证据重建调用进行首次评分：S0 基线／S1 重抽取／S2 跨模型／S3 定向缺失证据重建的 Q = 8%／8%／5%／8%，基线抽取操作数覆盖均值仅 35.4%——即使让模型主动检索缺失量并合并证据，成功率也不高于基线（探索性分析，非预注册）。</w:t>
       </w:r>
     </w:p>
     <w:p>

</xml_diff>

<commit_message>
250-task frozen Dynamic-v2 confirmation complete: case-2 verdict, +2.8pp CI[-0.8,+6.4] direction replicated but not confirmed; results written into abstract/5.7/6.3/7 with preregistered wording
</commit_message>
<xml_diff>
--- a/r3_own_pool/paper_method_feedback_aware_dag/最终整合_20260921/论文完整草稿.docx
+++ b/r3_own_pool/paper_method_feedback_aware_dag/最终整合_20260921/论文完整草稿.docx
@@ -35,7 +35,7 @@
         <w:pStyle w:val="FirstParagraph"/>
       </w:pPr>
       <w:r>
-        <w:t xml:space="preserve">复杂任务包含信息抽取、关系推理和结果验证等不同能力需求，针对完整查询选择单一模型难以利用执行阶段间的模型互补。本文提出反馈感知的自适应有向无环图路由框架，将能力画像、节点级模型分配、静态执行与反馈条件化的后继适应相结合，并以选择性干预、预算约束和历史图复用组织多模型协同。财务复杂任务实验表明，冻结节点路由相对查询路由的条件化节点质量提高约 6.9 个百分点，主要收益来自阶段粒度；跨模型传播显示，上游输入来源能够改变下游优势，条件能力不能直接等同于传播能力。在枚举的 3×3 抽取—推理模型组合空间内，精确 Oracle 为 30.5%，最佳固定组合为 20.5%，但剩余差距未被当前选择器稳定利用。理想失败检测条件下的 48 任务真实调用比较中，动态第二版由静态的 52.1% 提高至 54.2%，差异不显著。确认实验与开发层风险—覆盖率分析共同提示，限制无充分依据的切换有助于控制损害，但不能保证泛化收益；困难子集上较低的动作成功并集则揭示模型与动作覆盖的重要限制。研究支持在明确输入条件、反馈边界及资源口径的前提下，进行选择性的阶段级模型协同。</w:t>
+        <w:t xml:space="preserve">复杂任务包含信息抽取、关系推理和结果验证等不同能力需求，针对完整查询选择单一模型难以利用执行阶段间的模型互补。本文提出反馈感知的自适应有向无环图路由框架，将能力画像、节点级模型分配、静态执行与反馈条件化的后继适应相结合，并以选择性干预、预算约束和历史图复用组织多模型协同。财务复杂任务实验表明，冻结节点路由相对查询路由的条件化节点质量提高约 6.9 个百分点，主要收益来自阶段粒度；跨模型传播显示，上游输入来源能够改变下游优势，条件能力不能直接等同于传播能力。在枚举的 3×3 抽取—推理模型组合空间内，精确 Oracle 为 30.5%，最佳固定组合为 20.5%，但剩余差距未被当前选择器稳定利用。理想失败检测条件下的 48 任务真实调用比较中，动态第二版由静态的 52.1% 提高至 54.2%，差异不显著；在 250 个全新任务上的一次性冻结确认中该效应方向复现（44.0% 对 41.2%，+2.8pp，95% CI [−0.8,+6.4]，Help/Harm 13/6，预算违规 0），仍未达统计显著，只能作为方向一致的小幅正信号报告。确认实验与开发层风险—覆盖率分析共同提示，限制无充分依据的切换有助于控制损害，但不能保证泛化收益；困难子集上较低的动作成功并集则揭示模型与动作覆盖的重要限制。研究支持在明确输入条件、反馈边界及资源口径的前提下，进行选择性的阶段级模型协同。</w:t>
       </w:r>
     </w:p>
     <w:p>
@@ -7364,6 +7364,56 @@
     </w:p>
     <w:p>
       <w:pPr>
+        <w:pStyle w:val="BodyText"/>
+      </w:pPr>
+      <w:r>
+        <w:t xml:space="preserve">为把</w:t>
+      </w:r>
+      <w:r>
+        <w:t xml:space="preserve">“</w:t>
+      </w:r>
+      <w:r>
+        <w:t xml:space="preserve">+2 个百分点左右的小效应</w:t>
+      </w:r>
+      <w:r>
+        <w:t xml:space="preserve">”</w:t>
+      </w:r>
+      <w:r>
+        <w:t xml:space="preserve">与样本波动区分开，本文在 250 个全新的 TAT-QA train split 任务上做了一次性冻结确认（</w:t>
+      </w:r>
+      <w:r>
+        <w:rPr>
+          <w:rStyle w:val="VerbatimChar"/>
+        </w:rPr>
+        <w:t xml:space="preserve">dynamic_v2_confirm_250</w:t>
+      </w:r>
+      <w:r>
+        <w:t xml:space="preserve">，策略与阈值同 48 任务面板逐字一致，选择规则与任务清单在任何调用前冻结并提交；与工作区全部历史工件零重叠）。结果：静态 103/250（41.2%）、动态 110/250（44.0%），配对 ΔQ = +2.8pp，任务级 bootstrap 95% CI [−0.8, +6.4] 覆盖零；McNemar 精确检验 b=13、c=6，p=0.167；Help/Harm = 13/6；平均 tokens 略低于静态（1,337.5 对 1,350.3），预算违规 0。按预注册三情形判定为情形二：</w:t>
+      </w:r>
+      <w:r>
+        <w:rPr>
+          <w:b/>
+        </w:rPr>
+        <w:t xml:space="preserve">方向在第二个独立面板复现（+2.1 → +2.8），规模一致，但统计上仍未确证</w:t>
+      </w:r>
+      <w:r>
+        <w:t xml:space="preserve">。本文如实报告：动态第二版的端到端质量收益应描述为</w:t>
+      </w:r>
+      <w:r>
+        <w:t xml:space="preserve">“</w:t>
+      </w:r>
+      <w:r>
+        <w:t xml:space="preserve">在两个独立面板上方向一致的小幅正向信号</w:t>
+      </w:r>
+      <w:r>
+        <w:t xml:space="preserve">”</w:t>
+      </w:r>
+      <w:r>
+        <w:t xml:space="preserve">，不是已确证的改进；其可确证的价值仍是 harm 控制与零预算违规。</w:t>
+      </w:r>
+    </w:p>
+    <w:p>
+      <w:pPr>
         <w:pStyle w:val="Heading3"/>
       </w:pPr>
       <w:bookmarkStart w:id="56" w:name="恢复预算与能力覆盖如何限制收益"/>
@@ -8782,7 +8832,7 @@
         <w:pStyle w:val="BodyText"/>
       </w:pPr>
       <w:r>
-        <w:t xml:space="preserve">动态第二版在当前 48 任务面板中减少了观察到的负迁移，却没有增加相对于第一版的总正确数。其价值应表述为对后继决策范围的控制证据，而不是显著质量提升或零风险保证。该实验使用理想失败检测，因此运行时是否能够获得足够可靠的反馈，仍是将机制转化为部署收益的关键条件。</w:t>
+        <w:t xml:space="preserve">动态第二版在 48 任务面板中减少了观察到的负迁移，却没有增加相对于第一版的总正确数；在 250 个全新任务的冻结一次性确认中，效应方向复现（+2.8pp，CI 覆盖零，Help/Harm 13/6，预算违规 0）。两个独立面板上方向一致、规模稳定的小幅正信号，配合持续为零的预算违规与无恶化的成本，支持将其价值表述为对后继决策范围的控制证据与 harm 控制，而不是显著质量提升或零风险保证。该实验使用理想失败检测，因此运行时是否能够获得足够可靠的反馈，仍是将机制转化为部署收益的关键条件。</w:t>
       </w:r>
     </w:p>
     <w:p>
@@ -8910,7 +8960,7 @@
         <w:pStyle w:val="BodyText"/>
       </w:pPr>
       <w:r>
-        <w:t xml:space="preserve">实验支持阶段级互补真实存在：冻结节点路由相对查询路由提高约 6.9 个百分点，主要增益可由类型先验解释。跨模型传播进一步表明，上游来源能够改变下游能力的表现，独立分配阶段模型可以解除同模型链的能力绑定。然而，单模型成功的可预测性没有转化为稳定的剩余差距路由收益，较大确认集也未复现较小确认集的正向信号。动态第二版相对静态呈约 2.1 个百分点的正向但不显著变化，观察到的损害减少，其有效性仍受理想失败检测条件限制。</w:t>
+        <w:t xml:space="preserve">实验支持阶段级互补真实存在：冻结节点路由相对查询路由提高约 6.9 个百分点，主要增益可由类型先验解释。跨模型传播进一步表明，上游来源能够改变下游能力的表现，独立分配阶段模型可以解除同模型链的能力绑定。然而，单模型成功的可预测性没有转化为稳定的剩余差距路由收益，较大确认集也未复现较小确认集的正向信号。动态第二版相对静态的正向变化在两个独立面板上方向一致（48 任务 +2.1pp；250 任务冻结一次性确认 +2.8pp，CI 均覆盖零），观察到的损害减少、预算违规为零；其有效性仍受理想失败检测条件限制，质量收益不作为已确证改进报告。</w:t>
       </w:r>
     </w:p>
     <w:p>

</xml_diff>

<commit_message>
multinode DAG (120 tasks, 1413 calls): Dynamic +20pp CI[11.7,28.3] significant, selective-update audit clean (933 calls all in-closure, 134/134 branch isolation, 0 budget violations); results written into paper
</commit_message>
<xml_diff>
--- a/r3_own_pool/paper_method_feedback_aware_dag/最终整合_20260921/论文完整草稿.docx
+++ b/r3_own_pool/paper_method_feedback_aware_dag/最终整合_20260921/论文完整草稿.docx
@@ -35,7 +35,7 @@
         <w:pStyle w:val="FirstParagraph"/>
       </w:pPr>
       <w:r>
-        <w:t xml:space="preserve">复杂任务包含信息抽取、关系推理和结果验证等不同能力需求，针对完整查询选择单一模型难以利用执行阶段间的模型互补。本文提出反馈感知的自适应有向无环图路由框架，将能力画像、节点级模型分配、静态执行与反馈条件化的后继适应相结合，并以选择性干预、预算约束和历史图复用组织多模型协同。财务复杂任务实验表明，冻结节点路由相对查询路由的条件化节点质量提高约 6.9 个百分点，主要收益来自阶段粒度；跨模型传播显示，上游输入来源能够改变下游优势，条件能力不能直接等同于传播能力。在枚举的 3×3 抽取—推理模型组合空间内，精确 Oracle 为 30.5%，最佳固定组合为 20.5%，但剩余差距未被当前选择器稳定利用。理想失败检测条件下的 48 任务真实调用比较中，动态第二版由静态的 52.1% 提高至 54.2%，差异不显著；在 250 个全新任务上的一次性冻结确认中该效应方向复现（44.0% 对 41.2%，+2.8pp，95% CI [−0.8,+6.4]，Help/Harm 13/6，预算违规 0），仍未达统计显著，只能作为方向一致的小幅正信号报告。确认实验与开发层风险—覆盖率分析共同提示，限制无充分依据的切换有助于控制损害，但不能保证泛化收益；困难子集上较低的动作成功并集则揭示模型与动作覆盖的重要限制。研究支持在明确输入条件、反馈边界及资源口径的前提下，进行选择性的阶段级模型协同。</w:t>
+        <w:t xml:space="preserve">复杂任务包含信息抽取、关系推理和结果验证等不同能力需求，针对完整查询选择单一模型难以利用执行阶段间的模型互补。本文提出反馈感知的自适应有向无环图路由框架，将能力画像、节点级模型分配、静态执行与反馈条件化的后继适应相结合，并以选择性干预、预算约束和历史图复用组织多模型协同。财务复杂任务实验表明，冻结节点路由相对查询路由的条件化节点质量提高约 6.9 个百分点，主要收益来自阶段粒度；跨模型传播显示，上游输入来源能够改变下游优势，条件能力不能直接等同于传播能力。在枚举的 3×3 抽取—推理模型组合空间内，精确 Oracle 为 30.5%，最佳固定组合为 20.5%，但剩余差距未被当前选择器稳定利用。理想失败检测条件下的 48 任务真实调用比较中，动态第二版由静态的 52.1% 提高至 54.2%，差异不显著；在 250 个全新任务上的一次性冻结确认中该效应方向复现（+2.8pp，95% CI [−0.8,+6.4]），仍未达统计显著。而在含分支与汇合的四节点真实 DAG 面板上，选择性动态适应显著优于静态执行（36.7% 对 16.7%，+20.0pp，95% CI [11.7,28.3]，Help/Harm 28/4），且 933 次适配调用全部限于受影响后代闭包、分支隔离检查零违例、预算违规为零——动态 DAG 的价值在多节点结构下首次得到显著验证。确认实验与开发层风险—覆盖率分析共同提示，限制无充分依据的切换有助于控制损害，但不能保证泛化收益；困难子集上较低的动作成功并集则揭示模型与动作覆盖的重要限制。研究支持在明确输入条件、反馈边界及资源口径的前提下，进行选择性的阶段级模型协同。</w:t>
       </w:r>
     </w:p>
     <w:p>
@@ -7414,6 +7414,44 @@
     </w:p>
     <w:p>
       <w:pPr>
+        <w:pStyle w:val="BodyText"/>
+      </w:pPr>
+      <w:r>
+        <w:t xml:space="preserve">多节点结构验证。上述两面板均为两节点链；为回应</w:t>
+      </w:r>
+      <w:r>
+        <w:t xml:space="preserve">“</w:t>
+      </w:r>
+      <w:r>
+        <w:t xml:space="preserve">自适应 DAG 与两阶段流水线有何区别</w:t>
+      </w:r>
+      <w:r>
+        <w:t xml:space="preserve">”</w:t>
+      </w:r>
+      <w:r>
+        <w:t xml:space="preserve">，本文构建了真实的四节点 DAG 面板（</w:t>
+      </w:r>
+      <w:r>
+        <w:rPr>
+          <w:rStyle w:val="VerbatimChar"/>
+        </w:rPr>
+        <w:t xml:space="preserve">multidag_dynamic_120</w:t>
+      </w:r>
+      <w:r>
+        <w:t xml:space="preserve">，120 个全新任务，策略在任何调用前冻结并提交）：e1（表格抽取，large）与 e2（文本抽取，large）并联为分支，r（汇总表达式生成，medium）为汇合点，v（数值校验，coder）为尾节点；仅选择 gold 答案同时需要表格与文本区域的任务（TAT-QA answer_from = table-text），保证分支在结构上不可退化。两臂共享初始分配、prompt、生成配置与预算规则（1.2×静态实际消耗），失败检测为理想条件，差异仅为冻结的适应规则（静态：每失败节点一次本地回退 e→coder、r→coder、v→medium；动态：抽取失败记忆切换、r/v 升级 large 并受预算门控）。结果：静态 16.7%、动态 36.7%，配对 ΔQ = +20.0pp，95% CI [11.7, 28.3] 不含零；McNemar 精确检验 b=28、c=4，p≈1.9×10⁻⁵；Help/Harm = 28/4；动态成本略低（−90 tokens）、预算违规 0。选择性更新审计：933 次适配调用的每一次都属于某失败节点或其声明后代闭包（越界 0 次）；分支隔离检查 134 例全部通过——单侧分支失败时，干净分支从未被重执行，即</w:t>
+      </w:r>
+      <w:r>
+        <w:rPr>
+          <w:b/>
+        </w:rPr>
+        <w:t xml:space="preserve">只更新真正受影响的后代，从不全图重跑</w:t>
+      </w:r>
+      <w:r>
+        <w:t xml:space="preserve">。这是本文第一次在含分支与汇合的多节点真实传播下得到 Dynamic 显著优于 Static 的证据。同时如实说明边界：区域受限抽取（仅表格或仅文本）的失败率（158/480 节点槽位）远高于全上下文抽取；校验尾节点几乎在所有任务上都触发适配，动态收益相当部分来自 r/v 升级 large；结论限于该任务结构、单域与理想失败检测条件。</w:t>
+      </w:r>
+    </w:p>
+    <w:p>
+      <w:pPr>
         <w:pStyle w:val="Heading3"/>
       </w:pPr>
       <w:bookmarkStart w:id="56" w:name="恢复预算与能力覆盖如何限制收益"/>
@@ -8832,7 +8870,40 @@
         <w:pStyle w:val="BodyText"/>
       </w:pPr>
       <w:r>
-        <w:t xml:space="preserve">动态第二版在 48 任务面板中减少了观察到的负迁移，却没有增加相对于第一版的总正确数；在 250 个全新任务的冻结一次性确认中，效应方向复现（+2.8pp，CI 覆盖零，Help/Harm 13/6，预算违规 0）。两个独立面板上方向一致、规模稳定的小幅正信号，配合持续为零的预算违规与无恶化的成本，支持将其价值表述为对后继决策范围的控制证据与 harm 控制，而不是显著质量提升或零风险保证。该实验使用理想失败检测，因此运行时是否能够获得足够可靠的反馈，仍是将机制转化为部署收益的关键条件。</w:t>
+        <w:t xml:space="preserve">动态适应的价值随 DAG 结构深度显现。两节点链面板（48 与 250 任务）上动态第二版只给出方向一致但不显著的小幅正信号；而在含分支与汇合的四节点真实 DAG 上，同一族冻结适应规则带来 +20.0pp 的显著提升（CI 不含零，McNemar p≈1.9×10⁻⁵），且 933 次适配调用全部限于失败节点及其后代闭包、分支隔离零违例、预算违规为零。两个信息合起来读：</w:t>
+      </w:r>
+      <w:r>
+        <w:rPr>
+          <w:b/>
+        </w:rPr>
+        <w:t xml:space="preserve">选择性与预算约束下的动态适应，其收益与</w:t>
+      </w:r>
+      <w:r>
+        <w:rPr>
+          <w:b/>
+        </w:rPr>
+        <w:t xml:space="preserve">“</w:t>
+      </w:r>
+      <w:r>
+        <w:rPr>
+          <w:b/>
+        </w:rPr>
+        <w:t xml:space="preserve">失败能够局部化、受影响后代确实存在可利用替代</w:t>
+      </w:r>
+      <w:r>
+        <w:rPr>
+          <w:b/>
+        </w:rPr>
+        <w:t xml:space="preserve">”</w:t>
+      </w:r>
+      <w:r>
+        <w:rPr>
+          <w:b/>
+        </w:rPr>
+        <w:t xml:space="preserve">的结构条件成正比</w:t>
+      </w:r>
+      <w:r>
+        <w:t xml:space="preserve">——两节点链上可局部化的失败太少，四节点 DAG 上失败可以在分支、汇合与尾节点三个层面被选择性吸收。其价值仍应表述为对后继决策范围的控制证据与 harm 控制，而非普适的质量保证：该面板使用理想失败检测、单一任务域，且动态收益相当部分来自 r/v 节点升级 large。</w:t>
       </w:r>
     </w:p>
     <w:p>
@@ -8960,7 +9031,7 @@
         <w:pStyle w:val="BodyText"/>
       </w:pPr>
       <w:r>
-        <w:t xml:space="preserve">实验支持阶段级互补真实存在：冻结节点路由相对查询路由提高约 6.9 个百分点，主要增益可由类型先验解释。跨模型传播进一步表明，上游来源能够改变下游能力的表现，独立分配阶段模型可以解除同模型链的能力绑定。然而，单模型成功的可预测性没有转化为稳定的剩余差距路由收益，较大确认集也未复现较小确认集的正向信号。动态第二版相对静态的正向变化在两个独立面板上方向一致（48 任务 +2.1pp；250 任务冻结一次性确认 +2.8pp，CI 均覆盖零），观察到的损害减少、预算违规为零；其有效性仍受理想失败检测条件限制，质量收益不作为已确证改进报告。</w:t>
+        <w:t xml:space="preserve">实验支持阶段级互补真实存在：冻结节点路由相对查询路由提高约 6.9 个百分点，主要增益可由类型先验解释。跨模型传播进一步表明，上游来源能够改变下游能力的表现，独立分配阶段模型可以解除同模型链的能力绑定。然而，单模型成功的可预测性没有转化为稳定的剩余差距路由收益，较大确认集也未复现较小确认集的正向信号。动态适应的价值在两节点链与多节点 DAG 上呈现梯度：两节点链上为方向一致但未确证的小幅正信号（48 任务 +2.1pp、250 任务冻结确认 +2.8pp，CI 均覆盖零）；在含分支与汇合的四节点真实 DAG 上，选择性动态适应显著优于静态执行（+20.0pp，CI 不含零，Help/Harm 28/4），933 次适配调用全部限于受影响后代、分支隔离零违例、预算违规为零。其有效性仍受理想失败检测与单域面板限制。</w:t>
       </w:r>
     </w:p>
     <w:p>

</xml_diff>

<commit_message>
ablation closes both gaps: gain attributed to escalation action (SM 35.0%, policy adds +1.7pp ns) and RealDetector retains 91.7% of gain without gold; written into paper
</commit_message>
<xml_diff>
--- a/r3_own_pool/paper_method_feedback_aware_dag/最终整合_20260921/论文完整草稿.docx
+++ b/r3_own_pool/paper_method_feedback_aware_dag/最终整合_20260921/论文完整草稿.docx
@@ -35,7 +35,7 @@
         <w:pStyle w:val="FirstParagraph"/>
       </w:pPr>
       <w:r>
-        <w:t xml:space="preserve">复杂任务包含信息抽取、关系推理和结果验证等不同能力需求，针对完整查询选择单一模型难以利用执行阶段间的模型互补。本文提出反馈感知的自适应有向无环图路由框架，将能力画像、节点级模型分配、静态执行与反馈条件化的后继适应相结合，并以选择性干预、预算约束和历史图复用组织多模型协同。财务复杂任务实验表明，冻结节点路由相对查询路由的条件化节点质量提高约 6.9 个百分点，主要收益来自阶段粒度；跨模型传播显示，上游输入来源能够改变下游优势，条件能力不能直接等同于传播能力。在枚举的 3×3 抽取—推理模型组合空间内，精确 Oracle 为 30.5%，最佳固定组合为 20.5%，但剩余差距未被当前选择器稳定利用。理想失败检测条件下的 48 任务真实调用比较中，动态第二版由静态的 52.1% 提高至 54.2%，差异不显著；在 250 个全新任务上的一次性冻结确认中该效应方向复现（+2.8pp，95% CI [−0.8,+6.4]），仍未达统计显著。而在含分支与汇合的四节点真实 DAG 面板上，选择性动态适应显著优于静态执行（36.7% 对 16.7%，+20.0pp，95% CI [11.7,28.3]，Help/Harm 28/4），且 933 次适配调用全部限于受影响后代闭包、分支隔离检查零违例、预算违规为零——动态 DAG 的价值在多节点结构下首次得到显著验证。确认实验与开发层风险—覆盖率分析共同提示，限制无充分依据的切换有助于控制损害，但不能保证泛化收益；困难子集上较低的动作成功并集则揭示模型与动作覆盖的重要限制。研究支持在明确输入条件、反馈边界及资源口径的前提下，进行选择性的阶段级模型协同。</w:t>
+        <w:t xml:space="preserve">复杂任务包含信息抽取、关系推理和结果验证等不同能力需求，针对完整查询选择单一模型难以利用执行阶段间的模型互补。本文提出反馈感知的自适应有向无环图路由框架，将能力画像、节点级模型分配、静态执行与反馈条件化的后继适应相结合，并以选择性干预、预算约束和历史图复用组织多模型协同。财务复杂任务实验表明，冻结节点路由相对查询路由的条件化节点质量提高约 6.9 个百分点，主要收益来自阶段粒度；跨模型传播显示，上游输入来源能够改变下游优势，条件能力不能直接等同于传播能力。在枚举的 3×3 抽取—推理模型组合空间内，精确 Oracle 为 30.5%，最佳固定组合为 20.5%，但剩余差距未被当前选择器稳定利用。理想失败检测条件下的 48 任务真实调用比较中，动态第二版由静态的 52.1% 提高至 54.2%，差异不显著；在 250 个全新任务上的一次性冻结确认中该效应方向复现（+2.8pp，95% CI [−0.8,+6.4]），仍未达统计显著。而在含分支与汇合的四节点真实 DAG 面板上，选择性动态适应显著优于静态执行（36.7% 对 16.7%，+20.0pp，95% CI [11.7,28.3]，Help/Harm 28/4），且 933 次适配调用全部限于受影响后代闭包、分支隔离检查零违例、预算违规为零——动态 DAG 的价值在多节点结构下首次得到显著验证。对照消融显示增益主要来自失败节点升级至最强未试模型的动作（同目标静态对照 35.0%），而将失败检测全部换成部署可得信号（解析/执行与输出一致性检查，无 gold 参考）仍保留 91.7% 的增益（35.0%）——动态收益不依赖理想失败检测。确认实验与开发层风险—覆盖率分析共同提示，限制无充分依据的切换有助于控制损害，但不能保证泛化收益；困难子集上较低的动作成功并集则揭示模型与动作覆盖的重要限制。研究支持在明确输入条件、反馈边界及资源口径的前提下，进行选择性的阶段级模型协同。</w:t>
       </w:r>
     </w:p>
     <w:p>
@@ -7452,6 +7452,104 @@
     </w:p>
     <w:p>
       <w:pPr>
+        <w:pStyle w:val="BodyText"/>
+      </w:pPr>
+      <w:r>
+        <w:t xml:space="preserve">公平性与真实反馈消融（</w:t>
+      </w:r>
+      <w:r>
+        <w:rPr>
+          <w:rStyle w:val="VerbatimChar"/>
+        </w:rPr>
+        <w:t xml:space="preserve">multidag_ablation_120</w:t>
+      </w:r>
+      <w:r>
+        <w:t xml:space="preserve">，两个预注册对照臂，同一冻结面板，830 次新调用）。</w:t>
+      </w:r>
+      <w:r>
+        <w:rPr>
+          <w:b/>
+        </w:rPr>
+        <w:t xml:space="preserve">Static-Matched 臂</w:t>
+      </w:r>
+      <w:r>
+        <w:t xml:space="preserve">保持静态语义但将恢复目标换成动态的升级目标（r 失败→large、v 失败→large）：Q = 35.0%（+18.3pp，CI [10.0, 26.7]），完整动态策略 36.7%——策略超出目标选择的额外贡献仅 +1.7pp（CI [−4.2, +7.5]，McNemar p=0.77）。</w:t>
+      </w:r>
+      <w:r>
+        <w:rPr>
+          <w:b/>
+        </w:rPr>
+        <w:t xml:space="preserve">归因如实报告：主要质量增益来自</w:t>
+      </w:r>
+      <w:r>
+        <w:rPr>
+          <w:b/>
+        </w:rPr>
+        <w:t xml:space="preserve">“</w:t>
+      </w:r>
+      <w:r>
+        <w:rPr>
+          <w:b/>
+        </w:rPr>
+        <w:t xml:space="preserve">失败节点升级至最强未试模型</w:t>
+      </w:r>
+      <w:r>
+        <w:rPr>
+          <w:b/>
+        </w:rPr>
+        <w:t xml:space="preserve">”</w:t>
+      </w:r>
+      <w:r>
+        <w:rPr>
+          <w:b/>
+        </w:rPr>
+        <w:t xml:space="preserve">这一动作本身；动态框架的可确证价值在于以选择性更新与预算约束安全地承载该动作</w:t>
+      </w:r>
+      <w:r>
+        <w:t xml:space="preserve">。</w:t>
+      </w:r>
+      <w:r>
+        <w:rPr>
+          <w:b/>
+        </w:rPr>
+        <w:t xml:space="preserve">Dynamic-RealDetector 臂</w:t>
+      </w:r>
+      <w:r>
+        <w:t xml:space="preserve">将失败检测全部替换为部署可得信号（解析/执行检查加 v 与 r 的输出一致性，无 gold）：Q = 35.0%，</w:t>
+      </w:r>
+      <w:r>
+        <w:rPr>
+          <w:b/>
+        </w:rPr>
+        <w:t xml:space="preserve">增益保留率 91.7%</w:t>
+      </w:r>
+      <w:r>
+        <w:t xml:space="preserve">（CI [77.8%, 100%]），与理想检测无显著差异（p=0.5），成本更低（2,459.5 tokens）。机制边界如实说明：尾节点一致性检查在本面板近乎全触发（离线审计已表明其退化为常发），等价于</w:t>
+      </w:r>
+      <w:r>
+        <w:t xml:space="preserve">“</w:t>
+      </w:r>
+      <w:r>
+        <w:t xml:space="preserve">尾节点总是请求更强模型复核</w:t>
+      </w:r>
+      <w:r>
+        <w:t xml:space="preserve">”</w:t>
+      </w:r>
+      <w:r>
+        <w:t xml:space="preserve">；r 节点的值错误检测不到，但该缺口在本面板代价很小。结论：</w:t>
+      </w:r>
+      <w:r>
+        <w:rPr>
+          <w:b/>
+        </w:rPr>
+        <w:t xml:space="preserve">动态 DAG 的收益不依赖 gold 失败信号</w:t>
+      </w:r>
+      <w:r>
+        <w:t xml:space="preserve">。</w:t>
+      </w:r>
+    </w:p>
+    <w:p>
+      <w:pPr>
         <w:pStyle w:val="Heading3"/>
       </w:pPr>
       <w:bookmarkStart w:id="56" w:name="恢复预算与能力覆盖如何限制收益"/>
@@ -8903,7 +9001,19 @@
         <w:t xml:space="preserve">的结构条件成正比</w:t>
       </w:r>
       <w:r>
-        <w:t xml:space="preserve">——两节点链上可局部化的失败太少，四节点 DAG 上失败可以在分支、汇合与尾节点三个层面被选择性吸收。其价值仍应表述为对后继决策范围的控制证据与 harm 控制，而非普适的质量保证：该面板使用理想失败检测、单一任务域，且动态收益相当部分来自 r/v 节点升级 large。</w:t>
+        <w:t xml:space="preserve">——两节点链上可局部化的失败太少，四节点 DAG 上失败可以在分支、汇合与尾节点三个层面被选择性吸收。两臂对照消融进一步把归因说清：把静态对照的恢复目标同样换成升级 large，即可获得 +18.3pp（35.0%），策略逻辑超出目标选择的贡献仅 +1.7pp（不显著）——该面板的主要质量增益来自</w:t>
+      </w:r>
+      <w:r>
+        <w:t xml:space="preserve">“</w:t>
+      </w:r>
+      <w:r>
+        <w:t xml:space="preserve">失败节点升级至最强未试模型</w:t>
+      </w:r>
+      <w:r>
+        <w:t xml:space="preserve">”</w:t>
+      </w:r>
+      <w:r>
+        <w:t xml:space="preserve">这一动作；动态框架的可确证价值在于以选择性更新、预算约束与审计纪律安全地承载它。同时，把失败检测全部替换为部署可得信号后增益保留 91.7%，说明该收益不依赖 gold 失败信号，但部分依赖尾节点一致性检查在本面板近乎全触发的退化特性。因此动态适应的价值仍应表述为对后继决策范围的控制证据与 harm 控制，而非普适的质量保证：结论限于单一任务域。</w:t>
       </w:r>
     </w:p>
     <w:p>
@@ -9031,7 +9141,7 @@
         <w:pStyle w:val="BodyText"/>
       </w:pPr>
       <w:r>
-        <w:t xml:space="preserve">实验支持阶段级互补真实存在：冻结节点路由相对查询路由提高约 6.9 个百分点，主要增益可由类型先验解释。跨模型传播进一步表明，上游来源能够改变下游能力的表现，独立分配阶段模型可以解除同模型链的能力绑定。然而，单模型成功的可预测性没有转化为稳定的剩余差距路由收益，较大确认集也未复现较小确认集的正向信号。动态适应的价值在两节点链与多节点 DAG 上呈现梯度：两节点链上为方向一致但未确证的小幅正信号（48 任务 +2.1pp、250 任务冻结确认 +2.8pp，CI 均覆盖零）；在含分支与汇合的四节点真实 DAG 上，选择性动态适应显著优于静态执行（+20.0pp，CI 不含零，Help/Harm 28/4），933 次适配调用全部限于受影响后代、分支隔离零违例、预算违规为零。其有效性仍受理想失败检测与单域面板限制。</w:t>
+        <w:t xml:space="preserve">实验支持阶段级互补真实存在：冻结节点路由相对查询路由提高约 6.9 个百分点，主要增益可由类型先验解释。跨模型传播进一步表明，上游来源能够改变下游能力的表现，独立分配阶段模型可以解除同模型链的能力绑定。然而，单模型成功的可预测性没有转化为稳定的剩余差距路由收益，较大确认集也未复现较小确认集的正向信号。动态适应的价值在两节点链与多节点 DAG 上呈现梯度：两节点链上为方向一致但未确证的小幅正信号（48 任务 +2.1pp、250 任务冻结确认 +2.8pp，CI 均覆盖零）；在含分支与汇合的四节点真实 DAG 上，选择性动态适应显著优于静态执行（+20.0pp，CI 不含零，Help/Harm 28/4），933 次适配调用全部限于受影响后代、分支隔离零违例、预算违规为零。消融归因表明主要增益来自失败节点升级至最强未试模型的动作（同目标静态对照已达 35.0%），部署可得的解析/执行与一致性检测可保留其中 91.7%——动态收益不依赖理想失败检测，其框架价值在于安全、选择性且可审计地承载该动作；结论仍限于单域面板。</w:t>
       </w:r>
     </w:p>
     <w:p>

</xml_diff>

<commit_message>
paired decomposition benchmark written into paper: old +14pp retracted; decomposition itself harms TAT-QA (-21pp sig) and is ns on MH (+6pp); heterogeneous stage allocation +5pp sig overall - decomposition's value is stage decoupling, not splitting
</commit_message>
<xml_diff>
--- a/r3_own_pool/paper_method_feedback_aware_dag/最终整合_20260921/论文完整草稿.docx
+++ b/r3_own_pool/paper_method_feedback_aware_dag/最终整合_20260921/论文完整草稿.docx
@@ -268,7 +268,7 @@
         <w:pStyle w:val="BodyText"/>
       </w:pPr>
       <w:r>
-        <w:t xml:space="preserve">任务分解能够暴露中间接口，也增加接口错误和证据遗漏的机会。本文因此保留既有整题作答与 DAG 对照及其输入条件限制，讨论分解何时可能有益，而非预设分解必然改善推理。</w:t>
+        <w:t xml:space="preserve">任务分解能够暴露中间接口，也增加接口错误和证据遗漏的机会。本文的严格配对三臂基准显示：同模型拆分本身在 TAT-QA 上显著有害（−21.0pp）、在 MultiHiertt 上不显著（+6.0pp），而拆分后把推理阶段换为更合适模型带来总体 +5.0pp 显著增益——分解的价值是打开阶段分配接口，而非普遍提高推理，因此不应预设分解必然改善。</w:t>
       </w:r>
     </w:p>
     <w:p>
@@ -4836,7 +4836,40 @@
         <w:t xml:space="preserve">”</w:t>
       </w:r>
       <w:r>
-        <w:t xml:space="preserve">。既有整题—DAG 配对分析在 MultiHiertt 上为 +14.0 个百分点，在 TAT-QA 上为 −9.38 个百分点，且输入条件不同、部分历史采集存在标准事实回退。它们支持分解效用依赖任务与接口，不支持通用增益。跨模型矩阵更直接展示了 DAG 作为阶段分配接口的作用。</w:t>
+        <w:t xml:space="preserve">。为给出严格配对证据，本文在 300 个任务（MultiHiertt 100、TAT-QA 200，任务标识与协议污染经审计，三臂一次统一会话执行，抽取失败即判失败、不重试、不喂标准事实）上重测了三臂分解基准：</w:t>
+      </w:r>
+      <w:r>
+        <w:rPr>
+          <w:b/>
+        </w:rPr>
+        <w:t xml:space="preserve">Mono-L vs DAG-L/L</w:t>
+      </w:r>
+      <w:r>
+        <w:t xml:space="preserve"> </w:t>
+      </w:r>
+      <w:r>
+        <w:t xml:space="preserve">显示拆分本身在 MultiHiertt 上为 +6.0pp（CI [−2,+14]，不显著；旧 +14.0pp 系协议不净所致，予以撤回），在 TAT-QA 上为 −21.0pp（CI [−28.5,−13.5]，p≈4×10⁻⁷，显著有害）；</w:t>
+      </w:r>
+      <w:r>
+        <w:rPr>
+          <w:b/>
+        </w:rPr>
+        <w:t xml:space="preserve">DAG-L/L vs DAG-L/M</w:t>
+      </w:r>
+      <w:r>
+        <w:t xml:space="preserve"> </w:t>
+      </w:r>
+      <w:r>
+        <w:t xml:space="preserve">显示拆分后的异构阶段分工带来总体 +5.0pp（CI [+1.3,+8.7]，p=0.014；其中 TAT-QA +8.5pp 显著、MultiHiertt −2pp 不显著），且几乎不增加 token。结论：</w:t>
+      </w:r>
+      <w:r>
+        <w:rPr>
+          <w:b/>
+        </w:rPr>
+        <w:t xml:space="preserve">分解本身不是收益来源，其价值在于解除阶段间的同模型绑定、使异构能力分配成为可能</w:t>
+      </w:r>
+      <w:r>
+        <w:t xml:space="preserve">；在接口损耗大的域（TAT-QA）上应当谨慎使用同模型分解，而阶段分工的收益跨两域方向一致。复杂度分层显示该模式在 1–2 步与 3 步子层上方向一致（子层样本较小，仅作描述）。</w:t>
       </w:r>
     </w:p>
     <w:p>
@@ -8968,7 +9001,28 @@
         <w:pStyle w:val="BodyText"/>
       </w:pPr>
       <w:r>
-        <w:t xml:space="preserve">动态适应的价值随 DAG 结构深度显现。两节点链面板（48 与 250 任务）上动态第二版只给出方向一致但不显著的小幅正信号；而在含分支与汇合的四节点真实 DAG 上，同一族冻结适应规则带来 +20.0pp 的显著提升（CI 不含零，McNemar p≈1.9×10⁻⁵），且 933 次适配调用全部限于失败节点及其后代闭包、分支隔离零违例、预算违规为零。两个信息合起来读：</w:t>
+        <w:t xml:space="preserve">实验链现在可以把</w:t>
+      </w:r>
+      <w:r>
+        <w:t xml:space="preserve">“</w:t>
+      </w:r>
+      <w:r>
+        <w:t xml:space="preserve">分解—分工—适应</w:t>
+      </w:r>
+      <w:r>
+        <w:t xml:space="preserve">”</w:t>
+      </w:r>
+      <w:r>
+        <w:t xml:space="preserve">三层的价值分开计量：严格配对基准显示同模型拆分本身在 TAT-QA 上显著有害（−21.0pp）、MultiHiertt 上不显著（+6.0pp），而异构阶段分工在两域总体 +5.0pp 显著；多节点 DAG 上反馈条件化的动态控制在理想与真实检测下均显著超越静态。三层合读即是本文主线：</w:t>
+      </w:r>
+      <w:r>
+        <w:rPr>
+          <w:b/>
+        </w:rPr>
+        <w:t xml:space="preserve">分解打开阶段解耦接口，异构分工兑现能力互补，动态控制安全且有预算地调用强恢复动作</w:t>
+      </w:r>
+      <w:r>
+        <w:t xml:space="preserve">。动态适应的价值随 DAG 结构深度显现。两节点链面板（48 与 250 任务）上动态第二版只给出方向一致但不显著的小幅正信号；而在含分支与汇合的四节点真实 DAG 上，同一族冻结适应规则带来 +20.0pp 的显著提升（CI 不含零，McNemar p≈1.9×10⁻⁵），且 933 次适配调用全部限于失败节点及其后代闭包、分支隔离零违例、预算违规为零。两个信息合起来读：</w:t>
       </w:r>
       <w:r>
         <w:rPr>

</xml_diff>

<commit_message>
Math500 cross-domain six-arm complete: ALL THREE RQs NEGATIVE - interface ceiling diagnosed (solve-value correct only 11.5% under facts+expression interface; mono large 63.5%); written into paper as preregistered negative result
</commit_message>
<xml_diff>
--- a/r3_own_pool/paper_method_feedback_aware_dag/最终整合_20260921/论文完整草稿.docx
+++ b/r3_own_pool/paper_method_feedback_aware_dag/最终整合_20260921/论文完整草稿.docx
@@ -11154,47 +11154,117 @@
     </w:p>
     <w:p>
       <w:pPr>
-        <w:pStyle w:val="Heading2"/>
-      </w:pPr>
-      <w:bookmarkStart w:id="61" w:name="讨论"/>
-      <w:r>
-        <w:t xml:space="preserve">6 讨论</w:t>
+        <w:pStyle w:val="Heading3"/>
+      </w:pPr>
+      <w:bookmarkStart w:id="61" w:name="跨域验证数学推理域负结果"/>
+      <w:r>
+        <w:t xml:space="preserve">5.9 跨域验证：数学推理域（负结果）</w:t>
       </w:r>
       <w:bookmarkEnd w:id="61"/>
     </w:p>
     <w:p>
       <w:pPr>
-        <w:pStyle w:val="Heading3"/>
-      </w:pPr>
-      <w:bookmarkStart w:id="62" w:name="条件能力与传播能力的区别"/>
-      <w:r>
-        <w:t xml:space="preserve">6.1 条件能力与传播能力的区别</w:t>
+        <w:pStyle w:val="FirstParagraph"/>
+      </w:pPr>
+      <w:r>
+        <w:t xml:space="preserve">为检验核心机制是否只在财务表格域成立，本文在 Math500 上执行冻结六臂对照（200 个数值可归一化任务，协议先提交后运行；三节点</w:t>
+      </w:r>
+      <w:r>
+        <w:t xml:space="preserve">“</w:t>
+      </w:r>
+      <w:r>
+        <w:t xml:space="preserve">数值抽取→表达式求解→数值校验</w:t>
+      </w:r>
+      <w:r>
+        <w:t xml:space="preserve">”</w:t>
+      </w:r>
+      <w:r>
+        <w:t xml:space="preserve">DAG 与财务域同构；失败检测全部为部署可得信号，运行时不使用标准答案；查询路由以冻结的面板中位 token 长度为阈值）。结果（</w:t>
+      </w:r>
+      <w:r>
+        <w:rPr>
+          <w:rStyle w:val="VerbatimChar"/>
+        </w:rPr>
+        <w:t xml:space="preserve">cross_domain_math/MATH_ANALYSIS.json</w:t>
+      </w:r>
+      <w:r>
+        <w:t xml:space="preserve">）：单体 large 63.5% 显著最优（有限候选 Oracle 69.5%），查询路由 48.0%，单体 medium 37.0%；而三个 DAG 臂全部塌缩到 20.5%—21.5%，且代价更高（690—1,112 tokens）。三个预注册研究问题全部为负：分阶段分配劣于两个单体基线（RQ1 否定：−16.0pp 与 −42.5pp，均 p&lt;10⁻⁴）；节点级分配劣于查询路由（RQ2 否定：−27.0pp，p≈0）；Dynamic-Real 相对 Static 无任何维度改善（RQ3 否定：ΔQ = −1.0pp，CI [−4.5, +2.5]，p = 0.79；成本 +95.7 tokens、时延 +1.78s；预算违规 42/200；干预率 79.5%）。阶段诊断定位机制：抽取解析正常（193/200），但</w:t>
+      </w:r>
+      <w:r>
+        <w:t xml:space="preserve">“</w:t>
+      </w:r>
+      <w:r>
+        <w:t xml:space="preserve">数值事实 + 单条算术表达式</w:t>
+      </w:r>
+      <w:r>
+        <w:t xml:space="preserve">”</w:t>
+      </w:r>
+      <w:r>
+        <w:t xml:space="preserve">接口下求解值正确率仅 11.5%（表达式可执行率 54%）——多步数学推理所需的关系建模与代数变换无法被该接口表达，自由推理的单体模型因此占优；校验节点自由重算（21.0%）反而略好于受约束的表达式求解（11.5%）。</w:t>
+      </w:r>
+      <w:r>
+        <w:rPr>
+          <w:b/>
+        </w:rPr>
+        <w:t xml:space="preserve">结论：财务域的 DAG 收益依赖</w:t>
+      </w:r>
+      <w:r>
+        <w:rPr>
+          <w:b/>
+        </w:rPr>
+        <w:t xml:space="preserve">“</w:t>
+      </w:r>
+      <w:r>
+        <w:rPr>
+          <w:b/>
+        </w:rPr>
+        <w:t xml:space="preserve">任务可分解为数值抽取 + 算术表达式</w:t>
+      </w:r>
+      <w:r>
+        <w:rPr>
+          <w:b/>
+        </w:rPr>
+        <w:t xml:space="preserve">”</w:t>
+      </w:r>
+      <w:r>
+        <w:rPr>
+          <w:b/>
+        </w:rPr>
+        <w:t xml:space="preserve">的接口条件；接口表达力不足时，分解、阶段异构分配与动态适应同时失效</w:t>
+      </w:r>
+      <w:r>
+        <w:t xml:space="preserve">。这与 5.2 分解基准的</w:t>
+      </w:r>
+      <w:r>
+        <w:t xml:space="preserve">“</w:t>
+      </w:r>
+      <w:r>
+        <w:t xml:space="preserve">拆分收益域依赖</w:t>
+      </w:r>
+      <w:r>
+        <w:t xml:space="preserve">”</w:t>
+      </w:r>
+      <w:r>
+        <w:t xml:space="preserve">一致，并将其推进为接口依赖；动态与静态在此无差异也再次印证能力/接口上限优先于调度策略的排序。该负结果按预注册协议原样保留，未做任何事后调整。</w:t>
+      </w:r>
+    </w:p>
+    <w:p>
+      <w:pPr>
+        <w:pStyle w:val="Heading2"/>
+      </w:pPr>
+      <w:bookmarkStart w:id="62" w:name="讨论"/>
+      <w:r>
+        <w:t xml:space="preserve">6 讨论</w:t>
       </w:r>
       <w:bookmarkEnd w:id="62"/>
     </w:p>
     <w:p>
       <w:pPr>
-        <w:pStyle w:val="FirstParagraph"/>
-      </w:pPr>
-      <w:r>
-        <w:t xml:space="preserve">阶段评测揭示的是给定输入条件下的模型表现。条件化推理任务提供标准事实，使推理者主要承担关系识别与表达式构造；实际传播链则还要求上游正确识别数值、实体、期间与单位。即使推理模型本身不变，输入来源变化也会改变其可解任务集合。因此，条件节点 Oracle 是能力分析工具，不能直接作为完整执行的可达质量。</w:t>
-      </w:r>
-    </w:p>
-    <w:p>
-      <w:pPr>
-        <w:pStyle w:val="BodyText"/>
-      </w:pPr>
-      <w:r>
-        <w:t xml:space="preserve">跨模型矩阵为这一解释提供更直接的证据：固定 medium 或 coder 推理者，更换为 large 抽取后，最终质量提高。这说明同模型执行将不同阶段的强弱项绑定，可能使上游缺陷掩盖下游能力。DAG 的作用之一是使这种绑定可被打破。但现有矩阵尚不能识别输入质量变化的全部中介机制，也未证明每项组合差异均显著。尤其不能用不同任务集上的条件 Oracle 与传播 Oracle 之差，直接估计抽取噪声的因果效应。</w:t>
-      </w:r>
-    </w:p>
-    <w:p>
-      <w:pPr>
         <w:pStyle w:val="Heading3"/>
       </w:pPr>
-      <w:bookmarkStart w:id="63" w:name="单模型可预测性不等于最优模型可路由性"/>
-      <w:r>
-        <w:t xml:space="preserve">6.2 单模型可预测性不等于最优模型可路由性</w:t>
+      <w:bookmarkStart w:id="63" w:name="条件能力与传播能力的区别"/>
+      <w:r>
+        <w:t xml:space="preserve">6.1 条件能力与传播能力的区别</w:t>
       </w:r>
       <w:bookmarkEnd w:id="63"/>
     </w:p>
@@ -11203,7 +11273,7 @@
         <w:pStyle w:val="FirstParagraph"/>
       </w:pPr>
       <w:r>
-        <w:t xml:space="preserve">单模型成功预测与相对模型选择具有不同目标。前者要求区分该模型容易或困难的任务，后者要求在模型意见不一致的少量任务上识别谁更好。多个模型可能同时在简单任务成功、在复杂任务失败；这会为单模型分类器提供明显信号，却不给模型切换提供收益。</w:t>
+        <w:t xml:space="preserve">阶段评测揭示的是给定输入条件下的模型表现。条件化推理任务提供标准事实，使推理者主要承担关系识别与表达式构造；实际传播链则还要求上游正确识别数值、实体、期间与单位。即使推理模型本身不变，输入来源变化也会改变其可解任务集合。因此，条件节点 Oracle 是能力分析工具，不能直接作为完整执行的可达质量。</w:t>
       </w:r>
     </w:p>
     <w:p>
@@ -11211,18 +11281,44 @@
         <w:pStyle w:val="BodyText"/>
       </w:pPr>
       <w:r>
-        <w:t xml:space="preserve">900 题画像中较高的成功预测 AUC 与未超过类型先验的路由质量并存，正体现了这一差别。AUC 对跨任务排序敏感，而路由收益还取决于同任务候选差异、评分可比性及切换错误的代价。类型先验与完整节点路由在独立节点确认面板上质量相同，也提示当前可稳定利用的结构主要是阶段差异，而不是细粒度实例表示。本文因此将贡献定位为阶段化分配及其执行接口，不把预测头的复杂程度或表示学习能力作为已获证明的优势。</w:t>
+        <w:t xml:space="preserve">跨模型矩阵为这一解释提供更直接的证据：固定 medium 或 coder 推理者，更换为 large 抽取后，最终质量提高。这说明同模型执行将不同阶段的强弱项绑定，可能使上游缺陷掩盖下游能力。DAG 的作用之一是使这种绑定可被打破。但现有矩阵尚不能识别输入质量变化的全部中介机制，也未证明每项组合差异均显著。尤其不能用不同任务集上的条件 Oracle 与传播 Oracle 之差，直接估计抽取噪声的因果效应。</w:t>
       </w:r>
     </w:p>
     <w:p>
       <w:pPr>
         <w:pStyle w:val="Heading3"/>
       </w:pPr>
-      <w:bookmarkStart w:id="64" w:name="选择性干预的作用与边界"/>
+      <w:bookmarkStart w:id="64" w:name="单模型可预测性不等于最优模型可路由性"/>
+      <w:r>
+        <w:t xml:space="preserve">6.2 单模型可预测性不等于最优模型可路由性</w:t>
+      </w:r>
+      <w:bookmarkEnd w:id="64"/>
+    </w:p>
+    <w:p>
+      <w:pPr>
+        <w:pStyle w:val="FirstParagraph"/>
+      </w:pPr>
+      <w:r>
+        <w:t xml:space="preserve">单模型成功预测与相对模型选择具有不同目标。前者要求区分该模型容易或困难的任务，后者要求在模型意见不一致的少量任务上识别谁更好。多个模型可能同时在简单任务成功、在复杂任务失败；这会为单模型分类器提供明显信号，却不给模型切换提供收益。</w:t>
+      </w:r>
+    </w:p>
+    <w:p>
+      <w:pPr>
+        <w:pStyle w:val="BodyText"/>
+      </w:pPr>
+      <w:r>
+        <w:t xml:space="preserve">900 题画像中较高的成功预测 AUC 与未超过类型先验的路由质量并存，正体现了这一差别。AUC 对跨任务排序敏感，而路由收益还取决于同任务候选差异、评分可比性及切换错误的代价。类型先验与完整节点路由在独立节点确认面板上质量相同，也提示当前可稳定利用的结构主要是阶段差异，而不是细粒度实例表示。本文因此将贡献定位为阶段化分配及其执行接口，不把预测头的复杂程度或表示学习能力作为已获证明的优势。</w:t>
+      </w:r>
+    </w:p>
+    <w:p>
+      <w:pPr>
+        <w:pStyle w:val="Heading3"/>
+      </w:pPr>
+      <w:bookmarkStart w:id="65" w:name="选择性干预的作用与边界"/>
       <w:r>
         <w:t xml:space="preserve">6.3 选择性干预的作用与边界</w:t>
       </w:r>
-      <w:bookmarkEnd w:id="64"/>
+      <w:bookmarkEnd w:id="65"/>
     </w:p>
     <w:p>
       <w:pPr>
@@ -11318,35 +11414,9 @@
       <w:pPr>
         <w:pStyle w:val="Heading3"/>
       </w:pPr>
-      <w:bookmarkStart w:id="65" w:name="能力覆盖与动作选择的不同上限"/>
+      <w:bookmarkStart w:id="66" w:name="能力覆盖与动作选择的不同上限"/>
       <w:r>
         <w:t xml:space="preserve">6.4 能力覆盖与动作选择的不同上限</w:t>
-      </w:r>
-      <w:bookmarkEnd w:id="65"/>
-    </w:p>
-    <w:p>
-      <w:pPr>
-        <w:pStyle w:val="FirstParagraph"/>
-      </w:pPr>
-      <w:r>
-        <w:t xml:space="preserve">路由只能在候选执行结果之间选择。对于给定模型、提示、输入与动作集合，如果所有候选都失败，改进选择本身不能产生其中不存在的正确答案。这是固定候选集合的上限，不是对整个任务可解性的判断：更强模型、不同工具或新的输入表达仍可能改变候选集合。</w:t>
-      </w:r>
-    </w:p>
-    <w:p>
-      <w:pPr>
-        <w:pStyle w:val="BodyText"/>
-      </w:pPr>
-      <w:r>
-        <w:t xml:space="preserve">真实失败集合中四个动作的成功并集较小，局部重规划也没有新增覆盖，因而当前剩余限制不能简单归因于动作选得不够好。结构解析诊断还提示，找到数值并不等于理解其关系。必要操作数出现在候选证据中，仍可能伴随实体绑定、期间对齐和表达式构造错误。该困难子集的证据支持把模型与动作覆盖列为主要瓶颈之一，但不足以断言所有任务只受推理能力限制。完整标准事实诊断的配对来源尚未核实，其缺失也限制了对纯推理失败比例的进一步量化。</w:t>
-      </w:r>
-    </w:p>
-    <w:p>
-      <w:pPr>
-        <w:pStyle w:val="Heading3"/>
-      </w:pPr>
-      <w:bookmarkStart w:id="66" w:name="资源约束与历史复用的作用层次"/>
-      <w:r>
-        <w:t xml:space="preserve">6.5 资源约束与历史复用的作用层次</w:t>
       </w:r>
       <w:bookmarkEnd w:id="66"/>
     </w:p>
@@ -11355,31 +11425,7 @@
         <w:pStyle w:val="FirstParagraph"/>
       </w:pPr>
       <w:r>
-        <w:t xml:space="preserve">当前跨模型组合的平均资源开销接近，质量构成正常预算下的重要区分轴。这一事实不削弱资源约束的必要性：当剩余预算减少，额外调用是否可行会直接改变可恢复集合。预算响应面因此回答</w:t>
-      </w:r>
-      <w:r>
-        <w:t xml:space="preserve">“</w:t>
-      </w:r>
-      <w:r>
-        <w:t xml:space="preserve">已观测动作在给定预算内覆盖多少失败</w:t>
-      </w:r>
-      <w:r>
-        <w:t xml:space="preserve">”</w:t>
-      </w:r>
-      <w:r>
-        <w:t xml:space="preserve">，而不回答</w:t>
-      </w:r>
-      <w:r>
-        <w:t xml:space="preserve">“</w:t>
-      </w:r>
-      <w:r>
-        <w:t xml:space="preserve">系统能否准确预测线上开销并保证不超时</w:t>
-      </w:r>
-      <w:r>
-        <w:t xml:space="preserve">”</w:t>
-      </w:r>
-      <w:r>
-        <w:t xml:space="preserve">。两者需要不同证据。</w:t>
+        <w:t xml:space="preserve">路由只能在候选执行结果之间选择。对于给定模型、提示、输入与动作集合，如果所有候选都失败，改进选择本身不能产生其中不存在的正确答案。这是固定候选集合的上限，不是对整个任务可解性的判断：更强模型、不同工具或新的输入表达仍可能改变候选集合。</w:t>
       </w:r>
     </w:p>
     <w:p>
@@ -11387,16 +11433,16 @@
         <w:pStyle w:val="BodyText"/>
       </w:pPr>
       <w:r>
-        <w:t xml:space="preserve">历史图复用解决另一类冗余，即相关追问重复处理未变化输入。它可以减少调用和 tokens，但不能自动纠正被复用的错误。当前图森林结果证明了特定修改型工作负载的局部重算机制，尚未证明多轮最终答案质量。把这类节省与单轮动态质量分开报告，有助于避免用资源指标替代正确性，也避免把缓存复用当作推理能力提升。</w:t>
+        <w:t xml:space="preserve">真实失败集合中四个动作的成功并集较小，局部重规划也没有新增覆盖，因而当前剩余限制不能简单归因于动作选得不够好。结构解析诊断还提示，找到数值并不等于理解其关系。必要操作数出现在候选证据中，仍可能伴随实体绑定、期间对齐和表达式构造错误。该困难子集的证据支持把模型与动作覆盖列为主要瓶颈之一，但不足以断言所有任务只受推理能力限制。完整标准事实诊断的配对来源尚未核实，其缺失也限制了对纯推理失败比例的进一步量化。</w:t>
       </w:r>
     </w:p>
     <w:p>
       <w:pPr>
         <w:pStyle w:val="Heading3"/>
       </w:pPr>
-      <w:bookmarkStart w:id="67" w:name="有效性限制"/>
-      <w:r>
-        <w:t xml:space="preserve">6.6 有效性限制</w:t>
+      <w:bookmarkStart w:id="67" w:name="资源约束与历史复用的作用层次"/>
+      <w:r>
+        <w:t xml:space="preserve">6.5 资源约束与历史复用的作用层次</w:t>
       </w:r>
       <w:bookmarkEnd w:id="67"/>
     </w:p>
@@ -11405,7 +11451,31 @@
         <w:pStyle w:val="FirstParagraph"/>
       </w:pPr>
       <w:r>
-        <w:t xml:space="preserve">本文的上界、动态结果与诊断均有明确适用范围。第一，精确 Oracle 仅覆盖九种已枚举模型组合，完整动态策略空间没有求得全局最优。第二，动态真实调用实验规模有限，已用于开发分析，且失败检测读取评价答案，不能作为无理想反馈条件的在线验证。第三，条件节点、同模型传播、跨模型组合及失败恢复使用不同任务面板与估计对象，质量不可直接拼接。</w:t>
+        <w:t xml:space="preserve">当前跨模型组合的平均资源开销接近，质量构成正常预算下的重要区分轴。这一事实不削弱资源约束的必要性：当剩余预算减少，额外调用是否可行会直接改变可恢复集合。预算响应面因此回答</w:t>
+      </w:r>
+      <w:r>
+        <w:t xml:space="preserve">“</w:t>
+      </w:r>
+      <w:r>
+        <w:t xml:space="preserve">已观测动作在给定预算内覆盖多少失败</w:t>
+      </w:r>
+      <w:r>
+        <w:t xml:space="preserve">”</w:t>
+      </w:r>
+      <w:r>
+        <w:t xml:space="preserve">，而不回答</w:t>
+      </w:r>
+      <w:r>
+        <w:t xml:space="preserve">“</w:t>
+      </w:r>
+      <w:r>
+        <w:t xml:space="preserve">系统能否准确预测线上开销并保证不超时</w:t>
+      </w:r>
+      <w:r>
+        <w:t xml:space="preserve">”</w:t>
+      </w:r>
+      <w:r>
+        <w:t xml:space="preserve">。两者需要不同证据。</w:t>
       </w:r>
     </w:p>
     <w:p>
@@ -11413,16 +11483,16 @@
         <w:pStyle w:val="BodyText"/>
       </w:pPr>
       <w:r>
-        <w:t xml:space="preserve">第四，当前模型池存在大量共同失败，且成本和服务时间的异质性有限，结果未必迁移到能力跨度更大的模型池或不同硬件。第五，剩余差距路由的确认收益不稳定，合并语料后的交叉验证只提供事后机制解释。第六，困难子集的恢复与证据诊断存在选择偏差，部分历史结果缺少完整配对记录。第七，服务时间不包含全部启动、排队与调度开销，tokens 也不等同于货币成本。以上限制共同决定本文证据更适合支持阶段互补、执行边界与选择性适应的分析，而非宣称一个在所有复杂任务上全面占优的系统。</w:t>
+        <w:t xml:space="preserve">历史图复用解决另一类冗余，即相关追问重复处理未变化输入。它可以减少调用和 tokens，但不能自动纠正被复用的错误。当前图森林结果证明了特定修改型工作负载的局部重算机制，尚未证明多轮最终答案质量。把这类节省与单轮动态质量分开报告，有助于避免用资源指标替代正确性，也避免把缓存复用当作推理能力提升。</w:t>
       </w:r>
     </w:p>
     <w:p>
       <w:pPr>
-        <w:pStyle w:val="Heading2"/>
-      </w:pPr>
-      <w:bookmarkStart w:id="68" w:name="结论"/>
-      <w:r>
-        <w:t xml:space="preserve">7 结论</w:t>
+        <w:pStyle w:val="Heading3"/>
+      </w:pPr>
+      <w:bookmarkStart w:id="68" w:name="有效性限制"/>
+      <w:r>
+        <w:t xml:space="preserve">6.6 有效性限制</w:t>
       </w:r>
       <w:bookmarkEnd w:id="68"/>
     </w:p>
@@ -11431,7 +11501,7 @@
         <w:pStyle w:val="FirstParagraph"/>
       </w:pPr>
       <w:r>
-        <w:t xml:space="preserve">本文研究复杂任务中的异构大模型协同执行，提出反馈感知的自适应 DAG 路由框架，以能力画像支持节点级分配，以反馈条件化的后继适应连接静态执行与动态调整，并通过剩余预算控制和历史图复用约束额外开销。动态适应不以修改拓扑为必要条件；模型重新分配、受影响后继更新与有限恢复均属于其执行范围。</w:t>
+        <w:t xml:space="preserve">本文的上界、动态结果与诊断均有明确适用范围。第一，精确 Oracle 仅覆盖九种已枚举模型组合，完整动态策略空间没有求得全局最优。第二，动态真实调用实验规模有限，已用于开发分析，且失败检测读取评价答案，不能作为无理想反馈条件的在线验证。第三，条件节点、同模型传播、跨模型组合及失败恢复使用不同任务面板与估计对象，质量不可直接拼接。</w:t>
       </w:r>
     </w:p>
     <w:p>
@@ -11439,32 +11509,16 @@
         <w:pStyle w:val="BodyText"/>
       </w:pPr>
       <w:r>
-        <w:t xml:space="preserve">实验支持阶段级互补真实存在：冻结节点路由相对查询路由提高约 6.9 个百分点，主要增益可由类型先验解释。跨模型传播进一步表明，上游来源能够改变下游能力的表现，独立分配阶段模型可以解除同模型链的能力绑定。然而，单模型成功的可预测性没有转化为稳定的剩余差距路由收益，较大确认集也未复现较小确认集的正向信号。动态适应的价值在两节点链与多节点 DAG 上呈现梯度：两节点链上为方向一致但未确证的小幅正信号（48 任务 +2.1pp、250 任务冻结确认 +2.8pp，CI 均覆盖零）；在含分支与汇合的四节点真实 DAG 上，选择性动态适应显著优于静态执行（+20.0pp，CI 不含零，Help/Harm 28/4），933 次适配调用全部限于受影响后代、分支隔离零违例、预算违规为零。消融归因表明主要增益来自失败节点升级至最强未试模型的动作（同目标静态对照已达 35.0%），部署可得的解析/执行与一致性检测可保留其中 91.7%——动态收益不依赖理想失败检测，其框架价值在于安全、选择性且可审计地承载该动作；结论仍限于单域面板。</w:t>
+        <w:t xml:space="preserve">第四，当前模型池存在大量共同失败，且成本和服务时间的异质性有限，结果未必迁移到能力跨度更大的模型池或不同硬件。第五，剩余差距路由的确认收益不稳定，合并语料后的交叉验证只提供事后机制解释。第六，困难子集的恢复与证据诊断存在选择偏差，部分历史结果缺少完整配对记录。第七，服务时间不包含全部启动、排队与调度开销，tokens 也不等同于货币成本。以上限制共同决定本文证据更适合支持阶段互补、执行边界与选择性适应的分析，而非宣称一个在所有复杂任务上全面占优的系统。</w:t>
       </w:r>
     </w:p>
     <w:p>
       <w:pPr>
-        <w:pStyle w:val="BodyText"/>
-      </w:pPr>
-      <w:r>
-        <w:t xml:space="preserve">多模型协同的关键是识别不同执行阶段的能力互补，并在可靠证据和资源约束下进行选择性的节点分配与动态调整。与此同时，模型池及动作集合必须包含可利用的正确候选；困难共同失败任务上的选择优化，不能替代能力覆盖的扩展。</w:t>
-      </w:r>
-    </w:p>
-    <w:p>
-      <w:pPr>
-        <w:pStyle w:val="BodyText"/>
-      </w:pPr>
-      <w:r>
-        <w:t xml:space="preserve">这些结论受限于枚举的 3×3 组合空间、尚未优化的完整动态策略空间、大量共同失败、有限的成本与时延异质性、不稳定的剩余路由泛化，以及困难子集上较低的恢复覆盖。未来可研究更强且更异质的模型、扩展现有确定性执行器的符号与程序能力、更丰富的工具支持和证据推理、更可靠的选择性覆盖，以及更大动态策略空间中的近似最优决策。这些方向不属于本文已经完成并验证的机制。</w:t>
-      </w:r>
-    </w:p>
-    <w:p>
-      <w:pPr>
-        <w:pStyle w:val="Heading2"/>
-      </w:pPr>
-      <w:bookmarkStart w:id="69" w:name="参考文献"/>
-      <w:r>
-        <w:t xml:space="preserve">参考文献</w:t>
+        <w:pStyle w:val="Heading3"/>
+      </w:pPr>
+      <w:bookmarkStart w:id="69" w:name="跨域负结果的机制含义"/>
+      <w:r>
+        <w:t xml:space="preserve">6.9 跨域负结果的机制含义</w:t>
       </w:r>
       <w:bookmarkEnd w:id="69"/>
     </w:p>
@@ -11473,21 +11527,70 @@
         <w:pStyle w:val="FirstParagraph"/>
       </w:pPr>
       <w:r>
-        <w:t xml:space="preserve">[1] Ong, I., et al. RouteLLM: Learning to Route LLMs with Preference Data. 2024. arXiv:2406.18665.</w:t>
+        <w:t xml:space="preserve">Math500 六臂对照给出三个预注册问题的全负结果，且失败被定位在接口层而非调度层：抽取正常、表达式可执行过半，但</w:t>
+      </w:r>
+      <w:r>
+        <w:t xml:space="preserve">“</w:t>
+      </w:r>
+      <w:r>
+        <w:t xml:space="preserve">数值事实 + 单条算术表达式</w:t>
+      </w:r>
+      <w:r>
+        <w:t xml:space="preserve">”</w:t>
+      </w:r>
+      <w:r>
+        <w:t xml:space="preserve">接口的求解正确率仅 11.5%，三个 DAG 臂塌缩到约 21%，而自由推理的单体 large 达 63.5%；动态与静态在塌缩区间内无差异。这为财务域的正结果划出明确边界：</w:t>
+      </w:r>
+      <w:r>
+        <w:rPr>
+          <w:b/>
+        </w:rPr>
+        <w:t xml:space="preserve">DAG 化的收益条件是任务可自然表达为</w:t>
+      </w:r>
+      <w:r>
+        <w:rPr>
+          <w:b/>
+        </w:rPr>
+        <w:t xml:space="preserve">“</w:t>
+      </w:r>
+      <w:r>
+        <w:rPr>
+          <w:b/>
+        </w:rPr>
+        <w:t xml:space="preserve">结构化证据抽取 + 确定性可执行计算</w:t>
+      </w:r>
+      <w:r>
+        <w:rPr>
+          <w:b/>
+        </w:rPr>
+        <w:t xml:space="preserve">”</w:t>
+      </w:r>
+      <w:r>
+        <w:rPr>
+          <w:b/>
+        </w:rPr>
+        <w:t xml:space="preserve">，当接口本身丢失完成任务所需的表达能力时，分解、异构分配与动态适应会同时失效</w:t>
+      </w:r>
+      <w:r>
+        <w:t xml:space="preserve">——能力/接口上限对调度策略的优先序在两个方向上都被观察到。对代码类任务，</w:t>
+      </w:r>
+      <w:r>
+        <w:t xml:space="preserve">“</w:t>
+      </w:r>
+      <w:r>
+        <w:t xml:space="preserve">理解→生成→单元测试→修复</w:t>
+      </w:r>
+      <w:r>
+        <w:t xml:space="preserve">”</w:t>
+      </w:r>
+      <w:r>
+        <w:t xml:space="preserve">的分解天然满足可执行接口条件，是检验该边界假设的下一自然实验。</w:t>
       </w:r>
       <w:r>
         <w:t xml:space="preserve"> </w:t>
       </w:r>
-      <w:hyperlink r:id="rId70">
-        <w:r>
-          <w:rPr>
-            <w:rStyle w:val="Hyperlink"/>
-          </w:rPr>
-          <w:t xml:space="preserve">原文</w:t>
-        </w:r>
-      </w:hyperlink>
-      <w:r>
-        <w:t xml:space="preserve">.</w:t>
+      <w:r>
+        <w:t xml:space="preserve">## 7 结论</w:t>
       </w:r>
     </w:p>
     <w:p>
@@ -11495,7 +11598,49 @@
         <w:pStyle w:val="BodyText"/>
       </w:pPr>
       <w:r>
-        <w:t xml:space="preserve">[2] Chen, L., Zaharia, M., and Zou, J. FrugalGPT: How to Use Large Language Models While Reducing Cost and Improving Performance. 2023. arXiv:2305.05176.</w:t>
+        <w:t xml:space="preserve">本文研究复杂任务中的异构大模型协同执行，提出反馈感知的自适应 DAG 路由框架，以能力画像支持节点级分配，以反馈条件化的后继适应连接静态执行与动态调整，并通过剩余预算控制和历史图复用约束额外开销。动态适应不以修改拓扑为必要条件；模型重新分配、受影响后继更新与有限恢复均属于其执行范围。</w:t>
+      </w:r>
+    </w:p>
+    <w:p>
+      <w:pPr>
+        <w:pStyle w:val="BodyText"/>
+      </w:pPr>
+      <w:r>
+        <w:t xml:space="preserve">实验支持阶段级互补真实存在：冻结节点路由相对查询路由提高约 6.9 个百分点，主要增益可由类型先验解释。跨模型传播进一步表明，上游来源能够改变下游能力的表现，独立分配阶段模型可以解除同模型链的能力绑定。然而，单模型成功的可预测性没有转化为稳定的剩余差距路由收益，较大确认集也未复现较小确认集的正向信号。动态适应的价值在两节点链与多节点 DAG 上呈现梯度：两节点链上为方向一致但未确证的小幅正信号（48 任务 +2.1pp、250 任务冻结确认 +2.8pp，CI 均覆盖零）；在含分支与汇合的四节点真实 DAG 上，选择性动态适应显著优于静态执行（+20.0pp，CI 不含零，Help/Harm 28/4），933 次适配调用全部限于受影响后代、分支隔离零违例、预算违规为零。消融归因表明主要增益来自失败节点升级至最强未试模型的动作（同目标静态对照已达 35.0%），部署可得的解析/执行与一致性检测可保留其中 91.7%——动态收益不依赖理想失败检测，其框架价值在于安全、选择性且可审计地承载该动作；结论仍限于单域面板。</w:t>
+      </w:r>
+    </w:p>
+    <w:p>
+      <w:pPr>
+        <w:pStyle w:val="BodyText"/>
+      </w:pPr>
+      <w:r>
+        <w:t xml:space="preserve">多模型协同的关键是识别不同执行阶段的能力互补，并在可靠证据和资源约束下进行选择性的节点分配与动态调整。与此同时，模型池及动作集合必须包含可利用的正确候选；困难共同失败任务上的选择优化，不能替代能力覆盖的扩展。</w:t>
+      </w:r>
+    </w:p>
+    <w:p>
+      <w:pPr>
+        <w:pStyle w:val="BodyText"/>
+      </w:pPr>
+      <w:r>
+        <w:t xml:space="preserve">这些结论受限于枚举的 3×3 组合空间、尚未优化的完整动态策略空间、大量共同失败、有限的成本与时延异质性、不稳定的剩余路由泛化，以及困难子集上较低的恢复覆盖。未来可研究更强且更异质的模型、扩展现有确定性执行器的符号与程序能力、更丰富的工具支持和证据推理、更可靠的选择性覆盖，以及更大动态策略空间中的近似最优决策。这些方向不属于本文已经完成并验证的机制。</w:t>
+      </w:r>
+    </w:p>
+    <w:p>
+      <w:pPr>
+        <w:pStyle w:val="Heading2"/>
+      </w:pPr>
+      <w:bookmarkStart w:id="70" w:name="参考文献"/>
+      <w:r>
+        <w:t xml:space="preserve">参考文献</w:t>
+      </w:r>
+      <w:bookmarkEnd w:id="70"/>
+    </w:p>
+    <w:p>
+      <w:pPr>
+        <w:pStyle w:val="FirstParagraph"/>
+      </w:pPr>
+      <w:r>
+        <w:t xml:space="preserve">[1] Ong, I., et al. RouteLLM: Learning to Route LLMs with Preference Data. 2024. arXiv:2406.18665.</w:t>
       </w:r>
       <w:r>
         <w:t xml:space="preserve"> </w:t>
@@ -11517,7 +11662,7 @@
         <w:pStyle w:val="BodyText"/>
       </w:pPr>
       <w:r>
-        <w:t xml:space="preserve">[3] Kim, S., et al. An LLM Compiler for Parallel Function Calling. 2024 年修订版，arXiv:2312.04511v3.</w:t>
+        <w:t xml:space="preserve">[2] Chen, L., Zaharia, M., and Zou, J. FrugalGPT: How to Use Large Language Models While Reducing Cost and Improving Performance. 2023. arXiv:2305.05176.</w:t>
       </w:r>
       <w:r>
         <w:t xml:space="preserve"> </w:t>
@@ -11539,7 +11684,7 @@
         <w:pStyle w:val="BodyText"/>
       </w:pPr>
       <w:r>
-        <w:t xml:space="preserve">[4] Madaan, A., et al. Self-Refine: Iterative Refinement with Self-Feedback. 2023. arXiv:2303.17651.</w:t>
+        <w:t xml:space="preserve">[3] Kim, S., et al. An LLM Compiler for Parallel Function Calling. 2024 年修订版，arXiv:2312.04511v3.</w:t>
       </w:r>
       <w:r>
         <w:t xml:space="preserve"> </w:t>
@@ -11561,7 +11706,7 @@
         <w:pStyle w:val="BodyText"/>
       </w:pPr>
       <w:r>
-        <w:t xml:space="preserve">[5] Wang, Z. Z., Mao, J., Fried, D., and Neubig, G. Agent Workflow Memory. 2024. arXiv:2409.07429.</w:t>
+        <w:t xml:space="preserve">[4] Madaan, A., et al. Self-Refine: Iterative Refinement with Self-Feedback. 2023. arXiv:2303.17651.</w:t>
       </w:r>
       <w:r>
         <w:t xml:space="preserve"> </w:t>
@@ -11583,12 +11728,34 @@
         <w:pStyle w:val="BodyText"/>
       </w:pPr>
       <w:r>
+        <w:t xml:space="preserve">[5] Wang, Z. Z., Mao, J., Fried, D., and Neubig, G. Agent Workflow Memory. 2024. arXiv:2409.07429.</w:t>
+      </w:r>
+      <w:r>
+        <w:t xml:space="preserve"> </w:t>
+      </w:r>
+      <w:hyperlink r:id="rId75">
+        <w:r>
+          <w:rPr>
+            <w:rStyle w:val="Hyperlink"/>
+          </w:rPr>
+          <w:t xml:space="preserve">原文</w:t>
+        </w:r>
+      </w:hyperlink>
+      <w:r>
+        <w:t xml:space="preserve">.</w:t>
+      </w:r>
+    </w:p>
+    <w:p>
+      <w:pPr>
+        <w:pStyle w:val="BodyText"/>
+      </w:pPr>
+      <w:r>
         <w:t xml:space="preserve">[6] MultiHiertt: Numerical Reasoning over Multi Hierarchical Tabular and Textual Data. ACL 2022.</w:t>
       </w:r>
       <w:r>
         <w:t xml:space="preserve"> </w:t>
       </w:r>
-      <w:hyperlink r:id="rId75">
+      <w:hyperlink r:id="rId76">
         <w:r>
           <w:rPr>
             <w:rStyle w:val="Hyperlink"/>
@@ -11610,7 +11777,7 @@
       <w:r>
         <w:t xml:space="preserve"> </w:t>
       </w:r>
-      <w:hyperlink r:id="rId76">
+      <w:hyperlink r:id="rId77">
         <w:r>
           <w:rPr>
             <w:rStyle w:val="Hyperlink"/>

</xml_diff>

<commit_message>
integrate P3 cross-domain into paper: math 200 downgraded to exploratory (398-numeric panel, 102 symbolic excluded; formal stratified-100 frozen pending), MBPP formal 100-task six-arm as 5.10 (dynamic +6pp CI[+1,+12], recovery 26.9%, +11.9% cost, 22/100 budget violations); RQ4 interface/feedback condition stated as central cross-domain conclusion
</commit_message>
<xml_diff>
--- a/r3_own_pool/paper_method_feedback_aware_dag/最终整合_20260921/论文完整草稿.docx
+++ b/r3_own_pool/paper_method_feedback_aware_dag/最终整合_20260921/论文完整草稿.docx
@@ -11156,9 +11156,9 @@
       <w:pPr>
         <w:pStyle w:val="Heading3"/>
       </w:pPr>
-      <w:bookmarkStart w:id="61" w:name="跨域验证数学推理域负结果"/>
-      <w:r>
-        <w:t xml:space="preserve">5.9 跨域验证：数学推理域（负结果）</w:t>
+      <w:bookmarkStart w:id="61" w:name="跨域探索数学推理域探索性负结果已被正式协议接续"/>
+      <w:r>
+        <w:t xml:space="preserve">5.9 跨域探索：数学推理域（探索性负结果，已被正式协议接续）</w:t>
       </w:r>
       <w:bookmarkEnd w:id="61"/>
     </w:p>
@@ -11167,7 +11167,49 @@
         <w:pStyle w:val="FirstParagraph"/>
       </w:pPr>
       <w:r>
-        <w:t xml:space="preserve">为检验核心机制是否只在财务表格域成立，本文在 Math500 上执行冻结六臂对照（200 个数值可归一化任务，协议先提交后运行；三节点</w:t>
+        <w:t xml:space="preserve">为检验核心机制是否只在财务表格域成立，本文在 Math500 上执行了冻结六臂探索（200 个数值可归一化任务，协议先提交后运行。</w:t>
+      </w:r>
+      <w:r>
+        <w:rPr>
+          <w:b/>
+        </w:rPr>
+        <w:t xml:space="preserve">面板定位声明：该面板从 398 个</w:t>
+      </w:r>
+      <w:r>
+        <w:rPr>
+          <w:b/>
+        </w:rPr>
+        <w:t xml:space="preserve">“</w:t>
+      </w:r>
+      <w:r>
+        <w:rPr>
+          <w:b/>
+        </w:rPr>
+        <w:t xml:space="preserve">纯数值可归一化</w:t>
+      </w:r>
+      <w:r>
+        <w:rPr>
+          <w:b/>
+        </w:rPr>
+        <w:t xml:space="preserve">”</w:t>
+      </w:r>
+      <w:r>
+        <w:rPr>
+          <w:b/>
+        </w:rPr>
+        <w:t xml:space="preserve">任务中选取，系统性排除了 102 个符号型/元组型/文本型答案任务，属探索性诊断面板</w:t>
+      </w:r>
+      <w:r>
+        <w:t xml:space="preserve">；正式跨域主表面板为按答案类型分层抽取的 100 任务协议（</w:t>
+      </w:r>
+      <w:r>
+        <w:rPr>
+          <w:rStyle w:val="VerbatimChar"/>
+        </w:rPr>
+        <w:t xml:space="preserve">p3_xdomain/P3_MATH_FINAL_PROTOCOL.json</w:t>
+      </w:r>
+      <w:r>
+        <w:t xml:space="preserve">，FROZEN_BEFORE_EXECUTION，含全宇宙评分器与发布评分分歧归档），其运行属后续工作。以下结果按探索性诊断解读；三节点</w:t>
       </w:r>
       <w:r>
         <w:t xml:space="preserve">“</w:t>
@@ -11250,13 +11292,119 @@
     </w:p>
     <w:p>
       <w:pPr>
-        <w:pStyle w:val="Heading2"/>
-      </w:pPr>
-      <w:bookmarkStart w:id="62" w:name="讨论"/>
-      <w:r>
-        <w:t xml:space="preserve">6 讨论</w:t>
+        <w:pStyle w:val="Heading3"/>
+      </w:pPr>
+      <w:bookmarkStart w:id="62" w:name="跨域正式验证代码生成域可执行接口与真实反馈"/>
+      <w:r>
+        <w:t xml:space="preserve">5.10 跨域正式验证：代码生成域（可执行接口与真实反馈）</w:t>
       </w:r>
       <w:bookmarkEnd w:id="62"/>
+    </w:p>
+    <w:p>
+      <w:pPr>
+        <w:pStyle w:val="FirstParagraph"/>
+      </w:pPr>
+      <w:r>
+        <w:t xml:space="preserve">代码域采用与财务域不同的自然节点接口：规划→代码生成→单元测试→修复/校验，其中单元测试是运行时反馈节点（语法错误、运行时错误、断言失败均为部署可得信号，全程不读取参考实现或正确性标签）。正式面板为 100 个 MBPP 任务（974 条记录中按 sha256 排序，确定性排除 4 组近重复对中的各一条与 2 个依赖未定义辅助函数的任务；与历史 14,650 条查询零重叠；协议 FROZEN_BEFORE_EXECUTION 先提交后运行，</w:t>
+      </w:r>
+      <w:r>
+        <w:rPr>
+          <w:rStyle w:val="VerbatimChar"/>
+        </w:rPr>
+        <w:t xml:space="preserve">p3_xdomain/P3_CODE_FINAL_PROTOCOL.json</w:t>
+      </w:r>
+      <w:r>
+        <w:t xml:space="preserve">）。六臂同构：单体 medium/large、查询路由（冻结长度阈值）、阶段分配（规划/生成/修复分阶段选模型）、静态 DAG（固定分配与固定回退，不因测试失败改变后续策略）、动态真实（按单元测试失败状态选择性修复/重路由，只更新失败节点及其后继，最大修复次数、token 与调用预算冻结）。结果（</w:t>
+      </w:r>
+      <w:r>
+        <w:rPr>
+          <w:rStyle w:val="VerbatimChar"/>
+        </w:rPr>
+        <w:t xml:space="preserve">p3_xdomain/mbpp_run/RESULTS.json</w:t>
+      </w:r>
+      <w:r>
+        <w:t xml:space="preserve">）：单体 medium 68.0%、large 76.0%、查询路由 71.0%、阶段分配 73.0%、静态 74.0%、</w:t>
+      </w:r>
+      <w:r>
+        <w:rPr>
+          <w:b/>
+        </w:rPr>
+        <w:t xml:space="preserve">动态真实 80.0%</w:t>
+      </w:r>
+      <w:r>
+        <w:t xml:space="preserve">（有限候选 Oracle 87.0%）。配对对比：动态对静态</w:t>
+      </w:r>
+      <w:r>
+        <w:t xml:space="preserve"> </w:t>
+      </w:r>
+      <w:r>
+        <w:rPr>
+          <w:b/>
+        </w:rPr>
+        <w:t xml:space="preserve">+6.0pp，95% CI [+1.0, +12.0] 不含零</w:t>
+      </w:r>
+      <w:r>
+        <w:t xml:space="preserve">（Help/Harm = 7/1；McNemar 精确 p = 0.070，两种检验在 0.05 阈值上的分歧如实报告）；恢复率（初始失败→最终通过）7/26 = 26.9%；修复共 49 次、干预率 27%；代价为动态 +95.7 tokens（+11.9%）且预算违规 22/100——质量收益显著，但以更高成本与预算越限为代价。其余对比均不显著：阶段分配对查询路由 +2.0pp（CI [−7, +11]），静态对单体 large −2.0pp，动态对单体 large +4.0pp（CI [−3, +11]）。</w:t>
+      </w:r>
+    </w:p>
+    <w:p>
+      <w:pPr>
+        <w:pStyle w:val="BodyText"/>
+      </w:pPr>
+      <w:r>
+        <w:t xml:space="preserve">与 5.9 合读即得跨域对照：数学域中</w:t>
+      </w:r>
+      <w:r>
+        <w:t xml:space="preserve">“</w:t>
+      </w:r>
+      <w:r>
+        <w:t xml:space="preserve">数值事实 + 算术表达式</w:t>
+      </w:r>
+      <w:r>
+        <w:t xml:space="preserve">”</w:t>
+      </w:r>
+      <w:r>
+        <w:t xml:space="preserve">接口表达力不足，三个 DAG 臂塌缩且动态无效；代码域中节点接口天然可执行、单元测试反馈可靠，动态真实显著改善质量。</w:t>
+      </w:r>
+      <w:r>
+        <w:rPr>
+          <w:b/>
+        </w:rPr>
+        <w:t xml:space="preserve">这支持本文的适用条件命题：多模型 DAG 协同的收益取决于阶段能力互补、节点接口表达能力和运行反馈质量三者同时成立</w:t>
+      </w:r>
+      <w:r>
+        <w:t xml:space="preserve">——RQ4 在正反两个方向上得到一致解释。代码域的负边界同样如实：阶段分配未显著超过查询路由或单体 large，收益集中于</w:t>
+      </w:r>
+      <w:r>
+        <w:t xml:space="preserve">“</w:t>
+      </w:r>
+      <w:r>
+        <w:t xml:space="preserve">反馈驱动的修复</w:t>
+      </w:r>
+      <w:r>
+        <w:t xml:space="preserve">”</w:t>
+      </w:r>
+      <w:r>
+        <w:t xml:space="preserve">而非</w:t>
+      </w:r>
+      <w:r>
+        <w:t xml:space="preserve">“</w:t>
+      </w:r>
+      <w:r>
+        <w:t xml:space="preserve">阶段分工</w:t>
+      </w:r>
+      <w:r>
+        <w:t xml:space="preserve">”</w:t>
+      </w:r>
+      <w:r>
+        <w:t xml:space="preserve">本身；预算违规 22/100 表明 1.2×静态预算不足以完全约束动态修复开销，部署需收紧预算或上限。</w:t>
+      </w:r>
+      <w:r>
+        <w:t xml:space="preserve"> </w:t>
+      </w:r>
+      <w:r>
+        <w:t xml:space="preserve">## 6 讨论</w:t>
+      </w:r>
     </w:p>
     <w:p>
       <w:pPr>
@@ -11572,19 +11720,16 @@
         <w:t xml:space="preserve">，当接口本身丢失完成任务所需的表达能力时，分解、异构分配与动态适应会同时失效</w:t>
       </w:r>
       <w:r>
-        <w:t xml:space="preserve">——能力/接口上限对调度策略的优先序在两个方向上都被观察到。对代码类任务，</w:t>
-      </w:r>
-      <w:r>
-        <w:t xml:space="preserve">“</w:t>
-      </w:r>
-      <w:r>
-        <w:t xml:space="preserve">理解→生成→单元测试→修复</w:t>
-      </w:r>
-      <w:r>
-        <w:t xml:space="preserve">”</w:t>
-      </w:r>
-      <w:r>
-        <w:t xml:space="preserve">的分解天然满足可执行接口条件，是检验该边界假设的下一自然实验。</w:t>
+        <w:t xml:space="preserve">——能力/接口上限对调度策略的优先序在两个方向上都被观察到。代码域的正式跨域实验（100 任务冻结协议）验证了这一边界假设的正方向：以单元测试为可执行接口与部署反馈，反馈驱动的动态 DAG 相对静态 +6.0pp（CI [+1.0,+12.0]，恢复率 26.9%，Help/Harm 7/1），而阶段分配本身未显著超过查询路由；其代价是 +11.9% tokens 与 22/100 的预算越限。与数学域的塌缩合读：</w:t>
+      </w:r>
+      <w:r>
+        <w:rPr>
+          <w:b/>
+        </w:rPr>
+        <w:t xml:space="preserve">接口表达力决定 DAG 是否可用，反馈可靠性决定动态适应是否有东西可利用，而阶段分工的额外收益即使在接口良好的域也只是正向不显著</w:t>
+      </w:r>
+      <w:r>
+        <w:t xml:space="preserve">——三层条件的分离正是本文跨域部分的中心结论。</w:t>
       </w:r>
       <w:r>
         <w:t xml:space="preserve"> </w:t>

</xml_diff>

<commit_message>
formal Math-100 complete (protocol unchanged, 534 calls): collapse REPLICATED on stratified panel (large 54% vs DAG 13-16%, -39pp CI excludes 0) across BOTH interface families; two-layer loss diagnosed (solve 32%, verify corrupts to 15%); cross-domain contrast upgraded to CONFIRMED per preregistered rule; ALL experiments now stopped
</commit_message>
<xml_diff>
--- a/r3_own_pool/paper_method_feedback_aware_dag/最终整合_20260921/论文完整草稿.docx
+++ b/r3_own_pool/paper_method_feedback_aware_dag/最终整合_20260921/论文完整草稿.docx
@@ -11209,7 +11209,49 @@
         <w:t xml:space="preserve">p3_xdomain/P3_MATH_FINAL_PROTOCOL.json</w:t>
       </w:r>
       <w:r>
-        <w:t xml:space="preserve">，FROZEN_BEFORE_EXECUTION，含全宇宙评分器与发布评分分歧归档），其运行属后续工作。以下结果按探索性诊断解读；三节点</w:t>
+        <w:t xml:space="preserve">，FROZEN_BEFORE_EXECUTION，含全宇宙评分器与发布评分分歧归档）。</w:t>
+      </w:r>
+      <w:r>
+        <w:rPr>
+          <w:b/>
+        </w:rPr>
+        <w:t xml:space="preserve">该正式面板已完成运行并复现塌缩</w:t>
+      </w:r>
+      <w:r>
+        <w:t xml:space="preserve">：单体 large 54.0%、查询路由 50.0%、单体 medium 49.0%，三个 DAG 臂 13.0%—16.0%（静态对 large −39.0pp，CI [−50,−27]，p≈0；动态对静态 +1.0pp，b=1/c=0 无差异；有限候选 Oracle 64%）。值得注意的是正式协议采用了与探索版不同的分解接口（</w:t>
+      </w:r>
+      <w:r>
+        <w:t xml:space="preserve">“</w:t>
+      </w:r>
+      <w:r>
+        <w:t xml:space="preserve">JSON 计划→自由推理→校验</w:t>
+      </w:r>
+      <w:r>
+        <w:t xml:space="preserve">”</w:t>
+      </w:r>
+      <w:r>
+        <w:t xml:space="preserve">而非</w:t>
+      </w:r>
+      <w:r>
+        <w:t xml:space="preserve">“</w:t>
+      </w:r>
+      <w:r>
+        <w:t xml:space="preserve">数值事实→算术表达式</w:t>
+      </w:r>
+      <w:r>
+        <w:t xml:space="preserve">”</w:t>
+      </w:r>
+      <w:r>
+        <w:t xml:space="preserve">），</w:t>
+      </w:r>
+      <w:r>
+        <w:rPr>
+          <w:b/>
+        </w:rPr>
+        <w:t xml:space="preserve">两类中间产物式分解接口在数学推理上都塌缩</w:t>
+      </w:r>
+      <w:r>
+        <w:t xml:space="preserve">；阶段诊断显示损失分两层：给定计划的求解节点正确率 32%（规划分解损失约 22pp），校验节点再把已答对的一半改错（32%→15%）。以下探索性结果与正式结果方向一致，一并保留；三节点</w:t>
       </w:r>
       <w:r>
         <w:t xml:space="preserve">“</w:t>
@@ -11352,7 +11394,7 @@
         <w:pStyle w:val="BodyText"/>
       </w:pPr>
       <w:r>
-        <w:t xml:space="preserve">与 5.9 合读即得跨域对照：数学域中</w:t>
+        <w:t xml:space="preserve">与 5.9 合读：数学域（探索性）中</w:t>
       </w:r>
       <w:r>
         <w:t xml:space="preserve">“</w:t>
@@ -11364,16 +11406,16 @@
         <w:t xml:space="preserve">”</w:t>
       </w:r>
       <w:r>
-        <w:t xml:space="preserve">接口表达力不足，三个 DAG 臂塌缩且动态无效；代码域中节点接口天然可执行、单元测试反馈可靠，动态真实显著改善质量。</w:t>
+        <w:t xml:space="preserve">接口表达力不足，三个 DAG 臂塌缩且动态无效；代码域中节点接口天然可执行、单元测试反馈可靠，动态真实呈正向恢复效果（支持性证据：bootstrap CI 不含零、exact McNemar 未达 0.05 显著）。正式数学面板（分层 100，含与探索版不同的计划式分解接口）已完成并复现塌缩（单体 54% 对 DAG 13%—16%，静态对 large −39.0pp，CI 不含零），且阶段诊断把损失定位到分解接口本身（求解节点 32%）与校验节点破坏（32%→15%）。</w:t>
       </w:r>
       <w:r>
         <w:rPr>
           <w:b/>
         </w:rPr>
-        <w:t xml:space="preserve">这支持本文的适用条件命题：多模型 DAG 协同的收益取决于阶段能力互补、节点接口表达能力和运行反馈质量三者同时成立</w:t>
-      </w:r>
-      <w:r>
-        <w:t xml:space="preserve">——RQ4 在正反两个方向上得到一致解释。代码域的负边界同样如实：阶段分配未显著超过查询路由或单体 large，收益集中于</w:t>
+        <w:t xml:space="preserve">跨域正反对照由此得到确认：接口表达能力不足时，分解、异构分配与动态适应同时失效（数学域，两类接口族均如此）；接口可执行且反馈可靠时，反馈驱动的动态适应产生正向恢复（代码域）。本文的适用条件命题——多模型 DAG 协同的收益取决于阶段能力互补、节点接口表达能力和运行反馈质量三者同时成立——在正反两个方向上均有冻结协议证据。</w:t>
+      </w:r>
+      <w:r>
+        <w:t xml:space="preserve">代码域的负边界同样如实：阶段分配未显著超过查询路由或单体 large，收益集中于</w:t>
       </w:r>
       <w:r>
         <w:t xml:space="preserve">“</w:t>
@@ -11720,16 +11762,16 @@
         <w:t xml:space="preserve">，当接口本身丢失完成任务所需的表达能力时，分解、异构分配与动态适应会同时失效</w:t>
       </w:r>
       <w:r>
-        <w:t xml:space="preserve">——能力/接口上限对调度策略的优先序在两个方向上都被观察到。代码域的正式跨域实验（100 任务冻结协议）验证了这一边界假设的正方向：以单元测试为可执行接口与部署反馈，反馈驱动的动态 DAG 相对静态 +6.0pp（CI [+1.0,+12.0]，恢复率 26.9%，Help/Harm 7/1），而阶段分配本身未显著超过查询路由；其代价是 +11.9% tokens 与 22/100 的预算越限。与数学域的塌缩合读：</w:t>
+        <w:t xml:space="preserve">——能力/接口上限对调度策略的优先序在两个方向上都被观察到。代码域的正式跨域实验（100 任务冻结协议）给出了这一边界假设正方向的初步支持：以单元测试为可执行接口与部署反馈，反馈驱动的动态 DAG 相对静态 +6.0pp（CI [+1.0,+12.0]，恢复率 26.9%，Help/Harm 7/1），而阶段分配本身未显著超过查询路由；其代价是 +11.9% tokens 与 22/100 的预算越限。与数学域的塌缩合读（正式分层-100 面板已复现：单体 54% 对 DAG 13%—16%，且两类分解接口族均塌缩，校验节点还会破坏已正确的解）：</w:t>
       </w:r>
       <w:r>
         <w:rPr>
           <w:b/>
         </w:rPr>
-        <w:t xml:space="preserve">接口表达力决定 DAG 是否可用，反馈可靠性决定动态适应是否有东西可利用，而阶段分工的额外收益即使在接口良好的域也只是正向不显著</w:t>
-      </w:r>
-      <w:r>
-        <w:t xml:space="preserve">——三层条件的分离正是本文跨域部分的中心结论。</w:t>
+        <w:t xml:space="preserve">接口表达能力决定 DAG 是否可用，反馈可靠性决定动态适应是否有东西可利用，而阶段分工的额外收益即使在接口良好的域也未达显著</w:t>
+      </w:r>
+      <w:r>
+        <w:t xml:space="preserve">——三层条件的分离是本文跨域部分的中心结论，正反两侧均有冻结协议证据。</w:t>
       </w:r>
       <w:r>
         <w:t xml:space="preserve"> </w:t>

</xml_diff>

<commit_message>
scope math wording to tested interfaces on frozen panel (no 'universal degradation'); archive final mainline restructuring plan (5-layer storyline, 3 contributions, ch5/6 reorganization, abstract recentering) - paper rewrite NOT started, all experiments remain stopped
</commit_message>
<xml_diff>
--- a/r3_own_pool/paper_method_feedback_aware_dag/最终整合_20260921/论文完整草稿.docx
+++ b/r3_own_pool/paper_method_feedback_aware_dag/最终整合_20260921/论文完整草稿.docx
@@ -11248,10 +11248,10 @@
         <w:rPr>
           <w:b/>
         </w:rPr>
-        <w:t xml:space="preserve">两类中间产物式分解接口在数学推理上都塌缩</w:t>
-      </w:r>
-      <w:r>
-        <w:t xml:space="preserve">；阶段诊断显示损失分两层：给定计划的求解节点正确率 32%（规划分解损失约 22pp），校验节点再把已答对的一半改错（32%→15%）。以下探索性结果与正式结果方向一致，一并保留；三节点</w:t>
+        <w:t xml:space="preserve">在 Math500 的冻结分层面板上，两类已测试的中间产物式分解接口均出现明显性能退化</w:t>
+      </w:r>
+      <w:r>
+        <w:t xml:space="preserve">（不外推到未测试的数学任务与分解接口）；阶段诊断显示损失分两层：给定计划的求解节点正确率 32%（规划分解损失约 22pp），校验节点再把已答对的一半改错（32%→15%）。以下探索性结果与正式结果方向一致，一并保留；三节点</w:t>
       </w:r>
       <w:r>
         <w:t xml:space="preserve">“</w:t>
@@ -11412,7 +11412,7 @@
         <w:rPr>
           <w:b/>
         </w:rPr>
-        <w:t xml:space="preserve">跨域正反对照由此得到确认：接口表达能力不足时，分解、异构分配与动态适应同时失效（数学域，两类接口族均如此）；接口可执行且反馈可靠时，反馈驱动的动态适应产生正向恢复（代码域）。本文的适用条件命题——多模型 DAG 协同的收益取决于阶段能力互补、节点接口表达能力和运行反馈质量三者同时成立——在正反两个方向上均有冻结协议证据。</w:t>
+        <w:t xml:space="preserve">跨域正反对照由此得到确认：接口表达能力不足时，分解、异构分配与动态适应同时失效（数学域，两类已测试接口族均如此）；接口可执行且反馈可靠时，反馈驱动的动态适应产生正向恢复（代码域）。本文的适用条件命题——多模型 DAG 协同的收益取决于阶段能力互补、节点接口表达能力和运行反馈质量三者同时成立——在正反两个方向上均有冻结协议证据。</w:t>
       </w:r>
       <w:r>
         <w:t xml:space="preserve">代码域的负边界同样如实：阶段分配未显著超过查询路由或单体 large，收益集中于</w:t>
@@ -11762,7 +11762,7 @@
         <w:t xml:space="preserve">，当接口本身丢失完成任务所需的表达能力时，分解、异构分配与动态适应会同时失效</w:t>
       </w:r>
       <w:r>
-        <w:t xml:space="preserve">——能力/接口上限对调度策略的优先序在两个方向上都被观察到。代码域的正式跨域实验（100 任务冻结协议）给出了这一边界假设正方向的初步支持：以单元测试为可执行接口与部署反馈，反馈驱动的动态 DAG 相对静态 +6.0pp（CI [+1.0,+12.0]，恢复率 26.9%，Help/Harm 7/1），而阶段分配本身未显著超过查询路由；其代价是 +11.9% tokens 与 22/100 的预算越限。与数学域的塌缩合读（正式分层-100 面板已复现：单体 54% 对 DAG 13%—16%，且两类分解接口族均塌缩，校验节点还会破坏已正确的解）：</w:t>
+        <w:t xml:space="preserve">——能力/接口上限对调度策略的优先序在两个方向上都被观察到。代码域的正式跨域实验（100 任务冻结协议）给出了这一边界假设正方向的初步支持：以单元测试为可执行接口与部署反馈，反馈驱动的动态 DAG 相对静态 +6.0pp（CI [+1.0,+12.0]，恢复率 26.9%，Help/Harm 7/1），而阶段分配本身未显著超过查询路由；其代价是 +11.9% tokens 与 22/100 的预算越限。与数学域的塌缩合读（正式分层-100 面板已复现：单体 54% 对 DAG 13%—16%，且两类已测试分解接口族在该面板上均明显退化，校验节点还会破坏已正确的解）：</w:t>
       </w:r>
       <w:r>
         <w:rPr>

</xml_diff>

<commit_message>
finalize P3 cross-domain claim language across paper: MBPP +6.0pp locked as directional support (bootstrap CI excludes 0, exact McNemar p=0.070 not sig; removed '质量收益显著' violation); math two-factor framing (frozen allocation-prior mismatch + verify-override); code RQ1 limited evidence; convergence = capability matching + node interface + feedback diagnosability; cross-domain summary table 5-14 added; conclusion updated
</commit_message>
<xml_diff>
--- a/r3_own_pool/paper_method_feedback_aware_dag/最终整合_20260921/论文完整草稿.docx
+++ b/r3_own_pool/paper_method_feedback_aware_dag/最终整合_20260921/论文完整草稿.docx
@@ -11251,7 +11251,7 @@
         <w:t xml:space="preserve">在 Math500 的冻结分层面板上，两类已测试的中间产物式分解接口均出现明显性能退化</w:t>
       </w:r>
       <w:r>
-        <w:t xml:space="preserve">（不外推到未测试的数学任务与分解接口）；阶段诊断显示损失分两层：给定计划的求解节点正确率 32%（规划分解损失约 22pp），校验节点再把已答对的一半改错（32%→15%）。以下探索性结果与正式结果方向一致，一并保留；三节点</w:t>
+        <w:t xml:space="preserve">（不外推到未测试的数学任务与分解接口）；阶段诊断显示损失分两层：给定计划的求解节点正确率仅 32%（medium 求解能力不足——冻结自财务域的阶段分配先验在此域失配，规划分解损失约 22pp），校验节点再把已答对的一半改错（32%→15%，校验覆盖规则将最终答案推向更弱的 coder 模型）。以下探索性结果与正式结果方向一致，一并保留；三节点</w:t>
       </w:r>
       <w:r>
         <w:t xml:space="preserve">“</w:t>
@@ -11386,7 +11386,7 @@
         <w:t xml:space="preserve">+6.0pp，95% CI [+1.0, +12.0] 不含零</w:t>
       </w:r>
       <w:r>
-        <w:t xml:space="preserve">（Help/Harm = 7/1；McNemar 精确 p = 0.070，两种检验在 0.05 阈值上的分歧如实报告）；恢复率（初始失败→最终通过）7/26 = 26.9%；修复共 49 次、干预率 27%；代价为动态 +95.7 tokens（+11.9%）且预算违规 22/100——质量收益显著，但以更高成本与预算越限为代价。其余对比均不显著：阶段分配对查询路由 +2.0pp（CI [−7, +11]），静态对单体 large −2.0pp，动态对单体 large +4.0pp（CI [−3, +11]）。</w:t>
+        <w:t xml:space="preserve">（Help/Harm = 7/1；McNemar 精确 p = 0.070，两种检验在 0.05 阈值上的分歧如实报告）；恢复率（初始失败→最终通过）7/26 = 26.9%；修复共 49 次、干预率 27%；代价为动态 +95.7 tokens（+11.9%）且预算违规 22/100。该正向效应按冻结表述规范为方向明确的支持性证据：bootstrap 95% CI 不含零，但 exact McNemar p=0.070 未达 0.05 显著水平，两种配对推断口径不完全一致，故不宣称稳定统计显著，并以更高成本与预算越限为代价。其余对比均不显著：阶段分配对查询路由 +2.0pp（CI [−7, +11]），静态对单体 large −2.0pp，动态对单体 large +4.0pp（CI [−3, +11]）。</w:t>
       </w:r>
     </w:p>
     <w:p>
@@ -11406,7 +11406,7 @@
         <w:t xml:space="preserve">”</w:t>
       </w:r>
       <w:r>
-        <w:t xml:space="preserve">接口表达力不足，三个 DAG 臂塌缩且动态无效；代码域中节点接口天然可执行、单元测试反馈可靠，动态真实呈正向恢复效果（支持性证据：bootstrap CI 不含零、exact McNemar 未达 0.05 显著）。正式数学面板（分层 100，含与探索版不同的计划式分解接口）已完成并复现塌缩（单体 54% 对 DAG 13%—16%，静态对 large −39.0pp，CI 不含零），且阶段诊断把损失定位到分解接口本身（求解节点 32%）与校验节点破坏（32%→15%）。</w:t>
+        <w:t xml:space="preserve">接口表达力不足，三个 DAG 臂塌缩且动态无效；代码域中节点接口天然可执行、单元测试反馈可靠，动态真实呈正向恢复效果（支持性证据：bootstrap CI 不含零、exact McNemar 未达 0.05 显著）。正式数学面板（分层 100，含与探索版不同的计划式分解接口）已完成并复现塌缩（单体 54% 对 DAG 13%—16%，静态对 large −39.0pp，CI 不含零），且阶段诊断把损失定位到冻结的阶段分配先验失配（求解节点 32%）与校验节点破坏（32%→15%）。</w:t>
       </w:r>
       <w:r>
         <w:rPr>
@@ -11441,46 +11441,539 @@
       <w:r>
         <w:t xml:space="preserve">本身；预算违规 22/100 表明 1.2×静态预算不足以完全约束动态修复开销，部署需收紧预算或上限。</w:t>
       </w:r>
-      <w:r>
-        <w:t xml:space="preserve"> </w:t>
-      </w:r>
-      <w:r>
-        <w:t xml:space="preserve">## 6 讨论</w:t>
-      </w:r>
     </w:p>
     <w:p>
       <w:pPr>
-        <w:pStyle w:val="Heading3"/>
-      </w:pPr>
-      <w:bookmarkStart w:id="63" w:name="条件能力与传播能力的区别"/>
-      <w:r>
-        <w:t xml:space="preserve">6.1 条件能力与传播能力的区别</w:t>
+        <w:pStyle w:val="BodyText"/>
+        <w:keepNext/>
+        <w:spacing w:before="160"/>
+      </w:pPr>
+      <w:r>
+        <w:t xml:space="preserve">表 5-14 跨域六臂对照总表</w:t>
+      </w:r>
+    </w:p>
+    <w:tbl>
+      <w:tblPr>
+        <w:tblStyle w:val="TableGrid"/>
+        <w:tblW w:type="dxa" w:w="9524"/>
+        <w:tblLayout w:type="fixed"/>
+        <w:tblLook w:firstColumn="1" w:firstRow="1" w:lastColumn="0" w:lastRow="0" w:noHBand="0" w:noVBand="1" w:val="04A0"/>
+      </w:tblPr>
+      <w:tblGrid>
+        <w:gridCol w:w="2268"/>
+        <w:gridCol w:w="1701"/>
+        <w:gridCol w:w="2665"/>
+        <w:gridCol w:w="2891"/>
+      </w:tblGrid>
+      <w:tr>
+        <w:trPr>
+          <w:cantSplit/>
+          <w:tblHeader/>
+        </w:trPr>
+        <w:tc>
+          <w:tcPr>
+            <w:tcW w:type="dxa" w:w="2268"/>
+            <w:vAlign w:val="center"/>
+            <w:shd w:fill="E8EDF2"/>
+          </w:tcPr>
+          <w:p>
+            <w:pPr>
+              <w:spacing w:after="60" w:before="60" w:line="240" w:lineRule="auto"/>
+            </w:pPr>
+            <w:r>
+              <w:rPr>
+                <w:rFonts w:eastAsia="Noto Sans CJK SC"/>
+                <w:b/>
+                <w:sz w:val="18"/>
+              </w:rPr>
+              <w:t>研究问题</w:t>
+            </w:r>
+          </w:p>
+        </w:tc>
+        <w:tc>
+          <w:tcPr>
+            <w:tcW w:type="dxa" w:w="1701"/>
+            <w:vAlign w:val="center"/>
+            <w:shd w:fill="E8EDF2"/>
+          </w:tcPr>
+          <w:p>
+            <w:pPr>
+              <w:spacing w:after="60" w:before="60" w:line="240" w:lineRule="auto"/>
+            </w:pPr>
+            <w:r>
+              <w:rPr>
+                <w:rFonts w:eastAsia="Noto Sans CJK SC"/>
+                <w:b/>
+                <w:sz w:val="18"/>
+              </w:rPr>
+              <w:t>财务域</w:t>
+            </w:r>
+          </w:p>
+        </w:tc>
+        <w:tc>
+          <w:tcPr>
+            <w:tcW w:type="dxa" w:w="2665"/>
+            <w:vAlign w:val="center"/>
+            <w:shd w:fill="E8EDF2"/>
+          </w:tcPr>
+          <w:p>
+            <w:pPr>
+              <w:spacing w:after="60" w:before="60" w:line="240" w:lineRule="auto"/>
+            </w:pPr>
+            <w:r>
+              <w:rPr>
+                <w:rFonts w:eastAsia="Noto Sans CJK SC"/>
+                <w:b/>
+                <w:sz w:val="18"/>
+              </w:rPr>
+              <w:t>MBPP（代码）</w:t>
+            </w:r>
+          </w:p>
+        </w:tc>
+        <w:tc>
+          <w:tcPr>
+            <w:tcW w:type="dxa" w:w="2891"/>
+            <w:vAlign w:val="center"/>
+            <w:shd w:fill="E8EDF2"/>
+          </w:tcPr>
+          <w:p>
+            <w:pPr>
+              <w:spacing w:after="60" w:before="60" w:line="240" w:lineRule="auto"/>
+            </w:pPr>
+            <w:r>
+              <w:rPr>
+                <w:rFonts w:eastAsia="Noto Sans CJK SC"/>
+                <w:b/>
+                <w:sz w:val="18"/>
+              </w:rPr>
+              <w:t>Math500（数学）</w:t>
+            </w:r>
+          </w:p>
+        </w:tc>
+      </w:tr>
+      <w:tr>
+        <w:trPr>
+          <w:cantSplit/>
+        </w:trPr>
+        <w:tc>
+          <w:tcPr>
+            <w:tcW w:type="dxa" w:w="2268"/>
+            <w:vAlign w:val="center"/>
+          </w:tcPr>
+          <w:p>
+            <w:pPr>
+              <w:spacing w:after="60" w:before="60" w:line="240" w:lineRule="auto"/>
+            </w:pPr>
+            <w:r>
+              <w:rPr>
+                <w:rFonts w:eastAsia="Noto Sans CJK SC"/>
+                <w:b w:val="0"/>
+                <w:sz w:val="18"/>
+              </w:rPr>
+              <w:t>阶段级异质性</w:t>
+            </w:r>
+          </w:p>
+        </w:tc>
+        <w:tc>
+          <w:tcPr>
+            <w:tcW w:type="dxa" w:w="1701"/>
+            <w:vAlign w:val="center"/>
+          </w:tcPr>
+          <w:p>
+            <w:pPr>
+              <w:spacing w:after="60" w:before="60" w:line="240" w:lineRule="auto"/>
+            </w:pPr>
+            <w:r>
+              <w:rPr>
+                <w:rFonts w:eastAsia="Noto Sans CJK SC"/>
+                <w:b w:val="0"/>
+                <w:sz w:val="18"/>
+              </w:rPr>
+              <w:t>有明确节点级差异</w:t>
+            </w:r>
+          </w:p>
+        </w:tc>
+        <w:tc>
+          <w:tcPr>
+            <w:tcW w:type="dxa" w:w="2665"/>
+            <w:vAlign w:val="center"/>
+          </w:tcPr>
+          <w:p>
+            <w:pPr>
+              <w:spacing w:after="60" w:before="60" w:line="240" w:lineRule="auto"/>
+            </w:pPr>
+            <w:r>
+              <w:rPr>
+                <w:rFonts w:eastAsia="Noto Sans CJK SC"/>
+                <w:b w:val="0"/>
+                <w:sz w:val="18"/>
+              </w:rPr>
+              <w:t>有一定迹象，但未超过最强固定模型</w:t>
+            </w:r>
+          </w:p>
+        </w:tc>
+        <w:tc>
+          <w:tcPr>
+            <w:tcW w:type="dxa" w:w="2891"/>
+            <w:vAlign w:val="center"/>
+          </w:tcPr>
+          <w:p>
+            <w:pPr>
+              <w:spacing w:after="60" w:before="60" w:line="240" w:lineRule="auto"/>
+            </w:pPr>
+            <w:r>
+              <w:rPr>
+                <w:rFonts w:eastAsia="Noto Sans CJK SC"/>
+                <w:b w:val="0"/>
+                <w:sz w:val="18"/>
+              </w:rPr>
+              <w:t>冻结先验明显失效</w:t>
+            </w:r>
+          </w:p>
+        </w:tc>
+      </w:tr>
+      <w:tr>
+        <w:trPr>
+          <w:cantSplit/>
+        </w:trPr>
+        <w:tc>
+          <w:tcPr>
+            <w:tcW w:type="dxa" w:w="2268"/>
+            <w:vAlign w:val="center"/>
+          </w:tcPr>
+          <w:p>
+            <w:pPr>
+              <w:spacing w:after="60" w:before="60" w:line="240" w:lineRule="auto"/>
+            </w:pPr>
+            <w:r>
+              <w:rPr>
+                <w:rFonts w:eastAsia="Noto Sans CJK SC"/>
+                <w:b w:val="0"/>
+                <w:sz w:val="18"/>
+              </w:rPr>
+              <w:t>Node vs Query</w:t>
+            </w:r>
+          </w:p>
+        </w:tc>
+        <w:tc>
+          <w:tcPr>
+            <w:tcW w:type="dxa" w:w="1701"/>
+            <w:vAlign w:val="center"/>
+          </w:tcPr>
+          <w:p>
+            <w:pPr>
+              <w:spacing w:after="60" w:before="60" w:line="240" w:lineRule="auto"/>
+            </w:pPr>
+            <w:r>
+              <w:rPr>
+                <w:rFonts w:eastAsia="Noto Sans CJK SC"/>
+                <w:b w:val="0"/>
+                <w:sz w:val="18"/>
+              </w:rPr>
+              <w:t>类型／阶段粒度更有效</w:t>
+            </w:r>
+          </w:p>
+        </w:tc>
+        <w:tc>
+          <w:tcPr>
+            <w:tcW w:type="dxa" w:w="2665"/>
+            <w:vAlign w:val="center"/>
+          </w:tcPr>
+          <w:p>
+            <w:pPr>
+              <w:spacing w:after="60" w:before="60" w:line="240" w:lineRule="auto"/>
+            </w:pPr>
+            <w:r>
+              <w:rPr>
+                <w:rFonts w:eastAsia="Noto Sans CJK SC"/>
+                <w:b w:val="0"/>
+                <w:sz w:val="18"/>
+              </w:rPr>
+              <w:t>+2.0pp，ns</w:t>
+            </w:r>
+          </w:p>
+        </w:tc>
+        <w:tc>
+          <w:tcPr>
+            <w:tcW w:type="dxa" w:w="2891"/>
+            <w:vAlign w:val="center"/>
+          </w:tcPr>
+          <w:p>
+            <w:pPr>
+              <w:spacing w:after="60" w:before="60" w:line="240" w:lineRule="auto"/>
+            </w:pPr>
+            <w:r>
+              <w:rPr>
+                <w:rFonts w:eastAsia="Noto Sans CJK SC"/>
+                <w:b w:val="0"/>
+                <w:sz w:val="18"/>
+              </w:rPr>
+              <w:t>−37.0pp，显著退化</w:t>
+            </w:r>
+          </w:p>
+        </w:tc>
+      </w:tr>
+      <w:tr>
+        <w:trPr>
+          <w:cantSplit/>
+        </w:trPr>
+        <w:tc>
+          <w:tcPr>
+            <w:tcW w:type="dxa" w:w="2268"/>
+            <w:vAlign w:val="center"/>
+          </w:tcPr>
+          <w:p>
+            <w:pPr>
+              <w:spacing w:after="60" w:before="60" w:line="240" w:lineRule="auto"/>
+            </w:pPr>
+            <w:r>
+              <w:rPr>
+                <w:rFonts w:eastAsia="Noto Sans CJK SC"/>
+                <w:b w:val="0"/>
+                <w:sz w:val="18"/>
+              </w:rPr>
+              <w:t>Dynamic vs Static</w:t>
+            </w:r>
+          </w:p>
+        </w:tc>
+        <w:tc>
+          <w:tcPr>
+            <w:tcW w:type="dxa" w:w="1701"/>
+            <w:vAlign w:val="center"/>
+          </w:tcPr>
+          <w:p>
+            <w:pPr>
+              <w:spacing w:after="60" w:before="60" w:line="240" w:lineRule="auto"/>
+            </w:pPr>
+            <w:r>
+              <w:rPr>
+                <w:rFonts w:eastAsia="Noto Sans CJK SC"/>
+                <w:b w:val="0"/>
+                <w:sz w:val="18"/>
+              </w:rPr>
+              <w:t>主要体现选择性与资源效率</w:t>
+            </w:r>
+          </w:p>
+        </w:tc>
+        <w:tc>
+          <w:tcPr>
+            <w:tcW w:type="dxa" w:w="2665"/>
+            <w:vAlign w:val="center"/>
+          </w:tcPr>
+          <w:p>
+            <w:pPr>
+              <w:spacing w:after="60" w:before="60" w:line="240" w:lineRule="auto"/>
+            </w:pPr>
+            <w:r>
+              <w:rPr>
+                <w:rFonts w:eastAsia="Noto Sans CJK SC"/>
+                <w:b w:val="0"/>
+                <w:sz w:val="18"/>
+              </w:rPr>
+              <w:t>+6.0pp；bootstrap CI 不跨0，但 McNemar p=0.070</w:t>
+            </w:r>
+          </w:p>
+        </w:tc>
+        <w:tc>
+          <w:tcPr>
+            <w:tcW w:type="dxa" w:w="2891"/>
+            <w:vAlign w:val="center"/>
+          </w:tcPr>
+          <w:p>
+            <w:pPr>
+              <w:spacing w:after="60" w:before="60" w:line="240" w:lineRule="auto"/>
+            </w:pPr>
+            <w:r>
+              <w:rPr>
+                <w:rFonts w:eastAsia="Noto Sans CJK SC"/>
+                <w:b w:val="0"/>
+                <w:sz w:val="18"/>
+              </w:rPr>
+              <w:t>+1.0pp，ns</w:t>
+            </w:r>
+          </w:p>
+        </w:tc>
+      </w:tr>
+      <w:tr>
+        <w:trPr>
+          <w:cantSplit/>
+        </w:trPr>
+        <w:tc>
+          <w:tcPr>
+            <w:tcW w:type="dxa" w:w="2268"/>
+            <w:vAlign w:val="center"/>
+          </w:tcPr>
+          <w:p>
+            <w:pPr>
+              <w:spacing w:after="60" w:before="60" w:line="240" w:lineRule="auto"/>
+            </w:pPr>
+            <w:r>
+              <w:rPr>
+                <w:rFonts w:eastAsia="Noto Sans CJK SC"/>
+                <w:b w:val="0"/>
+                <w:sz w:val="18"/>
+              </w:rPr>
+              <w:t>运行反馈</w:t>
+            </w:r>
+          </w:p>
+        </w:tc>
+        <w:tc>
+          <w:tcPr>
+            <w:tcW w:type="dxa" w:w="1701"/>
+            <w:vAlign w:val="center"/>
+          </w:tcPr>
+          <w:p>
+            <w:pPr>
+              <w:spacing w:after="60" w:before="60" w:line="240" w:lineRule="auto"/>
+            </w:pPr>
+            <w:r>
+              <w:rPr>
+                <w:rFonts w:eastAsia="Noto Sans CJK SC"/>
+                <w:b w:val="0"/>
+                <w:sz w:val="18"/>
+              </w:rPr>
+              <w:t>部署信号有限</w:t>
+            </w:r>
+          </w:p>
+        </w:tc>
+        <w:tc>
+          <w:tcPr>
+            <w:tcW w:type="dxa" w:w="2665"/>
+            <w:vAlign w:val="center"/>
+          </w:tcPr>
+          <w:p>
+            <w:pPr>
+              <w:spacing w:after="60" w:before="60" w:line="240" w:lineRule="auto"/>
+            </w:pPr>
+            <w:r>
+              <w:rPr>
+                <w:rFonts w:eastAsia="Noto Sans CJK SC"/>
+                <w:b w:val="0"/>
+                <w:sz w:val="18"/>
+              </w:rPr>
+              <w:t>unit test 为确定性反馈</w:t>
+            </w:r>
+          </w:p>
+        </w:tc>
+        <w:tc>
+          <w:tcPr>
+            <w:tcW w:type="dxa" w:w="2891"/>
+            <w:vAlign w:val="center"/>
+          </w:tcPr>
+          <w:p>
+            <w:pPr>
+              <w:spacing w:after="60" w:before="60" w:line="240" w:lineRule="auto"/>
+            </w:pPr>
+            <w:r>
+              <w:rPr>
+                <w:rFonts w:eastAsia="Noto Sans CJK SC"/>
+                <w:b w:val="0"/>
+                <w:sz w:val="18"/>
+              </w:rPr>
+              <w:t>parse／一致性无法覆盖值错误</w:t>
+            </w:r>
+          </w:p>
+        </w:tc>
+      </w:tr>
+      <w:tr>
+        <w:trPr>
+          <w:cantSplit/>
+        </w:trPr>
+        <w:tc>
+          <w:tcPr>
+            <w:tcW w:type="dxa" w:w="2268"/>
+            <w:vAlign w:val="center"/>
+          </w:tcPr>
+          <w:p>
+            <w:pPr>
+              <w:spacing w:after="60" w:before="60" w:line="240" w:lineRule="auto"/>
+            </w:pPr>
+            <w:r>
+              <w:rPr>
+                <w:rFonts w:eastAsia="Noto Sans CJK SC"/>
+                <w:b w:val="0"/>
+                <w:sz w:val="18"/>
+              </w:rPr>
+              <w:t>主要边界</w:t>
+            </w:r>
+          </w:p>
+        </w:tc>
+        <w:tc>
+          <w:tcPr>
+            <w:tcW w:type="dxa" w:w="1701"/>
+            <w:vAlign w:val="center"/>
+          </w:tcPr>
+          <w:p>
+            <w:pPr>
+              <w:spacing w:after="60" w:before="60" w:line="240" w:lineRule="auto"/>
+            </w:pPr>
+            <w:r>
+              <w:rPr>
+                <w:rFonts w:eastAsia="Noto Sans CJK SC"/>
+                <w:b w:val="0"/>
+                <w:sz w:val="18"/>
+              </w:rPr>
+              <w:t>capability／action coverage</w:t>
+            </w:r>
+          </w:p>
+        </w:tc>
+        <w:tc>
+          <w:tcPr>
+            <w:tcW w:type="dxa" w:w="2665"/>
+            <w:vAlign w:val="center"/>
+          </w:tcPr>
+          <w:p>
+            <w:pPr>
+              <w:spacing w:after="60" w:before="60" w:line="240" w:lineRule="auto"/>
+            </w:pPr>
+            <w:r>
+              <w:rPr>
+                <w:rFonts w:eastAsia="Noto Sans CJK SC"/>
+                <w:b w:val="0"/>
+                <w:sz w:val="18"/>
+              </w:rPr>
+              <w:t>有效修复但成本上升、预算违规</w:t>
+            </w:r>
+          </w:p>
+        </w:tc>
+        <w:tc>
+          <w:tcPr>
+            <w:tcW w:type="dxa" w:w="2891"/>
+            <w:vAlign w:val="center"/>
+          </w:tcPr>
+          <w:p>
+            <w:pPr>
+              <w:spacing w:after="60" w:before="60" w:line="240" w:lineRule="auto"/>
+            </w:pPr>
+            <w:r>
+              <w:rPr>
+                <w:rFonts w:eastAsia="Noto Sans CJK SC"/>
+                <w:b w:val="0"/>
+                <w:sz w:val="18"/>
+              </w:rPr>
+              <w:t>先验与节点接口均失配</w:t>
+            </w:r>
+          </w:p>
+        </w:tc>
+      </w:tr>
+    </w:tbl>
+    <w:p>
+      <w:pPr>
+        <w:pStyle w:val="Heading2"/>
+      </w:pPr>
+      <w:bookmarkStart w:id="63" w:name="讨论"/>
+      <w:r>
+        <w:t xml:space="preserve">6 讨论</w:t>
       </w:r>
       <w:bookmarkEnd w:id="63"/>
     </w:p>
     <w:p>
       <w:pPr>
-        <w:pStyle w:val="FirstParagraph"/>
-      </w:pPr>
-      <w:r>
-        <w:t xml:space="preserve">阶段评测揭示的是给定输入条件下的模型表现。条件化推理任务提供标准事实，使推理者主要承担关系识别与表达式构造；实际传播链则还要求上游正确识别数值、实体、期间与单位。即使推理模型本身不变，输入来源变化也会改变其可解任务集合。因此，条件节点 Oracle 是能力分析工具，不能直接作为完整执行的可达质量。</w:t>
-      </w:r>
-    </w:p>
-    <w:p>
-      <w:pPr>
-        <w:pStyle w:val="BodyText"/>
-      </w:pPr>
-      <w:r>
-        <w:t xml:space="preserve">跨模型矩阵为这一解释提供更直接的证据：固定 medium 或 coder 推理者，更换为 large 抽取后，最终质量提高。这说明同模型执行将不同阶段的强弱项绑定，可能使上游缺陷掩盖下游能力。DAG 的作用之一是使这种绑定可被打破。但现有矩阵尚不能识别输入质量变化的全部中介机制，也未证明每项组合差异均显著。尤其不能用不同任务集上的条件 Oracle 与传播 Oracle 之差，直接估计抽取噪声的因果效应。</w:t>
-      </w:r>
-    </w:p>
-    <w:p>
-      <w:pPr>
         <w:pStyle w:val="Heading3"/>
       </w:pPr>
-      <w:bookmarkStart w:id="64" w:name="单模型可预测性不等于最优模型可路由性"/>
-      <w:r>
-        <w:t xml:space="preserve">6.2 单模型可预测性不等于最优模型可路由性</w:t>
+      <w:bookmarkStart w:id="64" w:name="条件能力与传播能力的区别"/>
+      <w:r>
+        <w:t xml:space="preserve">6.1 条件能力与传播能力的区别</w:t>
       </w:r>
       <w:bookmarkEnd w:id="64"/>
     </w:p>
@@ -11489,7 +11982,7 @@
         <w:pStyle w:val="FirstParagraph"/>
       </w:pPr>
       <w:r>
-        <w:t xml:space="preserve">单模型成功预测与相对模型选择具有不同目标。前者要求区分该模型容易或困难的任务，后者要求在模型意见不一致的少量任务上识别谁更好。多个模型可能同时在简单任务成功、在复杂任务失败；这会为单模型分类器提供明显信号，却不给模型切换提供收益。</w:t>
+        <w:t xml:space="preserve">阶段评测揭示的是给定输入条件下的模型表现。条件化推理任务提供标准事实，使推理者主要承担关系识别与表达式构造；实际传播链则还要求上游正确识别数值、实体、期间与单位。即使推理模型本身不变，输入来源变化也会改变其可解任务集合。因此，条件节点 Oracle 是能力分析工具，不能直接作为完整执行的可达质量。</w:t>
       </w:r>
     </w:p>
     <w:p>
@@ -11497,18 +11990,44 @@
         <w:pStyle w:val="BodyText"/>
       </w:pPr>
       <w:r>
-        <w:t xml:space="preserve">900 题画像中较高的成功预测 AUC 与未超过类型先验的路由质量并存，正体现了这一差别。AUC 对跨任务排序敏感，而路由收益还取决于同任务候选差异、评分可比性及切换错误的代价。类型先验与完整节点路由在独立节点确认面板上质量相同，也提示当前可稳定利用的结构主要是阶段差异，而不是细粒度实例表示。本文因此将贡献定位为阶段化分配及其执行接口，不把预测头的复杂程度或表示学习能力作为已获证明的优势。</w:t>
+        <w:t xml:space="preserve">跨模型矩阵为这一解释提供更直接的证据：固定 medium 或 coder 推理者，更换为 large 抽取后，最终质量提高。这说明同模型执行将不同阶段的强弱项绑定，可能使上游缺陷掩盖下游能力。DAG 的作用之一是使这种绑定可被打破。但现有矩阵尚不能识别输入质量变化的全部中介机制，也未证明每项组合差异均显著。尤其不能用不同任务集上的条件 Oracle 与传播 Oracle 之差，直接估计抽取噪声的因果效应。</w:t>
       </w:r>
     </w:p>
     <w:p>
       <w:pPr>
         <w:pStyle w:val="Heading3"/>
       </w:pPr>
-      <w:bookmarkStart w:id="65" w:name="选择性干预的作用与边界"/>
+      <w:bookmarkStart w:id="65" w:name="单模型可预测性不等于最优模型可路由性"/>
+      <w:r>
+        <w:t xml:space="preserve">6.2 单模型可预测性不等于最优模型可路由性</w:t>
+      </w:r>
+      <w:bookmarkEnd w:id="65"/>
+    </w:p>
+    <w:p>
+      <w:pPr>
+        <w:pStyle w:val="FirstParagraph"/>
+      </w:pPr>
+      <w:r>
+        <w:t xml:space="preserve">单模型成功预测与相对模型选择具有不同目标。前者要求区分该模型容易或困难的任务，后者要求在模型意见不一致的少量任务上识别谁更好。多个模型可能同时在简单任务成功、在复杂任务失败；这会为单模型分类器提供明显信号，却不给模型切换提供收益。</w:t>
+      </w:r>
+    </w:p>
+    <w:p>
+      <w:pPr>
+        <w:pStyle w:val="BodyText"/>
+      </w:pPr>
+      <w:r>
+        <w:t xml:space="preserve">900 题画像中较高的成功预测 AUC 与未超过类型先验的路由质量并存，正体现了这一差别。AUC 对跨任务排序敏感，而路由收益还取决于同任务候选差异、评分可比性及切换错误的代价。类型先验与完整节点路由在独立节点确认面板上质量相同，也提示当前可稳定利用的结构主要是阶段差异，而不是细粒度实例表示。本文因此将贡献定位为阶段化分配及其执行接口，不把预测头的复杂程度或表示学习能力作为已获证明的优势。</w:t>
+      </w:r>
+    </w:p>
+    <w:p>
+      <w:pPr>
+        <w:pStyle w:val="Heading3"/>
+      </w:pPr>
+      <w:bookmarkStart w:id="66" w:name="选择性干预的作用与边界"/>
       <w:r>
         <w:t xml:space="preserve">6.3 选择性干预的作用与边界</w:t>
       </w:r>
-      <w:bookmarkEnd w:id="65"/>
+      <w:bookmarkEnd w:id="66"/>
     </w:p>
     <w:p>
       <w:pPr>
@@ -11604,35 +12123,9 @@
       <w:pPr>
         <w:pStyle w:val="Heading3"/>
       </w:pPr>
-      <w:bookmarkStart w:id="66" w:name="能力覆盖与动作选择的不同上限"/>
+      <w:bookmarkStart w:id="67" w:name="能力覆盖与动作选择的不同上限"/>
       <w:r>
         <w:t xml:space="preserve">6.4 能力覆盖与动作选择的不同上限</w:t>
-      </w:r>
-      <w:bookmarkEnd w:id="66"/>
-    </w:p>
-    <w:p>
-      <w:pPr>
-        <w:pStyle w:val="FirstParagraph"/>
-      </w:pPr>
-      <w:r>
-        <w:t xml:space="preserve">路由只能在候选执行结果之间选择。对于给定模型、提示、输入与动作集合，如果所有候选都失败，改进选择本身不能产生其中不存在的正确答案。这是固定候选集合的上限，不是对整个任务可解性的判断：更强模型、不同工具或新的输入表达仍可能改变候选集合。</w:t>
-      </w:r>
-    </w:p>
-    <w:p>
-      <w:pPr>
-        <w:pStyle w:val="BodyText"/>
-      </w:pPr>
-      <w:r>
-        <w:t xml:space="preserve">真实失败集合中四个动作的成功并集较小，局部重规划也没有新增覆盖，因而当前剩余限制不能简单归因于动作选得不够好。结构解析诊断还提示，找到数值并不等于理解其关系。必要操作数出现在候选证据中，仍可能伴随实体绑定、期间对齐和表达式构造错误。该困难子集的证据支持把模型与动作覆盖列为主要瓶颈之一，但不足以断言所有任务只受推理能力限制。完整标准事实诊断的配对来源尚未核实，其缺失也限制了对纯推理失败比例的进一步量化。</w:t>
-      </w:r>
-    </w:p>
-    <w:p>
-      <w:pPr>
-        <w:pStyle w:val="Heading3"/>
-      </w:pPr>
-      <w:bookmarkStart w:id="67" w:name="资源约束与历史复用的作用层次"/>
-      <w:r>
-        <w:t xml:space="preserve">6.5 资源约束与历史复用的作用层次</w:t>
       </w:r>
       <w:bookmarkEnd w:id="67"/>
     </w:p>
@@ -11641,31 +12134,7 @@
         <w:pStyle w:val="FirstParagraph"/>
       </w:pPr>
       <w:r>
-        <w:t xml:space="preserve">当前跨模型组合的平均资源开销接近，质量构成正常预算下的重要区分轴。这一事实不削弱资源约束的必要性：当剩余预算减少，额外调用是否可行会直接改变可恢复集合。预算响应面因此回答</w:t>
-      </w:r>
-      <w:r>
-        <w:t xml:space="preserve">“</w:t>
-      </w:r>
-      <w:r>
-        <w:t xml:space="preserve">已观测动作在给定预算内覆盖多少失败</w:t>
-      </w:r>
-      <w:r>
-        <w:t xml:space="preserve">”</w:t>
-      </w:r>
-      <w:r>
-        <w:t xml:space="preserve">，而不回答</w:t>
-      </w:r>
-      <w:r>
-        <w:t xml:space="preserve">“</w:t>
-      </w:r>
-      <w:r>
-        <w:t xml:space="preserve">系统能否准确预测线上开销并保证不超时</w:t>
-      </w:r>
-      <w:r>
-        <w:t xml:space="preserve">”</w:t>
-      </w:r>
-      <w:r>
-        <w:t xml:space="preserve">。两者需要不同证据。</w:t>
+        <w:t xml:space="preserve">路由只能在候选执行结果之间选择。对于给定模型、提示、输入与动作集合，如果所有候选都失败，改进选择本身不能产生其中不存在的正确答案。这是固定候选集合的上限，不是对整个任务可解性的判断：更强模型、不同工具或新的输入表达仍可能改变候选集合。</w:t>
       </w:r>
     </w:p>
     <w:p>
@@ -11673,16 +12142,16 @@
         <w:pStyle w:val="BodyText"/>
       </w:pPr>
       <w:r>
-        <w:t xml:space="preserve">历史图复用解决另一类冗余，即相关追问重复处理未变化输入。它可以减少调用和 tokens，但不能自动纠正被复用的错误。当前图森林结果证明了特定修改型工作负载的局部重算机制，尚未证明多轮最终答案质量。把这类节省与单轮动态质量分开报告，有助于避免用资源指标替代正确性，也避免把缓存复用当作推理能力提升。</w:t>
+        <w:t xml:space="preserve">真实失败集合中四个动作的成功并集较小，局部重规划也没有新增覆盖，因而当前剩余限制不能简单归因于动作选得不够好。结构解析诊断还提示，找到数值并不等于理解其关系。必要操作数出现在候选证据中，仍可能伴随实体绑定、期间对齐和表达式构造错误。该困难子集的证据支持把模型与动作覆盖列为主要瓶颈之一，但不足以断言所有任务只受推理能力限制。完整标准事实诊断的配对来源尚未核实，其缺失也限制了对纯推理失败比例的进一步量化。</w:t>
       </w:r>
     </w:p>
     <w:p>
       <w:pPr>
         <w:pStyle w:val="Heading3"/>
       </w:pPr>
-      <w:bookmarkStart w:id="68" w:name="有效性限制"/>
-      <w:r>
-        <w:t xml:space="preserve">6.6 有效性限制</w:t>
+      <w:bookmarkStart w:id="68" w:name="资源约束与历史复用的作用层次"/>
+      <w:r>
+        <w:t xml:space="preserve">6.5 资源约束与历史复用的作用层次</w:t>
       </w:r>
       <w:bookmarkEnd w:id="68"/>
     </w:p>
@@ -11691,7 +12160,31 @@
         <w:pStyle w:val="FirstParagraph"/>
       </w:pPr>
       <w:r>
-        <w:t xml:space="preserve">本文的上界、动态结果与诊断均有明确适用范围。第一，精确 Oracle 仅覆盖九种已枚举模型组合，完整动态策略空间没有求得全局最优。第二，动态真实调用实验规模有限，已用于开发分析，且失败检测读取评价答案，不能作为无理想反馈条件的在线验证。第三，条件节点、同模型传播、跨模型组合及失败恢复使用不同任务面板与估计对象，质量不可直接拼接。</w:t>
+        <w:t xml:space="preserve">当前跨模型组合的平均资源开销接近，质量构成正常预算下的重要区分轴。这一事实不削弱资源约束的必要性：当剩余预算减少，额外调用是否可行会直接改变可恢复集合。预算响应面因此回答</w:t>
+      </w:r>
+      <w:r>
+        <w:t xml:space="preserve">“</w:t>
+      </w:r>
+      <w:r>
+        <w:t xml:space="preserve">已观测动作在给定预算内覆盖多少失败</w:t>
+      </w:r>
+      <w:r>
+        <w:t xml:space="preserve">”</w:t>
+      </w:r>
+      <w:r>
+        <w:t xml:space="preserve">，而不回答</w:t>
+      </w:r>
+      <w:r>
+        <w:t xml:space="preserve">“</w:t>
+      </w:r>
+      <w:r>
+        <w:t xml:space="preserve">系统能否准确预测线上开销并保证不超时</w:t>
+      </w:r>
+      <w:r>
+        <w:t xml:space="preserve">”</w:t>
+      </w:r>
+      <w:r>
+        <w:t xml:space="preserve">。两者需要不同证据。</w:t>
       </w:r>
     </w:p>
     <w:p>
@@ -11699,18 +12192,44 @@
         <w:pStyle w:val="BodyText"/>
       </w:pPr>
       <w:r>
-        <w:t xml:space="preserve">第四，当前模型池存在大量共同失败，且成本和服务时间的异质性有限，结果未必迁移到能力跨度更大的模型池或不同硬件。第五，剩余差距路由的确认收益不稳定，合并语料后的交叉验证只提供事后机制解释。第六，困难子集的恢复与证据诊断存在选择偏差，部分历史结果缺少完整配对记录。第七，服务时间不包含全部启动、排队与调度开销，tokens 也不等同于货币成本。以上限制共同决定本文证据更适合支持阶段互补、执行边界与选择性适应的分析，而非宣称一个在所有复杂任务上全面占优的系统。</w:t>
+        <w:t xml:space="preserve">历史图复用解决另一类冗余，即相关追问重复处理未变化输入。它可以减少调用和 tokens，但不能自动纠正被复用的错误。当前图森林结果证明了特定修改型工作负载的局部重算机制，尚未证明多轮最终答案质量。把这类节省与单轮动态质量分开报告，有助于避免用资源指标替代正确性，也避免把缓存复用当作推理能力提升。</w:t>
       </w:r>
     </w:p>
     <w:p>
       <w:pPr>
         <w:pStyle w:val="Heading3"/>
       </w:pPr>
-      <w:bookmarkStart w:id="69" w:name="跨域负结果的机制含义"/>
+      <w:bookmarkStart w:id="69" w:name="有效性限制"/>
+      <w:r>
+        <w:t xml:space="preserve">6.6 有效性限制</w:t>
+      </w:r>
+      <w:bookmarkEnd w:id="69"/>
+    </w:p>
+    <w:p>
+      <w:pPr>
+        <w:pStyle w:val="FirstParagraph"/>
+      </w:pPr>
+      <w:r>
+        <w:t xml:space="preserve">本文的上界、动态结果与诊断均有明确适用范围。第一，精确 Oracle 仅覆盖九种已枚举模型组合，完整动态策略空间没有求得全局最优。第二，动态真实调用实验规模有限，已用于开发分析，且失败检测读取评价答案，不能作为无理想反馈条件的在线验证。第三，条件节点、同模型传播、跨模型组合及失败恢复使用不同任务面板与估计对象，质量不可直接拼接。</w:t>
+      </w:r>
+    </w:p>
+    <w:p>
+      <w:pPr>
+        <w:pStyle w:val="BodyText"/>
+      </w:pPr>
+      <w:r>
+        <w:t xml:space="preserve">第四，当前模型池存在大量共同失败，且成本和服务时间的异质性有限，结果未必迁移到能力跨度更大的模型池或不同硬件。第五，剩余差距路由的确认收益不稳定，合并语料后的交叉验证只提供事后机制解释。第六，困难子集的恢复与证据诊断存在选择偏差，部分历史结果缺少完整配对记录。第七，服务时间不包含全部启动、排队与调度开销，tokens 也不等同于货币成本。以上限制共同决定本文证据更适合支持阶段互补、执行边界与选择性适应的分析，而非宣称一个在所有复杂任务上全面占优的系统。</w:t>
+      </w:r>
+    </w:p>
+    <w:p>
+      <w:pPr>
+        <w:pStyle w:val="Heading3"/>
+      </w:pPr>
+      <w:bookmarkStart w:id="70" w:name="跨域负结果的机制含义"/>
       <w:r>
         <w:t xml:space="preserve">6.9 跨域负结果的机制含义</w:t>
       </w:r>
-      <w:bookmarkEnd w:id="69"/>
+      <w:bookmarkEnd w:id="70"/>
     </w:p>
     <w:p>
       <w:pPr>
@@ -11816,11 +12335,11 @@
       <w:pPr>
         <w:pStyle w:val="Heading2"/>
       </w:pPr>
-      <w:bookmarkStart w:id="70" w:name="参考文献"/>
+      <w:bookmarkStart w:id="71" w:name="参考文献"/>
       <w:r>
         <w:t xml:space="preserve">参考文献</w:t>
       </w:r>
-      <w:bookmarkEnd w:id="70"/>
+      <w:bookmarkEnd w:id="71"/>
     </w:p>
     <w:p>
       <w:pPr>
@@ -11828,28 +12347,6 @@
       </w:pPr>
       <w:r>
         <w:t xml:space="preserve">[1] Ong, I., et al. RouteLLM: Learning to Route LLMs with Preference Data. 2024. arXiv:2406.18665.</w:t>
-      </w:r>
-      <w:r>
-        <w:t xml:space="preserve"> </w:t>
-      </w:r>
-      <w:hyperlink r:id="rId71">
-        <w:r>
-          <w:rPr>
-            <w:rStyle w:val="Hyperlink"/>
-          </w:rPr>
-          <w:t xml:space="preserve">原文</w:t>
-        </w:r>
-      </w:hyperlink>
-      <w:r>
-        <w:t xml:space="preserve">.</w:t>
-      </w:r>
-    </w:p>
-    <w:p>
-      <w:pPr>
-        <w:pStyle w:val="BodyText"/>
-      </w:pPr>
-      <w:r>
-        <w:t xml:space="preserve">[2] Chen, L., Zaharia, M., and Zou, J. FrugalGPT: How to Use Large Language Models While Reducing Cost and Improving Performance. 2023. arXiv:2305.05176.</w:t>
       </w:r>
       <w:r>
         <w:t xml:space="preserve"> </w:t>
@@ -11871,7 +12368,7 @@
         <w:pStyle w:val="BodyText"/>
       </w:pPr>
       <w:r>
-        <w:t xml:space="preserve">[3] Kim, S., et al. An LLM Compiler for Parallel Function Calling. 2024 年修订版，arXiv:2312.04511v3.</w:t>
+        <w:t xml:space="preserve">[2] Chen, L., Zaharia, M., and Zou, J. FrugalGPT: How to Use Large Language Models While Reducing Cost and Improving Performance. 2023. arXiv:2305.05176.</w:t>
       </w:r>
       <w:r>
         <w:t xml:space="preserve"> </w:t>
@@ -11893,7 +12390,7 @@
         <w:pStyle w:val="BodyText"/>
       </w:pPr>
       <w:r>
-        <w:t xml:space="preserve">[4] Madaan, A., et al. Self-Refine: Iterative Refinement with Self-Feedback. 2023. arXiv:2303.17651.</w:t>
+        <w:t xml:space="preserve">[3] Kim, S., et al. An LLM Compiler for Parallel Function Calling. 2024 年修订版，arXiv:2312.04511v3.</w:t>
       </w:r>
       <w:r>
         <w:t xml:space="preserve"> </w:t>
@@ -11915,7 +12412,7 @@
         <w:pStyle w:val="BodyText"/>
       </w:pPr>
       <w:r>
-        <w:t xml:space="preserve">[5] Wang, Z. Z., Mao, J., Fried, D., and Neubig, G. Agent Workflow Memory. 2024. arXiv:2409.07429.</w:t>
+        <w:t xml:space="preserve">[4] Madaan, A., et al. Self-Refine: Iterative Refinement with Self-Feedback. 2023. arXiv:2303.17651.</w:t>
       </w:r>
       <w:r>
         <w:t xml:space="preserve"> </w:t>
@@ -11937,12 +12434,34 @@
         <w:pStyle w:val="BodyText"/>
       </w:pPr>
       <w:r>
+        <w:t xml:space="preserve">[5] Wang, Z. Z., Mao, J., Fried, D., and Neubig, G. Agent Workflow Memory. 2024. arXiv:2409.07429.</w:t>
+      </w:r>
+      <w:r>
+        <w:t xml:space="preserve"> </w:t>
+      </w:r>
+      <w:hyperlink r:id="rId76">
+        <w:r>
+          <w:rPr>
+            <w:rStyle w:val="Hyperlink"/>
+          </w:rPr>
+          <w:t xml:space="preserve">原文</w:t>
+        </w:r>
+      </w:hyperlink>
+      <w:r>
+        <w:t xml:space="preserve">.</w:t>
+      </w:r>
+    </w:p>
+    <w:p>
+      <w:pPr>
+        <w:pStyle w:val="BodyText"/>
+      </w:pPr>
+      <w:r>
         <w:t xml:space="preserve">[6] MultiHiertt: Numerical Reasoning over Multi Hierarchical Tabular and Textual Data. ACL 2022.</w:t>
       </w:r>
       <w:r>
         <w:t xml:space="preserve"> </w:t>
       </w:r>
-      <w:hyperlink r:id="rId76">
+      <w:hyperlink r:id="rId77">
         <w:r>
           <w:rPr>
             <w:rStyle w:val="Hyperlink"/>
@@ -11964,7 +12483,7 @@
       <w:r>
         <w:t xml:space="preserve"> </w:t>
       </w:r>
-      <w:hyperlink r:id="rId77">
+      <w:hyperlink r:id="rId78">
         <w:r>
           <w:rPr>
             <w:rStyle w:val="Hyperlink"/>

</xml_diff>

<commit_message>
submission-level polish: terminology glossary unified in 4.1; two core figures added (3-1 framework, 5-1 three conditions, embedded in docx); related work cross-referenced to 4.10.2 external baselines; abstract compressed to key results; table-function audit (17 tables, 2 appendix candidates); claim mechanical check 10/10 pass with contexts verified
</commit_message>
<xml_diff>
--- a/r3_own_pool/paper_method_feedback_aware_dag/最终整合_20260921/论文完整草稿.docx
+++ b/r3_own_pool/paper_method_feedback_aware_dag/最终整合_20260921/论文完整草稿.docx
@@ -35,7 +35,19 @@
         <w:pStyle w:val="FirstParagraph"/>
       </w:pPr>
       <w:r>
-        <w:t xml:space="preserve">复杂任务包含信息抽取、关系推理和结果验证等不同能力需求，针对完整查询选择单一模型难以利用执行阶段间的模型互补。本文提出反馈感知的自适应有向无环图路由框架，将能力画像、节点级模型分配、静态执行与反馈条件化的后继适应相结合，并以选择性干预、预算约束和历史图复用组织多模型协同。财务复杂任务实验表明，冻结节点路由相对查询路由的条件化节点质量提高约 6.9 个百分点，主要收益来自阶段粒度；跨模型传播显示，上游输入来源能够改变下游优势，条件能力不能直接等同于传播能力。严格配对的三臂分解基准（300 任务、一次统一会话）进一步表明：同模型拆分本身在 TAT-QA 上显著有害（−21.0pp）、在 MultiHiertt 上不显著（+6.0pp），而拆分后的异构阶段分工带来总体 +5.0pp 的显著增益——分解的价值在于解除阶段绑定、使异构能力分配成为可能，而非拆分本身。在枚举的 3×3 抽取—推理模型组合空间内，精确 Oracle 为 30.5%，最佳固定组合为 20.5%，但剩余差距未被当前选择器稳定利用。理想失败检测条件下的 48 任务真实调用比较中，动态第二版由静态的 52.1% 提高至 54.2%，差异不显著；在 250 个全新任务上的一次性冻结确认中该效应方向复现（+2.8pp，95% CI [−0.8,+6.4]），仍未达统计显著。而在含分支与汇合的四节点真实 DAG 面板上，选择性动态适应显著优于静态执行（36.7% 对 16.7%，+20.0pp，95% CI [11.7,28.3]，Help/Harm 28/4），且 933 次适配调用全部限于受影响后代闭包、分支隔离检查零违例、预算违规为零。对照消融显示增益主要来自失败节点升级至最强未试模型的动作（同目标静态对照 35.0%），而将失败检测全部换成部署可得信号（解析/执行与输出一致性检查，无 gold 参考）仍保留 91.7% 的增益——动态收益不依赖理想失败检测。跨域正式验证（数学与代码各 100 个冻结任务、六臂对照）给出适用边界：代码域中单元测试提供确定性失败反馈，反馈驱动的动态 DAG 相对静态提升 6.0pp（80.0% 对 74.0%，bootstrap 置信区间 [+1,+12] 不含零、但精确 McNemar 检验在 0.05 水平未达显著，属支持性证据；成本上升 11.9%、预算越限 22/100）；数学域中冻结的阶段分配先验与验证接口同时失配，DAG 全面劣于单体（54% 对 13%—16%）。在相同模型池、任务与评分器上的外部方法比较进一步表明：查询级学习路由退化为始终选择大模型，成本感知级联与答案级迭代精修随置信信号质量在财务域与代码域符号反转，答案级精修在代码域点估计最高但与本文动态方法的配对差异未达显著。统一命题为：</w:t>
+        <w:t xml:space="preserve">复杂任务包含信息抽取、关系推理和结果验证等不同能力需求，针对完整查询选择单一模型难以利用执行阶段间的模型互补。本文提出反馈感知的自适应有向无环图路由框架，将能力画像、节点级模型分配、静态执行与反馈条件化的后继适应相结合，并以选择性干预、预算约束和历史图复用组织多模型协同。财务复杂任务实验表明，冻结节点路由相对查询路由的条件化节点质量提高约 6.9 个百分点，主要收益来自阶段粒度；严格配对的三臂分解基准（300 任务、一次统一会话）进一步表明，同模型拆分本身在 TAT-QA 上显著有害（−21.0pp）、在 MultiHiertt 上不显著，而拆分后的异构阶段分工带来总体 +5.0pp 的显著增益、但未完全抵消分解损耗——DAG 的核心作用是解除阶段能力绑定、使异构能力分配成为可能，而非普遍提高推理精度。在含分支与汇合的四节点真实 DAG 面板上，选择性动态适应显著优于静态执行（+20.0pp），对照消融显示主要增益来自</w:t>
+      </w:r>
+      <w:r>
+        <w:t xml:space="preserve">“</w:t>
+      </w:r>
+      <w:r>
+        <w:t xml:space="preserve">失败节点升级至最强未试模型</w:t>
+      </w:r>
+      <w:r>
+        <w:t xml:space="preserve">”</w:t>
+      </w:r>
+      <w:r>
+        <w:t xml:space="preserve">这一动作本身，部署可得信号可保留 91.7% 的增益——Dynamic 的作用是在反馈和预算约束下选择性调用已有能力，而非凭空创造能力。跨域与外部方法比较进一步划定适用边界：代码域中单元测试反馈驱动的动态适应相对静态提升 6.0pp（bootstrap 区间不含零、精确 McNemar p=0.070 未达显著，属支持性证据），数学域中冻结的阶段分配先验与验证接口同时失配、DAG 全面劣于单体；同池同面板同评分器下，答案级迭代精修在代码域点估计最高但与本文方法的配对差异未达显著。统一命题为：</w:t>
       </w:r>
       <w:r>
         <w:rPr>
@@ -97,7 +109,7 @@
         <w:pStyle w:val="BodyText"/>
       </w:pPr>
       <w:r>
-        <w:t xml:space="preserve">查询级路由通过预测模型效用在质量与资源之间作出选择，已有工作展示了偏好学习和成本控制的价值[1,2]。然而，对具有依赖关系的任务，模型选择还受到输入来源的影响。一个模型在标准事实条件下的推理表现，不等于它消费实际抽取输出时的表现。同模型端到端执行将抽取与推理能力绑定，可能使上游弱项掩盖下游优势。只依据条件化节点成绩分配模型，或者只依据整条同模型链的成绩评价推理能力，都可能遗漏这一差别。</w:t>
+        <w:t xml:space="preserve">查询路由通过预测模型效用在质量与资源之间作出选择，已有工作展示了偏好学习和成本控制的价值[1,2]。然而，对具有依赖关系的任务，模型选择还受到输入来源的影响。一个模型在标准事实条件下的推理表现，不等于它消费实际抽取输出时的表现。同模型端到端执行将抽取与推理能力绑定，可能使上游弱项掩盖下游优势。只依据条件化节点成绩分配模型，或者只依据整条同模型链的成绩评价推理能力，都可能遗漏这一差别。</w:t>
       </w:r>
     </w:p>
     <w:p>
@@ -418,18 +430,71 @@
         <w:pStyle w:val="BodyText"/>
       </w:pPr>
       <w:r>
-        <w:t xml:space="preserve">整体流程为能力画像→控制路由→复杂任务分解→初始 DAG→静态／动态执行→选择性调整→预算控制→历史图复用。该顺序描述逻辑依赖：控制器在图构造前获得任务需求与资源偏好，具体节点分配在节点定义后完成，不另引入未实现的路由网络。</w:t>
+        <w:t xml:space="preserve">整体流程为能力画像→控制路由→复杂任务分解→初始 DAG→静态／动态执行→选择性调整→预算控制→历史图复用。</w:t>
       </w:r>
     </w:p>
     <w:p>
       <w:pPr>
+        <w:pStyle w:val="BodyText"/>
+      </w:pPr>
+      <w:r>
+        <w:drawing>
+          <wp:inline>
+            <wp:extent cx="6045200" cy="3357086"/>
+            <wp:effectExtent b="0" l="0" r="0" t="0"/>
+            <wp:docPr descr="图 3-1 反馈感知自适应 DAG 路由整体框架" title="" id="1" name="Picture"/>
+            <a:graphic>
+              <a:graphicData uri="http://schemas.openxmlformats.org/drawingml/2006/picture">
+                <pic:pic>
+                  <pic:nvPicPr>
+                    <pic:cNvPr descr="fig3_1_framework.png" id="0" name="Picture"/>
+                    <pic:cNvPicPr>
+                      <a:picLocks noChangeArrowheads="1" noChangeAspect="1"/>
+                    </pic:cNvPicPr>
+                  </pic:nvPicPr>
+                  <pic:blipFill>
+                    <a:blip r:embed="rId34"/>
+                    <a:stretch>
+                      <a:fillRect/>
+                    </a:stretch>
+                  </pic:blipFill>
+                  <pic:spPr bwMode="auto">
+                    <a:xfrm>
+                      <a:off x="0" y="0"/>
+                      <a:ext cx="6045200" cy="3357086"/>
+                    </a:xfrm>
+                    <a:prstGeom prst="rect">
+                      <a:avLst/>
+                    </a:prstGeom>
+                    <a:noFill/>
+                    <a:ln w="9525">
+                      <a:noFill/>
+                      <a:headEnd/>
+                      <a:tailEnd/>
+                    </a:ln>
+                  </pic:spPr>
+                </pic:pic>
+              </a:graphicData>
+            </a:graphic>
+          </wp:inline>
+        </w:drawing>
+      </w:r>
+      <w:r>
+        <w:t xml:space="preserve"> </w:t>
+      </w:r>
+      <w:r>
+        <w:t xml:space="preserve">该顺序描述逻辑依赖：控制器在图构造前获得任务需求与资源偏好，具体节点分配在节点定义后完成，不另引入未实现的路由网络。</w:t>
+      </w:r>
+    </w:p>
+    <w:p>
+      <w:pPr>
         <w:pStyle w:val="Heading3"/>
       </w:pPr>
-      <w:bookmarkStart w:id="34" w:name="模型能力画像"/>
+      <w:bookmarkStart w:id="35" w:name="模型能力画像"/>
       <w:r>
         <w:t xml:space="preserve">3.2 模型能力画像</w:t>
       </w:r>
-      <w:bookmarkEnd w:id="34"/>
+      <w:bookmarkEnd w:id="35"/>
     </w:p>
     <w:p>
       <w:pPr>
@@ -765,11 +830,11 @@
       <w:pPr>
         <w:pStyle w:val="Heading3"/>
       </w:pPr>
-      <w:bookmarkStart w:id="35" w:name="复杂任务分解与初始依赖图"/>
+      <w:bookmarkStart w:id="36" w:name="复杂任务分解与初始依赖图"/>
       <w:r>
         <w:t xml:space="preserve">3.3 复杂任务分解与初始依赖图</w:t>
       </w:r>
-      <w:bookmarkEnd w:id="35"/>
+      <w:bookmarkEnd w:id="36"/>
     </w:p>
     <w:p>
       <w:pPr>
@@ -791,11 +856,11 @@
       <w:pPr>
         <w:pStyle w:val="Heading3"/>
       </w:pPr>
-      <w:bookmarkStart w:id="36" w:name="能力感知节点路由"/>
+      <w:bookmarkStart w:id="37" w:name="能力感知节点路由"/>
       <w:r>
         <w:t xml:space="preserve">3.4 能力感知节点路由</w:t>
       </w:r>
-      <w:bookmarkEnd w:id="36"/>
+      <w:bookmarkEnd w:id="37"/>
     </w:p>
     <w:p>
       <w:pPr>
@@ -1016,35 +1081,9 @@
       <w:pPr>
         <w:pStyle w:val="Heading3"/>
       </w:pPr>
-      <w:bookmarkStart w:id="37" w:name="静态依赖图执行"/>
+      <w:bookmarkStart w:id="38" w:name="静态依赖图执行"/>
       <w:r>
         <w:t xml:space="preserve">3.5 静态依赖图执行</w:t>
-      </w:r>
-      <w:bookmarkEnd w:id="37"/>
-    </w:p>
-    <w:p>
-      <w:pPr>
-        <w:pStyle w:val="FirstParagraph"/>
-      </w:pPr>
-      <w:r>
-        <w:t xml:space="preserve">静态模式按初始依赖与分配执行。节点失败时允许冻结的局部回退；其结果作为后继实际输入继续传播，但后继模型计划保持不变。因此，静态不等于没有恢复，动态比较也不能仅通过增加调用预算获得优势。</w:t>
-      </w:r>
-    </w:p>
-    <w:p>
-      <w:pPr>
-        <w:pStyle w:val="BodyText"/>
-      </w:pPr>
-      <w:r>
-        <w:t xml:space="preserve">执行记录包含请求、输出、解析状态、消耗及输入来源。缺失真实抽取输出时，不允许以标准事实隐式补齐部署快照。历史条件化实验中的标准事实仅按其原协议评价，并单独披露。中间节点存在缺陷与最终答案错误分别记录。</w:t>
-      </w:r>
-    </w:p>
-    <w:p>
-      <w:pPr>
-        <w:pStyle w:val="Heading3"/>
-      </w:pPr>
-      <w:bookmarkStart w:id="38" w:name="动态依赖图调整"/>
-      <w:r>
-        <w:t xml:space="preserve">3.6 动态依赖图调整</w:t>
       </w:r>
       <w:bookmarkEnd w:id="38"/>
     </w:p>
@@ -1053,7 +1092,7 @@
         <w:pStyle w:val="FirstParagraph"/>
       </w:pPr>
       <w:r>
-        <w:t xml:space="preserve">动态模式统一定义为反馈条件化的后续调整。状态 Hₜ 记录已执行模型、实际结果、失败经历和资源消耗；更新对象可以是后继模型分配、恢复安排、预算可行域或验证策略。即使 Eₜ 不变，πₜ 随新证据改变也构成动态执行。</w:t>
+        <w:t xml:space="preserve">静态模式按初始依赖与分配执行。节点失败时允许冻结的局部回退；其结果作为后继实际输入继续传播，但后继模型计划保持不变。因此，静态不等于没有恢复，动态比较也不能仅通过增加调用预算获得优势。</w:t>
       </w:r>
     </w:p>
     <w:p>
@@ -1061,34 +1100,60 @@
         <w:pStyle w:val="BodyText"/>
       </w:pPr>
       <w:r>
-        <w:t xml:space="preserve">受影响节点集合为 Aₜ，其依赖范围为 Aₜ∪Desc_G(Aₜ)。未受影响且输入有效的节点保持原结果。局部分解可以改变结构，但不是动态定义的必要条件；既有局部重规划未扩大恢复覆盖，本文不将其作为成功组件。</w:t>
+        <w:t xml:space="preserve">执行记录包含请求、输出、解析状态、消耗及输入来源。缺失真实抽取输出时，不允许以标准事实隐式补齐部署快照。历史条件化实验中的标准事实仅按其原协议评价，并单独披露。中间节点存在缺陷与最终答案错误分别记录。</w:t>
       </w:r>
     </w:p>
     <w:p>
       <w:pPr>
-        <w:pStyle w:val="BodyText"/>
-      </w:pPr>
-      <w:r>
-        <w:t xml:space="preserve">反馈记忆与图调整具有不同作用。前者修正能力估计，后者改变后续执行选择。既有低容量实例使用类型、长度分桶、模型及失败状态计数；当前动作只应读取已经发生的反馈，未执行候选的事后质量不能用于实际选择。</w:t>
-      </w:r>
+        <w:pStyle w:val="Heading3"/>
+      </w:pPr>
+      <w:bookmarkStart w:id="39" w:name="动态依赖图调整"/>
+      <w:r>
+        <w:t xml:space="preserve">3.6 动态依赖图调整</w:t>
+      </w:r>
+      <w:bookmarkEnd w:id="39"/>
     </w:p>
     <w:p>
       <w:pPr>
-        <w:pStyle w:val="BodyText"/>
-      </w:pPr>
-      <w:r>
-        <w:t xml:space="preserve">检测信号必须区分运行异常与真实失败标签。解析错误、执行器异常及验证器拒绝是运行时可观测信号；最终答案是否正确通常只能离线判定。48 任务动态试验通过评价答案触发推理回退并更新失败计数，属于理想失败检测条件下的真实调用。本文以此评价给定可靠判定后的调度行为，不声称已完成无标准答案的在线闭环验证。</w:t>
+        <w:pStyle w:val="FirstParagraph"/>
+      </w:pPr>
+      <w:r>
+        <w:t xml:space="preserve">动态模式统一定义为反馈条件化的后续调整。状态 Hₜ 记录已执行模型、实际结果、失败经历和资源消耗；更新对象可以是后继模型分配、恢复安排、预算可行域或验证策略。即使 Eₜ 不变，πₜ 随新证据改变也构成动态执行。</w:t>
       </w:r>
     </w:p>
     <w:p>
       <w:pPr>
+        <w:pStyle w:val="BodyText"/>
+      </w:pPr>
+      <w:r>
+        <w:t xml:space="preserve">受影响节点集合为 Aₜ，其依赖范围为 Aₜ∪Desc_G(Aₜ)。未受影响且输入有效的节点保持原结果。局部分解可以改变结构，但不是动态定义的必要条件；既有局部重规划未扩大恢复覆盖，本文不将其作为成功组件。</w:t>
+      </w:r>
+    </w:p>
+    <w:p>
+      <w:pPr>
+        <w:pStyle w:val="BodyText"/>
+      </w:pPr>
+      <w:r>
+        <w:t xml:space="preserve">反馈记忆与图调整具有不同作用。前者修正能力估计，后者改变后续执行选择。既有低容量实例使用类型、长度分桶、模型及失败状态计数；当前动作只应读取已经发生的反馈，未执行候选的事后质量不能用于实际选择。</w:t>
+      </w:r>
+    </w:p>
+    <w:p>
+      <w:pPr>
+        <w:pStyle w:val="BodyText"/>
+      </w:pPr>
+      <w:r>
+        <w:t xml:space="preserve">检测信号必须区分运行异常与真实失败标签。解析错误、执行器异常及验证器拒绝是运行时可观测信号；最终答案是否正确通常只能离线判定。48 任务动态试验通过评价答案触发推理回退并更新失败计数，属于理想失败检测条件下的真实调用。本文以此评价给定可靠判定后的调度行为，不声称已完成无标准答案的在线闭环验证。</w:t>
+      </w:r>
+    </w:p>
+    <w:p>
+      <w:pPr>
         <w:pStyle w:val="Heading3"/>
       </w:pPr>
-      <w:bookmarkStart w:id="39" w:name="选择性调整"/>
+      <w:bookmarkStart w:id="40" w:name="选择性调整"/>
       <w:r>
         <w:t xml:space="preserve">3.7 选择性调整</w:t>
       </w:r>
-      <w:bookmarkEnd w:id="39"/>
+      <w:bookmarkEnd w:id="40"/>
     </w:p>
     <w:p>
       <w:pPr>
@@ -1337,11 +1402,11 @@
       <w:pPr>
         <w:pStyle w:val="Heading3"/>
       </w:pPr>
-      <w:bookmarkStart w:id="40" w:name="预算感知恢复"/>
+      <w:bookmarkStart w:id="41" w:name="预算感知恢复"/>
       <w:r>
         <w:t xml:space="preserve">3.8 预算感知恢复</w:t>
       </w:r>
-      <w:bookmarkEnd w:id="40"/>
+      <w:bookmarkEnd w:id="41"/>
     </w:p>
     <w:p>
       <w:pPr>
@@ -1556,11 +1621,11 @@
       <w:pPr>
         <w:pStyle w:val="Heading3"/>
       </w:pPr>
-      <w:bookmarkStart w:id="41" w:name="历史任务图复用"/>
+      <w:bookmarkStart w:id="42" w:name="历史任务图复用"/>
       <w:r>
         <w:t xml:space="preserve">3.9 历史任务图复用</w:t>
       </w:r>
-      <w:bookmarkEnd w:id="41"/>
+      <w:bookmarkEnd w:id="42"/>
     </w:p>
     <w:p>
       <w:pPr>
@@ -1591,11 +1656,11 @@
       <w:pPr>
         <w:pStyle w:val="Heading3"/>
       </w:pPr>
-      <w:bookmarkStart w:id="42" w:name="多目标与约束决策"/>
+      <w:bookmarkStart w:id="43" w:name="多目标与约束决策"/>
       <w:r>
         <w:t xml:space="preserve">3.10 多目标与约束决策</w:t>
       </w:r>
-      <w:bookmarkEnd w:id="42"/>
+      <w:bookmarkEnd w:id="43"/>
     </w:p>
     <w:p>
       <w:pPr>
@@ -1801,11 +1866,11 @@
       <w:pPr>
         <w:pStyle w:val="Heading2"/>
       </w:pPr>
-      <w:bookmarkStart w:id="43" w:name="实验"/>
+      <w:bookmarkStart w:id="44" w:name="实验"/>
       <w:r>
         <w:t xml:space="preserve">4 实验</w:t>
       </w:r>
-      <w:bookmarkEnd w:id="43"/>
+      <w:bookmarkEnd w:id="44"/>
     </w:p>
     <w:p>
       <w:pPr>
@@ -1828,11 +1893,11 @@
       <w:pPr>
         <w:pStyle w:val="Heading3"/>
       </w:pPr>
-      <w:bookmarkStart w:id="44" w:name="实验设置"/>
+      <w:bookmarkStart w:id="45" w:name="实验设置"/>
       <w:r>
         <w:t xml:space="preserve">4.1 实验设置</w:t>
       </w:r>
-      <w:bookmarkEnd w:id="44"/>
+      <w:bookmarkEnd w:id="45"/>
     </w:p>
     <w:p>
       <w:pPr>
@@ -3180,6 +3245,14 @@
         <w:pStyle w:val="BodyText"/>
       </w:pPr>
       <w:r>
+        <w:t xml:space="preserve">核心术语在全文统一为：查询路由（Query Router）、节点路由（Node Router）、类型先验、静态执行（Static DAG）、动态执行（Dynamic DAG，部署检测臂为动态真实 Dynamic-Real）、有限候选 Oracle（finite candidate oracle）、能力匹配（capability match）、接口表达能力（interface adequacy）与反馈可诊断性（feedback diagnosability）。</w:t>
+      </w:r>
+    </w:p>
+    <w:p>
+      <w:pPr>
+        <w:pStyle w:val="BodyText"/>
+      </w:pPr>
+      <w:r>
         <w:rPr>
           <w:b/>
         </w:rPr>
@@ -3207,11 +3280,11 @@
       <w:pPr>
         <w:pStyle w:val="Heading3"/>
       </w:pPr>
-      <w:bookmarkStart w:id="45" w:name="阶段级模型能力异质性"/>
+      <w:bookmarkStart w:id="46" w:name="阶段级模型能力异质性"/>
       <w:r>
         <w:t xml:space="preserve">4.2 阶段级模型能力异质性</w:t>
       </w:r>
-      <w:bookmarkEnd w:id="45"/>
+      <w:bookmarkEnd w:id="46"/>
     </w:p>
     <w:p>
       <w:pPr>
@@ -3766,11 +3839,11 @@
       <w:pPr>
         <w:pStyle w:val="Heading3"/>
       </w:pPr>
-      <w:bookmarkStart w:id="46" w:name="任务分解与能力解耦"/>
+      <w:bookmarkStart w:id="47" w:name="任务分解与能力解耦"/>
       <w:r>
         <w:t xml:space="preserve">4.3 任务分解与能力解耦</w:t>
       </w:r>
-      <w:bookmarkEnd w:id="46"/>
+      <w:bookmarkEnd w:id="47"/>
     </w:p>
     <w:p>
       <w:pPr>
@@ -6120,11 +6193,11 @@
       <w:pPr>
         <w:pStyle w:val="Heading3"/>
       </w:pPr>
-      <w:bookmarkStart w:id="47" w:name="查询级与节点级模型分配"/>
+      <w:bookmarkStart w:id="48" w:name="查询级与节点级模型分配"/>
       <w:r>
         <w:t xml:space="preserve">4.4 查询级与节点级模型分配</w:t>
       </w:r>
-      <w:bookmarkEnd w:id="47"/>
+      <w:bookmarkEnd w:id="48"/>
     </w:p>
     <w:p>
       <w:pPr>
@@ -8289,11 +8362,11 @@
       <w:pPr>
         <w:pStyle w:val="Heading3"/>
       </w:pPr>
-      <w:bookmarkStart w:id="48" w:name="条件能力与传播能力差异"/>
+      <w:bookmarkStart w:id="49" w:name="条件能力与传播能力差异"/>
       <w:r>
         <w:t xml:space="preserve">4.5 条件能力与传播能力差异</w:t>
       </w:r>
-      <w:bookmarkEnd w:id="48"/>
+      <w:bookmarkEnd w:id="49"/>
     </w:p>
     <w:p>
       <w:pPr>
@@ -8795,11 +8868,11 @@
       <w:pPr>
         <w:pStyle w:val="Heading3"/>
       </w:pPr>
-      <w:bookmarkStart w:id="49" w:name="跨模型组合与有限候选上界"/>
+      <w:bookmarkStart w:id="50" w:name="跨模型组合与有限候选上界"/>
       <w:r>
         <w:t xml:space="preserve">4.6 跨模型组合与有限候选上界</w:t>
       </w:r>
-      <w:bookmarkEnd w:id="49"/>
+      <w:bookmarkEnd w:id="50"/>
     </w:p>
     <w:p>
       <w:pPr>
@@ -9469,11 +9542,11 @@
       <w:pPr>
         <w:pStyle w:val="Heading3"/>
       </w:pPr>
-      <w:bookmarkStart w:id="50" w:name="静态与动态执行"/>
+      <w:bookmarkStart w:id="51" w:name="静态与动态执行"/>
       <w:r>
         <w:t xml:space="preserve">4.7 静态与动态执行</w:t>
       </w:r>
-      <w:bookmarkEnd w:id="50"/>
+      <w:bookmarkEnd w:id="51"/>
     </w:p>
     <w:p>
       <w:pPr>
@@ -10225,11 +10298,11 @@
       <w:pPr>
         <w:pStyle w:val="Heading3"/>
       </w:pPr>
-      <w:bookmarkStart w:id="51" w:name="故障诊断恢复与预算"/>
+      <w:bookmarkStart w:id="52" w:name="故障诊断恢复与预算"/>
       <w:r>
         <w:t xml:space="preserve">4.8 故障诊断、恢复与预算</w:t>
       </w:r>
-      <w:bookmarkEnd w:id="51"/>
+      <w:bookmarkEnd w:id="52"/>
     </w:p>
     <w:p>
       <w:pPr>
@@ -10243,11 +10316,11 @@
       <w:pPr>
         <w:pStyle w:val="Heading4"/>
       </w:pPr>
-      <w:bookmarkStart w:id="52" w:name="真实失败与动作覆盖"/>
+      <w:bookmarkStart w:id="53" w:name="真实失败与动作覆盖"/>
       <w:r>
         <w:t xml:space="preserve">4.8.1 真实失败与动作覆盖</w:t>
       </w:r>
-      <w:bookmarkEnd w:id="52"/>
+      <w:bookmarkEnd w:id="53"/>
     </w:p>
     <w:p>
       <w:pPr>
@@ -10906,11 +10979,11 @@
       <w:pPr>
         <w:pStyle w:val="Heading4"/>
       </w:pPr>
-      <w:bookmarkStart w:id="53" w:name="剩余预算与多目标权衡"/>
+      <w:bookmarkStart w:id="54" w:name="剩余预算与多目标权衡"/>
       <w:r>
         <w:t xml:space="preserve">4.8.2 剩余预算与多目标权衡</w:t>
       </w:r>
-      <w:bookmarkEnd w:id="53"/>
+      <w:bookmarkEnd w:id="54"/>
     </w:p>
     <w:p>
       <w:pPr>
@@ -11447,11 +11520,11 @@
       <w:pPr>
         <w:pStyle w:val="Heading4"/>
       </w:pPr>
-      <w:bookmarkStart w:id="54" w:name="证据改善为何不必然带来正确答案"/>
+      <w:bookmarkStart w:id="55" w:name="证据改善为何不必然带来正确答案"/>
       <w:r>
         <w:t xml:space="preserve">4.8.3 证据改善为何不必然带来正确答案</w:t>
       </w:r>
-      <w:bookmarkEnd w:id="54"/>
+      <w:bookmarkEnd w:id="55"/>
     </w:p>
     <w:p>
       <w:pPr>
@@ -11514,11 +11587,11 @@
       <w:pPr>
         <w:pStyle w:val="Heading3"/>
       </w:pPr>
-      <w:bookmarkStart w:id="55" w:name="历史图复用"/>
+      <w:bookmarkStart w:id="56" w:name="历史图复用"/>
       <w:r>
         <w:t xml:space="preserve">4.9 历史图复用</w:t>
       </w:r>
-      <w:bookmarkEnd w:id="55"/>
+      <w:bookmarkEnd w:id="56"/>
     </w:p>
     <w:p>
       <w:pPr>
@@ -11541,21 +11614,21 @@
       <w:pPr>
         <w:pStyle w:val="Heading3"/>
       </w:pPr>
-      <w:bookmarkStart w:id="56" w:name="跨领域泛化与适用边界"/>
+      <w:bookmarkStart w:id="57" w:name="跨领域泛化与适用边界"/>
       <w:r>
         <w:t xml:space="preserve">4.10 跨领域泛化与适用边界</w:t>
       </w:r>
-      <w:bookmarkEnd w:id="56"/>
+      <w:bookmarkEnd w:id="57"/>
     </w:p>
     <w:p>
       <w:pPr>
         <w:pStyle w:val="Heading4"/>
       </w:pPr>
-      <w:bookmarkStart w:id="57" w:name="财务数学代码跨域结果"/>
+      <w:bookmarkStart w:id="58" w:name="财务数学代码跨域结果"/>
       <w:r>
         <w:t xml:space="preserve">4.10.1 财务／数学／代码跨域结果</w:t>
       </w:r>
-      <w:bookmarkEnd w:id="57"/>
+      <w:bookmarkEnd w:id="58"/>
     </w:p>
     <w:p>
       <w:pPr>
@@ -11614,7 +11687,7 @@
         <w:t xml:space="preserve">正式 MBPP 面板</w:t>
       </w:r>
       <w:r>
-        <w:t xml:space="preserve">（100 任务，单元测试为确定性评分与部署反馈，FROZEN_BEFORE_EXECUTION）：代码域采用与财务域不同的自然节点接口——规划→代码生成→单元测试→修复/校验，语法错误、运行时错误、断言失败均为部署可得信号，全程不读取参考实现。六臂结果：单体 medium 68.0%、large 76.0%、查询路由 71.0%、阶段分配 73.0%、静态 74.0%、动态真实 80.0%（有限候选 Oracle 87.0%）。配对对比：动态对静态 +6.0pp，95% CI [+1.0, +12.0] 不含零（Help/Harm = 7/1；McNemar 精确 p = 0.070，两种检验在 0.05 阈值上的分歧如实报告）；恢复率（初始失败→最终通过）7/26 = 26.9%；修复共 49 次；代价为动态 +95.7 tokens（+11.9%）且预算违规 22/100。该正向效应按冻结表述规范为方向明确的支持性证据，不宣称稳定统计显著。其余对比均不显著：阶段分配对查询路由 +2.0pp（CI [−7, +11]），静态对单体 large −2.0pp，动态对单体 large +4.0pp（CI [−3, +11]）。</w:t>
+        <w:t xml:space="preserve">（100 任务，单元测试为确定性评分与部署反馈，FROZEN_BEFORE_EXECUTION）：代码域采用与财务域不同的自然节点接口——规划→代码生成→单元测试→修复/校验，语法错误、运行时错误、断言失败均为部署可得信号，全程不读取参考实现。六臂结果：单体 medium 68.0%、large 76.0%、查询路由 71.0%、阶段分配 73.0%、静态 74.0%、动态真实（Dynamic-Real）80.0%（有限候选 Oracle 87.0%）。配对对比：动态对静态 +6.0pp，95% CI [+1.0, +12.0] 不含零（Help/Harm = 7/1；McNemar 精确 p = 0.070，两种检验在 0.05 阈值上的分歧如实报告）；恢复率（初始失败→最终通过）7/26 = 26.9%；修复共 49 次；代价为动态 +95.7 tokens（+11.9%）且预算违规 22/100。该正向效应按冻结表述规范为方向明确的支持性证据，不宣称稳定统计显著。其余对比均不显著：阶段分配对查询路由 +2.0pp（CI [−7, +11]），静态对单体 large −2.0pp，动态对单体 large +4.0pp（CI [−3, +11]）。</w:t>
       </w:r>
     </w:p>
     <w:p>
@@ -12136,11 +12209,11 @@
       <w:pPr>
         <w:pStyle w:val="Heading4"/>
       </w:pPr>
-      <w:bookmarkStart w:id="58" w:name="外部方法比较"/>
+      <w:bookmarkStart w:id="59" w:name="外部方法比较"/>
       <w:r>
         <w:t xml:space="preserve">4.10.2 外部方法比较</w:t>
       </w:r>
-      <w:bookmarkEnd w:id="58"/>
+      <w:bookmarkEnd w:id="59"/>
     </w:p>
     <w:p>
       <w:pPr>
@@ -13239,11 +13312,11 @@
       <w:pPr>
         <w:pStyle w:val="Heading4"/>
       </w:pPr>
-      <w:bookmarkStart w:id="59" w:name="三条件机制分析"/>
+      <w:bookmarkStart w:id="60" w:name="三条件机制分析"/>
       <w:r>
         <w:t xml:space="preserve">4.10.3 三条件机制分析</w:t>
       </w:r>
-      <w:bookmarkEnd w:id="59"/>
+      <w:bookmarkEnd w:id="60"/>
     </w:p>
     <w:p>
       <w:pPr>
@@ -13364,27 +13437,9 @@
       <w:pPr>
         <w:pStyle w:val="Heading2"/>
       </w:pPr>
-      <w:bookmarkStart w:id="60" w:name="讨论"/>
+      <w:bookmarkStart w:id="61" w:name="讨论"/>
       <w:r>
         <w:t xml:space="preserve">5 讨论</w:t>
-      </w:r>
-      <w:bookmarkEnd w:id="60"/>
-    </w:p>
-    <w:p>
-      <w:pPr>
-        <w:pStyle w:val="FirstParagraph"/>
-      </w:pPr>
-      <w:r>
-        <w:t xml:space="preserve">本章围绕四个问题组织，而不是复述实验结果：分解为什么不是免费的；条件能力为什么不能直接代表传播能力；Dynamic 为什么不能创造候选之外的能力；多模型 DAG 协同何时有效。四个问题的答案共同收敛到中心命题的三个条件。</w:t>
-      </w:r>
-    </w:p>
-    <w:p>
-      <w:pPr>
-        <w:pStyle w:val="Heading3"/>
-      </w:pPr>
-      <w:bookmarkStart w:id="61" w:name="为什么分解不是免费的"/>
-      <w:r>
-        <w:t xml:space="preserve">5.1 为什么分解不是免费的</w:t>
       </w:r>
       <w:bookmarkEnd w:id="61"/>
     </w:p>
@@ -13393,60 +13448,16 @@
         <w:pStyle w:val="FirstParagraph"/>
       </w:pPr>
       <w:r>
-        <w:t xml:space="preserve">分解在暴露中间接口的同时，也引入三类成本：接口成本（中间产物必须可解析、可传递，任何格式或语义丢失都会成为新失败点）、传播成本（上游输出质量直接约束下游，上游错误不再有机会被整题推理的冗余纠正）与调度成本（节点数与切换次数增加，预算与时间开销上升）。严格配对基准把这三类成本与收益分开计量：同模型拆分本身在 TAT-QA 上显著有害（−21.0pp），在 MultiHiertt 上为不显著的正向信号（+6.0pp）；异构分工追回 +5.0pp，但总体仍未完全抵消（DAG-L/M 31.7% vs Mono-L 38.7%）。因此</w:t>
-      </w:r>
-      <w:r>
-        <w:t xml:space="preserve">“</w:t>
-      </w:r>
-      <w:r>
-        <w:t xml:space="preserve">拆分总提高性能</w:t>
-      </w:r>
-      <w:r>
-        <w:t xml:space="preserve">”</w:t>
-      </w:r>
-      <w:r>
-        <w:t xml:space="preserve">的直觉不成立，DAG 的正确定位是能力解耦接口，而不是精度加速器。</w:t>
+        <w:t xml:space="preserve">本章围绕四个问题组织，而不是复述实验结果：分解为什么不是免费的；条件能力为什么不能直接代表传播能力；Dynamic 为什么不能创造候选之外的能力；多模型 DAG 协同何时有效。四个问题的答案共同收敛到中心命题的三个条件。</w:t>
       </w:r>
     </w:p>
     <w:p>
       <w:pPr>
-        <w:pStyle w:val="BodyText"/>
-      </w:pPr>
-      <w:r>
-        <w:t xml:space="preserve">TAT-QA 上 56 个 Harm 的逐题分类进一步说明分解税的成分：真分解失败 31 例（推理在 gold facts 下仍错），接口损失 25 例（解析/执行失败与 6 例事实顺序/符号错位）。值得强调的反事实是：即便将全部接口损失修正，配对差仍为 −8.5pp 且区间不含零——该域的分解损失以真实推理退化为主，不能归因于实现 bug。复杂度分层同时给出</w:t>
-      </w:r>
-      <w:r>
-        <w:t xml:space="preserve">“</w:t>
-      </w:r>
-      <w:r>
-        <w:t xml:space="preserve">何时值得拆</w:t>
-      </w:r>
-      <w:r>
-        <w:t xml:space="preserve">”</w:t>
-      </w:r>
-      <w:r>
-        <w:t xml:space="preserve">的初步形状：TAT-QA 上分解效应随推导步数单调上升（−27.1 → +21.1 → +50.0pp），简单任务承担了绝大部分分解税。这提示分解决策是任务复杂度依赖的，但 3 步以上子层样本很小，本文只把它作为描述性机制证据，不给出</w:t>
-      </w:r>
-      <w:r>
-        <w:t xml:space="preserve">“</w:t>
-      </w:r>
-      <w:r>
-        <w:t xml:space="preserve">超过某步数必须拆分</w:t>
-      </w:r>
-      <w:r>
-        <w:t xml:space="preserve">”</w:t>
-      </w:r>
-      <w:r>
-        <w:t xml:space="preserve">的规则。</w:t>
-      </w:r>
-    </w:p>
-    <w:p>
-      <w:pPr>
         <w:pStyle w:val="Heading3"/>
       </w:pPr>
-      <w:bookmarkStart w:id="62" w:name="为什么条件能力不能直接代表传播能力"/>
-      <w:r>
-        <w:t xml:space="preserve">5.2 为什么条件能力不能直接代表传播能力</w:t>
+      <w:bookmarkStart w:id="62" w:name="为什么分解不是免费的"/>
+      <w:r>
+        <w:t xml:space="preserve">5.1 为什么分解不是免费的</w:t>
       </w:r>
       <w:bookmarkEnd w:id="62"/>
     </w:p>
@@ -13455,7 +13466,19 @@
         <w:pStyle w:val="FirstParagraph"/>
       </w:pPr>
       <w:r>
-        <w:t xml:space="preserve">阶段评测揭示的是给定输入条件下的模型表现。条件化推理任务提供标准事实，使推理者主要承担关系识别与表达式构造；实际传播链还要求上游正确识别数值、实体、期间与单位。即使推理模型本身不变，输入来源变化也会改变其可解任务集合。因此条件节点 Oracle 是能力分析工具，不能直接作为完整执行的可达质量——条件口径的最佳固定质量为 0.31、逐任务推理 Oracle 为 0.41，而传播口径的同模型链最佳为 0.18、Oracle 为 0.23；冻结审计给出各面板传播 headroom 5.00/4.50/5.40/5.06pp，共同失败占比约 77%。跨模型矩阵提供更直接的机制证据：固定 medium 或 coder 推理者，更换为 large 抽取后最终质量提高——同模型执行将不同阶段的强弱项绑定，上游缺陷会掩盖下游能力，而 DAG 的作用之一正是使这种绑定可被打破。</w:t>
+        <w:t xml:space="preserve">分解在暴露中间接口的同时，也引入三类成本：接口成本（中间产物必须可解析、可传递，任何格式或语义丢失都会成为新失败点）、传播成本（上游输出质量直接约束下游，上游错误不再有机会被整题推理的冗余纠正）与调度成本（节点数与切换次数增加，预算与时间开销上升）。严格配对基准把这三类成本与收益分开计量：同模型拆分本身在 TAT-QA 上显著有害（−21.0pp），在 MultiHiertt 上为不显著的正向信号（+6.0pp）；异构分工追回 +5.0pp，但总体仍未完全抵消（DAG-L/M 31.7% vs Mono-L 38.7%）。因此</w:t>
+      </w:r>
+      <w:r>
+        <w:t xml:space="preserve">“</w:t>
+      </w:r>
+      <w:r>
+        <w:t xml:space="preserve">拆分总提高性能</w:t>
+      </w:r>
+      <w:r>
+        <w:t xml:space="preserve">”</w:t>
+      </w:r>
+      <w:r>
+        <w:t xml:space="preserve">的直觉不成立，DAG 的正确定位是能力解耦接口，而不是精度加速器。</w:t>
       </w:r>
     </w:p>
     <w:p>
@@ -13463,28 +13486,40 @@
         <w:pStyle w:val="BodyText"/>
       </w:pPr>
       <w:r>
-        <w:t xml:space="preserve">由此得到两个方法论结论。其一，能力画像、条件 Oracle 与传播链质量是三个不同层级的测量，不可直接拼接；用不同任务集上的条件 Oracle 与传播 Oracle 之差估计</w:t>
+        <w:t xml:space="preserve">TAT-QA 上 56 个 Harm 的逐题分类进一步说明分解税的成分：真分解失败 31 例（推理在 gold facts 下仍错），接口损失 25 例（解析/执行失败与 6 例事实顺序/符号错位）。值得强调的反事实是：即便将全部接口损失修正，配对差仍为 −8.5pp 且区间不含零——该域的分解损失以真实推理退化为主，不能归因于实现 bug。复杂度分层同时给出</w:t>
       </w:r>
       <w:r>
         <w:t xml:space="preserve">“</w:t>
       </w:r>
       <w:r>
-        <w:t xml:space="preserve">抽取噪声</w:t>
+        <w:t xml:space="preserve">何时值得拆</w:t>
       </w:r>
       <w:r>
         <w:t xml:space="preserve">”</w:t>
       </w:r>
       <w:r>
-        <w:t xml:space="preserve">的因果效应没有依据。其二，单模型成功可预测（传播画像中 ROC-AUC 0.75–0.84）不等于最优模型可路由：多个模型往往同时在简单任务成功、在复杂任务失败，这给单模型分类器提供了明显信号，却不给模型切换提供收益——AUC 对跨任务排序敏感，而路由收益取决于同任务候选差异、评分可比性与切换错误的代价。节点确认面板上类型先验与冻结节点路由质量相同，提示当前可稳定利用的结构主要是阶段差异，而非细粒度实例表示。</w:t>
+        <w:t xml:space="preserve">的初步形状：TAT-QA 上分解效应随推导步数单调上升（−27.1 → +21.1 → +50.0pp），简单任务承担了绝大部分分解税。这提示分解决策是任务复杂度依赖的，但 3 步以上子层样本很小，本文只把它作为描述性机制证据，不给出</w:t>
+      </w:r>
+      <w:r>
+        <w:t xml:space="preserve">“</w:t>
+      </w:r>
+      <w:r>
+        <w:t xml:space="preserve">超过某步数必须拆分</w:t>
+      </w:r>
+      <w:r>
+        <w:t xml:space="preserve">”</w:t>
+      </w:r>
+      <w:r>
+        <w:t xml:space="preserve">的规则。</w:t>
       </w:r>
     </w:p>
     <w:p>
       <w:pPr>
         <w:pStyle w:val="Heading3"/>
       </w:pPr>
-      <w:bookmarkStart w:id="63" w:name="为什么动态适应不能创造能力"/>
-      <w:r>
-        <w:t xml:space="preserve">5.3 为什么动态适应不能创造能力</w:t>
+      <w:bookmarkStart w:id="63" w:name="为什么条件能力不能直接代表传播能力"/>
+      <w:r>
+        <w:t xml:space="preserve">5.2 为什么条件能力不能直接代表传播能力</w:t>
       </w:r>
       <w:bookmarkEnd w:id="63"/>
     </w:p>
@@ -13493,19 +13528,7 @@
         <w:pStyle w:val="FirstParagraph"/>
       </w:pPr>
       <w:r>
-        <w:t xml:space="preserve">路由和恢复都只能在候选执行结果之间选择：对于给定模型、提示、输入与动作集合，如果所有候选都失败，改进选择本身不能产生其中不存在的正确答案。这是固定候选集合的上限，不是对整个任务可解性的判断。真实失败集合中四个动作的成功并集仅为 8/116（6.90%），局部子图重规划新增覆盖为零（NO-GO）——当前剩余限制不能简单归因于</w:t>
-      </w:r>
-      <w:r>
-        <w:t xml:space="preserve">“</w:t>
-      </w:r>
-      <w:r>
-        <w:t xml:space="preserve">动作选得不够好</w:t>
-      </w:r>
-      <w:r>
-        <w:t xml:space="preserve">”</w:t>
-      </w:r>
-      <w:r>
-        <w:t xml:space="preserve">，而是动作集合里确实缺少成功输出。结构解析诊断进一步提示，找到数值并不等于理解其关系：必要操作数出现在候选证据中，仍可能伴随实体绑定、期间对齐和表达式构造错误。</w:t>
+        <w:t xml:space="preserve">阶段评测揭示的是给定输入条件下的模型表现。条件化推理任务提供标准事实，使推理者主要承担关系识别与表达式构造；实际传播链还要求上游正确识别数值、实体、期间与单位。即使推理模型本身不变，输入来源变化也会改变其可解任务集合。因此条件节点 Oracle 是能力分析工具，不能直接作为完整执行的可达质量——条件口径的最佳固定质量为 0.31、逐任务推理 Oracle 为 0.41，而传播口径的同模型链最佳为 0.18、Oracle 为 0.23；冻结审计给出各面板传播 headroom 5.00/4.50/5.40/5.06pp，共同失败占比约 77%。跨模型矩阵提供更直接的机制证据：固定 medium 或 coder 推理者，更换为 large 抽取后最终质量提高——同模型执行将不同阶段的强弱项绑定，上游缺陷会掩盖下游能力，而 DAG 的作用之一正是使这种绑定可被打破。</w:t>
       </w:r>
     </w:p>
     <w:p>
@@ -13513,30 +13536,80 @@
         <w:pStyle w:val="BodyText"/>
       </w:pPr>
       <w:r>
-        <w:t xml:space="preserve">这一上限在归因消融中同样成立。四节点 DAG 面板上动态相对静态的 +20.0pp 中，Static-Matched 臂（保持静态语义、仅把恢复目标换成升级目标）单独取得 +18.3pp，策略逻辑超出目标选择的贡献仅 +1.7pp（不显著）——该面板的主要质量增益来自</w:t>
+        <w:t xml:space="preserve">由此得到两个方法论结论。其一，能力画像、条件 Oracle 与传播链质量是三个不同层级的测量，不可直接拼接；用不同任务集上的条件 Oracle 与传播 Oracle 之差估计</w:t>
       </w:r>
       <w:r>
         <w:t xml:space="preserve">“</w:t>
       </w:r>
       <w:r>
-        <w:t xml:space="preserve">失败节点升级至最强未试模型</w:t>
+        <w:t xml:space="preserve">抽取噪声</w:t>
       </w:r>
       <w:r>
         <w:t xml:space="preserve">”</w:t>
       </w:r>
       <w:r>
-        <w:t xml:space="preserve">这一动作本身，而这一动作之所以有效，正是因为候选集合中存在更强的未试模型。动态框架的可确证价值在于以选择性更新（933 次适配调用全部限于失败节点及其后代闭包、分支隔离零违例）与预算约束安全地承载该动作，而不是凭空创造能力。反过来，当候选集合被接口表达力封顶（数学域两类接口族均塌缩）或动作集合覆盖不足（8/116）时，任何调度策略都无法突破该上限。能力覆盖与动作选择因此是两个不同层级的上限，本文的贡献定位是后者。</w:t>
+        <w:t xml:space="preserve">的因果效应没有依据。其二，单模型成功可预测（传播画像中 ROC-AUC 0.75–0.84）不等于最优模型可路由：多个模型往往同时在简单任务成功、在复杂任务失败，这给单模型分类器提供了明显信号，却不给模型切换提供收益——AUC 对跨任务排序敏感，而路由收益取决于同任务候选差异、评分可比性与切换错误的代价。节点确认面板上类型先验与冻结节点路由质量相同，提示当前可稳定利用的结构主要是阶段差异，而非细粒度实例表示。</w:t>
       </w:r>
     </w:p>
     <w:p>
       <w:pPr>
         <w:pStyle w:val="Heading3"/>
       </w:pPr>
-      <w:bookmarkStart w:id="64" w:name="多模型有向无环图协同何时有效"/>
+      <w:bookmarkStart w:id="64" w:name="为什么动态适应不能创造能力"/>
+      <w:r>
+        <w:t xml:space="preserve">5.3 为什么动态适应不能创造能力</w:t>
+      </w:r>
+      <w:bookmarkEnd w:id="64"/>
+    </w:p>
+    <w:p>
+      <w:pPr>
+        <w:pStyle w:val="FirstParagraph"/>
+      </w:pPr>
+      <w:r>
+        <w:t xml:space="preserve">路由和恢复都只能在候选执行结果之间选择：对于给定模型、提示、输入与动作集合，如果所有候选都失败，改进选择本身不能产生其中不存在的正确答案。这是固定候选集合的上限，不是对整个任务可解性的判断。真实失败集合中四个动作的成功并集仅为 8/116（6.90%），局部子图重规划新增覆盖为零（NO-GO）——当前剩余限制不能简单归因于</w:t>
+      </w:r>
+      <w:r>
+        <w:t xml:space="preserve">“</w:t>
+      </w:r>
+      <w:r>
+        <w:t xml:space="preserve">动作选得不够好</w:t>
+      </w:r>
+      <w:r>
+        <w:t xml:space="preserve">”</w:t>
+      </w:r>
+      <w:r>
+        <w:t xml:space="preserve">，而是动作集合里确实缺少成功输出。结构解析诊断进一步提示，找到数值并不等于理解其关系：必要操作数出现在候选证据中，仍可能伴随实体绑定、期间对齐和表达式构造错误。</w:t>
+      </w:r>
+    </w:p>
+    <w:p>
+      <w:pPr>
+        <w:pStyle w:val="BodyText"/>
+      </w:pPr>
+      <w:r>
+        <w:t xml:space="preserve">这一上限在归因消融中同样成立。四节点 DAG 面板上动态相对静态的 +20.0pp 中，Static-Matched 臂（保持静态语义、仅把恢复目标换成升级目标）单独取得 +18.3pp，策略逻辑超出目标选择的贡献仅 +1.7pp（不显著）——该面板的主要质量增益来自</w:t>
+      </w:r>
+      <w:r>
+        <w:t xml:space="preserve">“</w:t>
+      </w:r>
+      <w:r>
+        <w:t xml:space="preserve">失败节点升级至最强未试模型</w:t>
+      </w:r>
+      <w:r>
+        <w:t xml:space="preserve">”</w:t>
+      </w:r>
+      <w:r>
+        <w:t xml:space="preserve">这一动作本身，而这一动作之所以有效，正是因为候选集合中存在更强的未试模型。动态框架的可确证价值在于以选择性更新（933 次适配调用全部限于失败节点及其后代闭包、分支隔离零违例）与预算约束安全地承载该动作，而不是凭空创造能力。反过来，当候选集合被接口表达力封顶（数学域两类接口族均塌缩）或动作集合覆盖不足（8/116）时，任何调度策略都无法突破该上限。能力覆盖与动作选择因此是两个不同层级的上限，本文的贡献定位是后者。</w:t>
+      </w:r>
+    </w:p>
+    <w:p>
+      <w:pPr>
+        <w:pStyle w:val="Heading3"/>
+      </w:pPr>
+      <w:bookmarkStart w:id="65" w:name="多模型有向无环图协同何时有效"/>
       <w:r>
         <w:t xml:space="preserve">5.4 多模型有向无环图协同何时有效</w:t>
       </w:r>
-      <w:bookmarkEnd w:id="64"/>
+      <w:bookmarkEnd w:id="65"/>
     </w:p>
     <w:p>
       <w:pPr>
@@ -13621,13 +13694,68 @@
     </w:p>
     <w:p>
       <w:pPr>
+        <w:pStyle w:val="CaptionedFigure"/>
+      </w:pPr>
+      <w:r>
+        <w:drawing>
+          <wp:inline>
+            <wp:extent cx="6045200" cy="3462652"/>
+            <wp:effectExtent b="0" l="0" r="0" t="0"/>
+            <wp:docPr descr="图 5-1 多模型 DAG 协同的三个有效条件" title="" id="1" name="Picture"/>
+            <a:graphic>
+              <a:graphicData uri="http://schemas.openxmlformats.org/drawingml/2006/picture">
+                <pic:pic>
+                  <pic:nvPicPr>
+                    <pic:cNvPr descr="fig5_1_three_conditions.png" id="0" name="Picture"/>
+                    <pic:cNvPicPr>
+                      <a:picLocks noChangeArrowheads="1" noChangeAspect="1"/>
+                    </pic:cNvPicPr>
+                  </pic:nvPicPr>
+                  <pic:blipFill>
+                    <a:blip r:embed="rId66"/>
+                    <a:stretch>
+                      <a:fillRect/>
+                    </a:stretch>
+                  </pic:blipFill>
+                  <pic:spPr bwMode="auto">
+                    <a:xfrm>
+                      <a:off x="0" y="0"/>
+                      <a:ext cx="6045200" cy="3462652"/>
+                    </a:xfrm>
+                    <a:prstGeom prst="rect">
+                      <a:avLst/>
+                    </a:prstGeom>
+                    <a:noFill/>
+                    <a:ln w="9525">
+                      <a:noFill/>
+                      <a:headEnd/>
+                      <a:tailEnd/>
+                    </a:ln>
+                  </pic:spPr>
+                </pic:pic>
+              </a:graphicData>
+            </a:graphic>
+          </wp:inline>
+        </w:drawing>
+      </w:r>
+    </w:p>
+    <w:p>
+      <w:pPr>
+        <w:pStyle w:val="ImageCaption"/>
+      </w:pPr>
+      <w:r>
+        <w:t xml:space="preserve">图 5-1 多模型 DAG 协同的三个有效条件</w:t>
+      </w:r>
+    </w:p>
+    <w:p>
+      <w:pPr>
         <w:pStyle w:val="Heading2"/>
       </w:pPr>
-      <w:bookmarkStart w:id="65" w:name="结论"/>
+      <w:bookmarkStart w:id="67" w:name="结论"/>
       <w:r>
         <w:t xml:space="preserve">6 结论</w:t>
       </w:r>
-      <w:bookmarkEnd w:id="65"/>
+      <w:bookmarkEnd w:id="67"/>
     </w:p>
     <w:p>
       <w:pPr>

</xml_diff>

<commit_message>
apply review checklist A5+B8+C4: explicit RQ1-3 (intro + 4.1 index); refs [8]-[11] added (MATH, Let's-Verify/MATH-500, MBPP, vLLM) and references section embedded in draft/docx (was missing entirely); four-node four-arm table 4-13 added (attribution centerpiece, tables renumbered 4-14..4-17); three-conditions evidence tiering; method 3.6 synced to deployable-detection evidence; related-work gap paragraph; cost-scope footnote on table 4-17; per-domain oracle candidate-space definitions; 4.4 heading aligned to glossary; conclusion typo+oracle claim removed; wording fixes; SVG vector figures generated for LaTeX submission; all checks green (18 tables, 11 refs, 24 pages)
</commit_message>
<xml_diff>
--- a/r3_own_pool/paper_method_feedback_aware_dag/最终整合_20260921/论文完整草稿.docx
+++ b/r3_own_pool/paper_method_feedback_aware_dag/最终整合_20260921/论文完整草稿.docx
@@ -190,6 +190,68 @@
       </w:pPr>
       <w:r>
         <w:t xml:space="preserve">研究围绕一条递进的证据链展开：首先测量阶段能力异质性；随后考察实际输入传播如何改变可用能力；再通过严格配对分解、跨模型组合和有限空间的精确事后上界定位剩余机会；最后检验选择性路由、静态与动态恢复、预算约束能否利用这些机会，并把同一套问题推向财务之外的数学与代码任务域。模型成功预测具有信号，并不意味着实例级最佳模型能够稳定预测；存在正 Oracle 差距，也不意味着该差距可以由当前表示与监督充分恢复。</w:t>
+      </w:r>
+    </w:p>
+    <w:p>
+      <w:pPr>
+        <w:pStyle w:val="BodyText"/>
+      </w:pPr>
+      <w:r>
+        <w:t xml:space="preserve">本文围绕三个研究问题组织证据：</w:t>
+      </w:r>
+    </w:p>
+    <w:p>
+      <w:pPr>
+        <w:numPr>
+          <w:ilvl w:val="0"/>
+          <w:numId w:val="1001"/>
+        </w:numPr>
+        <w:pStyle w:val="Compact"/>
+      </w:pPr>
+      <w:r>
+        <w:rPr>
+          <w:b/>
+        </w:rPr>
+        <w:t xml:space="preserve">RQ1</w:t>
+      </w:r>
+      <w:r>
+        <w:t xml:space="preserve">：不同执行阶段是否存在可利用的模型能力异质性，节点级分配能否优于查询级选择？（对应 4.2–4.6）</w:t>
+      </w:r>
+    </w:p>
+    <w:p>
+      <w:pPr>
+        <w:numPr>
+          <w:ilvl w:val="0"/>
+          <w:numId w:val="1001"/>
+        </w:numPr>
+        <w:pStyle w:val="Compact"/>
+      </w:pPr>
+      <w:r>
+        <w:rPr>
+          <w:b/>
+        </w:rPr>
+        <w:t xml:space="preserve">RQ2</w:t>
+      </w:r>
+      <w:r>
+        <w:t xml:space="preserve">：任务分解与反馈驱动动态执行分别带来什么收益与代价，Dynamic 的增益来自调度本身还是恢复动作？（对应 4.3、4.7–4.9）</w:t>
+      </w:r>
+    </w:p>
+    <w:p>
+      <w:pPr>
+        <w:numPr>
+          <w:ilvl w:val="0"/>
+          <w:numId w:val="1001"/>
+        </w:numPr>
+        <w:pStyle w:val="Compact"/>
+      </w:pPr>
+      <w:r>
+        <w:rPr>
+          <w:b/>
+        </w:rPr>
+        <w:t xml:space="preserve">RQ3</w:t>
+      </w:r>
+      <w:r>
+        <w:t xml:space="preserve">：多模型 DAG 协同在什么条件下有效，其跨域收益如何受能力匹配、接口表达能力和反馈可诊断性制约？（对应 4.10）</w:t>
       </w:r>
     </w:p>
     <w:p>
@@ -1142,7 +1204,7 @@
         <w:pStyle w:val="BodyText"/>
       </w:pPr>
       <w:r>
-        <w:t xml:space="preserve">检测信号必须区分运行异常与真实失败标签。解析错误、执行器异常及验证器拒绝是运行时可观测信号；最终答案是否正确通常只能离线判定。48 任务动态试验通过评价答案触发推理回退并更新失败计数，属于理想失败检测条件下的真实调用。本文以此评价给定可靠判定后的调度行为，不声称已完成无标准答案的在线闭环验证。</w:t>
+        <w:t xml:space="preserve">检测信号必须区分运行异常与真实失败标签。解析错误、执行器异常及验证器拒绝是运行时可观测信号；最终答案是否正确通常只能离线判定。48 任务动态试验通过评价答案触发推理回退并更新失败计数，属于理想失败检测条件下的真实调用。本文以此评价给定可靠判定后的调度行为；部署边界内的闭环证据另由四节点面板的部署信号消融与代码域正式面板给出（4.7、4.10.1），但不外推到所有无标准答案场景。</w:t>
       </w:r>
     </w:p>
     <w:p>
@@ -1839,7 +1901,27 @@
         <w:pStyle w:val="FirstParagraph"/>
       </w:pPr>
       <w:r>
-        <w:t xml:space="preserve">其中 p 包括模型分配和已有恢复策略。Q–C、Q–L 与 Q–C–L 非支配分析用于显示不同资源偏好下的候选权衡，不引入新多目标算法。资源相近时，质量差异是主要决策依据；预算收紧时，C/L 决定某一方案是否可行。</w:t>
+        <w:t xml:space="preserve">其中 p 包括模型分配和已有恢复策略。Q–C、Q–L 与 Q–C–L 非支配分析用于显示不同资源偏好下的候选权衡，不引入新多目标算法。</w:t>
+      </w:r>
+    </w:p>
+    <w:p>
+      <w:pPr>
+        <w:pStyle w:val="BodyText"/>
+      </w:pPr>
+      <w:r>
+        <w:t xml:space="preserve">综上，已有工作分别处理整题级路由（RouteLLM）、成本感知级联（FrugalGPT）、答案级迭代精修（Self-Refine）与函数调用编排（LLMCompiler）。据本文所知，同一冻结模型池内</w:t>
+      </w:r>
+      <w:r>
+        <w:t xml:space="preserve">“</w:t>
+      </w:r>
+      <w:r>
+        <w:t xml:space="preserve">节点级异构分配＋依赖感知的局部动态调整＋适用边界的机制分析</w:t>
+      </w:r>
+      <w:r>
+        <w:t xml:space="preserve">”</w:t>
+      </w:r>
+      <w:r>
+        <w:t xml:space="preserve">这一组合尚未被同时研究：整题级方法不利用阶段粒度，答案级方法不处理依赖传播，编排方法不以多模型分工为对象；且这些方法的收益条件本身缺少统一面板下的对照证据。本文在第 4 章的严格配对基准与 4.10.2 的统一外部基线比较中同时填补这两点。资源相近时，质量差异是主要决策依据；预算收紧时，C/L 决定某一方案是否可行。</w:t>
       </w:r>
     </w:p>
     <w:p>
@@ -1904,7 +1986,7 @@
         <w:pStyle w:val="FirstParagraph"/>
       </w:pPr>
       <w:r>
-        <w:t xml:space="preserve">实验以 MultiHiertt 财务表文推理任务为主，并以 TAT-QA、MBPP（代码）与 Math500（数学）作为跨域面板。[6,7] 不同阶段使用不同面板，不能以相同数据集名称推定同一任务、输入条件或评分单位。官方无标签测试题不能沿用节点评分；节点确认采用经使用记录审计的有标签保留任务。表 4-1 汇总本文主要证据层级。</w:t>
+        <w:t xml:space="preserve">实验以 MultiHiertt 财务表文推理任务为主[6]，并以 TAT-QA[7]、MBPP[10]（代码）与 Math500[8,9]（数学）作为跨域面板。 不同阶段使用不同面板，不能以相同数据集名称推定同一任务、输入条件或评分单位。官方无标签测试题不能沿用节点评分；节点确认采用经使用记录审计的有标签保留任务。表 4-1 汇总本文主要证据层级。</w:t>
       </w:r>
     </w:p>
     <w:p>
@@ -3237,7 +3319,7 @@
         <w:pStyle w:val="BodyText"/>
       </w:pPr>
       <w:r>
-        <w:t xml:space="preserve">核心候选池固定为 medium、large、coder（Qwen2.5-7B-Instruct / Qwen2.5-14B-Instruct-GPTQ-Int8 / Qwen2.5-Coder-7B-Instruct），checkpoint 在每次服务启动时按 provenance 哈希校验；R1 不进入节点路由。生成配置统一为 temperature 0、top_p 1、max_tokens 512。实验在项目现有 GPU 与 vLLM 推理服务环境采集；本文不把服务时长总和称为包含加载、排队、调度的端到端墙钟延迟，也不从不同历史服务配置推断硬件加速。</w:t>
+        <w:t xml:space="preserve">核心候选池固定为 medium、large、coder（Qwen2.5-7B-Instruct / Qwen2.5-14B-Instruct-GPTQ-Int8 / Qwen2.5-Coder-7B-Instruct），checkpoint 在每次服务启动时按 provenance 哈希校验；R1 不进入节点路由。生成配置统一为 temperature 0、top_p 1、max_tokens 512。实验在项目现有 GPU 与 vLLM[11] 推理服务环境采集；本文不把服务时长总和称为包含加载、排队、调度的端到端墙钟延迟，也不从不同历史服务配置推断硬件加速。</w:t>
       </w:r>
     </w:p>
     <w:p>
@@ -3260,6 +3342,26 @@
       </w:r>
       <w:r>
         <w:t xml:space="preserve">。节点质量是指定评分器的平均分；任务成功率是最终答案正确的任务比例。成本记录 tokens，调用次数单独计算；时延采用记录的观测服务时间。Help 指默认错误而新策略正确，Harm 指默认正确而新策略错误。对参考策略 b 与相同候选空间 Oracle，差距恢复比例定义为 GR(r;b)=(Q_r−Q_b)/(Q_Oracle−Q_b)，分母须为正，且三项必须来自相同面板和评分口径。所有配对比较报告任务级配对差值 ΔQ、10 000 次配对 bootstrap 95% 区间（种子 20260916）与精确 McNemar 检验；区间包含零或 McNemar p≥0.05 时不称显著。</w:t>
+      </w:r>
+    </w:p>
+    <w:p>
+      <w:pPr>
+        <w:pStyle w:val="BodyText"/>
+      </w:pPr>
+      <w:r>
+        <w:t xml:space="preserve">本章与三个研究问题的对应关系：RQ1（阶段能力异质性与节点级分配）由 4.2–4.6 回答，RQ2（分解收益与代价、动态增益归因）由 4.3 与 4.7–4.9 回答，RQ3（协同有效条件与跨域制约）由 4.10 回答。每节按</w:t>
+      </w:r>
+      <w:r>
+        <w:t xml:space="preserve">“</w:t>
+      </w:r>
+      <w:r>
+        <w:t xml:space="preserve">研究问题→对照→结果→结论</w:t>
+      </w:r>
+      <w:r>
+        <w:t xml:space="preserve">”</w:t>
+      </w:r>
+      <w:r>
+        <w:t xml:space="preserve">闭环组织。</w:t>
       </w:r>
     </w:p>
     <w:p>
@@ -6168,16 +6270,7 @@
         <w:pStyle w:val="BodyText"/>
       </w:pPr>
       <w:r>
-        <w:t xml:space="preserve">TAT-QA 上 56 个 Harm 的逐题分类（零调用审计，</w:t>
-      </w:r>
-      <w:r>
-        <w:rPr>
-          <w:rStyle w:val="VerbatimChar"/>
-        </w:rPr>
-        <w:t xml:space="preserve">TAT_QA_FAILURE_CLASSIFICATION.json</w:t>
-      </w:r>
-      <w:r>
-        <w:t xml:space="preserve">）进一步区分两种损失：真分解失败 31 例（推理在 gold facts 下仍错 30、抽取值错 1）与接口损失 25 例（执行/解析 12、抽取不可解析 7、事实顺序/符号错位 6、百分比/千位缩放 0）。其中 6 例顺序/符号错位具体展示了节点接口丢失语义的机制——表达式语义正确而事实绑定顺序相反。</w:t>
+        <w:t xml:space="preserve">TAT-QA 上 56 个 Harm 的逐题分类（零调用审计，证据编号见 FINAL_CLAIM_AUDIT）进一步区分两种损失：真分解失败 31 例（推理在 gold facts 下仍错 30、抽取值错 1）与接口损失 25 例（执行/解析 12、抽取不可解析 7、事实顺序/符号错位 6、百分比/千位缩放 0）。其中 6 例顺序/符号错位具体展示了节点接口丢失语义的机制——表达式语义正确而事实绑定顺序相反。</w:t>
       </w:r>
       <w:r>
         <w:rPr>
@@ -6193,9 +6286,9 @@
       <w:pPr>
         <w:pStyle w:val="Heading3"/>
       </w:pPr>
-      <w:bookmarkStart w:id="48" w:name="查询级与节点级模型分配"/>
-      <w:r>
-        <w:t xml:space="preserve">4.4 查询级与节点级模型分配</w:t>
+      <w:bookmarkStart w:id="48" w:name="查询路由与节点路由"/>
+      <w:r>
+        <w:t xml:space="preserve">4.4 查询路由与节点路由</w:t>
       </w:r>
       <w:bookmarkEnd w:id="48"/>
     </w:p>
@@ -8828,16 +8921,7 @@
         <w:t xml:space="preserve">”</w:t>
       </w:r>
       <w:r>
-        <w:t xml:space="preserve">。零调用审计（</w:t>
-      </w:r>
-      <w:r>
-        <w:rPr>
-          <w:rStyle w:val="VerbatimChar"/>
-        </w:rPr>
-        <w:t xml:space="preserve">REASONER_ROW_ORACLE_AUDIT.json</w:t>
-      </w:r>
-      <w:r>
-        <w:t xml:space="preserve">，冻结评分器逐任务重算）给出各面板传播 headroom：900 题开发集 5.00pp、Conf-200 4.50pp、Conf-500 5.40pp、合并 1,600 题 5.06pp；共同失败占比 77.0%／76.5%／76.2%／76.7%。本文统一引用上述审计值；此前口径外的</w:t>
+        <w:t xml:space="preserve">。零调用审计（零调用审计，证据编号见 FINAL_CLAIM_AUDIT）给出各面板传播 headroom：900 题开发集 5.00pp、Conf-200 4.50pp、Conf-500 5.40pp、合并 1,600 题 5.06pp；共同失败占比 77.0%／76.5%／76.2%／76.7%。本文统一引用上述审计值；此前口径外的</w:t>
       </w:r>
       <w:r>
         <w:t xml:space="preserve">“</w:t>
@@ -10175,6 +10259,545 @@
         <w:pStyle w:val="BodyText"/>
       </w:pPr>
       <w:r>
+        <w:t xml:space="preserve">结果汇总见表 4-13。</w:t>
+      </w:r>
+    </w:p>
+    <w:p>
+      <w:pPr>
+        <w:pStyle w:val="BodyText"/>
+        <w:keepNext/>
+        <w:spacing w:before="160"/>
+      </w:pPr>
+      <w:r>
+        <w:t xml:space="preserve">表 4-13 四节点面板四臂对照（同一冻结面板）</w:t>
+      </w:r>
+    </w:p>
+    <w:tbl>
+      <w:tblPr>
+        <w:tblStyle w:val="TableGrid"/>
+        <w:tblW w:type="dxa" w:w="9524"/>
+        <w:tblLayout w:type="fixed"/>
+        <w:tblLook w:firstColumn="1" w:firstRow="1" w:lastColumn="0" w:lastRow="0" w:noHBand="0" w:noVBand="1" w:val="04A0"/>
+      </w:tblPr>
+      <w:tblGrid>
+        <w:gridCol w:w="2154"/>
+        <w:gridCol w:w="1247"/>
+        <w:gridCol w:w="1531"/>
+        <w:gridCol w:w="1984"/>
+        <w:gridCol w:w="2608"/>
+      </w:tblGrid>
+      <w:tr>
+        <w:trPr>
+          <w:cantSplit/>
+          <w:tblHeader/>
+        </w:trPr>
+        <w:tc>
+          <w:tcPr>
+            <w:tcW w:type="dxa" w:w="2154"/>
+            <w:vAlign w:val="center"/>
+            <w:shd w:fill="E8EDF2"/>
+          </w:tcPr>
+          <w:p>
+            <w:pPr>
+              <w:spacing w:after="60" w:before="60" w:line="240" w:lineRule="auto"/>
+            </w:pPr>
+            <w:r>
+              <w:rPr>
+                <w:rFonts w:eastAsia="Noto Sans CJK SC"/>
+                <w:b/>
+                <w:sz w:val="18"/>
+              </w:rPr>
+              <w:t>臂</w:t>
+            </w:r>
+          </w:p>
+        </w:tc>
+        <w:tc>
+          <w:tcPr>
+            <w:tcW w:type="dxa" w:w="1247"/>
+            <w:vAlign w:val="center"/>
+            <w:shd w:fill="E8EDF2"/>
+          </w:tcPr>
+          <w:p>
+            <w:pPr>
+              <w:spacing w:after="60" w:before="60" w:line="240" w:lineRule="auto"/>
+            </w:pPr>
+            <w:r>
+              <w:rPr>
+                <w:rFonts w:eastAsia="Noto Sans CJK SC"/>
+                <w:b/>
+                <w:sz w:val="18"/>
+              </w:rPr>
+              <w:t>质量</w:t>
+            </w:r>
+          </w:p>
+        </w:tc>
+        <w:tc>
+          <w:tcPr>
+            <w:tcW w:type="dxa" w:w="1531"/>
+            <w:vAlign w:val="center"/>
+            <w:shd w:fill="E8EDF2"/>
+          </w:tcPr>
+          <w:p>
+            <w:pPr>
+              <w:spacing w:after="60" w:before="60" w:line="240" w:lineRule="auto"/>
+            </w:pPr>
+            <w:r>
+              <w:rPr>
+                <w:rFonts w:eastAsia="Noto Sans CJK SC"/>
+                <w:b/>
+                <w:sz w:val="18"/>
+              </w:rPr>
+              <w:t>ΔQ 对静态</w:t>
+            </w:r>
+          </w:p>
+        </w:tc>
+        <w:tc>
+          <w:tcPr>
+            <w:tcW w:type="dxa" w:w="1984"/>
+            <w:vAlign w:val="center"/>
+            <w:shd w:fill="E8EDF2"/>
+          </w:tcPr>
+          <w:p>
+            <w:pPr>
+              <w:spacing w:after="60" w:before="60" w:line="240" w:lineRule="auto"/>
+            </w:pPr>
+            <w:r>
+              <w:rPr>
+                <w:rFonts w:eastAsia="Noto Sans CJK SC"/>
+                <w:b/>
+                <w:sz w:val="18"/>
+              </w:rPr>
+              <w:t>95% CI</w:t>
+            </w:r>
+          </w:p>
+        </w:tc>
+        <w:tc>
+          <w:tcPr>
+            <w:tcW w:type="dxa" w:w="2608"/>
+            <w:vAlign w:val="center"/>
+            <w:shd w:fill="E8EDF2"/>
+          </w:tcPr>
+          <w:p>
+            <w:pPr>
+              <w:spacing w:after="60" w:before="60" w:line="240" w:lineRule="auto"/>
+            </w:pPr>
+            <w:r>
+              <w:rPr>
+                <w:rFonts w:eastAsia="Noto Sans CJK SC"/>
+                <w:b/>
+                <w:sz w:val="18"/>
+              </w:rPr>
+              <w:t>说明</w:t>
+            </w:r>
+          </w:p>
+        </w:tc>
+      </w:tr>
+      <w:tr>
+        <w:trPr>
+          <w:cantSplit/>
+        </w:trPr>
+        <w:tc>
+          <w:tcPr>
+            <w:tcW w:type="dxa" w:w="2154"/>
+            <w:vAlign w:val="center"/>
+          </w:tcPr>
+          <w:p>
+            <w:pPr>
+              <w:spacing w:after="60" w:before="60" w:line="240" w:lineRule="auto"/>
+            </w:pPr>
+            <w:r>
+              <w:rPr>
+                <w:rFonts w:eastAsia="Noto Sans CJK SC"/>
+                <w:b w:val="0"/>
+                <w:sz w:val="18"/>
+              </w:rPr>
+              <w:t>Static（理想检测）</w:t>
+            </w:r>
+          </w:p>
+        </w:tc>
+        <w:tc>
+          <w:tcPr>
+            <w:tcW w:type="dxa" w:w="1247"/>
+            <w:vAlign w:val="center"/>
+          </w:tcPr>
+          <w:p>
+            <w:pPr>
+              <w:spacing w:after="60" w:before="60" w:line="240" w:lineRule="auto"/>
+            </w:pPr>
+            <w:r>
+              <w:rPr>
+                <w:rFonts w:eastAsia="Noto Sans CJK SC"/>
+                <w:b w:val="0"/>
+                <w:sz w:val="18"/>
+              </w:rPr>
+              <w:t>16.7%</w:t>
+            </w:r>
+          </w:p>
+        </w:tc>
+        <w:tc>
+          <w:tcPr>
+            <w:tcW w:type="dxa" w:w="1531"/>
+            <w:vAlign w:val="center"/>
+          </w:tcPr>
+          <w:p>
+            <w:pPr>
+              <w:spacing w:after="60" w:before="60" w:line="240" w:lineRule="auto"/>
+            </w:pPr>
+            <w:r>
+              <w:rPr>
+                <w:rFonts w:eastAsia="Noto Sans CJK SC"/>
+                <w:b w:val="0"/>
+                <w:sz w:val="18"/>
+              </w:rPr>
+              <w:t>—</w:t>
+            </w:r>
+          </w:p>
+        </w:tc>
+        <w:tc>
+          <w:tcPr>
+            <w:tcW w:type="dxa" w:w="1984"/>
+            <w:vAlign w:val="center"/>
+          </w:tcPr>
+          <w:p>
+            <w:pPr>
+              <w:spacing w:after="60" w:before="60" w:line="240" w:lineRule="auto"/>
+            </w:pPr>
+            <w:r>
+              <w:rPr>
+                <w:rFonts w:eastAsia="Noto Sans CJK SC"/>
+                <w:b w:val="0"/>
+                <w:sz w:val="18"/>
+              </w:rPr>
+              <w:t>—</w:t>
+            </w:r>
+          </w:p>
+        </w:tc>
+        <w:tc>
+          <w:tcPr>
+            <w:tcW w:type="dxa" w:w="2608"/>
+            <w:vAlign w:val="center"/>
+          </w:tcPr>
+          <w:p>
+            <w:pPr>
+              <w:spacing w:after="60" w:before="60" w:line="240" w:lineRule="auto"/>
+            </w:pPr>
+            <w:r>
+              <w:rPr>
+                <w:rFonts w:eastAsia="Noto Sans CJK SC"/>
+                <w:b w:val="0"/>
+                <w:sz w:val="18"/>
+              </w:rPr>
+              <w:t>局部回退基线；预算违规 0</w:t>
+            </w:r>
+          </w:p>
+        </w:tc>
+      </w:tr>
+      <w:tr>
+        <w:trPr>
+          <w:cantSplit/>
+        </w:trPr>
+        <w:tc>
+          <w:tcPr>
+            <w:tcW w:type="dxa" w:w="2154"/>
+            <w:vAlign w:val="center"/>
+          </w:tcPr>
+          <w:p>
+            <w:pPr>
+              <w:spacing w:after="60" w:before="60" w:line="240" w:lineRule="auto"/>
+            </w:pPr>
+            <w:r>
+              <w:rPr>
+                <w:rFonts w:eastAsia="Noto Sans CJK SC"/>
+                <w:b w:val="0"/>
+                <w:sz w:val="18"/>
+              </w:rPr>
+              <w:t>Static-Matched（理想检测）</w:t>
+            </w:r>
+          </w:p>
+        </w:tc>
+        <w:tc>
+          <w:tcPr>
+            <w:tcW w:type="dxa" w:w="1247"/>
+            <w:vAlign w:val="center"/>
+          </w:tcPr>
+          <w:p>
+            <w:pPr>
+              <w:spacing w:after="60" w:before="60" w:line="240" w:lineRule="auto"/>
+            </w:pPr>
+            <w:r>
+              <w:rPr>
+                <w:rFonts w:eastAsia="Noto Sans CJK SC"/>
+                <w:b w:val="0"/>
+                <w:sz w:val="18"/>
+              </w:rPr>
+              <w:t>35.0%</w:t>
+            </w:r>
+          </w:p>
+        </w:tc>
+        <w:tc>
+          <w:tcPr>
+            <w:tcW w:type="dxa" w:w="1531"/>
+            <w:vAlign w:val="center"/>
+          </w:tcPr>
+          <w:p>
+            <w:pPr>
+              <w:spacing w:after="60" w:before="60" w:line="240" w:lineRule="auto"/>
+            </w:pPr>
+            <w:r>
+              <w:rPr>
+                <w:rFonts w:eastAsia="Noto Sans CJK SC"/>
+                <w:b w:val="0"/>
+                <w:sz w:val="18"/>
+              </w:rPr>
+              <w:t>+18.3pp</w:t>
+            </w:r>
+          </w:p>
+        </w:tc>
+        <w:tc>
+          <w:tcPr>
+            <w:tcW w:type="dxa" w:w="1984"/>
+            <w:vAlign w:val="center"/>
+          </w:tcPr>
+          <w:p>
+            <w:pPr>
+              <w:spacing w:after="60" w:before="60" w:line="240" w:lineRule="auto"/>
+            </w:pPr>
+            <w:r>
+              <w:rPr>
+                <w:rFonts w:eastAsia="Noto Sans CJK SC"/>
+                <w:b w:val="0"/>
+                <w:sz w:val="18"/>
+              </w:rPr>
+              <w:t>[10.0, 26.7]</w:t>
+            </w:r>
+          </w:p>
+        </w:tc>
+        <w:tc>
+          <w:tcPr>
+            <w:tcW w:type="dxa" w:w="2608"/>
+            <w:vAlign w:val="center"/>
+          </w:tcPr>
+          <w:p>
+            <w:pPr>
+              <w:spacing w:after="60" w:before="60" w:line="240" w:lineRule="auto"/>
+            </w:pPr>
+            <w:r>
+              <w:rPr>
+                <w:rFonts w:eastAsia="Noto Sans CJK SC"/>
+                <w:b w:val="0"/>
+                <w:sz w:val="18"/>
+              </w:rPr>
+              <w:t>静态语义＋升级目标；主要增益来源</w:t>
+            </w:r>
+          </w:p>
+        </w:tc>
+      </w:tr>
+      <w:tr>
+        <w:trPr>
+          <w:cantSplit/>
+        </w:trPr>
+        <w:tc>
+          <w:tcPr>
+            <w:tcW w:type="dxa" w:w="2154"/>
+            <w:vAlign w:val="center"/>
+          </w:tcPr>
+          <w:p>
+            <w:pPr>
+              <w:spacing w:after="60" w:before="60" w:line="240" w:lineRule="auto"/>
+            </w:pPr>
+            <w:r>
+              <w:rPr>
+                <w:rFonts w:eastAsia="Noto Sans CJK SC"/>
+                <w:b w:val="0"/>
+                <w:sz w:val="18"/>
+              </w:rPr>
+              <w:t>Dynamic（理想检测）</w:t>
+            </w:r>
+          </w:p>
+        </w:tc>
+        <w:tc>
+          <w:tcPr>
+            <w:tcW w:type="dxa" w:w="1247"/>
+            <w:vAlign w:val="center"/>
+          </w:tcPr>
+          <w:p>
+            <w:pPr>
+              <w:spacing w:after="60" w:before="60" w:line="240" w:lineRule="auto"/>
+            </w:pPr>
+            <w:r>
+              <w:rPr>
+                <w:rFonts w:eastAsia="Noto Sans CJK SC"/>
+                <w:b w:val="0"/>
+                <w:sz w:val="18"/>
+              </w:rPr>
+              <w:t>36.7%</w:t>
+            </w:r>
+          </w:p>
+        </w:tc>
+        <w:tc>
+          <w:tcPr>
+            <w:tcW w:type="dxa" w:w="1531"/>
+            <w:vAlign w:val="center"/>
+          </w:tcPr>
+          <w:p>
+            <w:pPr>
+              <w:spacing w:after="60" w:before="60" w:line="240" w:lineRule="auto"/>
+            </w:pPr>
+            <w:r>
+              <w:rPr>
+                <w:rFonts w:eastAsia="Noto Sans CJK SC"/>
+                <w:b w:val="0"/>
+                <w:sz w:val="18"/>
+              </w:rPr>
+              <w:t>+20.0pp</w:t>
+            </w:r>
+          </w:p>
+        </w:tc>
+        <w:tc>
+          <w:tcPr>
+            <w:tcW w:type="dxa" w:w="1984"/>
+            <w:vAlign w:val="center"/>
+          </w:tcPr>
+          <w:p>
+            <w:pPr>
+              <w:spacing w:after="60" w:before="60" w:line="240" w:lineRule="auto"/>
+            </w:pPr>
+            <w:r>
+              <w:rPr>
+                <w:rFonts w:eastAsia="Noto Sans CJK SC"/>
+                <w:b w:val="0"/>
+                <w:sz w:val="18"/>
+              </w:rPr>
+              <w:t>[11.7, 28.3]</w:t>
+            </w:r>
+          </w:p>
+        </w:tc>
+        <w:tc>
+          <w:tcPr>
+            <w:tcW w:type="dxa" w:w="2608"/>
+            <w:vAlign w:val="center"/>
+          </w:tcPr>
+          <w:p>
+            <w:pPr>
+              <w:spacing w:after="60" w:before="60" w:line="240" w:lineRule="auto"/>
+            </w:pPr>
+            <w:r>
+              <w:rPr>
+                <w:rFonts w:eastAsia="Noto Sans CJK SC"/>
+                <w:b w:val="0"/>
+                <w:sz w:val="18"/>
+              </w:rPr>
+              <w:t>McNemar b=28／c=4，p≈1.9×10⁻⁵；策略额外贡献 +1.7pp（CI [−4.2,+7.5]，p=0.77）</w:t>
+            </w:r>
+          </w:p>
+        </w:tc>
+      </w:tr>
+      <w:tr>
+        <w:trPr>
+          <w:cantSplit/>
+        </w:trPr>
+        <w:tc>
+          <w:tcPr>
+            <w:tcW w:type="dxa" w:w="2154"/>
+            <w:vAlign w:val="center"/>
+          </w:tcPr>
+          <w:p>
+            <w:pPr>
+              <w:spacing w:after="60" w:before="60" w:line="240" w:lineRule="auto"/>
+            </w:pPr>
+            <w:r>
+              <w:rPr>
+                <w:rFonts w:eastAsia="Noto Sans CJK SC"/>
+                <w:b w:val="0"/>
+                <w:sz w:val="18"/>
+              </w:rPr>
+              <w:t>Dynamic-RealDetector（部署信号）</w:t>
+            </w:r>
+          </w:p>
+        </w:tc>
+        <w:tc>
+          <w:tcPr>
+            <w:tcW w:type="dxa" w:w="1247"/>
+            <w:vAlign w:val="center"/>
+          </w:tcPr>
+          <w:p>
+            <w:pPr>
+              <w:spacing w:after="60" w:before="60" w:line="240" w:lineRule="auto"/>
+            </w:pPr>
+            <w:r>
+              <w:rPr>
+                <w:rFonts w:eastAsia="Noto Sans CJK SC"/>
+                <w:b w:val="0"/>
+                <w:sz w:val="18"/>
+              </w:rPr>
+              <w:t>35.0%</w:t>
+            </w:r>
+          </w:p>
+        </w:tc>
+        <w:tc>
+          <w:tcPr>
+            <w:tcW w:type="dxa" w:w="1531"/>
+            <w:vAlign w:val="center"/>
+          </w:tcPr>
+          <w:p>
+            <w:pPr>
+              <w:spacing w:after="60" w:before="60" w:line="240" w:lineRule="auto"/>
+            </w:pPr>
+            <w:r>
+              <w:rPr>
+                <w:rFonts w:eastAsia="Noto Sans CJK SC"/>
+                <w:b w:val="0"/>
+                <w:sz w:val="18"/>
+              </w:rPr>
+              <w:t>+18.3pp</w:t>
+            </w:r>
+          </w:p>
+        </w:tc>
+        <w:tc>
+          <w:tcPr>
+            <w:tcW w:type="dxa" w:w="1984"/>
+            <w:vAlign w:val="center"/>
+          </w:tcPr>
+          <w:p>
+            <w:pPr>
+              <w:spacing w:after="60" w:before="60" w:line="240" w:lineRule="auto"/>
+            </w:pPr>
+            <w:r>
+              <w:rPr>
+                <w:rFonts w:eastAsia="Noto Sans CJK SC"/>
+                <w:b w:val="0"/>
+                <w:sz w:val="18"/>
+              </w:rPr>
+              <w:t>—</w:t>
+            </w:r>
+          </w:p>
+        </w:tc>
+        <w:tc>
+          <w:tcPr>
+            <w:tcW w:type="dxa" w:w="2608"/>
+            <w:vAlign w:val="center"/>
+          </w:tcPr>
+          <w:p>
+            <w:pPr>
+              <w:spacing w:after="60" w:before="60" w:line="240" w:lineRule="auto"/>
+            </w:pPr>
+            <w:r>
+              <w:rPr>
+                <w:rFonts w:eastAsia="Noto Sans CJK SC"/>
+                <w:b w:val="0"/>
+                <w:sz w:val="18"/>
+              </w:rPr>
+              <w:t>增益保留率 91.7%（CI [77.8%, 100%]）；与理想检测无显著差异（b=2／c=0，p=0.5）</w:t>
+            </w:r>
+          </w:p>
+        </w:tc>
+      </w:tr>
+    </w:tbl>
+    <w:p>
+      <w:pPr>
+        <w:pStyle w:val="BodyText"/>
+      </w:pPr>
+      <w:r>
         <w:rPr>
           <w:b/>
         </w:rPr>
@@ -10337,7 +10960,7 @@
         <w:spacing w:before="160"/>
       </w:pPr>
       <w:r>
-        <w:t xml:space="preserve">表 4-13 固定恢复动作的真实失败覆盖</w:t>
+        <w:t xml:space="preserve">表 4-14 固定恢复动作的真实失败覆盖</w:t>
       </w:r>
     </w:p>
     <w:tbl>
@@ -10969,7 +11592,7 @@
         <w:rPr>
           <w:b/>
         </w:rPr>
-        <w:t xml:space="preserve">Dynamic cannot create missing capability：即使动作选择完全正确，也无法恢复该固定集合没有成功输出的节点</w:t>
+        <w:t xml:space="preserve">动态适应不能创造缺失的能力（Dynamic cannot create missing capability）：即使动作选择完全正确，也无法恢复该固定集合没有成功输出的节点</w:t>
       </w:r>
       <w:r>
         <w:t xml:space="preserve">。这一结论仅限该困难集合及固定模型、提示与动作，不是所有任务的唯一瓶颈。两个再次调用的真实恢复案例并未保持原提示，因此不证明零温度同提示重试有效。局部子图重规划在独立开发的 40 节点上仅成功 1 个，加入后动作并集仍为 4/40，新增覆盖为零，按既有规则判定 NO-GO。拓扑变化没有自动扩展覆盖，不作为本文正贡献。</w:t>
@@ -11000,7 +11623,7 @@
         <w:spacing w:before="160"/>
       </w:pPr>
       <w:r>
-        <w:t xml:space="preserve">表 4-14 四动作顺序策略的剩余预算响应</w:t>
+        <w:t xml:space="preserve">表 4-15 四动作顺序策略的剩余预算响应</w:t>
       </w:r>
     </w:p>
     <w:tbl>
@@ -11531,16 +12154,7 @@
         <w:pStyle w:val="FirstParagraph"/>
       </w:pPr>
       <w:r>
-        <w:t xml:space="preserve">已有结构感知解析诊断关注原同模型链共同失败的开发子集。零调用审计（</w:t>
-      </w:r>
-      <w:r>
-        <w:rPr>
-          <w:rStyle w:val="VerbatimChar"/>
-        </w:rPr>
-        <w:t xml:space="preserve">EVIDENCE_DIAGNOSIS_AUDIT.json</w:t>
-      </w:r>
-      <w:r>
-        <w:t xml:space="preserve">，含 commit 与全部输入哈希）给出其可复核边界：25 个结构推理应答全部可解析，按冻结评分器重打分 Q = 0/25，与保存的评分汇总一致；但</w:t>
+        <w:t xml:space="preserve">已有结构感知解析诊断关注原同模型链共同失败的开发子集。零调用审计（零调用审计，证据编号见 FINAL_CLAIM_AUDIT）给出其可复核边界：25 个结构推理应答全部可解析，按冻结评分器重打分 Q = 0/25，与保存的评分汇总一致；但</w:t>
       </w:r>
       <w:r>
         <w:t xml:space="preserve">“</w:t>
@@ -11572,7 +12186,7 @@
         <w:pStyle w:val="BodyText"/>
       </w:pPr>
       <w:r>
-        <w:t xml:space="preserve">对 D2—D4 变体：保存应答各 25/25 可解析，但配对输入未冻结，成功率不可重算，本文不报告任何来自会话记录的百分比；D0、D1 与 Dev-25 上的 gold-facts 臂没有已定位的冻结输出，相应口头数字（0%、4%）同样无审计工件支持。作为补充，对 100 个 large 抽取→medium 推理失败任务上已冻结但此前未评分的证据重建调用进行首次评分：S0 基线／S1 重抽取／S2 跨模型／S3 定向缺失证据重建的 Q = 8%／8%／5%／8%，基线抽取操作数覆盖均值仅 35.4%——即使让模型主动检索缺失量并合并证据，成功率也不高于基线（探索性分析，非预注册）。</w:t>
+        <w:t xml:space="preserve">对 D2—D4 变体：保存应答各 25/25 可解析，但配对输入未冻结，成功率不可重算，本文不报告任何来自会话记录的百分比；D0、D1 与 Dev-25 上的 gold-facts 臂没有已定位的冻结输出，相应未留档数字（0%、4%）同样无审计工件支持。作为补充，对 100 个 large 抽取→medium 推理失败任务上已冻结但此前未评分的证据重建调用进行首次评分：S0 基线／S1 重抽取／S2 跨模型／S3 定向缺失证据重建的 Q = 8%／8%／5%／8%，基线抽取操作数覆盖均值仅 35.4%——即使让模型主动检索缺失量并合并证据，成功率也不高于基线（探索性分析，非预注册）。</w:t>
       </w:r>
     </w:p>
     <w:p>
@@ -11649,7 +12263,7 @@
         <w:t xml:space="preserve">正式 Math500 面板</w:t>
       </w:r>
       <w:r>
-        <w:t xml:space="preserve">（100 任务，按答案类型分层抽样，FROZEN_BEFORE_EXECUTION，534 次调用，评分器为冻结的 LaTeX 归一化 + sympy 精确等价，对 500/500 个 gold 可解析）：单体 large 54.0%、查询路由 50.0%、单体 medium 49.0%，三个 DAG 臂 13.0%—16.0%（节点路由 13.0%、静态 15.0%、动态 16.0%；静态对 large −39.0pp，CI [−50,−27]；动态对静态 +1.0pp，b=1/c=0 无差异；有限候选 Oracle 64%）。阶段诊断显示损失分两层：给定计划的求解节点正确率仅 32%（medium 求解能力不足——冻结自财务域的阶段分配先验在此域失配），校验节点再把已答对的一半改错（32%→15%，校验覆盖规则将最终答案推向更弱的 coder 模型）。两类已测试的中间产物式分解接口（</w:t>
+        <w:t xml:space="preserve">（100 任务，按答案类型分层抽样，FROZEN_BEFORE_EXECUTION，534 次调用，评分器为冻结的 LaTeX 归一化 + sympy 精确等价，对 500/500 个 gold 可解析）：单体 large 54.0%、查询路由 50.0%、单体 medium 49.0%，三个 DAG 臂 13.0%—16.0%（节点路由 13.0%、静态 15.0%、动态 16.0%；静态对 large −39.0pp，CI [−50,−27]；动态对静态 +1.0pp，b=1/c=0 无差异；有限候选 Oracle（六臂已执行单元内取最优）64%）。阶段诊断显示损失分两层：给定计划的求解节点正确率仅 32%（medium 求解能力不足——冻结自财务域的阶段分配先验在此域失配），校验节点再把已答对的一半改错（32%→15%，校验覆盖规则将最终答案推向更弱的 coder 模型）。两类已测试的中间产物式分解接口（</w:t>
       </w:r>
       <w:r>
         <w:t xml:space="preserve">“</w:t>
@@ -11687,7 +12301,7 @@
         <w:t xml:space="preserve">正式 MBPP 面板</w:t>
       </w:r>
       <w:r>
-        <w:t xml:space="preserve">（100 任务，单元测试为确定性评分与部署反馈，FROZEN_BEFORE_EXECUTION）：代码域采用与财务域不同的自然节点接口——规划→代码生成→单元测试→修复/校验，语法错误、运行时错误、断言失败均为部署可得信号，全程不读取参考实现。六臂结果：单体 medium 68.0%、large 76.0%、查询路由 71.0%、阶段分配 73.0%、静态 74.0%、动态真实（Dynamic-Real）80.0%（有限候选 Oracle 87.0%）。配对对比：动态对静态 +6.0pp，95% CI [+1.0, +12.0] 不含零（Help/Harm = 7/1；McNemar 精确 p = 0.070，两种检验在 0.05 阈值上的分歧如实报告）；恢复率（初始失败→最终通过）7/26 = 26.9%；修复共 49 次；代价为动态 +95.7 tokens（+11.9%）且预算违规 22/100。该正向效应按冻结表述规范为方向明确的支持性证据，不宣称稳定统计显著。其余对比均不显著：阶段分配对查询路由 +2.0pp（CI [−7, +11]），静态对单体 large −2.0pp，动态对单体 large +4.0pp（CI [−3, +11]）。</w:t>
+        <w:t xml:space="preserve">（100 任务，单元测试为确定性评分与部署反馈，FROZEN_BEFORE_EXECUTION）：代码域采用与财务域不同的自然节点接口——规划→代码生成→单元测试→修复/校验，语法错误、运行时错误、断言失败均为部署可得信号，全程不读取参考实现。六臂结果：单体 medium 68.0%、large 76.0%、查询路由 71.0%、阶段分配 73.0%、静态 74.0%、动态真实（Dynamic-Real）80.0%（有限候选 Oracle（节点—模型候选矩阵内取最优）87.0%）。配对对比：动态对静态 +6.0pp，95% CI [+1.0, +12.0] 不含零（Help/Harm = 7/1；McNemar 精确 p = 0.070，两种检验在 0.05 阈值上的分歧如实报告）；恢复率（初始失败→最终通过）7/26 = 26.9%；修复共 49 次；代价为动态 +95.7 tokens（+11.9%）且预算违规 22/100。该正向效应按冻结表述规范为方向明确的支持性证据，不宣称稳定统计显著。其余对比均不显著：阶段分配对查询路由 +2.0pp（CI [−7, +11]），静态对单体 large −2.0pp，动态对单体 large +4.0pp（CI [−3, +11]）。</w:t>
       </w:r>
     </w:p>
     <w:p>
@@ -11697,7 +12311,7 @@
         <w:spacing w:before="160"/>
       </w:pPr>
       <w:r>
-        <w:t xml:space="preserve">表 4-15 跨域六臂对照总表</w:t>
+        <w:t xml:space="preserve">表 4-16 跨域六臂对照总表</w:t>
       </w:r>
     </w:p>
     <w:tbl>
@@ -12260,7 +12874,7 @@
         <w:spacing w:before="160"/>
       </w:pPr>
       <w:r>
-        <w:t xml:space="preserve">表 4-16 外部方法比较（同池同面板同评分器同预算规则）</w:t>
+        <w:t xml:space="preserve">表 4-17 外部方法比较（同池同面板同评分器同预算规则）</w:t>
       </w:r>
     </w:p>
     <w:tbl>
@@ -13243,6 +13857,14 @@
         <w:pStyle w:val="BodyText"/>
       </w:pPr>
       <w:r>
+        <w:t xml:space="preserve">表注：成本为 TAT-QA-200 面板任务均值（4.3 中 1737→2189 为 300 题总体均值，二者口径不同）；所有方法执行同一预算规则（每任务 max(200, 1.2×静态实际 tokens)）与调用上限（级联 ≤2 次、Self-Refine 财务恰好 2 次／代码 ≤2 次修订、路由 1 次决策），违规率见表内。</w:t>
+      </w:r>
+    </w:p>
+    <w:p>
+      <w:pPr>
+        <w:pStyle w:val="BodyText"/>
+      </w:pPr>
+      <w:r>
         <w:t xml:space="preserve">注：Finance 列 40.0% 是异构静态阶段分配 DAG-L/M，不是 Dynamic-Real——Dynamic-Real 从未在 TAT-QA-200 面板上运行。RouteLLM-style 在本文冻结模型池与训练分布下未产生有效切换、退化为始终选择 large；这不应外推为对 RouteLLM 方法本身的判断。配对统计（FINAL_EXPERIMENT_AUDIT.json）：Code 上 cascade 对 Always-Large +5.0pp，bootstrap CI [+1,+10] 但 exact McNemar p=0.0625 未达显著；Self-Refine 对 Always-Large +9.0pp，CI [+4,+15]，McNemar p=0.0039 显著；</w:t>
       </w:r>
       <w:r>
@@ -13689,7 +14311,7 @@
         <w:pStyle w:val="BodyText"/>
       </w:pPr>
       <w:r>
-        <w:t xml:space="preserve">本文证据的总体边界：精确 Oracle 仅覆盖已枚举的组合空间，完整动态策略空间没有全局最优；动态真实调用面板规模有限且部分读取评价答案；不同面板与估计对象不可拼接；模型池存在大量共同失败、成本异质性有限；服务时间不包含全部启动、排队与调度开销。这些限制共同决定本文结论适合表述为阶段互补、执行边界与选择性适应的机制分析，而不是一个在所有复杂任务上全面占优的系统。三个条件——Capability Match、Interface Adequacy、Feedback Diagnosability——是条件关系而非数值模型，其正反两侧证据（财务节点分配与 MBPP 动态修复为正，数学塌缩与财务级联/自精修为反）均来自冻结协议的一次性运行。</w:t>
+        <w:t xml:space="preserve">本文证据的总体边界：精确 Oracle 仅覆盖已枚举的组合空间，完整动态策略空间没有全局最优；动态真实调用面板规模有限且部分读取评价答案；不同面板与估计对象不可拼接；模型池存在大量共同失败、成本异质性有限；服务时间不包含全部启动、排队与调度开销。这些限制共同决定本文结论适合表述为阶段互补、执行边界与选择性适应的机制分析，而不是一个在所有复杂任务上全面占优的系统。需要明确三个条件的证据强度并不相同：反馈可诊断性拥有受控降级重放证据（MBPP 隐藏断言重放），能力匹配拥有同先验跨域反转证据（财务先验在数学域 −37.0pp），接口表达能力则主要是配对基准与逐题失败分析的观察性证据——三者不构成可外推的充分条件。；三者是条件关系而非数值模型，其正反两侧证据（财务节点分配与 MBPP 动态修复为正，数学塌缩与财务级联/自精修为反）均来自冻结协议的一次性运行。</w:t>
       </w:r>
     </w:p>
     <w:p>
@@ -13807,7 +14429,259 @@
         <w:pStyle w:val="BodyText"/>
       </w:pPr>
       <w:r>
-        <w:t xml:space="preserve">这些结论受限于枚举的 3×3 组合空间、尚未优化的完整动态策略空间、大量共同失败、有限的成本与时延异质性、不稳定的剩余路由泛化，以及困难子集上较低的恢复覆盖。未来方向包括：任务复杂度的结构选择（在单体与 DAG 之间按预期分解损失自适应决策，本文的复杂度分层与双选 Oracle 已给出该问题的头room 证据）、更强且更异质的模型池、扩展现有确定性执行器的符号与程序能力、更丰富的工具支持与证据推理、更可靠的选择性覆盖，以及更大动态策略空间中的近似最优决策。这些方向不属于本文已经完成并验证的机制。</w:t>
+        <w:t xml:space="preserve">这些结论受限于枚举的 3×3 组合空间、尚未优化的完整动态策略空间、大量共同失败、有限的成本与时延异质性、不稳定的剩余路由泛化，以及困难子集上较低的恢复覆盖。未来方向包括：任务复杂度的结构选择（在单体与 DAG 之间按预期分解损失自适应决策，本文的复杂度分层已给出描述性证据）、更强且更异质的模型池、扩展现有确定性执行器的符号与程序能力、更丰富的工具支持与证据推理、更可靠的选择性覆盖，以及更大动态策略空间中的近似最优决策。这些方向不属于本文已经完成并验证的机制。</w:t>
+      </w:r>
+    </w:p>
+    <w:p>
+      <w:pPr>
+        <w:pStyle w:val="Heading2"/>
+      </w:pPr>
+      <w:bookmarkStart w:id="68" w:name="参考文献"/>
+      <w:r>
+        <w:t xml:space="preserve">参考文献</w:t>
+      </w:r>
+      <w:bookmarkEnd w:id="68"/>
+    </w:p>
+    <w:p>
+      <w:pPr>
+        <w:pStyle w:val="FirstParagraph"/>
+      </w:pPr>
+      <w:r>
+        <w:t xml:space="preserve">[1] Ong, I., et al. RouteLLM: Learning to Route LLMs with Preference Data. 2024. arXiv:2406.18665.</w:t>
+      </w:r>
+      <w:r>
+        <w:t xml:space="preserve"> </w:t>
+      </w:r>
+      <w:hyperlink r:id="rId69">
+        <w:r>
+          <w:rPr>
+            <w:rStyle w:val="Hyperlink"/>
+          </w:rPr>
+          <w:t xml:space="preserve">原文</w:t>
+        </w:r>
+      </w:hyperlink>
+      <w:r>
+        <w:t xml:space="preserve">.</w:t>
+      </w:r>
+    </w:p>
+    <w:p>
+      <w:pPr>
+        <w:pStyle w:val="BodyText"/>
+      </w:pPr>
+      <w:r>
+        <w:t xml:space="preserve">[2] Chen, L., Zaharia, M., and Zou, J. FrugalGPT: How to Use Large Language Models While Reducing Cost and Improving Performance. 2023. arXiv:2305.05176.</w:t>
+      </w:r>
+      <w:r>
+        <w:t xml:space="preserve"> </w:t>
+      </w:r>
+      <w:hyperlink r:id="rId70">
+        <w:r>
+          <w:rPr>
+            <w:rStyle w:val="Hyperlink"/>
+          </w:rPr>
+          <w:t xml:space="preserve">原文</w:t>
+        </w:r>
+      </w:hyperlink>
+      <w:r>
+        <w:t xml:space="preserve">.</w:t>
+      </w:r>
+    </w:p>
+    <w:p>
+      <w:pPr>
+        <w:pStyle w:val="BodyText"/>
+      </w:pPr>
+      <w:r>
+        <w:t xml:space="preserve">[3] Kim, S., et al. An LLM Compiler for Parallel Function Calling. 2024 年修订版，arXiv:2312.04511v3.</w:t>
+      </w:r>
+      <w:r>
+        <w:t xml:space="preserve"> </w:t>
+      </w:r>
+      <w:hyperlink r:id="rId71">
+        <w:r>
+          <w:rPr>
+            <w:rStyle w:val="Hyperlink"/>
+          </w:rPr>
+          <w:t xml:space="preserve">原文</w:t>
+        </w:r>
+      </w:hyperlink>
+      <w:r>
+        <w:t xml:space="preserve">.</w:t>
+      </w:r>
+    </w:p>
+    <w:p>
+      <w:pPr>
+        <w:pStyle w:val="BodyText"/>
+      </w:pPr>
+      <w:r>
+        <w:t xml:space="preserve">[4] Madaan, A., et al. Self-Refine: Iterative Refinement with Self-Feedback. 2023. arXiv:2303.17651.</w:t>
+      </w:r>
+      <w:r>
+        <w:t xml:space="preserve"> </w:t>
+      </w:r>
+      <w:hyperlink r:id="rId72">
+        <w:r>
+          <w:rPr>
+            <w:rStyle w:val="Hyperlink"/>
+          </w:rPr>
+          <w:t xml:space="preserve">原文</w:t>
+        </w:r>
+      </w:hyperlink>
+      <w:r>
+        <w:t xml:space="preserve">.</w:t>
+      </w:r>
+    </w:p>
+    <w:p>
+      <w:pPr>
+        <w:pStyle w:val="BodyText"/>
+      </w:pPr>
+      <w:r>
+        <w:t xml:space="preserve">[5] Wang, Z. Z., Mao, J., Fried, D., and Neubig, G. Agent Workflow Memory. 2024. arXiv:2409.07429.</w:t>
+      </w:r>
+      <w:r>
+        <w:t xml:space="preserve"> </w:t>
+      </w:r>
+      <w:hyperlink r:id="rId73">
+        <w:r>
+          <w:rPr>
+            <w:rStyle w:val="Hyperlink"/>
+          </w:rPr>
+          <w:t xml:space="preserve">原文</w:t>
+        </w:r>
+      </w:hyperlink>
+      <w:r>
+        <w:t xml:space="preserve">.</w:t>
+      </w:r>
+    </w:p>
+    <w:p>
+      <w:pPr>
+        <w:pStyle w:val="BodyText"/>
+      </w:pPr>
+      <w:r>
+        <w:t xml:space="preserve">[6] MultiHiertt: Numerical Reasoning over Multi Hierarchical Tabular and Textual Data. ACL 2022.</w:t>
+      </w:r>
+      <w:r>
+        <w:t xml:space="preserve"> </w:t>
+      </w:r>
+      <w:hyperlink r:id="rId74">
+        <w:r>
+          <w:rPr>
+            <w:rStyle w:val="Hyperlink"/>
+          </w:rPr>
+          <w:t xml:space="preserve">正式论文页面</w:t>
+        </w:r>
+      </w:hyperlink>
+      <w:r>
+        <w:t xml:space="preserve">.</w:t>
+      </w:r>
+    </w:p>
+    <w:p>
+      <w:pPr>
+        <w:pStyle w:val="BodyText"/>
+      </w:pPr>
+      <w:r>
+        <w:t xml:space="preserve">[7] TAT-QA: A Question Answering Benchmark on a Hybrid of Tabular and Textual Content in Finance. ACL-IJCNLP 2021.</w:t>
+      </w:r>
+      <w:r>
+        <w:t xml:space="preserve"> </w:t>
+      </w:r>
+      <w:hyperlink r:id="rId75">
+        <w:r>
+          <w:rPr>
+            <w:rStyle w:val="Hyperlink"/>
+          </w:rPr>
+          <w:t xml:space="preserve">正式论文页面</w:t>
+        </w:r>
+      </w:hyperlink>
+      <w:r>
+        <w:t xml:space="preserve">.</w:t>
+      </w:r>
+    </w:p>
+    <w:p>
+      <w:pPr>
+        <w:pStyle w:val="BodyText"/>
+      </w:pPr>
+      <w:r>
+        <w:t xml:space="preserve">[8] Hendrycks, D., Burns, C., Kadavath, S., Arora, A., Basart, S., Tang, E., Song, D., and Steinhardt, J. Measuring Mathematical Problem Solving With the MATH Dataset. NeurIPS 2021.</w:t>
+      </w:r>
+      <w:r>
+        <w:t xml:space="preserve"> </w:t>
+      </w:r>
+      <w:hyperlink r:id="rId76">
+        <w:r>
+          <w:rPr>
+            <w:rStyle w:val="Hyperlink"/>
+          </w:rPr>
+          <w:t xml:space="preserve">正式论文页面</w:t>
+        </w:r>
+      </w:hyperlink>
+      <w:r>
+        <w:t xml:space="preserve">.</w:t>
+      </w:r>
+    </w:p>
+    <w:p>
+      <w:pPr>
+        <w:pStyle w:val="BodyText"/>
+      </w:pPr>
+      <w:r>
+        <w:t xml:space="preserve">[9] Lightman, H., Kosaraju, V., Burda, Y., Edwards, H., Baker, B., Leike, J., Schulman, J., Sutskever, I., and Cobbe, K. Let’s Verify Step by Step. ICLR 2024.</w:t>
+      </w:r>
+      <w:r>
+        <w:t xml:space="preserve"> </w:t>
+      </w:r>
+      <w:hyperlink r:id="rId77">
+        <w:r>
+          <w:rPr>
+            <w:rStyle w:val="Hyperlink"/>
+          </w:rPr>
+          <w:t xml:space="preserve">正式论文页面</w:t>
+        </w:r>
+      </w:hyperlink>
+      <w:r>
+        <w:t xml:space="preserve">.（MATH-500 子集由该工作引入）</w:t>
+      </w:r>
+    </w:p>
+    <w:p>
+      <w:pPr>
+        <w:pStyle w:val="BodyText"/>
+      </w:pPr>
+      <w:r>
+        <w:t xml:space="preserve">[10] Austin, J., Odena, A., Nye, M., Bosma, M., Michalewski, H., Dohan, D., Jiang, E., Cai, C., Terry, M., Le, Q., and Sutton, C. Program Synthesis with Large Language Models. TMLR 2021.</w:t>
+      </w:r>
+      <w:r>
+        <w:t xml:space="preserve"> </w:t>
+      </w:r>
+      <w:hyperlink r:id="rId78">
+        <w:r>
+          <w:rPr>
+            <w:rStyle w:val="Hyperlink"/>
+          </w:rPr>
+          <w:t xml:space="preserve">正式论文页面</w:t>
+        </w:r>
+      </w:hyperlink>
+      <w:r>
+        <w:t xml:space="preserve">.（MBPP 974 任务及测试划分）</w:t>
+      </w:r>
+    </w:p>
+    <w:p>
+      <w:pPr>
+        <w:pStyle w:val="BodyText"/>
+      </w:pPr>
+      <w:r>
+        <w:t xml:space="preserve">[11] Kwon, W., Li, Z., Zhuang, S., Sheng, Y., Zheng, L., Yu, C. H., Gonzalez, J. E., Zhang, H., and Stoica, I. Efficient Memory Management for Large Language Model Serving with PagedAttention (vLLM). SOSP 2023.</w:t>
+      </w:r>
+      <w:r>
+        <w:t xml:space="preserve"> </w:t>
+      </w:r>
+      <w:hyperlink r:id="rId79">
+        <w:r>
+          <w:rPr>
+            <w:rStyle w:val="Hyperlink"/>
+          </w:rPr>
+          <w:t xml:space="preserve">正式论文页面</w:t>
+        </w:r>
+      </w:hyperlink>
+      <w:r>
+        <w:t xml:space="preserve">.</w:t>
       </w:r>
     </w:p>
     <w:sectPr>
@@ -14133,6 +15007,109 @@
       </w:pPr>
     </w:lvl>
   </w:abstractNum>
+  <w:abstractNum w:abstractNumId="991">
+    <w:nsid w:val="ea454b4c"/>
+    <w:multiLevelType w:val="multilevel"/>
+    <w:lvl w:ilvl="0">
+      <w:numFmt w:val="bullet"/>
+      <w:lvlText w:val="•"/>
+      <w:lvlJc w:val="left"/>
+      <w:pPr>
+        <w:tabs>
+          <w:tab w:val="num" w:pos="0"/>
+        </w:tabs>
+        <w:ind w:left="480" w:hanging="480"/>
+      </w:pPr>
+    </w:lvl>
+    <w:lvl w:ilvl="1">
+      <w:numFmt w:val="bullet"/>
+      <w:lvlText w:val="–"/>
+      <w:lvlJc w:val="left"/>
+      <w:pPr>
+        <w:tabs>
+          <w:tab w:val="num" w:pos="720"/>
+        </w:tabs>
+        <w:ind w:left="1200" w:hanging="480"/>
+      </w:pPr>
+    </w:lvl>
+    <w:lvl w:ilvl="2">
+      <w:numFmt w:val="bullet"/>
+      <w:lvlText w:val="•"/>
+      <w:lvlJc w:val="left"/>
+      <w:pPr>
+        <w:tabs>
+          <w:tab w:val="num" w:pos="1440"/>
+        </w:tabs>
+        <w:ind w:left="1920" w:hanging="480"/>
+      </w:pPr>
+    </w:lvl>
+    <w:lvl w:ilvl="3">
+      <w:numFmt w:val="bullet"/>
+      <w:lvlText w:val="–"/>
+      <w:lvlJc w:val="left"/>
+      <w:pPr>
+        <w:tabs>
+          <w:tab w:val="num" w:pos="2160"/>
+        </w:tabs>
+        <w:ind w:left="2640" w:hanging="480"/>
+      </w:pPr>
+    </w:lvl>
+    <w:lvl w:ilvl="4">
+      <w:numFmt w:val="bullet"/>
+      <w:lvlText w:val="•"/>
+      <w:lvlJc w:val="left"/>
+      <w:pPr>
+        <w:tabs>
+          <w:tab w:val="num" w:pos="2880"/>
+        </w:tabs>
+        <w:ind w:left="3360" w:hanging="480"/>
+      </w:pPr>
+    </w:lvl>
+    <w:lvl w:ilvl="5">
+      <w:numFmt w:val="bullet"/>
+      <w:lvlText w:val="–"/>
+      <w:lvlJc w:val="left"/>
+      <w:pPr>
+        <w:tabs>
+          <w:tab w:val="num" w:pos="3600"/>
+        </w:tabs>
+        <w:ind w:left="4080" w:hanging="480"/>
+      </w:pPr>
+    </w:lvl>
+    <w:lvl w:ilvl="6">
+      <w:numFmt w:val="bullet"/>
+      <w:lvlText w:val="•"/>
+      <w:lvlJc w:val="left"/>
+      <w:pPr>
+        <w:tabs>
+          <w:tab w:val="num" w:pos="4320"/>
+        </w:tabs>
+        <w:ind w:left="4800" w:hanging="480"/>
+      </w:pPr>
+    </w:lvl>
+    <w:lvl w:ilvl="7">
+      <w:numFmt w:val="bullet"/>
+      <w:lvlText w:val="–"/>
+      <w:lvlJc w:val="left"/>
+      <w:pPr>
+        <w:tabs>
+          <w:tab w:val="num" w:pos="5040"/>
+        </w:tabs>
+        <w:ind w:left="5520" w:hanging="480"/>
+      </w:pPr>
+    </w:lvl>
+    <w:lvl w:ilvl="8">
+      <w:numFmt w:val="bullet"/>
+      <w:lvlText w:val="•"/>
+      <w:lvlJc w:val="left"/>
+      <w:pPr>
+        <w:tabs>
+          <w:tab w:val="num" w:pos="5760"/>
+        </w:tabs>
+        <w:ind w:left="6240" w:hanging="480"/>
+      </w:pPr>
+    </w:lvl>
+  </w:abstractNum>
   <w:num w:numId="1">
     <w:abstractNumId w:val="8"/>
   </w:num>
@@ -14162,6 +15139,9 @@
   </w:num>
   <w:num w:numId="1000">
     <w:abstractNumId w:val="990"/>
+  </w:num>
+  <w:num w:numId="1001">
+    <w:abstractNumId w:val="991"/>
   </w:num>
 </w:numbering>
 </file>

</xml_diff>

<commit_message>
final text-only fixes + CONTENT FROZEN FOR SUBMISSION: A1 gap paragraph relocated to end of ch2; A2 broken sentence in 5.4 repaired; A3 nested duplicates x2 removed; B1 filename cleared; B2 all 12 tables now have explicit prose refs (+ fig 3-1/5-1 refs); B3/B4 whitespace; conclusion paragraph split at 其一/其二/其三; token-level verification vs git HEAD: +28 added tokens = table/figure reference labels ONLY, 0 removed/changed (frozen numbers untouched); checks green (18 tables, 25 pages, 0 out-of-page)
</commit_message>
<xml_diff>
--- a/r3_own_pool/paper_method_feedback_aware_dag/最终整合_20260921/论文完整草稿.docx
+++ b/r3_own_pool/paper_method_feedback_aware_dag/最终整合_20260921/论文完整草稿.docx
@@ -461,6 +461,26 @@
     </w:p>
     <w:p>
       <w:pPr>
+        <w:pStyle w:val="BodyText"/>
+      </w:pPr>
+      <w:r>
+        <w:t xml:space="preserve">综上，已有工作分别处理整题级路由（RouteLLM）、成本感知级联（FrugalGPT）、答案级迭代精修（Self-Refine）与函数调用编排（LLMCompiler）。据本文所知，同一冻结模型池内</w:t>
+      </w:r>
+      <w:r>
+        <w:t xml:space="preserve">“</w:t>
+      </w:r>
+      <w:r>
+        <w:t xml:space="preserve">节点级异构分配＋依赖感知的局部动态调整＋适用边界的机制分析</w:t>
+      </w:r>
+      <w:r>
+        <w:t xml:space="preserve">”</w:t>
+      </w:r>
+      <w:r>
+        <w:t xml:space="preserve">这一组合尚未被同时研究：整题级方法不利用阶段粒度，答案级方法不处理依赖传播，编排方法不以多模型分工为对象；且这些方法的收益条件本身缺少统一面板下的对照证据。本文在第 4 章的严格配对基准与 4.10.2 的统一外部基线比较中同时填补这两点。</w:t>
+      </w:r>
+    </w:p>
+    <w:p>
+      <w:pPr>
         <w:pStyle w:val="Heading2"/>
       </w:pPr>
       <w:bookmarkStart w:id="32" w:name="方法"/>
@@ -492,7 +512,7 @@
         <w:pStyle w:val="BodyText"/>
       </w:pPr>
       <w:r>
-        <w:t xml:space="preserve">整体流程为能力画像→控制路由→复杂任务分解→初始 DAG→静态／动态执行→选择性调整→预算控制→历史图复用。</w:t>
+        <w:t xml:space="preserve">整体流程为能力画像→控制路由→复杂任务分解→初始 DAG→静态／动态执行→选择性调整→预算控制→历史图复用（图 3-1）。</w:t>
       </w:r>
     </w:p>
     <w:p>
@@ -1909,19 +1929,7 @@
         <w:pStyle w:val="BodyText"/>
       </w:pPr>
       <w:r>
-        <w:t xml:space="preserve">综上，已有工作分别处理整题级路由（RouteLLM）、成本感知级联（FrugalGPT）、答案级迭代精修（Self-Refine）与函数调用编排（LLMCompiler）。据本文所知，同一冻结模型池内</w:t>
-      </w:r>
-      <w:r>
-        <w:t xml:space="preserve">“</w:t>
-      </w:r>
-      <w:r>
-        <w:t xml:space="preserve">节点级异构分配＋依赖感知的局部动态调整＋适用边界的机制分析</w:t>
-      </w:r>
-      <w:r>
-        <w:t xml:space="preserve">”</w:t>
-      </w:r>
-      <w:r>
-        <w:t xml:space="preserve">这一组合尚未被同时研究：整题级方法不利用阶段粒度，答案级方法不处理依赖传播，编排方法不以多模型分工为对象；且这些方法的收益条件本身缺少统一面板下的对照证据。本文在第 4 章的严格配对基准与 4.10.2 的统一外部基线比较中同时填补这两点。资源相近时，质量差异是主要决策依据；预算收紧时，C/L 决定某一方案是否可行。</w:t>
+        <w:t xml:space="preserve">资源相近时，质量差异是主要决策依据；预算收紧时，C/L 决定某一方案是否可行。</w:t>
       </w:r>
     </w:p>
     <w:p>
@@ -1986,7 +1994,7 @@
         <w:pStyle w:val="FirstParagraph"/>
       </w:pPr>
       <w:r>
-        <w:t xml:space="preserve">实验以 MultiHiertt 财务表文推理任务为主[6]，并以 TAT-QA[7]、MBPP[10]（代码）与 Math500[8,9]（数学）作为跨域面板。 不同阶段使用不同面板，不能以相同数据集名称推定同一任务、输入条件或评分单位。官方无标签测试题不能沿用节点评分；节点确认采用经使用记录审计的有标签保留任务。表 4-1 汇总本文主要证据层级。</w:t>
+        <w:t xml:space="preserve">实验以 MultiHiertt 财务表文推理任务为主[6]，并以 TAT-QA[7]、MBPP[10]（代码）与 Math500[8,9]（数学）作为跨域面板。不同阶段使用不同面板，不能以相同数据集名称推定同一任务、输入条件或评分单位。官方无标签测试题不能沿用节点评分；节点确认采用经使用记录审计的有标签保留任务。表 4-1 汇总本文主要证据层级。</w:t>
       </w:r>
     </w:p>
     <w:p>
@@ -3393,7 +3401,7 @@
         <w:pStyle w:val="FirstParagraph"/>
       </w:pPr>
       <w:r>
-        <w:t xml:space="preserve">本节回答第一个研究问题：为什么整题级单模型选择不够。在 100 任务、493 个主要节点的冻结确认面板上，三候选模型分别执行节点，以扩展执行器统一评分。推理与验证采用基准规定的条件输入，因此本节首先测量阶段能力，而不是完整链成功率。</w:t>
+        <w:t xml:space="preserve">本节回答第一个研究问题：为什么整题级单模型选择不够。在 100 任务、493 个主要节点的冻结确认面板上，三候选模型分别执行节点，以扩展执行器统一评分（表 4-2）。推理与验证采用基准规定的条件输入，因此本节首先测量阶段能力，而不是完整链成功率。</w:t>
       </w:r>
     </w:p>
     <w:p>
@@ -6297,7 +6305,7 @@
         <w:pStyle w:val="FirstParagraph"/>
       </w:pPr>
       <w:r>
-        <w:t xml:space="preserve">本节把 4.2 的能力差异转化为分配问题：稳定收益来自阶段/类型粒度，还是来自强实例级学习器。节点路由相对查询路由提高 6.90 个百分点，并减少记录中的 token 与服务时间。</w:t>
+        <w:t xml:space="preserve">本节把 4.2 的能力差异转化为分配问题：稳定收益来自阶段/类型粒度，还是来自强实例级学习器。节点路由相对查询路由提高 6.90 个百分点，并减少记录中的 token 与服务时间（表 4-6）。</w:t>
       </w:r>
     </w:p>
     <w:p>
@@ -6849,7 +6857,7 @@
         <w:pStyle w:val="BodyText"/>
       </w:pPr>
       <w:r>
-        <w:t xml:space="preserve">剩余差距能否由实例级信号稳定利用？剩余差距路由以 large 为强默认，使用 900 任务开发数据拟合两阶段选择器，固定阈值 τ=0.5 后分别评价较小 Conf-200 与较大 Conf-500。这里的 Oracle 仅取三条同模型传播链，与 4.6 九组合 Oracle 不同。</w:t>
+        <w:t xml:space="preserve">剩余差距能否由实例级信号稳定利用？剩余差距路由以 large 为强默认，使用 900 任务开发数据拟合两阶段选择器，固定阈值 τ=0.5 后分别评价较小 Conf-200 与较大 Conf-500（表 4-7）。这里的 Oracle 仅取三条同模型传播链，与 4.6 九组合 Oracle 不同。</w:t>
       </w:r>
     </w:p>
     <w:p>
@@ -7574,7 +7582,7 @@
         <w:pStyle w:val="BodyText"/>
       </w:pPr>
       <w:r>
-        <w:t xml:space="preserve">低覆盖率选择为何相对安全？将 900 开发任务、200 和 500 个已分析确认任务合并为 1,600 题开发语料，进行任务级五折预测与事后风险—覆盖率分析。运行时特征来自 large 的实际抽取和推理输出；这一评价不能再称为独立确认，也不等同于零执行成本的到达时路由。</w:t>
+        <w:t xml:space="preserve">低覆盖率选择为何相对安全？将 900 开发任务、200 和 500 个已分析确认任务合并为 1,600 题开发语料，进行任务级五折预测与事后风险—覆盖率分析（表 4-8）。运行时特征来自 large 的实际抽取和推理输出；这一评价不能再称为独立确认，也不等同于零执行成本的到达时路由。</w:t>
       </w:r>
     </w:p>
     <w:p>
@@ -8466,7 +8474,7 @@
         <w:pStyle w:val="FirstParagraph"/>
       </w:pPr>
       <w:r>
-        <w:t xml:space="preserve">900 任务画像使推理模型消费同模型实际抽取结果，测量传播链能力。任务级五折交叉验证保持同任务节点同折。</w:t>
+        <w:t xml:space="preserve">900 任务画像使推理模型消费同模型实际抽取结果，测量传播链能力（表 4-9）。任务级五折交叉验证保持同任务节点同折。</w:t>
       </w:r>
     </w:p>
     <w:p>
@@ -8921,7 +8929,7 @@
         <w:t xml:space="preserve">”</w:t>
       </w:r>
       <w:r>
-        <w:t xml:space="preserve">。零调用审计（零调用审计，证据编号见 FINAL_CLAIM_AUDIT）给出各面板传播 headroom：900 题开发集 5.00pp、Conf-200 4.50pp、Conf-500 5.40pp、合并 1,600 题 5.06pp；共同失败占比 77.0%／76.5%／76.2%／76.7%。本文统一引用上述审计值；此前口径外的</w:t>
+        <w:t xml:space="preserve">。零调用审计（证据编号见 FINAL_CLAIM_AUDIT）给出各面板传播 headroom：900 题开发集 5.00pp、Conf-200 4.50pp、Conf-500 5.40pp、合并 1,600 题 5.06pp；共同失败占比 77.0%／76.5%／76.2%／76.7%。本文统一引用上述审计值；此前口径外的</w:t>
       </w:r>
       <w:r>
         <w:t xml:space="preserve">“</w:t>
@@ -8963,7 +8971,7 @@
         <w:pStyle w:val="FirstParagraph"/>
       </w:pPr>
       <w:r>
-        <w:t xml:space="preserve">在能力画像的 200 任务子集上，实际执行三个抽取模型与三个推理模型的九种组合，推理者消费对应抽取者输出。该子集用于开发机制分析，不是 Conf-200 确认集。</w:t>
+        <w:t xml:space="preserve">在能力画像的 200 任务子集上，实际执行三个抽取模型与三个推理模型的九种组合，推理者消费对应抽取者输出（表 4-10）。该子集用于开发机制分析，不是 Conf-200 确认集。</w:t>
       </w:r>
     </w:p>
     <w:p>
@@ -9324,7 +9332,7 @@
         <w:pStyle w:val="BodyText"/>
       </w:pPr>
       <w:r>
-        <w:t xml:space="preserve">保持推理者 medium 不变，将抽取者从 medium 换成 large，质量由 10.0% 提高至 20.0%；保持推理者 coder 不变，对应变化为 11.0% 至 20.5%。固定 large 抽取后，medium 和 coder 的推理结果分别高于 large 推理的 18.0%。这表明同模型链可能因抽取弱项而掩盖下游优势，独立分配阶段模型能够解除这种绑定。上述比较支持阶段互补的机制解释，但当前未据该汇总表宣称各点估计差异均达到统计显著；large 抽取均值更好也不意味着它在每个任务上都是最优来源。</w:t>
+        <w:t xml:space="preserve">该九组合空间的有限候选精确上界汇总于表 4-11。保持推理者 medium 不变，将抽取者从 medium 换成 large，质量由 10.0% 提高至 20.0%；保持推理者 coder 不变，对应变化为 11.0% 至 20.5%。固定 large 抽取后，medium 和 coder 的推理结果分别高于 large 推理的 18.0%。这表明同模型链可能因抽取弱项而掩盖下游优势，独立分配阶段模型能够解除这种绑定。上述比较支持阶段互补的机制解释，但当前未据该汇总表宣称各点估计差异均达到统计显著；large 抽取均值更好也不意味着它在每个任务上都是最优来源。</w:t>
       </w:r>
     </w:p>
     <w:p>
@@ -9664,7 +9672,7 @@
         <w:t xml:space="preserve">”</w:t>
       </w:r>
       <w:r>
-        <w:t xml:space="preserve">会被误读为调度器本身的贡献。最新动态对照使用已分析的 48 任务真实调用面板。静态允许局部回退，动态使用反馈更新执行选择。第二版复用已记录的静态前缀并执行分歧请求；真实上游输出进入下游，但推理失败检测与失败计数读取评价答案，属于理想失败检测条件下的 live 实验。</w:t>
+        <w:t xml:space="preserve">会被误读为调度器本身的贡献。最新动态对照使用已分析的 48 任务真实调用面板（表 4-12）。静态允许局部回退，动态使用反馈更新执行选择。第二版复用已记录的静态前缀并执行分歧请求；真实上游输出进入下游，但推理失败检测与失败计数读取评价答案，属于理想失败检测条件下的 live 实验。</w:t>
       </w:r>
     </w:p>
     <w:p>
@@ -10950,7 +10958,7 @@
         <w:pStyle w:val="FirstParagraph"/>
       </w:pPr>
       <w:r>
-        <w:t xml:space="preserve">原 148 个缺陷节点中有 32 个原最终答案已正确，审计后恢复集合为 116 个节点、96 个任务。恢复以原最终答案错误为前提，避免将再次答对原本正确的任务计为救回。</w:t>
+        <w:t xml:space="preserve">原 148 个缺陷节点中有 32 个原最终答案已正确，审计后恢复集合为 116 个节点、96 个任务（表 4-14）。恢复以原最终答案错误为前提，避免将再次答对原本正确的任务计为救回。</w:t>
       </w:r>
     </w:p>
     <w:p>
@@ -11613,7 +11621,7 @@
         <w:pStyle w:val="FirstParagraph"/>
       </w:pPr>
       <w:r>
-        <w:t xml:space="preserve">预算响应面使用 116 节点的已测动作开销，在 11×7 个 token／服务时间档位上回放。</w:t>
+        <w:t xml:space="preserve">预算响应面使用 116 节点的已测动作开销，在 11×7 个 token／服务时间档位上回放（表 4-15）。</w:t>
       </w:r>
     </w:p>
     <w:p>
@@ -12154,7 +12162,7 @@
         <w:pStyle w:val="FirstParagraph"/>
       </w:pPr>
       <w:r>
-        <w:t xml:space="preserve">已有结构感知解析诊断关注原同模型链共同失败的开发子集。零调用审计（零调用审计，证据编号见 FINAL_CLAIM_AUDIT）给出其可复核边界：25 个结构推理应答全部可解析，按冻结评分器重打分 Q = 0/25，与保存的评分汇总一致；但</w:t>
+        <w:t xml:space="preserve">已有结构感知解析诊断关注原同模型链共同失败的开发子集。零调用审计（证据编号见 FINAL_CLAIM_AUDIT）给出其可复核边界：25 个结构推理应答全部可解析，按冻结评分器重打分 Q = 0/25，与保存的评分汇总一致；但</w:t>
       </w:r>
       <w:r>
         <w:t xml:space="preserve">“</w:t>
@@ -12301,7 +12309,7 @@
         <w:t xml:space="preserve">正式 MBPP 面板</w:t>
       </w:r>
       <w:r>
-        <w:t xml:space="preserve">（100 任务，单元测试为确定性评分与部署反馈，FROZEN_BEFORE_EXECUTION）：代码域采用与财务域不同的自然节点接口——规划→代码生成→单元测试→修复/校验，语法错误、运行时错误、断言失败均为部署可得信号，全程不读取参考实现。六臂结果：单体 medium 68.0%、large 76.0%、查询路由 71.0%、阶段分配 73.0%、静态 74.0%、动态真实（Dynamic-Real）80.0%（有限候选 Oracle（节点—模型候选矩阵内取最优）87.0%）。配对对比：动态对静态 +6.0pp，95% CI [+1.0, +12.0] 不含零（Help/Harm = 7/1；McNemar 精确 p = 0.070，两种检验在 0.05 阈值上的分歧如实报告）；恢复率（初始失败→最终通过）7/26 = 26.9%；修复共 49 次；代价为动态 +95.7 tokens（+11.9%）且预算违规 22/100。该正向效应按冻结表述规范为方向明确的支持性证据，不宣称稳定统计显著。其余对比均不显著：阶段分配对查询路由 +2.0pp（CI [−7, +11]），静态对单体 large −2.0pp，动态对单体 large +4.0pp（CI [−3, +11]）。</w:t>
+        <w:t xml:space="preserve">（100 任务，单元测试为确定性评分与部署反馈，FROZEN_BEFORE_EXECUTION）：代码域采用与财务域不同的自然节点接口——规划→代码生成→单元测试→修复/校验，语法错误、运行时错误、断言失败均为部署可得信号，全程不读取参考实现。六臂结果：单体 medium 68.0%、large 76.0%、查询路由 71.0%、阶段分配 73.0%、静态 74.0%、动态真实（Dynamic-Real）80.0%（有限候选 Oracle（节点—模型候选矩阵内取最优）87.0%）。配对对比：动态对静态 +6.0pp，95% CI [+1.0, +12.0] 不含零（Help/Harm = 7/1；McNemar 精确 p = 0.070，两种检验在 0.05 阈值上的分歧如实报告）；恢复率（初始失败→最终通过）7/26 = 26.9%；修复共 49 次；代价为动态 +95.7 tokens（+11.9%）且预算违规 22/100。该正向效应按冻结表述规范为方向明确的支持性证据，不宣称稳定统计显著。其余对比均不显著：阶段分配对查询路由 +2.0pp（CI [−7, +11]），静态对单体 large −2.0pp，动态对单体 large +4.0pp（CI [−3, +11]）。三域六臂对照汇总见表 4-16。</w:t>
       </w:r>
     </w:p>
     <w:p>
@@ -12864,7 +12872,7 @@
         <w:t xml:space="preserve"> </w:t>
       </w:r>
       <w:r>
-        <w:t xml:space="preserve">并声明 adapted to the same frozen model pool, task panel, scorer, and budget constraints；不宣称对原系统的忠实复现）：RouteLLM-style 查询级学习路由（900 题开发语料传播结果重算标签 + GTE 嵌入 + 逻辑回归）、FrugalGPT-style 成本感知级联（廉价模型先执行、部署可得置信检查失败才升级）、Self-Refine-style 答案级迭代精修（批判-修订；代码域反馈为单元测试失败报告）。协议先冻结后运行（641 次调用，one-shot）。</w:t>
+        <w:t xml:space="preserve">并声明 adapted to the same frozen model pool, task panel, scorer, and budget constraints；不宣称对原系统的忠实复现）：RouteLLM-style 查询级学习路由（900 题开发语料传播结果重算标签 + GTE 嵌入 + 逻辑回归）、FrugalGPT-style 成本感知级联（廉价模型先执行、部署可得置信检查失败才升级）、Self-Refine-style 答案级迭代精修（批判-修订；代码域反馈为单元测试失败报告）。协议先冻结后运行（641 次调用，one-shot），结果见表 4-17。</w:t>
       </w:r>
     </w:p>
     <w:p>
@@ -13865,7 +13873,7 @@
         <w:pStyle w:val="BodyText"/>
       </w:pPr>
       <w:r>
-        <w:t xml:space="preserve">注：Finance 列 40.0% 是异构静态阶段分配 DAG-L/M，不是 Dynamic-Real——Dynamic-Real 从未在 TAT-QA-200 面板上运行。RouteLLM-style 在本文冻结模型池与训练分布下未产生有效切换、退化为始终选择 large；这不应外推为对 RouteLLM 方法本身的判断。配对统计（FINAL_EXPERIMENT_AUDIT.json）：Code 上 cascade 对 Always-Large +5.0pp，bootstrap CI [+1,+10] 但 exact McNemar p=0.0625 未达显著；Self-Refine 对 Always-Large +9.0pp，CI [+4,+15]，McNemar p=0.0039 显著；</w:t>
+        <w:t xml:space="preserve">注：Finance 列 40.0% 是异构静态阶段分配 DAG-L/M，不是 Dynamic-Real——Dynamic-Real 从未在 TAT-QA-200 面板上运行。RouteLLM-style 在本文冻结模型池与训练分布下未产生有效切换、退化为始终选择 large；这不应外推为对 RouteLLM 方法本身的判断。配对统计（证据编号见 FINAL_CLAIM_AUDIT）：Code 上 cascade 对 Always-Large +5.0pp，bootstrap CI [+1,+10] 但 exact McNemar p=0.0625 未达显著；Self-Refine 对 Always-Large +9.0pp，CI [+4,+15]，McNemar p=0.0039 显著；</w:t>
       </w:r>
       <w:r>
         <w:rPr>
@@ -14311,7 +14319,7 @@
         <w:pStyle w:val="BodyText"/>
       </w:pPr>
       <w:r>
-        <w:t xml:space="preserve">本文证据的总体边界：精确 Oracle 仅覆盖已枚举的组合空间，完整动态策略空间没有全局最优；动态真实调用面板规模有限且部分读取评价答案；不同面板与估计对象不可拼接；模型池存在大量共同失败、成本异质性有限；服务时间不包含全部启动、排队与调度开销。这些限制共同决定本文结论适合表述为阶段互补、执行边界与选择性适应的机制分析，而不是一个在所有复杂任务上全面占优的系统。需要明确三个条件的证据强度并不相同：反馈可诊断性拥有受控降级重放证据（MBPP 隐藏断言重放），能力匹配拥有同先验跨域反转证据（财务先验在数学域 −37.0pp），接口表达能力则主要是配对基准与逐题失败分析的观察性证据——三者不构成可外推的充分条件。；三者是条件关系而非数值模型，其正反两侧证据（财务节点分配与 MBPP 动态修复为正，数学塌缩与财务级联/自精修为反）均来自冻结协议的一次性运行。</w:t>
+        <w:t xml:space="preserve">本文证据的总体边界：精确 Oracle 仅覆盖已枚举的组合空间，完整动态策略空间没有全局最优；动态真实调用面板规模有限且部分读取评价答案；不同面板与估计对象不可拼接；模型池存在大量共同失败、成本异质性有限；服务时间不包含全部启动、排队与调度开销。这些限制共同决定本文结论适合表述为阶段互补、执行边界与选择性适应的机制分析，而不是一个在所有复杂任务上全面占优的系统。需要明确三个条件的证据强度并不相同：反馈可诊断性拥有受控降级重放证据（MBPP 隐藏断言重放），能力匹配拥有同先验跨域反转证据（财务先验在数学域 −37.0pp），接口表达能力则主要是配对基准与逐题失败分析的观察性证据——三者不构成可外推的充分条件。三个条件是条件关系而非数值模型，其正反两侧证据（财务节点分配与 MBPP 动态修复为正，数学塌缩与财务级联/自精修为反）均来自冻结协议的一次性运行（图 5-1）。</w:t>
       </w:r>
     </w:p>
     <w:p>
@@ -14401,7 +14409,23 @@
         <w:t xml:space="preserve">多模型 DAG 协同并非天然带来性能提升，其有效性取决于阶段能力匹配、节点接口表达能力和运行反馈可诊断性</w:t>
       </w:r>
       <w:r>
-        <w:t xml:space="preserve">。三组证据共同支持这一命题。其一，严格配对分解基准显示同模型拆分本身在 TAT-QA 上显著有害（−21.0pp）、在 MultiHiertt 上为不显著正向信号（+6.0pp），异构阶段分工追回总体 +5.0pp 但未完全抵消分解损耗（DAG-L/M 31.7% 对 Mono-L 38.7%）——DAG 的核心作用是解除阶段能力绑定，而非提高推理精度。其二，反馈驱动的动态适应呈现结构依赖的梯度：两节点链上为方向一致但未确证的小幅正信号；四节点真实 DAG 上选择性动态适应显著优于静态（+20.0pp，CI 不含零），但 Static-Matched 消融把归因说清——主要增益来自</w:t>
+        <w:t xml:space="preserve">。三组证据共同支持这一命题。</w:t>
+      </w:r>
+    </w:p>
+    <w:p>
+      <w:pPr>
+        <w:pStyle w:val="BodyText"/>
+      </w:pPr>
+      <w:r>
+        <w:t xml:space="preserve">其一，严格配对分解基准显示同模型拆分本身在 TAT-QA 上显著有害（−21.0pp）、在 MultiHiertt 上为不显著正向信号（+6.0pp），异构阶段分工追回总体 +5.0pp 但未完全抵消分解损耗（DAG-L/M 31.7% 对 Mono-L 38.7%）——DAG 的核心作用是解除阶段能力绑定，而非提高推理精度。</w:t>
+      </w:r>
+    </w:p>
+    <w:p>
+      <w:pPr>
+        <w:pStyle w:val="BodyText"/>
+      </w:pPr>
+      <w:r>
+        <w:t xml:space="preserve">其二，反馈驱动的动态适应呈现结构依赖的梯度：两节点链上为方向一致但未确证的小幅正信号；四节点真实 DAG 上选择性动态适应显著优于静态（+20.0pp，CI 不含零），但 Static-Matched 消融把归因说清——主要增益来自</w:t>
       </w:r>
       <w:r>
         <w:t xml:space="preserve">“</w:t>
@@ -14413,7 +14437,15 @@
         <w:t xml:space="preserve">”</w:t>
       </w:r>
       <w:r>
-        <w:t xml:space="preserve">这一动作本身（+18.3pp），动态框架的可确证价值在于以选择性更新与预算约束安全地承载该动作（933 次适配调用全部限于受影响后代、分支隔离零违例、预算违规为零），且部署可得信号可保留 91.7% 的增益。其三，跨域与外部对照给出适用边界：代码域的单元测试反馈驱动动态适应取得 +6.0pp 的正向支持性证据（bootstrap CI 不含零、exact McNemar p=0.070 未达显著），而冻结的阶段先验与验证接口在数学域同时失配、DAG 全面劣于单体；外部方法比较中，答案级迭代精修在代码域点估计更高（85.0% 对 80.0%）但配对差异未达显著，级联策略则随置信信号质量在财务域与代码域符号反转。这些结果共同表明：本文方法不是 universal best solver，其辨识度在于节点级、依赖感知、局部且可审计的动态执行机制。</w:t>
+        <w:t xml:space="preserve">这一动作本身（+18.3pp），动态框架的可确证价值在于以选择性更新与预算约束安全地承载该动作（933 次适配调用全部限于受影响后代、分支隔离零违例、预算违规为零），且部署可得信号可保留 91.7% 的增益。</w:t>
+      </w:r>
+    </w:p>
+    <w:p>
+      <w:pPr>
+        <w:pStyle w:val="BodyText"/>
+      </w:pPr>
+      <w:r>
+        <w:t xml:space="preserve">其三，跨域与外部对照给出适用边界：代码域的单元测试反馈驱动动态适应取得 +6.0pp 的正向支持性证据（bootstrap CI 不含零、exact McNemar p=0.070 未达显著），而冻结的阶段先验与验证接口在数学域同时失配、DAG 全面劣于单体；外部方法比较中，答案级迭代精修在代码域点估计更高（85.0% 对 80.0%）但配对差异未达显著，级联策略则随置信信号质量在财务域与代码域符号反转。这些结果共同表明：本文方法不是 universal best solver，其辨识度在于节点级、依赖感知、局部且可审计的动态执行机制。</w:t>
       </w:r>
     </w:p>
     <w:p>

</xml_diff>

<commit_message>
integrate FLARE-DAG into paper as third pillar: method §3.11 (multi-objective formulation + local Pareto re-optimization + formal upper bound ΔQ≤|R∩D|/N), discussion §5.5 (non-dominated opportunity ≠ dynamic optimization opportunity, three conditions quantified), contribution 3 rewritten as Q/C/L multi-objective scheduling and optimization boundary; checks green (11 method, 5 discussion, 18 tables, 25 pages)
</commit_message>
<xml_diff>
--- a/r3_own_pool/paper_method_feedback_aware_dag/最终整合_20260921/论文完整草稿.docx
+++ b/r3_own_pool/paper_method_feedback_aware_dag/最终整合_20260921/论文完整草稿.docx
@@ -321,10 +321,48 @@
         <w:rPr>
           <w:b/>
         </w:rPr>
-        <w:t xml:space="preserve">适用边界机制分析</w:t>
-      </w:r>
-      <w:r>
-        <w:t xml:space="preserve">。通过严格配对、精确 Oracle、恢复覆盖与 Finance / MBPP / Math500 正负对照及外部方法比较，揭示 DAG 协同受到能力匹配、接口表达能力和反馈可诊断性的共同制约：反馈驱动的 DAG 调整并非跨域自动有效，其收益条件在正反两个方向上均有冻结协议证据。</w:t>
+        <w:t xml:space="preserve">Q/C/L 多目标协同调度及优化边界</w:t>
+      </w:r>
+      <w:r>
+        <w:t xml:space="preserve">。将异构智能体 DAG 执行形式化为质量—成本—时延联合优化问题，设计反馈驱动、剩余预算约束的后继局部 Pareto 重优化机制 FLARE-DAG。实验验证了候选执行策略之间存在真实的非支配权衡，同时通过逐任务分析给出反馈触发式动态调度的可恢复收益上界</w:t>
+      </w:r>
+      <w:r>
+        <w:t xml:space="preserve"> </w:t>
+      </w:r>
+      <m:oMath>
+        <m:r>
+          <m:t>Δ</m:t>
+        </m:r>
+        <m:r>
+          <m:t>Q</m:t>
+        </m:r>
+        <m:r>
+          <m:t>≤</m:t>
+        </m:r>
+        <m:r>
+          <m:t>|</m:t>
+        </m:r>
+        <m:r>
+          <m:t>R</m:t>
+        </m:r>
+        <m:r>
+          <m:t>∩</m:t>
+        </m:r>
+        <m:r>
+          <m:t>D</m:t>
+        </m:r>
+        <m:r>
+          <m:t>|</m:t>
+        </m:r>
+        <m:r>
+          <m:t>/</m:t>
+        </m:r>
+        <m:r>
+          <m:t>N</m:t>
+        </m:r>
+      </m:oMath>
+      <w:r>
+        <w:t xml:space="preserve">，揭示 Pareto 机会并不必然转化为可实现的动态优化收益，其有效性进一步受到 Pareto 多样性、可恢复能力互补性和反馈可诊断性的共同制约。</w:t>
       </w:r>
     </w:p>
     <w:p>
@@ -1934,33 +1972,1005 @@
     </w:p>
     <w:p>
       <w:pPr>
-        <w:pStyle w:val="BodyText"/>
-      </w:pPr>
-      <w:r>
-        <w:t xml:space="preserve">在两节点、三候选模型的固定组合分析中，定义 A=M_E×M_R，包含九个组合。逐任务取其记录质量最大值后平均，得到</w:t>
-      </w:r>
-      <w:r>
-        <w:t xml:space="preserve">“</w:t>
-      </w:r>
-      <w:r>
-        <w:t xml:space="preserve">枚举 3×3 模型组合空间内的精确 Oracle</w:t>
-      </w:r>
-      <w:r>
-        <w:t xml:space="preserve">”</w:t>
-      </w:r>
-      <w:r>
-        <w:t xml:space="preserve">。其最优性仅覆盖这九个既有输出；完整动态策略还包含反馈分支、恢复、停止和可能的结构变化，并未求得全局最优。预算约束 Oracle 使用实际开销，也只作为事后诊断上界。</w:t>
-      </w:r>
+        <w:pStyle w:val="Heading3"/>
+      </w:pPr>
+      <w:bookmarkStart w:id="44" w:name="反馈驱动的多目标局部重优化"/>
+      <w:r>
+        <w:t xml:space="preserve">3.11 反馈驱动的多目标局部重优化</w:t>
+      </w:r>
+      <w:bookmarkEnd w:id="44"/>
     </w:p>
     <w:p>
       <w:pPr>
+        <w:pStyle w:val="FirstParagraph"/>
+      </w:pPr>
+      <w:r>
+        <w:t xml:space="preserve">为同时考虑任务质量、执行成本与响应时延，本文将 DAG 中的智能体协同调度建模为多目标执行决策问题。对于调度策略</w:t>
+      </w:r>
+      <w:r>
+        <w:t xml:space="preserve"> </w:t>
+      </w:r>
+      <m:oMath>
+        <m:r>
+          <m:t>π</m:t>
+        </m:r>
+      </m:oMath>
+      <w:r>
+        <w:t xml:space="preserve">，定义任务质量、执行成本和端到端时延分别为</w:t>
+      </w:r>
+      <w:r>
+        <w:t xml:space="preserve"> </w:t>
+      </w:r>
+      <m:oMath>
+        <m:r>
+          <m:t>Q</m:t>
+        </m:r>
+        <m:r>
+          <m:t>(</m:t>
+        </m:r>
+        <m:r>
+          <m:t>π</m:t>
+        </m:r>
+        <m:r>
+          <m:t>)</m:t>
+        </m:r>
+      </m:oMath>
+      <w:r>
+        <w:t xml:space="preserve">、</w:t>
+      </w:r>
+      <m:oMath>
+        <m:r>
+          <m:t>C</m:t>
+        </m:r>
+        <m:r>
+          <m:t>(</m:t>
+        </m:r>
+        <m:r>
+          <m:t>π</m:t>
+        </m:r>
+        <m:r>
+          <m:t>)</m:t>
+        </m:r>
+      </m:oMath>
+      <w:r>
+        <w:t xml:space="preserve"> </w:t>
+      </w:r>
+      <w:r>
+        <w:t xml:space="preserve">和</w:t>
+      </w:r>
+      <w:r>
+        <w:t xml:space="preserve"> </w:t>
+      </w:r>
+      <m:oMath>
+        <m:r>
+          <m:t>L</m:t>
+        </m:r>
+        <m:r>
+          <m:t>(</m:t>
+        </m:r>
+        <m:r>
+          <m:t>π</m:t>
+        </m:r>
+        <m:r>
+          <m:t>)</m:t>
+        </m:r>
+      </m:oMath>
+      <w:r>
+        <w:t xml:space="preserve">，优化目标表示为</w:t>
+      </w:r>
+    </w:p>
+    <w:p>
+      <w:pPr>
+        <w:pStyle w:val="BodyText"/>
+      </w:pPr>
+      <m:oMathPara>
+        <m:oMathParaPr>
+          <m:jc m:val="center"/>
+        </m:oMathParaPr>
+        <m:oMath>
+          <m:limLow>
+            <m:e>
+              <m:r>
+                <m:rPr>
+                  <m:nor/>
+                  <m:sty m:val="p"/>
+                </m:rPr>
+                <m:t>max</m:t>
+              </m:r>
+            </m:e>
+            <m:lim>
+              <m:r>
+                <m:t>π</m:t>
+              </m:r>
+            </m:lim>
+          </m:limLow>
+          <m:r>
+            <m:t>Q</m:t>
+          </m:r>
+          <m:r>
+            <m:t>(</m:t>
+          </m:r>
+          <m:r>
+            <m:t>π</m:t>
+          </m:r>
+          <m:r>
+            <m:t>)</m:t>
+          </m:r>
+          <m:r>
+            <m:t>,</m:t>
+          </m:r>
+          <m:r>
+            <m:t>  </m:t>
+          </m:r>
+          <m:limLow>
+            <m:e>
+              <m:r>
+                <m:rPr>
+                  <m:nor/>
+                  <m:sty m:val="p"/>
+                </m:rPr>
+                <m:t>min</m:t>
+              </m:r>
+            </m:e>
+            <m:lim>
+              <m:r>
+                <m:t>π</m:t>
+              </m:r>
+            </m:lim>
+          </m:limLow>
+          <m:r>
+            <m:t>C</m:t>
+          </m:r>
+          <m:r>
+            <m:t>(</m:t>
+          </m:r>
+          <m:r>
+            <m:t>π</m:t>
+          </m:r>
+          <m:r>
+            <m:t>)</m:t>
+          </m:r>
+          <m:r>
+            <m:t>,</m:t>
+          </m:r>
+          <m:r>
+            <m:t>  </m:t>
+          </m:r>
+          <m:limLow>
+            <m:e>
+              <m:r>
+                <m:rPr>
+                  <m:nor/>
+                  <m:sty m:val="p"/>
+                </m:rPr>
+                <m:t>min</m:t>
+              </m:r>
+            </m:e>
+            <m:lim>
+              <m:r>
+                <m:t>π</m:t>
+              </m:r>
+            </m:lim>
+          </m:limLow>
+          <m:r>
+            <m:t>L</m:t>
+          </m:r>
+          <m:r>
+            <m:t>(</m:t>
+          </m:r>
+          <m:r>
+            <m:t>π</m:t>
+          </m:r>
+          <m:r>
+            <m:t>)</m:t>
+          </m:r>
+          <m:r>
+            <m:t>.</m:t>
+          </m:r>
+        </m:oMath>
+      </m:oMathPara>
+    </w:p>
+    <w:p>
+      <w:pPr>
+        <w:pStyle w:val="FirstParagraph"/>
+      </w:pPr>
+      <w:r>
+        <w:t xml:space="preserve">其中，时延按照 DAG 的关键执行路径计算，以反映并行节点对端到端响应时间的影响。</w:t>
+      </w:r>
+    </w:p>
+    <w:p>
+      <w:pPr>
+        <w:pStyle w:val="BodyText"/>
+      </w:pPr>
+      <w:r>
+        <w:t xml:space="preserve">在静态 Pareto 调度基础上，本文进一步设计反馈驱动的后继局部重优化机制 FLARE-DAG。设节点</w:t>
+      </w:r>
+      <w:r>
+        <w:t xml:space="preserve"> </w:t>
+      </w:r>
+      <m:oMath>
+        <m:sSub>
+          <m:e>
+            <m:r>
+              <m:t>v</m:t>
+            </m:r>
+          </m:e>
+          <m:sub>
+            <m:r>
+              <m:t>i</m:t>
+            </m:r>
+          </m:sub>
+        </m:sSub>
+      </m:oMath>
+      <w:r>
+        <w:t xml:space="preserve"> </w:t>
+      </w:r>
+      <w:r>
+        <w:t xml:space="preserve">执行后产生运行反馈</w:t>
+      </w:r>
+      <w:r>
+        <w:t xml:space="preserve"> </w:t>
+      </w:r>
+      <m:oMath>
+        <m:sSub>
+          <m:e>
+            <m:r>
+              <m:t>f</m:t>
+            </m:r>
+          </m:e>
+          <m:sub>
+            <m:r>
+              <m:t>i</m:t>
+            </m:r>
+          </m:sub>
+        </m:sSub>
+      </m:oMath>
+      <w:r>
+        <w:t xml:space="preserve">，上游实际输出为</w:t>
+      </w:r>
+      <w:r>
+        <w:t xml:space="preserve"> </w:t>
+      </w:r>
+      <m:oMath>
+        <m:sSub>
+          <m:e>
+            <m:r>
+              <m:t>z</m:t>
+            </m:r>
+          </m:e>
+          <m:sub>
+            <m:r>
+              <m:t>i</m:t>
+            </m:r>
+          </m:sub>
+        </m:sSub>
+      </m:oMath>
+      <w:r>
+        <w:t xml:space="preserve">，则候选智能体的条件能力估计表示为</w:t>
+      </w:r>
+      <w:r>
+        <w:t xml:space="preserve"> </w:t>
+      </w:r>
+      <m:oMath>
+        <m:sSub>
+          <m:e>
+            <m:acc>
+              <m:accPr>
+                <m:chr m:val="̂"/>
+              </m:accPr>
+              <m:e>
+                <m:r>
+                  <m:t>q</m:t>
+                </m:r>
+              </m:e>
+            </m:acc>
+          </m:e>
+          <m:sub>
+            <m:r>
+              <m:t>i</m:t>
+            </m:r>
+          </m:sub>
+        </m:sSub>
+        <m:r>
+          <m:t>(</m:t>
+        </m:r>
+        <m:r>
+          <m:t>m</m:t>
+        </m:r>
+        <m:r>
+          <m:t>∣</m:t>
+        </m:r>
+        <m:sSub>
+          <m:e>
+            <m:r>
+              <m:t>z</m:t>
+            </m:r>
+          </m:e>
+          <m:sub>
+            <m:r>
+              <m:t>i</m:t>
+            </m:r>
+          </m:sub>
+        </m:sSub>
+        <m:r>
+          <m:t>,</m:t>
+        </m:r>
+        <m:sSub>
+          <m:e>
+            <m:r>
+              <m:t>f</m:t>
+            </m:r>
+          </m:e>
+          <m:sub>
+            <m:r>
+              <m:t>i</m:t>
+            </m:r>
+          </m:sub>
+        </m:sSub>
+        <m:r>
+          <m:t>)</m:t>
+        </m:r>
+      </m:oMath>
+      <w:r>
+        <w:t xml:space="preserve">。当运行反馈表明当前执行存在异常时，仅提取失败节点及其后继闭包</w:t>
+      </w:r>
+      <w:r>
+        <w:t xml:space="preserve"> </w:t>
+      </w:r>
+      <m:oMath>
+        <m:r>
+          <m:rPr>
+            <m:sty m:val="p"/>
+            <m:scr m:val="script"/>
+          </m:rPr>
+          <m:t>A</m:t>
+        </m:r>
+        <m:r>
+          <m:t>(</m:t>
+        </m:r>
+        <m:sSub>
+          <m:e>
+            <m:r>
+              <m:t>v</m:t>
+            </m:r>
+          </m:e>
+          <m:sub>
+            <m:r>
+              <m:t>i</m:t>
+            </m:r>
+          </m:sub>
+        </m:sSub>
+        <m:r>
+          <m:t>)</m:t>
+        </m:r>
+        <m:r>
+          <m:t>=</m:t>
+        </m:r>
+        <m:r>
+          <m:t>{</m:t>
+        </m:r>
+        <m:sSub>
+          <m:e>
+            <m:r>
+              <m:t>v</m:t>
+            </m:r>
+          </m:e>
+          <m:sub>
+            <m:r>
+              <m:t>i</m:t>
+            </m:r>
+          </m:sub>
+        </m:sSub>
+        <m:r>
+          <m:t>}</m:t>
+        </m:r>
+        <m:r>
+          <m:t>∪</m:t>
+        </m:r>
+        <m:r>
+          <m:rPr>
+            <m:sty m:val="p"/>
+          </m:rPr>
+          <m:t>D</m:t>
+        </m:r>
+        <m:r>
+          <m:rPr>
+            <m:sty m:val="p"/>
+          </m:rPr>
+          <m:t>e</m:t>
+        </m:r>
+        <m:r>
+          <m:rPr>
+            <m:sty m:val="p"/>
+          </m:rPr>
+          <m:t>s</m:t>
+        </m:r>
+        <m:r>
+          <m:rPr>
+            <m:sty m:val="p"/>
+          </m:rPr>
+          <m:t>c</m:t>
+        </m:r>
+        <m:r>
+          <m:t>(</m:t>
+        </m:r>
+        <m:sSub>
+          <m:e>
+            <m:r>
+              <m:t>v</m:t>
+            </m:r>
+          </m:e>
+          <m:sub>
+            <m:r>
+              <m:t>i</m:t>
+            </m:r>
+          </m:sub>
+        </m:sSub>
+        <m:r>
+          <m:t>)</m:t>
+        </m:r>
+      </m:oMath>
+      <w:r>
+        <w:t xml:space="preserve">，已成功完成且不受依赖传播影响的其他分支保持不变。根据已消耗资源更新剩余预算</w:t>
+      </w:r>
+      <w:r>
+        <w:t xml:space="preserve"> </w:t>
+      </w:r>
+      <m:oMath>
+        <m:sSub>
+          <m:e>
+            <m:r>
+              <m:t>C</m:t>
+            </m:r>
+          </m:e>
+          <m:sub>
+            <m:r>
+              <m:rPr>
+                <m:sty m:val="p"/>
+              </m:rPr>
+              <m:t>r</m:t>
+            </m:r>
+            <m:r>
+              <m:rPr>
+                <m:sty m:val="p"/>
+              </m:rPr>
+              <m:t>e</m:t>
+            </m:r>
+            <m:r>
+              <m:rPr>
+                <m:sty m:val="p"/>
+              </m:rPr>
+              <m:t>m</m:t>
+            </m:r>
+          </m:sub>
+        </m:sSub>
+        <m:r>
+          <m:t>=</m:t>
+        </m:r>
+        <m:sSub>
+          <m:e>
+            <m:r>
+              <m:t>B</m:t>
+            </m:r>
+          </m:e>
+          <m:sub>
+            <m:r>
+              <m:t>C</m:t>
+            </m:r>
+          </m:sub>
+        </m:sSub>
+        <m:r>
+          <m:t>−</m:t>
+        </m:r>
+        <m:sSub>
+          <m:e>
+            <m:r>
+              <m:t>C</m:t>
+            </m:r>
+          </m:e>
+          <m:sub>
+            <m:r>
+              <m:rPr>
+                <m:sty m:val="p"/>
+              </m:rPr>
+              <m:t>u</m:t>
+            </m:r>
+            <m:r>
+              <m:rPr>
+                <m:sty m:val="p"/>
+              </m:rPr>
+              <m:t>s</m:t>
+            </m:r>
+            <m:r>
+              <m:rPr>
+                <m:sty m:val="p"/>
+              </m:rPr>
+              <m:t>e</m:t>
+            </m:r>
+            <m:r>
+              <m:rPr>
+                <m:sty m:val="p"/>
+              </m:rPr>
+              <m:t>d</m:t>
+            </m:r>
+          </m:sub>
+        </m:sSub>
+      </m:oMath>
+      <w:r>
+        <w:t xml:space="preserve">、</w:t>
+      </w:r>
+      <m:oMath>
+        <m:sSub>
+          <m:e>
+            <m:r>
+              <m:t>L</m:t>
+            </m:r>
+          </m:e>
+          <m:sub>
+            <m:r>
+              <m:rPr>
+                <m:sty m:val="p"/>
+              </m:rPr>
+              <m:t>r</m:t>
+            </m:r>
+            <m:r>
+              <m:rPr>
+                <m:sty m:val="p"/>
+              </m:rPr>
+              <m:t>e</m:t>
+            </m:r>
+            <m:r>
+              <m:rPr>
+                <m:sty m:val="p"/>
+              </m:rPr>
+              <m:t>m</m:t>
+            </m:r>
+          </m:sub>
+        </m:sSub>
+        <m:r>
+          <m:t>=</m:t>
+        </m:r>
+        <m:sSub>
+          <m:e>
+            <m:r>
+              <m:t>B</m:t>
+            </m:r>
+          </m:e>
+          <m:sub>
+            <m:r>
+              <m:t>L</m:t>
+            </m:r>
+          </m:sub>
+        </m:sSub>
+        <m:r>
+          <m:t>−</m:t>
+        </m:r>
+        <m:sSub>
+          <m:e>
+            <m:r>
+              <m:t>L</m:t>
+            </m:r>
+          </m:e>
+          <m:sub>
+            <m:r>
+              <m:rPr>
+                <m:sty m:val="p"/>
+              </m:rPr>
+              <m:t>u</m:t>
+            </m:r>
+            <m:r>
+              <m:rPr>
+                <m:sty m:val="p"/>
+              </m:rPr>
+              <m:t>s</m:t>
+            </m:r>
+            <m:r>
+              <m:rPr>
+                <m:sty m:val="p"/>
+              </m:rPr>
+              <m:t>e</m:t>
+            </m:r>
+            <m:r>
+              <m:rPr>
+                <m:sty m:val="p"/>
+              </m:rPr>
+              <m:t>d</m:t>
+            </m:r>
+          </m:sub>
+        </m:sSub>
+      </m:oMath>
+      <w:r>
+        <w:t xml:space="preserve">，随后仅在受影响子图内重新构造满足剩余预算约束的非支配候选集合，形成</w:t>
+      </w:r>
+    </w:p>
+    <w:p>
+      <w:pPr>
+        <w:pStyle w:val="BodyText"/>
+      </w:pPr>
+      <m:oMathPara>
+        <m:oMathParaPr>
+          <m:jc m:val="center"/>
+        </m:oMathParaPr>
+        <m:oMath>
+          <m:sSub>
+            <m:e>
+              <m:r>
+                <m:t>f</m:t>
+              </m:r>
+            </m:e>
+            <m:sub>
+              <m:r>
+                <m:t>i</m:t>
+              </m:r>
+            </m:sub>
+          </m:sSub>
+          <m:r>
+            <m:t>→</m:t>
+          </m:r>
+          <m:sSub>
+            <m:e>
+              <m:acc>
+                <m:accPr>
+                  <m:chr m:val="̂"/>
+                </m:accPr>
+                <m:e>
+                  <m:r>
+                    <m:t>q</m:t>
+                  </m:r>
+                </m:e>
+              </m:acc>
+            </m:e>
+            <m:sub>
+              <m:r>
+                <m:t>i</m:t>
+              </m:r>
+            </m:sub>
+          </m:sSub>
+          <m:r>
+            <m:t>(</m:t>
+          </m:r>
+          <m:r>
+            <m:t>m</m:t>
+          </m:r>
+          <m:r>
+            <m:t>∣</m:t>
+          </m:r>
+          <m:sSub>
+            <m:e>
+              <m:r>
+                <m:t>z</m:t>
+              </m:r>
+            </m:e>
+            <m:sub>
+              <m:r>
+                <m:t>i</m:t>
+              </m:r>
+            </m:sub>
+          </m:sSub>
+          <m:r>
+            <m:t>,</m:t>
+          </m:r>
+          <m:sSub>
+            <m:e>
+              <m:r>
+                <m:t>f</m:t>
+              </m:r>
+            </m:e>
+            <m:sub>
+              <m:r>
+                <m:t>i</m:t>
+              </m:r>
+            </m:sub>
+          </m:sSub>
+          <m:r>
+            <m:t>)</m:t>
+          </m:r>
+          <m:r>
+            <m:t>→</m:t>
+          </m:r>
+          <m:r>
+            <m:t>G</m:t>
+          </m:r>
+          <m:r>
+            <m:t>[</m:t>
+          </m:r>
+          <m:r>
+            <m:rPr>
+              <m:sty m:val="p"/>
+              <m:scr m:val="script"/>
+            </m:rPr>
+            <m:t>A</m:t>
+          </m:r>
+          <m:r>
+            <m:t>(</m:t>
+          </m:r>
+          <m:sSub>
+            <m:e>
+              <m:r>
+                <m:t>v</m:t>
+              </m:r>
+            </m:e>
+            <m:sub>
+              <m:r>
+                <m:t>i</m:t>
+              </m:r>
+            </m:sub>
+          </m:sSub>
+          <m:r>
+            <m:t>)</m:t>
+          </m:r>
+          <m:r>
+            <m:t>]</m:t>
+          </m:r>
+          <m:r>
+            <m:t>→</m:t>
+          </m:r>
+          <m:r>
+            <m:t>(</m:t>
+          </m:r>
+          <m:sSub>
+            <m:e>
+              <m:r>
+                <m:t>C</m:t>
+              </m:r>
+            </m:e>
+            <m:sub>
+              <m:r>
+                <m:rPr>
+                  <m:sty m:val="p"/>
+                </m:rPr>
+                <m:t>r</m:t>
+              </m:r>
+              <m:r>
+                <m:rPr>
+                  <m:sty m:val="p"/>
+                </m:rPr>
+                <m:t>e</m:t>
+              </m:r>
+              <m:r>
+                <m:rPr>
+                  <m:sty m:val="p"/>
+                </m:rPr>
+                <m:t>m</m:t>
+              </m:r>
+            </m:sub>
+          </m:sSub>
+          <m:r>
+            <m:t>,</m:t>
+          </m:r>
+          <m:sSub>
+            <m:e>
+              <m:r>
+                <m:t>L</m:t>
+              </m:r>
+            </m:e>
+            <m:sub>
+              <m:r>
+                <m:rPr>
+                  <m:sty m:val="p"/>
+                </m:rPr>
+                <m:t>r</m:t>
+              </m:r>
+              <m:r>
+                <m:rPr>
+                  <m:sty m:val="p"/>
+                </m:rPr>
+                <m:t>e</m:t>
+              </m:r>
+              <m:r>
+                <m:rPr>
+                  <m:sty m:val="p"/>
+                </m:rPr>
+                <m:t>m</m:t>
+              </m:r>
+            </m:sub>
+          </m:sSub>
+          <m:r>
+            <m:t>)</m:t>
+          </m:r>
+          <m:r>
+            <m:t>→</m:t>
+          </m:r>
+          <m:r>
+            <m:rPr>
+              <m:nor/>
+              <m:sty m:val="p"/>
+            </m:rPr>
+            <m:t>Local Pareto Re-optimization</m:t>
+          </m:r>
+        </m:oMath>
+      </m:oMathPara>
+    </w:p>
+    <w:p>
+      <w:pPr>
+        <w:pStyle w:val="FirstParagraph"/>
+      </w:pPr>
+      <w:r>
+        <w:t xml:space="preserve">的反馈闭环。</w:t>
+      </w:r>
+    </w:p>
+    <w:p>
+      <w:pPr>
+        <w:pStyle w:val="BodyText"/>
+      </w:pPr>
+      <w:r>
+        <w:t xml:space="preserve">对于动态优化收益的可实现性，本文进一步给出形式化上界。定义可恢复机会</w:t>
+      </w:r>
+      <w:r>
+        <w:t xml:space="preserve"> </w:t>
+      </w:r>
+      <m:oMath>
+        <m:r>
+          <m:t>R</m:t>
+        </m:r>
+        <m:r>
+          <m:t>(</m:t>
+        </m:r>
+        <m:r>
+          <m:t>x</m:t>
+        </m:r>
+        <m:r>
+          <m:t>)</m:t>
+        </m:r>
+      </m:oMath>
+      <w:r>
+        <w:t xml:space="preserve"> </w:t>
+      </w:r>
+      <w:r>
+        <w:t xml:space="preserve">为当前策略执行错误但候选策略集合中至少存在一种策略能够正确完成任务，部署反馈触发</w:t>
+      </w:r>
+      <w:r>
+        <w:t xml:space="preserve"> </w:t>
+      </w:r>
+      <m:oMath>
+        <m:r>
+          <m:t>D</m:t>
+        </m:r>
+        <m:r>
+          <m:t>(</m:t>
+        </m:r>
+        <m:r>
+          <m:t>x</m:t>
+        </m:r>
+        <m:r>
+          <m:t>)</m:t>
+        </m:r>
+      </m:oMath>
+      <w:r>
+        <w:t xml:space="preserve"> </w:t>
+      </w:r>
+      <w:r>
+        <w:t xml:space="preserve">为运行时信号检测到异常。任何仅依赖部署反馈触发候选策略切换的动态调度器，其可实现的最大质量增益受到以下约束：</w:t>
+      </w:r>
+    </w:p>
+    <w:p>
+      <w:pPr>
+        <w:pStyle w:val="BodyText"/>
+      </w:pPr>
+      <m:oMathPara>
+        <m:oMathParaPr>
+          <m:jc m:val="center"/>
+        </m:oMathParaPr>
+        <m:oMath>
+          <m:r>
+            <m:t>Δ</m:t>
+          </m:r>
+          <m:sSub>
+            <m:e>
+              <m:r>
+                <m:t>Q</m:t>
+              </m:r>
+            </m:e>
+            <m:sub>
+              <m:r>
+                <m:rPr>
+                  <m:sty m:val="p"/>
+                </m:rPr>
+                <m:t>d</m:t>
+              </m:r>
+              <m:r>
+                <m:rPr>
+                  <m:sty m:val="p"/>
+                </m:rPr>
+                <m:t>y</m:t>
+              </m:r>
+              <m:r>
+                <m:rPr>
+                  <m:sty m:val="p"/>
+                </m:rPr>
+                <m:t>n</m:t>
+              </m:r>
+              <m:r>
+                <m:rPr>
+                  <m:sty m:val="p"/>
+                </m:rPr>
+                <m:t>a</m:t>
+              </m:r>
+              <m:r>
+                <m:rPr>
+                  <m:sty m:val="p"/>
+                </m:rPr>
+                <m:t>m</m:t>
+              </m:r>
+              <m:r>
+                <m:rPr>
+                  <m:sty m:val="p"/>
+                </m:rPr>
+                <m:t>i</m:t>
+              </m:r>
+              <m:r>
+                <m:rPr>
+                  <m:sty m:val="p"/>
+                </m:rPr>
+                <m:t>c</m:t>
+              </m:r>
+            </m:sub>
+          </m:sSub>
+          <m:r>
+            <m:t>≤</m:t>
+          </m:r>
+          <m:f>
+            <m:fPr>
+              <m:type m:val="bar"/>
+            </m:fPr>
+            <m:num>
+              <m:r>
+                <m:t>|</m:t>
+              </m:r>
+              <m:r>
+                <m:t>R</m:t>
+              </m:r>
+              <m:r>
+                <m:t>∩</m:t>
+              </m:r>
+              <m:r>
+                <m:t>D</m:t>
+              </m:r>
+              <m:r>
+                <m:t>|</m:t>
+              </m:r>
+            </m:num>
+            <m:den>
+              <m:r>
+                <m:t>N</m:t>
+              </m:r>
+            </m:den>
+          </m:f>
+          <m:r>
+            <m:t>.</m:t>
+          </m:r>
+        </m:oMath>
+      </m:oMathPara>
+    </w:p>
+    <w:p>
+      <w:pPr>
+        <w:pStyle w:val="FirstParagraph"/>
+      </w:pPr>
+      <w:r>
+        <w:t xml:space="preserve">在两节点、三候选模型的固定组合分析中，定义 A=M_E×M_R，包含九个组合。逐任务取其记录质量最大值后平均，得到</w:t>
+      </w:r>
+      <w:r>
+        <w:t xml:space="preserve">“</w:t>
+      </w:r>
+      <w:r>
+        <w:t xml:space="preserve">枚举 3×3 模型组合空间内的精确 Oracle</w:t>
+      </w:r>
+      <w:r>
+        <w:t xml:space="preserve">”</w:t>
+      </w:r>
+      <w:r>
+        <w:t xml:space="preserve">。其最优性仅覆盖这九个既有输出；完整动态策略还包含反馈分支、恢复、停止和可能的结构变化，并未求得全局最优。预算约束 Oracle 使用实际开销，也只作为事后诊断上界。</w:t>
+      </w:r>
+    </w:p>
+    <w:p>
+      <w:pPr>
         <w:pStyle w:val="Heading2"/>
       </w:pPr>
-      <w:bookmarkStart w:id="44" w:name="实验"/>
+      <w:bookmarkStart w:id="45" w:name="实验"/>
       <w:r>
         <w:t xml:space="preserve">4 实验</w:t>
       </w:r>
-      <w:bookmarkEnd w:id="44"/>
+      <w:bookmarkEnd w:id="45"/>
     </w:p>
     <w:p>
       <w:pPr>
@@ -1983,11 +2993,11 @@
       <w:pPr>
         <w:pStyle w:val="Heading3"/>
       </w:pPr>
-      <w:bookmarkStart w:id="45" w:name="实验设置"/>
+      <w:bookmarkStart w:id="46" w:name="实验设置"/>
       <w:r>
         <w:t xml:space="preserve">4.1 实验设置</w:t>
       </w:r>
-      <w:bookmarkEnd w:id="45"/>
+      <w:bookmarkEnd w:id="46"/>
     </w:p>
     <w:p>
       <w:pPr>
@@ -3390,11 +4400,11 @@
       <w:pPr>
         <w:pStyle w:val="Heading3"/>
       </w:pPr>
-      <w:bookmarkStart w:id="46" w:name="阶段级模型能力异质性"/>
+      <w:bookmarkStart w:id="47" w:name="阶段级模型能力异质性"/>
       <w:r>
         <w:t xml:space="preserve">4.2 阶段级模型能力异质性</w:t>
       </w:r>
-      <w:bookmarkEnd w:id="46"/>
+      <w:bookmarkEnd w:id="47"/>
     </w:p>
     <w:p>
       <w:pPr>
@@ -3949,11 +4959,11 @@
       <w:pPr>
         <w:pStyle w:val="Heading3"/>
       </w:pPr>
-      <w:bookmarkStart w:id="47" w:name="任务分解与能力解耦"/>
+      <w:bookmarkStart w:id="48" w:name="任务分解与能力解耦"/>
       <w:r>
         <w:t xml:space="preserve">4.3 任务分解与能力解耦</w:t>
       </w:r>
-      <w:bookmarkEnd w:id="47"/>
+      <w:bookmarkEnd w:id="48"/>
     </w:p>
     <w:p>
       <w:pPr>
@@ -6294,11 +7304,11 @@
       <w:pPr>
         <w:pStyle w:val="Heading3"/>
       </w:pPr>
-      <w:bookmarkStart w:id="48" w:name="查询路由与节点路由"/>
+      <w:bookmarkStart w:id="49" w:name="查询路由与节点路由"/>
       <w:r>
         <w:t xml:space="preserve">4.4 查询路由与节点路由</w:t>
       </w:r>
-      <w:bookmarkEnd w:id="48"/>
+      <w:bookmarkEnd w:id="49"/>
     </w:p>
     <w:p>
       <w:pPr>
@@ -8463,11 +9473,11 @@
       <w:pPr>
         <w:pStyle w:val="Heading3"/>
       </w:pPr>
-      <w:bookmarkStart w:id="49" w:name="条件能力与传播能力差异"/>
+      <w:bookmarkStart w:id="50" w:name="条件能力与传播能力差异"/>
       <w:r>
         <w:t xml:space="preserve">4.5 条件能力与传播能力差异</w:t>
       </w:r>
-      <w:bookmarkEnd w:id="49"/>
+      <w:bookmarkEnd w:id="50"/>
     </w:p>
     <w:p>
       <w:pPr>
@@ -8960,11 +9970,11 @@
       <w:pPr>
         <w:pStyle w:val="Heading3"/>
       </w:pPr>
-      <w:bookmarkStart w:id="50" w:name="跨模型组合与有限候选上界"/>
+      <w:bookmarkStart w:id="51" w:name="跨模型组合与有限候选上界"/>
       <w:r>
         <w:t xml:space="preserve">4.6 跨模型组合与有限候选上界</w:t>
       </w:r>
-      <w:bookmarkEnd w:id="50"/>
+      <w:bookmarkEnd w:id="51"/>
     </w:p>
     <w:p>
       <w:pPr>
@@ -9634,11 +10644,11 @@
       <w:pPr>
         <w:pStyle w:val="Heading3"/>
       </w:pPr>
-      <w:bookmarkStart w:id="51" w:name="静态与动态执行"/>
+      <w:bookmarkStart w:id="52" w:name="静态与动态执行"/>
       <w:r>
         <w:t xml:space="preserve">4.7 静态与动态执行</w:t>
       </w:r>
-      <w:bookmarkEnd w:id="51"/>
+      <w:bookmarkEnd w:id="52"/>
     </w:p>
     <w:p>
       <w:pPr>
@@ -10929,11 +11939,11 @@
       <w:pPr>
         <w:pStyle w:val="Heading3"/>
       </w:pPr>
-      <w:bookmarkStart w:id="52" w:name="故障诊断恢复与预算"/>
+      <w:bookmarkStart w:id="53" w:name="故障诊断恢复与预算"/>
       <w:r>
         <w:t xml:space="preserve">4.8 故障诊断、恢复与预算</w:t>
       </w:r>
-      <w:bookmarkEnd w:id="52"/>
+      <w:bookmarkEnd w:id="53"/>
     </w:p>
     <w:p>
       <w:pPr>
@@ -10947,11 +11957,11 @@
       <w:pPr>
         <w:pStyle w:val="Heading4"/>
       </w:pPr>
-      <w:bookmarkStart w:id="53" w:name="真实失败与动作覆盖"/>
+      <w:bookmarkStart w:id="54" w:name="真实失败与动作覆盖"/>
       <w:r>
         <w:t xml:space="preserve">4.8.1 真实失败与动作覆盖</w:t>
       </w:r>
-      <w:bookmarkEnd w:id="53"/>
+      <w:bookmarkEnd w:id="54"/>
     </w:p>
     <w:p>
       <w:pPr>
@@ -11610,11 +12620,11 @@
       <w:pPr>
         <w:pStyle w:val="Heading4"/>
       </w:pPr>
-      <w:bookmarkStart w:id="54" w:name="剩余预算与多目标权衡"/>
+      <w:bookmarkStart w:id="55" w:name="剩余预算与多目标权衡"/>
       <w:r>
         <w:t xml:space="preserve">4.8.2 剩余预算与多目标权衡</w:t>
       </w:r>
-      <w:bookmarkEnd w:id="54"/>
+      <w:bookmarkEnd w:id="55"/>
     </w:p>
     <w:p>
       <w:pPr>
@@ -12151,11 +13161,11 @@
       <w:pPr>
         <w:pStyle w:val="Heading4"/>
       </w:pPr>
-      <w:bookmarkStart w:id="55" w:name="证据改善为何不必然带来正确答案"/>
+      <w:bookmarkStart w:id="56" w:name="证据改善为何不必然带来正确答案"/>
       <w:r>
         <w:t xml:space="preserve">4.8.3 证据改善为何不必然带来正确答案</w:t>
       </w:r>
-      <w:bookmarkEnd w:id="55"/>
+      <w:bookmarkEnd w:id="56"/>
     </w:p>
     <w:p>
       <w:pPr>
@@ -12209,11 +13219,11 @@
       <w:pPr>
         <w:pStyle w:val="Heading3"/>
       </w:pPr>
-      <w:bookmarkStart w:id="56" w:name="历史图复用"/>
+      <w:bookmarkStart w:id="57" w:name="历史图复用"/>
       <w:r>
         <w:t xml:space="preserve">4.9 历史图复用</w:t>
       </w:r>
-      <w:bookmarkEnd w:id="56"/>
+      <w:bookmarkEnd w:id="57"/>
     </w:p>
     <w:p>
       <w:pPr>
@@ -12236,21 +13246,21 @@
       <w:pPr>
         <w:pStyle w:val="Heading3"/>
       </w:pPr>
-      <w:bookmarkStart w:id="57" w:name="跨领域泛化与适用边界"/>
+      <w:bookmarkStart w:id="58" w:name="跨领域泛化与适用边界"/>
       <w:r>
         <w:t xml:space="preserve">4.10 跨领域泛化与适用边界</w:t>
       </w:r>
-      <w:bookmarkEnd w:id="57"/>
+      <w:bookmarkEnd w:id="58"/>
     </w:p>
     <w:p>
       <w:pPr>
         <w:pStyle w:val="Heading4"/>
       </w:pPr>
-      <w:bookmarkStart w:id="58" w:name="财务数学代码跨域结果"/>
+      <w:bookmarkStart w:id="59" w:name="财务数学代码跨域结果"/>
       <w:r>
         <w:t xml:space="preserve">4.10.1 财务／数学／代码跨域结果</w:t>
       </w:r>
-      <w:bookmarkEnd w:id="58"/>
+      <w:bookmarkEnd w:id="59"/>
     </w:p>
     <w:p>
       <w:pPr>
@@ -12831,11 +13841,11 @@
       <w:pPr>
         <w:pStyle w:val="Heading4"/>
       </w:pPr>
-      <w:bookmarkStart w:id="59" w:name="外部方法比较"/>
+      <w:bookmarkStart w:id="60" w:name="外部方法比较"/>
       <w:r>
         <w:t xml:space="preserve">4.10.2 外部方法比较</w:t>
       </w:r>
-      <w:bookmarkEnd w:id="59"/>
+      <w:bookmarkEnd w:id="60"/>
     </w:p>
     <w:p>
       <w:pPr>
@@ -13942,11 +14952,11 @@
       <w:pPr>
         <w:pStyle w:val="Heading4"/>
       </w:pPr>
-      <w:bookmarkStart w:id="60" w:name="三条件机制分析"/>
+      <w:bookmarkStart w:id="61" w:name="三条件机制分析"/>
       <w:r>
         <w:t xml:space="preserve">4.10.3 三条件机制分析</w:t>
       </w:r>
-      <w:bookmarkEnd w:id="60"/>
+      <w:bookmarkEnd w:id="61"/>
     </w:p>
     <w:p>
       <w:pPr>
@@ -14067,27 +15077,9 @@
       <w:pPr>
         <w:pStyle w:val="Heading2"/>
       </w:pPr>
-      <w:bookmarkStart w:id="61" w:name="讨论"/>
+      <w:bookmarkStart w:id="62" w:name="讨论"/>
       <w:r>
         <w:t xml:space="preserve">5 讨论</w:t>
-      </w:r>
-      <w:bookmarkEnd w:id="61"/>
-    </w:p>
-    <w:p>
-      <w:pPr>
-        <w:pStyle w:val="FirstParagraph"/>
-      </w:pPr>
-      <w:r>
-        <w:t xml:space="preserve">本章围绕四个问题组织，而不是复述实验结果：分解为什么不是免费的；条件能力为什么不能直接代表传播能力；Dynamic 为什么不能创造候选之外的能力；多模型 DAG 协同何时有效。四个问题的答案共同收敛到中心命题的三个条件。</w:t>
-      </w:r>
-    </w:p>
-    <w:p>
-      <w:pPr>
-        <w:pStyle w:val="Heading3"/>
-      </w:pPr>
-      <w:bookmarkStart w:id="62" w:name="为什么分解不是免费的"/>
-      <w:r>
-        <w:t xml:space="preserve">5.1 为什么分解不是免费的</w:t>
       </w:r>
       <w:bookmarkEnd w:id="62"/>
     </w:p>
@@ -14096,60 +15088,16 @@
         <w:pStyle w:val="FirstParagraph"/>
       </w:pPr>
       <w:r>
-        <w:t xml:space="preserve">分解在暴露中间接口的同时，也引入三类成本：接口成本（中间产物必须可解析、可传递，任何格式或语义丢失都会成为新失败点）、传播成本（上游输出质量直接约束下游，上游错误不再有机会被整题推理的冗余纠正）与调度成本（节点数与切换次数增加，预算与时间开销上升）。严格配对基准把这三类成本与收益分开计量：同模型拆分本身在 TAT-QA 上显著有害（−21.0pp），在 MultiHiertt 上为不显著的正向信号（+6.0pp）；异构分工追回 +5.0pp，但总体仍未完全抵消（DAG-L/M 31.7% vs Mono-L 38.7%）。因此</w:t>
-      </w:r>
-      <w:r>
-        <w:t xml:space="preserve">“</w:t>
-      </w:r>
-      <w:r>
-        <w:t xml:space="preserve">拆分总提高性能</w:t>
-      </w:r>
-      <w:r>
-        <w:t xml:space="preserve">”</w:t>
-      </w:r>
-      <w:r>
-        <w:t xml:space="preserve">的直觉不成立，DAG 的正确定位是能力解耦接口，而不是精度加速器。</w:t>
+        <w:t xml:space="preserve">本章围绕四个问题组织，而不是复述实验结果：分解为什么不是免费的；条件能力为什么不能直接代表传播能力；Dynamic 为什么不能创造候选之外的能力；多模型 DAG 协同何时有效。四个问题的答案共同收敛到中心命题的三个条件。</w:t>
       </w:r>
     </w:p>
     <w:p>
       <w:pPr>
-        <w:pStyle w:val="BodyText"/>
-      </w:pPr>
-      <w:r>
-        <w:t xml:space="preserve">TAT-QA 上 56 个 Harm 的逐题分类进一步说明分解税的成分：真分解失败 31 例（推理在 gold facts 下仍错），接口损失 25 例（解析/执行失败与 6 例事实顺序/符号错位）。值得强调的反事实是：即便将全部接口损失修正，配对差仍为 −8.5pp 且区间不含零——该域的分解损失以真实推理退化为主，不能归因于实现 bug。复杂度分层同时给出</w:t>
-      </w:r>
-      <w:r>
-        <w:t xml:space="preserve">“</w:t>
-      </w:r>
-      <w:r>
-        <w:t xml:space="preserve">何时值得拆</w:t>
-      </w:r>
-      <w:r>
-        <w:t xml:space="preserve">”</w:t>
-      </w:r>
-      <w:r>
-        <w:t xml:space="preserve">的初步形状：TAT-QA 上分解效应随推导步数单调上升（−27.1 → +21.1 → +50.0pp），简单任务承担了绝大部分分解税。这提示分解决策是任务复杂度依赖的，但 3 步以上子层样本很小，本文只把它作为描述性机制证据，不给出</w:t>
-      </w:r>
-      <w:r>
-        <w:t xml:space="preserve">“</w:t>
-      </w:r>
-      <w:r>
-        <w:t xml:space="preserve">超过某步数必须拆分</w:t>
-      </w:r>
-      <w:r>
-        <w:t xml:space="preserve">”</w:t>
-      </w:r>
-      <w:r>
-        <w:t xml:space="preserve">的规则。</w:t>
-      </w:r>
-    </w:p>
-    <w:p>
-      <w:pPr>
         <w:pStyle w:val="Heading3"/>
       </w:pPr>
-      <w:bookmarkStart w:id="63" w:name="为什么条件能力不能直接代表传播能力"/>
-      <w:r>
-        <w:t xml:space="preserve">5.2 为什么条件能力不能直接代表传播能力</w:t>
+      <w:bookmarkStart w:id="63" w:name="为什么分解不是免费的"/>
+      <w:r>
+        <w:t xml:space="preserve">5.1 为什么分解不是免费的</w:t>
       </w:r>
       <w:bookmarkEnd w:id="63"/>
     </w:p>
@@ -14158,7 +15106,19 @@
         <w:pStyle w:val="FirstParagraph"/>
       </w:pPr>
       <w:r>
-        <w:t xml:space="preserve">阶段评测揭示的是给定输入条件下的模型表现。条件化推理任务提供标准事实，使推理者主要承担关系识别与表达式构造；实际传播链还要求上游正确识别数值、实体、期间与单位。即使推理模型本身不变，输入来源变化也会改变其可解任务集合。因此条件节点 Oracle 是能力分析工具，不能直接作为完整执行的可达质量——条件口径的最佳固定质量为 0.31、逐任务推理 Oracle 为 0.41，而传播口径的同模型链最佳为 0.18、Oracle 为 0.23；冻结审计给出各面板传播 headroom 5.00/4.50/5.40/5.06pp，共同失败占比约 77%。跨模型矩阵提供更直接的机制证据：固定 medium 或 coder 推理者，更换为 large 抽取后最终质量提高——同模型执行将不同阶段的强弱项绑定，上游缺陷会掩盖下游能力，而 DAG 的作用之一正是使这种绑定可被打破。</w:t>
+        <w:t xml:space="preserve">分解在暴露中间接口的同时，也引入三类成本：接口成本（中间产物必须可解析、可传递，任何格式或语义丢失都会成为新失败点）、传播成本（上游输出质量直接约束下游，上游错误不再有机会被整题推理的冗余纠正）与调度成本（节点数与切换次数增加，预算与时间开销上升）。严格配对基准把这三类成本与收益分开计量：同模型拆分本身在 TAT-QA 上显著有害（−21.0pp），在 MultiHiertt 上为不显著的正向信号（+6.0pp）；异构分工追回 +5.0pp，但总体仍未完全抵消（DAG-L/M 31.7% vs Mono-L 38.7%）。因此</w:t>
+      </w:r>
+      <w:r>
+        <w:t xml:space="preserve">“</w:t>
+      </w:r>
+      <w:r>
+        <w:t xml:space="preserve">拆分总提高性能</w:t>
+      </w:r>
+      <w:r>
+        <w:t xml:space="preserve">”</w:t>
+      </w:r>
+      <w:r>
+        <w:t xml:space="preserve">的直觉不成立，DAG 的正确定位是能力解耦接口，而不是精度加速器。</w:t>
       </w:r>
     </w:p>
     <w:p>
@@ -14166,28 +15126,40 @@
         <w:pStyle w:val="BodyText"/>
       </w:pPr>
       <w:r>
-        <w:t xml:space="preserve">由此得到两个方法论结论。其一，能力画像、条件 Oracle 与传播链质量是三个不同层级的测量，不可直接拼接；用不同任务集上的条件 Oracle 与传播 Oracle 之差估计</w:t>
+        <w:t xml:space="preserve">TAT-QA 上 56 个 Harm 的逐题分类进一步说明分解税的成分：真分解失败 31 例（推理在 gold facts 下仍错），接口损失 25 例（解析/执行失败与 6 例事实顺序/符号错位）。值得强调的反事实是：即便将全部接口损失修正，配对差仍为 −8.5pp 且区间不含零——该域的分解损失以真实推理退化为主，不能归因于实现 bug。复杂度分层同时给出</w:t>
       </w:r>
       <w:r>
         <w:t xml:space="preserve">“</w:t>
       </w:r>
       <w:r>
-        <w:t xml:space="preserve">抽取噪声</w:t>
+        <w:t xml:space="preserve">何时值得拆</w:t>
       </w:r>
       <w:r>
         <w:t xml:space="preserve">”</w:t>
       </w:r>
       <w:r>
-        <w:t xml:space="preserve">的因果效应没有依据。其二，单模型成功可预测（传播画像中 ROC-AUC 0.75–0.84）不等于最优模型可路由：多个模型往往同时在简单任务成功、在复杂任务失败，这给单模型分类器提供了明显信号，却不给模型切换提供收益——AUC 对跨任务排序敏感，而路由收益取决于同任务候选差异、评分可比性与切换错误的代价。节点确认面板上类型先验与冻结节点路由质量相同，提示当前可稳定利用的结构主要是阶段差异，而非细粒度实例表示。</w:t>
+        <w:t xml:space="preserve">的初步形状：TAT-QA 上分解效应随推导步数单调上升（−27.1 → +21.1 → +50.0pp），简单任务承担了绝大部分分解税。这提示分解决策是任务复杂度依赖的，但 3 步以上子层样本很小，本文只把它作为描述性机制证据，不给出</w:t>
+      </w:r>
+      <w:r>
+        <w:t xml:space="preserve">“</w:t>
+      </w:r>
+      <w:r>
+        <w:t xml:space="preserve">超过某步数必须拆分</w:t>
+      </w:r>
+      <w:r>
+        <w:t xml:space="preserve">”</w:t>
+      </w:r>
+      <w:r>
+        <w:t xml:space="preserve">的规则。</w:t>
       </w:r>
     </w:p>
     <w:p>
       <w:pPr>
         <w:pStyle w:val="Heading3"/>
       </w:pPr>
-      <w:bookmarkStart w:id="64" w:name="为什么动态适应不能创造能力"/>
-      <w:r>
-        <w:t xml:space="preserve">5.3 为什么动态适应不能创造能力</w:t>
+      <w:bookmarkStart w:id="64" w:name="为什么条件能力不能直接代表传播能力"/>
+      <w:r>
+        <w:t xml:space="preserve">5.2 为什么条件能力不能直接代表传播能力</w:t>
       </w:r>
       <w:bookmarkEnd w:id="64"/>
     </w:p>
@@ -14196,19 +15168,7 @@
         <w:pStyle w:val="FirstParagraph"/>
       </w:pPr>
       <w:r>
-        <w:t xml:space="preserve">路由和恢复都只能在候选执行结果之间选择：对于给定模型、提示、输入与动作集合，如果所有候选都失败，改进选择本身不能产生其中不存在的正确答案。这是固定候选集合的上限，不是对整个任务可解性的判断。真实失败集合中四个动作的成功并集仅为 8/116（6.90%），局部子图重规划新增覆盖为零（NO-GO）——当前剩余限制不能简单归因于</w:t>
-      </w:r>
-      <w:r>
-        <w:t xml:space="preserve">“</w:t>
-      </w:r>
-      <w:r>
-        <w:t xml:space="preserve">动作选得不够好</w:t>
-      </w:r>
-      <w:r>
-        <w:t xml:space="preserve">”</w:t>
-      </w:r>
-      <w:r>
-        <w:t xml:space="preserve">，而是动作集合里确实缺少成功输出。结构解析诊断进一步提示，找到数值并不等于理解其关系：必要操作数出现在候选证据中，仍可能伴随实体绑定、期间对齐和表达式构造错误。</w:t>
+        <w:t xml:space="preserve">阶段评测揭示的是给定输入条件下的模型表现。条件化推理任务提供标准事实，使推理者主要承担关系识别与表达式构造；实际传播链还要求上游正确识别数值、实体、期间与单位。即使推理模型本身不变，输入来源变化也会改变其可解任务集合。因此条件节点 Oracle 是能力分析工具，不能直接作为完整执行的可达质量——条件口径的最佳固定质量为 0.31、逐任务推理 Oracle 为 0.41，而传播口径的同模型链最佳为 0.18、Oracle 为 0.23；冻结审计给出各面板传播 headroom 5.00/4.50/5.40/5.06pp，共同失败占比约 77%。跨模型矩阵提供更直接的机制证据：固定 medium 或 coder 推理者，更换为 large 抽取后最终质量提高——同模型执行将不同阶段的强弱项绑定，上游缺陷会掩盖下游能力，而 DAG 的作用之一正是使这种绑定可被打破。</w:t>
       </w:r>
     </w:p>
     <w:p>
@@ -14216,30 +15176,80 @@
         <w:pStyle w:val="BodyText"/>
       </w:pPr>
       <w:r>
-        <w:t xml:space="preserve">这一上限在归因消融中同样成立。四节点 DAG 面板上动态相对静态的 +20.0pp 中，Static-Matched 臂（保持静态语义、仅把恢复目标换成升级目标）单独取得 +18.3pp，策略逻辑超出目标选择的贡献仅 +1.7pp（不显著）——该面板的主要质量增益来自</w:t>
+        <w:t xml:space="preserve">由此得到两个方法论结论。其一，能力画像、条件 Oracle 与传播链质量是三个不同层级的测量，不可直接拼接；用不同任务集上的条件 Oracle 与传播 Oracle 之差估计</w:t>
       </w:r>
       <w:r>
         <w:t xml:space="preserve">“</w:t>
       </w:r>
       <w:r>
-        <w:t xml:space="preserve">失败节点升级至最强未试模型</w:t>
+        <w:t xml:space="preserve">抽取噪声</w:t>
       </w:r>
       <w:r>
         <w:t xml:space="preserve">”</w:t>
       </w:r>
       <w:r>
-        <w:t xml:space="preserve">这一动作本身，而这一动作之所以有效，正是因为候选集合中存在更强的未试模型。动态框架的可确证价值在于以选择性更新（933 次适配调用全部限于失败节点及其后代闭包、分支隔离零违例）与预算约束安全地承载该动作，而不是凭空创造能力。反过来，当候选集合被接口表达力封顶（数学域两类接口族均塌缩）或动作集合覆盖不足（8/116）时，任何调度策略都无法突破该上限。能力覆盖与动作选择因此是两个不同层级的上限，本文的贡献定位是后者。</w:t>
+        <w:t xml:space="preserve">的因果效应没有依据。其二，单模型成功可预测（传播画像中 ROC-AUC 0.75–0.84）不等于最优模型可路由：多个模型往往同时在简单任务成功、在复杂任务失败，这给单模型分类器提供了明显信号，却不给模型切换提供收益——AUC 对跨任务排序敏感，而路由收益取决于同任务候选差异、评分可比性与切换错误的代价。节点确认面板上类型先验与冻结节点路由质量相同，提示当前可稳定利用的结构主要是阶段差异，而非细粒度实例表示。</w:t>
       </w:r>
     </w:p>
     <w:p>
       <w:pPr>
         <w:pStyle w:val="Heading3"/>
       </w:pPr>
-      <w:bookmarkStart w:id="65" w:name="多模型有向无环图协同何时有效"/>
+      <w:bookmarkStart w:id="65" w:name="为什么动态适应不能创造能力"/>
+      <w:r>
+        <w:t xml:space="preserve">5.3 为什么动态适应不能创造能力</w:t>
+      </w:r>
+      <w:bookmarkEnd w:id="65"/>
+    </w:p>
+    <w:p>
+      <w:pPr>
+        <w:pStyle w:val="FirstParagraph"/>
+      </w:pPr>
+      <w:r>
+        <w:t xml:space="preserve">路由和恢复都只能在候选执行结果之间选择：对于给定模型、提示、输入与动作集合，如果所有候选都失败，改进选择本身不能产生其中不存在的正确答案。这是固定候选集合的上限，不是对整个任务可解性的判断。真实失败集合中四个动作的成功并集仅为 8/116（6.90%），局部子图重规划新增覆盖为零（NO-GO）——当前剩余限制不能简单归因于</w:t>
+      </w:r>
+      <w:r>
+        <w:t xml:space="preserve">“</w:t>
+      </w:r>
+      <w:r>
+        <w:t xml:space="preserve">动作选得不够好</w:t>
+      </w:r>
+      <w:r>
+        <w:t xml:space="preserve">”</w:t>
+      </w:r>
+      <w:r>
+        <w:t xml:space="preserve">，而是动作集合里确实缺少成功输出。结构解析诊断进一步提示，找到数值并不等于理解其关系：必要操作数出现在候选证据中，仍可能伴随实体绑定、期间对齐和表达式构造错误。</w:t>
+      </w:r>
+    </w:p>
+    <w:p>
+      <w:pPr>
+        <w:pStyle w:val="BodyText"/>
+      </w:pPr>
+      <w:r>
+        <w:t xml:space="preserve">这一上限在归因消融中同样成立。四节点 DAG 面板上动态相对静态的 +20.0pp 中，Static-Matched 臂（保持静态语义、仅把恢复目标换成升级目标）单独取得 +18.3pp，策略逻辑超出目标选择的贡献仅 +1.7pp（不显著）——该面板的主要质量增益来自</w:t>
+      </w:r>
+      <w:r>
+        <w:t xml:space="preserve">“</w:t>
+      </w:r>
+      <w:r>
+        <w:t xml:space="preserve">失败节点升级至最强未试模型</w:t>
+      </w:r>
+      <w:r>
+        <w:t xml:space="preserve">”</w:t>
+      </w:r>
+      <w:r>
+        <w:t xml:space="preserve">这一动作本身，而这一动作之所以有效，正是因为候选集合中存在更强的未试模型。动态框架的可确证价值在于以选择性更新（933 次适配调用全部限于失败节点及其后代闭包、分支隔离零违例）与预算约束安全地承载该动作，而不是凭空创造能力。反过来，当候选集合被接口表达力封顶（数学域两类接口族均塌缩）或动作集合覆盖不足（8/116）时，任何调度策略都无法突破该上限。能力覆盖与动作选择因此是两个不同层级的上限，本文的贡献定位是后者。</w:t>
+      </w:r>
+    </w:p>
+    <w:p>
+      <w:pPr>
+        <w:pStyle w:val="Heading3"/>
+      </w:pPr>
+      <w:bookmarkStart w:id="66" w:name="多模型有向无环图协同何时有效"/>
       <w:r>
         <w:t xml:space="preserve">5.4 多模型有向无环图协同何时有效</w:t>
       </w:r>
-      <w:bookmarkEnd w:id="65"/>
+      <w:bookmarkEnd w:id="66"/>
     </w:p>
     <w:p>
       <w:pPr>
@@ -14312,6 +15322,66 @@
       </w:r>
       <w:r>
         <w:t xml:space="preserve">，而不是线上开销预测保证或多轮答案质量——缓存复用不是推理能力提升。</w:t>
+      </w:r>
+    </w:p>
+    <w:p>
+      <w:pPr>
+        <w:pStyle w:val="Heading3"/>
+      </w:pPr>
+      <w:bookmarkStart w:id="67" w:name="pareto-机会为何不等于动态优化机会"/>
+      <w:r>
+        <w:t xml:space="preserve">5.5 Pareto 机会为何不等于动态优化机会</w:t>
+      </w:r>
+      <w:bookmarkEnd w:id="67"/>
+    </w:p>
+    <w:p>
+      <w:pPr>
+        <w:pStyle w:val="FirstParagraph"/>
+      </w:pPr>
+      <w:r>
+        <w:t xml:space="preserve">多目标调度首先要求候选执行策略之间存在质量、成本与时延上的非支配差异，但 Pareto 前沿的存在并不意味着动态调度一定能够获得额外收益。在统一的 88 个任务支持集上，MC（medium 推理 + coder 验证）与 LC（large 推理 + coder 验证）构成非支配关系：前者具有更低的执行成本和观测服务时延，而后者具有更高的平均任务质量，说明当前模型池确实存在静态多目标权衡空间。然而，逐任务分析进一步表明，88 个任务中仅有 3 个任务能够通过从 MC 切换至 LC 得到恢复，对应的可恢复质量增益上界仅为 3.4 个百分点；其余大部分失败（78%）在当前候选策略下均无法通过调度切换解决。</w:t>
+      </w:r>
+    </w:p>
+    <w:p>
+      <w:pPr>
+        <w:pStyle w:val="BodyText"/>
+      </w:pPr>
+      <w:r>
+        <w:t xml:space="preserve">更重要的是，这 3 个可恢复任务均未被当前部署反馈识别。其推理节点均能够正常解析，验证节点也能够返回格式合法的数值结果，但最终数值仍然错误。这表明当前运行信号主要能够检测格式或执行层异常，而难以识别形式合法但语义错误的输出。在当前候选集合和反馈机制下，</w:t>
+      </w:r>
+      <m:oMath>
+        <m:r>
+          <m:t>|</m:t>
+        </m:r>
+        <m:r>
+          <m:t>R</m:t>
+        </m:r>
+        <m:r>
+          <m:t>∩</m:t>
+        </m:r>
+        <m:r>
+          <m:t>D</m:t>
+        </m:r>
+        <m:r>
+          <m:t>|</m:t>
+        </m:r>
+        <m:r>
+          <m:t>=</m:t>
+        </m:r>
+        <m:r>
+          <m:t>0</m:t>
+        </m:r>
+      </m:oMath>
+      <w:r>
+        <w:t xml:space="preserve">，因此依赖该反馈触发策略切换的动态调度器不存在可利用的质量恢复机会。</w:t>
+      </w:r>
+    </w:p>
+    <w:p>
+      <w:pPr>
+        <w:pStyle w:val="BodyText"/>
+      </w:pPr>
+      <w:r>
+        <w:t xml:space="preserve">上述结果表明，Pareto Opportunity 并不等价于 Dynamic Optimization Opportunity。动态多目标协同至少受到三个结构条件制约：候选策略之间需要形成足够的 Pareto 差异，需要存在可通过策略切换恢复的能力互补，同时运行反馈还必须能够识别这些真正需要切换的实例。仅满足静态非支配性并不不足以保证反馈驱动重优化产生实际收益。</w:t>
       </w:r>
     </w:p>
     <w:p>
@@ -14342,7 +15412,7 @@
                     </pic:cNvPicPr>
                   </pic:nvPicPr>
                   <pic:blipFill>
-                    <a:blip r:embed="rId66"/>
+                    <a:blip r:embed="rId68"/>
                     <a:stretch>
                       <a:fillRect/>
                     </a:stretch>
@@ -14381,11 +15451,11 @@
       <w:pPr>
         <w:pStyle w:val="Heading2"/>
       </w:pPr>
-      <w:bookmarkStart w:id="67" w:name="结论"/>
+      <w:bookmarkStart w:id="69" w:name="结论"/>
       <w:r>
         <w:t xml:space="preserve">6 结论</w:t>
       </w:r>
-      <w:bookmarkEnd w:id="67"/>
+      <w:bookmarkEnd w:id="69"/>
     </w:p>
     <w:p>
       <w:pPr>
@@ -14468,11 +15538,11 @@
       <w:pPr>
         <w:pStyle w:val="Heading2"/>
       </w:pPr>
-      <w:bookmarkStart w:id="68" w:name="参考文献"/>
+      <w:bookmarkStart w:id="70" w:name="参考文献"/>
       <w:r>
         <w:t xml:space="preserve">参考文献</w:t>
       </w:r>
-      <w:bookmarkEnd w:id="68"/>
+      <w:bookmarkEnd w:id="70"/>
     </w:p>
     <w:p>
       <w:pPr>
@@ -14480,50 +15550,6 @@
       </w:pPr>
       <w:r>
         <w:t xml:space="preserve">[1] Ong, I., et al. RouteLLM: Learning to Route LLMs with Preference Data. 2024. arXiv:2406.18665.</w:t>
-      </w:r>
-      <w:r>
-        <w:t xml:space="preserve"> </w:t>
-      </w:r>
-      <w:hyperlink r:id="rId69">
-        <w:r>
-          <w:rPr>
-            <w:rStyle w:val="Hyperlink"/>
-          </w:rPr>
-          <w:t xml:space="preserve">原文</w:t>
-        </w:r>
-      </w:hyperlink>
-      <w:r>
-        <w:t xml:space="preserve">.</w:t>
-      </w:r>
-    </w:p>
-    <w:p>
-      <w:pPr>
-        <w:pStyle w:val="BodyText"/>
-      </w:pPr>
-      <w:r>
-        <w:t xml:space="preserve">[2] Chen, L., Zaharia, M., and Zou, J. FrugalGPT: How to Use Large Language Models While Reducing Cost and Improving Performance. 2023. arXiv:2305.05176.</w:t>
-      </w:r>
-      <w:r>
-        <w:t xml:space="preserve"> </w:t>
-      </w:r>
-      <w:hyperlink r:id="rId70">
-        <w:r>
-          <w:rPr>
-            <w:rStyle w:val="Hyperlink"/>
-          </w:rPr>
-          <w:t xml:space="preserve">原文</w:t>
-        </w:r>
-      </w:hyperlink>
-      <w:r>
-        <w:t xml:space="preserve">.</w:t>
-      </w:r>
-    </w:p>
-    <w:p>
-      <w:pPr>
-        <w:pStyle w:val="BodyText"/>
-      </w:pPr>
-      <w:r>
-        <w:t xml:space="preserve">[3] Kim, S., et al. An LLM Compiler for Parallel Function Calling. 2024 年修订版，arXiv:2312.04511v3.</w:t>
       </w:r>
       <w:r>
         <w:t xml:space="preserve"> </w:t>
@@ -14545,7 +15571,7 @@
         <w:pStyle w:val="BodyText"/>
       </w:pPr>
       <w:r>
-        <w:t xml:space="preserve">[4] Madaan, A., et al. Self-Refine: Iterative Refinement with Self-Feedback. 2023. arXiv:2303.17651.</w:t>
+        <w:t xml:space="preserve">[2] Chen, L., Zaharia, M., and Zou, J. FrugalGPT: How to Use Large Language Models While Reducing Cost and Improving Performance. 2023. arXiv:2305.05176.</w:t>
       </w:r>
       <w:r>
         <w:t xml:space="preserve"> </w:t>
@@ -14567,7 +15593,7 @@
         <w:pStyle w:val="BodyText"/>
       </w:pPr>
       <w:r>
-        <w:t xml:space="preserve">[5] Wang, Z. Z., Mao, J., Fried, D., and Neubig, G. Agent Workflow Memory. 2024. arXiv:2409.07429.</w:t>
+        <w:t xml:space="preserve">[3] Kim, S., et al. An LLM Compiler for Parallel Function Calling. 2024 年修订版，arXiv:2312.04511v3.</w:t>
       </w:r>
       <w:r>
         <w:t xml:space="preserve"> </w:t>
@@ -14589,7 +15615,7 @@
         <w:pStyle w:val="BodyText"/>
       </w:pPr>
       <w:r>
-        <w:t xml:space="preserve">[6] MultiHiertt: Numerical Reasoning over Multi Hierarchical Tabular and Textual Data. ACL 2022.</w:t>
+        <w:t xml:space="preserve">[4] Madaan, A., et al. Self-Refine: Iterative Refinement with Self-Feedback. 2023. arXiv:2303.17651.</w:t>
       </w:r>
       <w:r>
         <w:t xml:space="preserve"> </w:t>
@@ -14599,7 +15625,7 @@
           <w:rPr>
             <w:rStyle w:val="Hyperlink"/>
           </w:rPr>
-          <w:t xml:space="preserve">正式论文页面</w:t>
+          <w:t xml:space="preserve">原文</w:t>
         </w:r>
       </w:hyperlink>
       <w:r>
@@ -14611,7 +15637,7 @@
         <w:pStyle w:val="BodyText"/>
       </w:pPr>
       <w:r>
-        <w:t xml:space="preserve">[7] TAT-QA: A Question Answering Benchmark on a Hybrid of Tabular and Textual Content in Finance. ACL-IJCNLP 2021.</w:t>
+        <w:t xml:space="preserve">[5] Wang, Z. Z., Mao, J., Fried, D., and Neubig, G. Agent Workflow Memory. 2024. arXiv:2409.07429.</w:t>
       </w:r>
       <w:r>
         <w:t xml:space="preserve"> </w:t>
@@ -14621,7 +15647,7 @@
           <w:rPr>
             <w:rStyle w:val="Hyperlink"/>
           </w:rPr>
-          <w:t xml:space="preserve">正式论文页面</w:t>
+          <w:t xml:space="preserve">原文</w:t>
         </w:r>
       </w:hyperlink>
       <w:r>
@@ -14633,7 +15659,7 @@
         <w:pStyle w:val="BodyText"/>
       </w:pPr>
       <w:r>
-        <w:t xml:space="preserve">[8] Hendrycks, D., Burns, C., Kadavath, S., Arora, A., Basart, S., Tang, E., Song, D., and Steinhardt, J. Measuring Mathematical Problem Solving With the MATH Dataset. NeurIPS 2021.</w:t>
+        <w:t xml:space="preserve">[6] MultiHiertt: Numerical Reasoning over Multi Hierarchical Tabular and Textual Data. ACL 2022.</w:t>
       </w:r>
       <w:r>
         <w:t xml:space="preserve"> </w:t>
@@ -14655,7 +15681,7 @@
         <w:pStyle w:val="BodyText"/>
       </w:pPr>
       <w:r>
-        <w:t xml:space="preserve">[9] Lightman, H., Kosaraju, V., Burda, Y., Edwards, H., Baker, B., Leike, J., Schulman, J., Sutskever, I., and Cobbe, K. Let’s Verify Step by Step. ICLR 2024.</w:t>
+        <w:t xml:space="preserve">[7] TAT-QA: A Question Answering Benchmark on a Hybrid of Tabular and Textual Content in Finance. ACL-IJCNLP 2021.</w:t>
       </w:r>
       <w:r>
         <w:t xml:space="preserve"> </w:t>
@@ -14669,7 +15695,7 @@
         </w:r>
       </w:hyperlink>
       <w:r>
-        <w:t xml:space="preserve">.（MATH-500 子集由该工作引入）</w:t>
+        <w:t xml:space="preserve">.</w:t>
       </w:r>
     </w:p>
     <w:p>
@@ -14677,7 +15703,7 @@
         <w:pStyle w:val="BodyText"/>
       </w:pPr>
       <w:r>
-        <w:t xml:space="preserve">[10] Austin, J., Odena, A., Nye, M., Bosma, M., Michalewski, H., Dohan, D., Jiang, E., Cai, C., Terry, M., Le, Q., and Sutton, C. Program Synthesis with Large Language Models. TMLR 2021.</w:t>
+        <w:t xml:space="preserve">[8] Hendrycks, D., Burns, C., Kadavath, S., Arora, A., Basart, S., Tang, E., Song, D., and Steinhardt, J. Measuring Mathematical Problem Solving With the MATH Dataset. NeurIPS 2021.</w:t>
       </w:r>
       <w:r>
         <w:t xml:space="preserve"> </w:t>
@@ -14691,7 +15717,7 @@
         </w:r>
       </w:hyperlink>
       <w:r>
-        <w:t xml:space="preserve">.（MBPP 974 任务及测试划分）</w:t>
+        <w:t xml:space="preserve">.</w:t>
       </w:r>
     </w:p>
     <w:p>
@@ -14699,12 +15725,56 @@
         <w:pStyle w:val="BodyText"/>
       </w:pPr>
       <w:r>
+        <w:t xml:space="preserve">[9] Lightman, H., Kosaraju, V., Burda, Y., Edwards, H., Baker, B., Leike, J., Schulman, J., Sutskever, I., and Cobbe, K. Let’s Verify Step by Step. ICLR 2024.</w:t>
+      </w:r>
+      <w:r>
+        <w:t xml:space="preserve"> </w:t>
+      </w:r>
+      <w:hyperlink r:id="rId79">
+        <w:r>
+          <w:rPr>
+            <w:rStyle w:val="Hyperlink"/>
+          </w:rPr>
+          <w:t xml:space="preserve">正式论文页面</w:t>
+        </w:r>
+      </w:hyperlink>
+      <w:r>
+        <w:t xml:space="preserve">.（MATH-500 子集由该工作引入）</w:t>
+      </w:r>
+    </w:p>
+    <w:p>
+      <w:pPr>
+        <w:pStyle w:val="BodyText"/>
+      </w:pPr>
+      <w:r>
+        <w:t xml:space="preserve">[10] Austin, J., Odena, A., Nye, M., Bosma, M., Michalewski, H., Dohan, D., Jiang, E., Cai, C., Terry, M., Le, Q., and Sutton, C. Program Synthesis with Large Language Models. TMLR 2021.</w:t>
+      </w:r>
+      <w:r>
+        <w:t xml:space="preserve"> </w:t>
+      </w:r>
+      <w:hyperlink r:id="rId80">
+        <w:r>
+          <w:rPr>
+            <w:rStyle w:val="Hyperlink"/>
+          </w:rPr>
+          <w:t xml:space="preserve">正式论文页面</w:t>
+        </w:r>
+      </w:hyperlink>
+      <w:r>
+        <w:t xml:space="preserve">.（MBPP 974 任务及测试划分）</w:t>
+      </w:r>
+    </w:p>
+    <w:p>
+      <w:pPr>
+        <w:pStyle w:val="BodyText"/>
+      </w:pPr>
+      <w:r>
         <w:t xml:space="preserve">[11] Kwon, W., Li, Z., Zhuang, S., Sheng, Y., Zheng, L., Yu, C. H., Gonzalez, J. E., Zhang, H., and Stoica, I. Efficient Memory Management for Large Language Model Serving with PagedAttention (vLLM). SOSP 2023.</w:t>
       </w:r>
       <w:r>
         <w:t xml:space="preserve"> </w:t>
       </w:r>
-      <w:hyperlink r:id="rId79">
+      <w:hyperlink r:id="rId81">
         <w:r>
           <w:rPr>
             <w:rStyle w:val="Hyperlink"/>

</xml_diff>

<commit_message>
integrate Loss Attribution + Selective-DAG + multi-objective comparison + decision granularity into paper §4.5; 4 new tables (19 total); checks green (5 exp sections, 5 discussion, 11 method, 27 pages, 0 out-of-page)
</commit_message>
<xml_diff>
--- a/r3_own_pool/paper_method_feedback_aware_dag/最终整合_20260921/论文完整草稿.docx
+++ b/r3_own_pool/paper_method_feedback_aware_dag/最终整合_20260921/论文完整草稿.docx
@@ -4396,9 +4396,9 @@
       <w:pPr>
         <w:pStyle w:val="Heading3"/>
       </w:pPr>
-      <w:bookmarkStart w:id="47" w:name="rq1阶段能力异质性与节点级分配"/>
-      <w:r>
-        <w:t xml:space="preserve">4.2 RQ1：阶段能力异质性与节点级分配</w:t>
+      <w:bookmarkStart w:id="47" w:name="阶段能力异质性与节点级分配"/>
+      <w:r>
+        <w:t xml:space="preserve">4.2 阶段能力异质性与节点级分配</w:t>
       </w:r>
       <w:bookmarkEnd w:id="47"/>
     </w:p>
@@ -8306,9 +8306,9 @@
       <w:pPr>
         <w:pStyle w:val="Heading3"/>
       </w:pPr>
-      <w:bookmarkStart w:id="48" w:name="rq2dag-分解与反馈调度的收益代价及归因"/>
-      <w:r>
-        <w:t xml:space="preserve">4.3 RQ2：DAG 分解与反馈调度的收益、代价及归因</w:t>
+      <w:bookmarkStart w:id="48" w:name="任务分解与反馈调度的收益及归因"/>
+      <w:r>
+        <w:t xml:space="preserve">4.3 任务分解与反馈调度的收益及归因</w:t>
       </w:r>
       <w:bookmarkEnd w:id="48"/>
     </w:p>
@@ -13281,9 +13281,9 @@
       <w:pPr>
         <w:pStyle w:val="Heading3"/>
       </w:pPr>
-      <w:bookmarkStart w:id="49" w:name="rq3pareto-优化空间与动态收益条件"/>
-      <w:r>
-        <w:t xml:space="preserve">4.4 RQ3：Pareto 优化空间与动态收益条件</w:t>
+      <w:bookmarkStart w:id="49" w:name="多目标优化空间与动态收益条件"/>
+      <w:r>
+        <w:t xml:space="preserve">4.4 多目标优化空间与动态收益条件</w:t>
       </w:r>
       <w:bookmarkEnd w:id="49"/>
     </w:p>
@@ -15340,6 +15340,451 @@
     </w:p>
     <w:p>
       <w:pPr>
+        <w:pStyle w:val="Heading4"/>
+      </w:pPr>
+      <w:bookmarkStart w:id="51" w:name="损失归因消融"/>
+      <w:r>
+        <w:t xml:space="preserve">损失归因消融</w:t>
+      </w:r>
+      <w:bookmarkEnd w:id="51"/>
+    </w:p>
+    <w:p>
+      <w:pPr>
+        <w:pStyle w:val="FirstParagraph"/>
+      </w:pPr>
+      <w:r>
+        <w:t xml:space="preserve">为定位 TAT-QA 上 21.0 个百分点分解损失的主要来源，在同一冻结面板上执行四版本消融：A（Mono-L）、B（当前 DAG-L/L）、C（DAG + 完整上下文透传）、D（DAG + gold facts）。版本 C 仅恢复 3.5 个百分点，说明接口信息丢失不是主要瓶颈。版本 D 比基线更差（27.0%），因为 gold facts 的 evidence 字段缺乏语义描述，证明 evidence 描述对推理的关键性。21.0 个百分点损失以分解诱导的推理退化为主（约 17.5 个百分点残余）。</w:t>
+      </w:r>
+    </w:p>
+    <w:p>
+      <w:pPr>
+        <w:pStyle w:val="Heading4"/>
+      </w:pPr>
+      <w:bookmarkStart w:id="52" w:name="选择性分解"/>
+      <w:r>
+        <w:t xml:space="preserve">选择性分解</w:t>
+      </w:r>
+      <w:bookmarkEnd w:id="52"/>
+    </w:p>
+    <w:p>
+      <w:pPr>
+        <w:pStyle w:val="FirstParagraph"/>
+      </w:pPr>
+      <w:r>
+        <w:t xml:space="preserve">在 12 个纯执行前特征上训练逻辑回归分解门控（5 折交叉拟合），选择性分解在总体 300 题上达到 42.0%，同时超过单体基线 Mono-L（38.7%，+3.3pp）和强制分解 DAG-L/M（31.7%，+10.3pp）。Help/Harm = 20/10，CI [−0.3, +7.0]pp，McNemar p = 0.198。两域均正向（TAT-QA +3.5pp、MultiHiertt +3.0pp）。</w:t>
+      </w:r>
+    </w:p>
+    <w:tbl>
+      <w:tblPr>
+        <w:tblStyle w:val="TableGrid"/>
+        <w:tblW w:type="dxa" w:w="9524"/>
+        <w:tblLayout w:type="fixed"/>
+        <w:tblLook w:firstColumn="1" w:firstRow="1" w:lastColumn="0" w:lastRow="0" w:noHBand="0" w:noVBand="1" w:val="04A0"/>
+      </w:tblPr>
+      <w:tblGrid>
+        <w:gridCol w:w="2381"/>
+        <w:gridCol w:w="2835"/>
+        <w:gridCol w:w="4309"/>
+      </w:tblGrid>
+      <w:tr>
+        <w:trPr>
+          <w:cantSplit/>
+          <w:tblHeader/>
+        </w:trPr>
+        <w:tc>
+          <w:tcPr>
+            <w:tcW w:type="dxa" w:w="2381"/>
+            <w:vAlign w:val="center"/>
+            <w:shd w:fill="E8EDF2"/>
+          </w:tcPr>
+          <w:p>
+            <w:pPr>
+              <w:spacing w:after="60" w:before="60" w:line="240" w:lineRule="auto"/>
+            </w:pPr>
+            <w:r>
+              <w:rPr>
+                <w:rFonts w:eastAsia="Noto Sans CJK SC"/>
+                <w:b/>
+                <w:sz w:val="18"/>
+              </w:rPr>
+              <w:t>方法</w:t>
+            </w:r>
+          </w:p>
+        </w:tc>
+        <w:tc>
+          <w:tcPr>
+            <w:tcW w:type="dxa" w:w="2835"/>
+            <w:vAlign w:val="center"/>
+            <w:shd w:fill="E8EDF2"/>
+          </w:tcPr>
+          <w:p>
+            <w:pPr>
+              <w:spacing w:after="60" w:before="60" w:line="240" w:lineRule="auto"/>
+            </w:pPr>
+            <w:r>
+              <w:rPr>
+                <w:rFonts w:eastAsia="Noto Sans CJK SC"/>
+                <w:b/>
+                <w:sz w:val="18"/>
+              </w:rPr>
+              <w:t>Q</w:t>
+            </w:r>
+          </w:p>
+        </w:tc>
+        <w:tc>
+          <w:tcPr>
+            <w:tcW w:type="dxa" w:w="4309"/>
+            <w:vAlign w:val="center"/>
+            <w:shd w:fill="E8EDF2"/>
+          </w:tcPr>
+          <w:p>
+            <w:pPr>
+              <w:spacing w:after="60" w:before="60" w:line="240" w:lineRule="auto"/>
+            </w:pPr>
+            <w:r>
+              <w:rPr>
+                <w:rFonts w:eastAsia="Noto Sans CJK SC"/>
+                <w:b/>
+                <w:sz w:val="18"/>
+              </w:rPr>
+              <w:t>Oracle Gap</w:t>
+            </w:r>
+          </w:p>
+        </w:tc>
+      </w:tr>
+      <w:tr>
+        <w:trPr>
+          <w:cantSplit/>
+        </w:trPr>
+        <w:tc>
+          <w:tcPr>
+            <w:tcW w:type="dxa" w:w="2381"/>
+            <w:vAlign w:val="center"/>
+          </w:tcPr>
+          <w:p>
+            <w:pPr>
+              <w:spacing w:after="60" w:before="60" w:line="240" w:lineRule="auto"/>
+            </w:pPr>
+            <w:r>
+              <w:rPr>
+                <w:rFonts w:eastAsia="Noto Sans CJK SC"/>
+                <w:b w:val="0"/>
+                <w:sz w:val="18"/>
+              </w:rPr>
+              <w:t>Random</w:t>
+            </w:r>
+          </w:p>
+        </w:tc>
+        <w:tc>
+          <w:tcPr>
+            <w:tcW w:type="dxa" w:w="2835"/>
+            <w:vAlign w:val="center"/>
+          </w:tcPr>
+          <w:p>
+            <w:pPr>
+              <w:spacing w:after="60" w:before="60" w:line="240" w:lineRule="auto"/>
+            </w:pPr>
+            <w:r>
+              <w:rPr>
+                <w:rFonts w:eastAsia="Noto Sans CJK SC"/>
+                <w:b w:val="0"/>
+                <w:sz w:val="18"/>
+              </w:rPr>
+              <w:t>28.0%</w:t>
+            </w:r>
+          </w:p>
+        </w:tc>
+        <w:tc>
+          <w:tcPr>
+            <w:tcW w:type="dxa" w:w="4309"/>
+            <w:vAlign w:val="center"/>
+          </w:tcPr>
+          <w:p>
+            <w:pPr>
+              <w:spacing w:after="60" w:before="60" w:line="240" w:lineRule="auto"/>
+            </w:pPr>
+            <w:r>
+              <w:rPr>
+                <w:rFonts w:eastAsia="Noto Sans CJK SC"/>
+                <w:b w:val="0"/>
+                <w:sz w:val="18"/>
+              </w:rPr>
+              <w:t>+20.0pp</w:t>
+            </w:r>
+          </w:p>
+        </w:tc>
+      </w:tr>
+      <w:tr>
+        <w:trPr>
+          <w:cantSplit/>
+        </w:trPr>
+        <w:tc>
+          <w:tcPr>
+            <w:tcW w:type="dxa" w:w="2381"/>
+            <w:vAlign w:val="center"/>
+          </w:tcPr>
+          <w:p>
+            <w:pPr>
+              <w:spacing w:after="60" w:before="60" w:line="240" w:lineRule="auto"/>
+            </w:pPr>
+            <w:r>
+              <w:rPr>
+                <w:rFonts w:eastAsia="Noto Sans CJK SC"/>
+                <w:b w:val="0"/>
+                <w:sz w:val="18"/>
+              </w:rPr>
+              <w:t>Single Best (Mono-L)</w:t>
+            </w:r>
+          </w:p>
+        </w:tc>
+        <w:tc>
+          <w:tcPr>
+            <w:tcW w:type="dxa" w:w="2835"/>
+            <w:vAlign w:val="center"/>
+          </w:tcPr>
+          <w:p>
+            <w:pPr>
+              <w:spacing w:after="60" w:before="60" w:line="240" w:lineRule="auto"/>
+            </w:pPr>
+            <w:r>
+              <w:rPr>
+                <w:rFonts w:eastAsia="Noto Sans CJK SC"/>
+                <w:b w:val="0"/>
+                <w:sz w:val="18"/>
+              </w:rPr>
+              <w:t>38.7%</w:t>
+            </w:r>
+          </w:p>
+        </w:tc>
+        <w:tc>
+          <w:tcPr>
+            <w:tcW w:type="dxa" w:w="4309"/>
+            <w:vAlign w:val="center"/>
+          </w:tcPr>
+          <w:p>
+            <w:pPr>
+              <w:spacing w:after="60" w:before="60" w:line="240" w:lineRule="auto"/>
+            </w:pPr>
+            <w:r>
+              <w:rPr>
+                <w:rFonts w:eastAsia="Noto Sans CJK SC"/>
+                <w:b w:val="0"/>
+                <w:sz w:val="18"/>
+              </w:rPr>
+              <w:t>+9.3pp</w:t>
+            </w:r>
+          </w:p>
+        </w:tc>
+      </w:tr>
+      <w:tr>
+        <w:trPr>
+          <w:cantSplit/>
+        </w:trPr>
+        <w:tc>
+          <w:tcPr>
+            <w:tcW w:type="dxa" w:w="2381"/>
+            <w:vAlign w:val="center"/>
+          </w:tcPr>
+          <w:p>
+            <w:pPr>
+              <w:spacing w:after="60" w:before="60" w:line="240" w:lineRule="auto"/>
+            </w:pPr>
+            <w:r>
+              <w:rPr>
+                <w:rFonts w:eastAsia="Noto Sans CJK SC"/>
+                <w:b w:val="0"/>
+                <w:sz w:val="18"/>
+              </w:rPr>
+              <w:t>Weighted Sum</w:t>
+            </w:r>
+          </w:p>
+        </w:tc>
+        <w:tc>
+          <w:tcPr>
+            <w:tcW w:type="dxa" w:w="2835"/>
+            <w:vAlign w:val="center"/>
+          </w:tcPr>
+          <w:p>
+            <w:pPr>
+              <w:spacing w:after="60" w:before="60" w:line="240" w:lineRule="auto"/>
+            </w:pPr>
+            <w:r>
+              <w:rPr>
+                <w:rFonts w:eastAsia="Noto Sans CJK SC"/>
+                <w:b w:val="0"/>
+                <w:sz w:val="18"/>
+              </w:rPr>
+              <w:t>40.7%</w:t>
+            </w:r>
+          </w:p>
+        </w:tc>
+        <w:tc>
+          <w:tcPr>
+            <w:tcW w:type="dxa" w:w="4309"/>
+            <w:vAlign w:val="center"/>
+          </w:tcPr>
+          <w:p>
+            <w:pPr>
+              <w:spacing w:after="60" w:before="60" w:line="240" w:lineRule="auto"/>
+            </w:pPr>
+            <w:r>
+              <w:rPr>
+                <w:rFonts w:eastAsia="Noto Sans CJK SC"/>
+                <w:b w:val="0"/>
+                <w:sz w:val="18"/>
+              </w:rPr>
+              <w:t>+7.3pp</w:t>
+            </w:r>
+          </w:p>
+        </w:tc>
+      </w:tr>
+      <w:tr>
+        <w:trPr>
+          <w:cantSplit/>
+        </w:trPr>
+        <w:tc>
+          <w:tcPr>
+            <w:tcW w:type="dxa" w:w="2381"/>
+            <w:vAlign w:val="center"/>
+          </w:tcPr>
+          <w:p>
+            <w:pPr>
+              <w:spacing w:after="60" w:before="60" w:line="240" w:lineRule="auto"/>
+            </w:pPr>
+            <w:r>
+              <w:rPr>
+                <w:rFonts w:eastAsia="Noto Sans CJK SC"/>
+                <w:b w:val="0"/>
+                <w:sz w:val="18"/>
+              </w:rPr>
+              <w:t>选择性分解（本文）</w:t>
+            </w:r>
+          </w:p>
+        </w:tc>
+        <w:tc>
+          <w:tcPr>
+            <w:tcW w:type="dxa" w:w="2835"/>
+            <w:vAlign w:val="center"/>
+          </w:tcPr>
+          <w:p>
+            <w:pPr>
+              <w:spacing w:after="60" w:before="60" w:line="240" w:lineRule="auto"/>
+            </w:pPr>
+            <w:r>
+              <w:rPr>
+                <w:rFonts w:eastAsia="Noto Sans CJK SC"/>
+                <w:b w:val="0"/>
+                <w:sz w:val="18"/>
+              </w:rPr>
+              <w:t>42.0%</w:t>
+            </w:r>
+          </w:p>
+        </w:tc>
+        <w:tc>
+          <w:tcPr>
+            <w:tcW w:type="dxa" w:w="4309"/>
+            <w:vAlign w:val="center"/>
+          </w:tcPr>
+          <w:p>
+            <w:pPr>
+              <w:spacing w:after="60" w:before="60" w:line="240" w:lineRule="auto"/>
+            </w:pPr>
+            <w:r>
+              <w:rPr>
+                <w:rFonts w:eastAsia="Noto Sans CJK SC"/>
+                <w:b w:val="0"/>
+                <w:sz w:val="18"/>
+              </w:rPr>
+              <w:t>+6.0pp</w:t>
+            </w:r>
+          </w:p>
+        </w:tc>
+      </w:tr>
+      <w:tr>
+        <w:trPr>
+          <w:cantSplit/>
+        </w:trPr>
+        <w:tc>
+          <w:tcPr>
+            <w:tcW w:type="dxa" w:w="2381"/>
+            <w:vAlign w:val="center"/>
+          </w:tcPr>
+          <w:p>
+            <w:pPr>
+              <w:spacing w:after="60" w:before="60" w:line="240" w:lineRule="auto"/>
+            </w:pPr>
+            <w:r>
+              <w:rPr>
+                <w:rFonts w:eastAsia="Noto Sans CJK SC"/>
+                <w:b w:val="0"/>
+                <w:sz w:val="18"/>
+              </w:rPr>
+              <w:t>Oracle</w:t>
+            </w:r>
+          </w:p>
+        </w:tc>
+        <w:tc>
+          <w:tcPr>
+            <w:tcW w:type="dxa" w:w="2835"/>
+            <w:vAlign w:val="center"/>
+          </w:tcPr>
+          <w:p>
+            <w:pPr>
+              <w:spacing w:after="60" w:before="60" w:line="240" w:lineRule="auto"/>
+            </w:pPr>
+            <w:r>
+              <w:rPr>
+                <w:rFonts w:eastAsia="Noto Sans CJK SC"/>
+                <w:b w:val="0"/>
+                <w:sz w:val="18"/>
+              </w:rPr>
+              <w:t>48.0%</w:t>
+            </w:r>
+          </w:p>
+        </w:tc>
+        <w:tc>
+          <w:tcPr>
+            <w:tcW w:type="dxa" w:w="4309"/>
+            <w:vAlign w:val="center"/>
+          </w:tcPr>
+          <w:p>
+            <w:pPr>
+              <w:spacing w:after="60" w:before="60" w:line="240" w:lineRule="auto"/>
+            </w:pPr>
+            <w:r>
+              <w:rPr>
+                <w:rFonts w:eastAsia="Noto Sans CJK SC"/>
+                <w:b w:val="0"/>
+                <w:sz w:val="18"/>
+              </w:rPr>
+              <w:t>—</w:t>
+            </w:r>
+          </w:p>
+        </w:tc>
+      </w:tr>
+    </w:tbl>
+    <w:p>
+      <w:pPr>
+        <w:pStyle w:val="BodyText"/>
+      </w:pPr>
+      <w:r>
+        <w:t xml:space="preserve">不同决策粒度下，查询级路由 38.5%、节点级路由 40.0%、工作流级调度 56.0%（TAT-QA 200），决策粒度升级后质量持续提升。查询级路由反而低于单体 L（52.5%），与</w:t>
+      </w:r>
+      <w:r>
+        <w:t xml:space="preserve">“</w:t>
+      </w:r>
+      <w:r>
+        <w:t xml:space="preserve">路由机会不等价于可学习的路由信号</w:t>
+      </w:r>
+      <w:r>
+        <w:t xml:space="preserve">”</w:t>
+      </w:r>
+      <w:r>
+        <w:t xml:space="preserve">一致。</w:t>
+      </w:r>
+    </w:p>
+    <w:p>
+      <w:pPr>
         <w:pStyle w:val="BodyText"/>
       </w:pPr>
       <w:r>
@@ -15415,89 +15860,9 @@
       <w:pPr>
         <w:pStyle w:val="Heading2"/>
       </w:pPr>
-      <w:bookmarkStart w:id="51" w:name="讨论"/>
+      <w:bookmarkStart w:id="53" w:name="讨论"/>
       <w:r>
         <w:t xml:space="preserve">5 讨论</w:t>
-      </w:r>
-      <w:bookmarkEnd w:id="51"/>
-    </w:p>
-    <w:p>
-      <w:pPr>
-        <w:pStyle w:val="FirstParagraph"/>
-      </w:pPr>
-      <w:r>
-        <w:t xml:space="preserve">本章围绕四个问题组织，而不是复述实验结果：分解为什么不是免费的；条件能力为什么不能直接代表传播能力；Dynamic 为什么不能创造候选之外的能力；多模型 DAG 协同何时有效。四个问题的答案共同收敛到中心命题的三个条件。</w:t>
-      </w:r>
-    </w:p>
-    <w:p>
-      <w:pPr>
-        <w:pStyle w:val="Heading3"/>
-      </w:pPr>
-      <w:bookmarkStart w:id="52" w:name="为什么分解不是免费的"/>
-      <w:r>
-        <w:t xml:space="preserve">5.1 为什么分解不是免费的</w:t>
-      </w:r>
-      <w:bookmarkEnd w:id="52"/>
-    </w:p>
-    <w:p>
-      <w:pPr>
-        <w:pStyle w:val="FirstParagraph"/>
-      </w:pPr>
-      <w:r>
-        <w:t xml:space="preserve">分解在暴露中间接口的同时，也引入三类成本：接口成本（中间产物必须可解析、可传递，任何格式或语义丢失都会成为新失败点）、传播成本（上游输出质量直接约束下游，上游错误不再有机会被整题推理的冗余纠正）与调度成本（节点数与切换次数增加，预算与时间开销上升）。严格配对基准把这三类成本与收益分开计量：同模型拆分本身在 TAT-QA 上显著有害（−21.0pp），在 MultiHiertt 上为不显著的正向信号（+6.0pp）；异构分工追回 +5.0pp，但总体仍未完全抵消（DAG-L/M 31.7% vs Mono-L 38.7%）。因此</w:t>
-      </w:r>
-      <w:r>
-        <w:t xml:space="preserve">“</w:t>
-      </w:r>
-      <w:r>
-        <w:t xml:space="preserve">拆分总提高性能</w:t>
-      </w:r>
-      <w:r>
-        <w:t xml:space="preserve">”</w:t>
-      </w:r>
-      <w:r>
-        <w:t xml:space="preserve">的直觉不成立，DAG 的正确定位是能力解耦接口，而不是精度加速器。</w:t>
-      </w:r>
-    </w:p>
-    <w:p>
-      <w:pPr>
-        <w:pStyle w:val="BodyText"/>
-      </w:pPr>
-      <w:r>
-        <w:t xml:space="preserve">TAT-QA 上 56 个 Harm 的逐题分类进一步说明分解税的成分：真分解失败 31 例（推理在 gold facts 下仍错），接口损失 25 例（解析/执行失败与 6 例事实顺序/符号错位）。值得强调的反事实是：即便将全部接口损失修正，配对差仍为 −8.5pp 且区间不含零——该域的分解损失以真实推理退化为主，不能归因于实现 bug。复杂度分层同时给出</w:t>
-      </w:r>
-      <w:r>
-        <w:t xml:space="preserve">“</w:t>
-      </w:r>
-      <w:r>
-        <w:t xml:space="preserve">何时值得拆</w:t>
-      </w:r>
-      <w:r>
-        <w:t xml:space="preserve">”</w:t>
-      </w:r>
-      <w:r>
-        <w:t xml:space="preserve">的初步形状：TAT-QA 上分解效应随推导步数单调上升（−27.1 → +21.1 → +50.0pp），简单任务承担了绝大部分分解税。这提示分解决策是任务复杂度依赖的，但 3 步以上子层样本很小，本文只把它作为描述性机制证据，不给出</w:t>
-      </w:r>
-      <w:r>
-        <w:t xml:space="preserve">“</w:t>
-      </w:r>
-      <w:r>
-        <w:t xml:space="preserve">超过某步数必须拆分</w:t>
-      </w:r>
-      <w:r>
-        <w:t xml:space="preserve">”</w:t>
-      </w:r>
-      <w:r>
-        <w:t xml:space="preserve">的规则。</w:t>
-      </w:r>
-    </w:p>
-    <w:p>
-      <w:pPr>
-        <w:pStyle w:val="Heading3"/>
-      </w:pPr>
-      <w:bookmarkStart w:id="53" w:name="为什么条件能力不能直接代表传播能力"/>
-      <w:r>
-        <w:t xml:space="preserve">5.2 为什么条件能力不能直接代表传播能力</w:t>
       </w:r>
       <w:bookmarkEnd w:id="53"/>
     </w:p>
@@ -15506,36 +15871,16 @@
         <w:pStyle w:val="FirstParagraph"/>
       </w:pPr>
       <w:r>
-        <w:t xml:space="preserve">阶段评测揭示的是给定输入条件下的模型表现。条件化推理任务提供标准事实，使推理者主要承担关系识别与表达式构造；实际传播链还要求上游正确识别数值、实体、期间与单位。即使推理模型本身不变，输入来源变化也会改变其可解任务集合。因此条件节点 Oracle 是能力分析工具，不能直接作为完整执行的可达质量——条件口径的最佳固定质量为 0.31、逐任务推理 Oracle 为 0.41，而传播口径的同模型链最佳为 0.18、Oracle 为 0.23；冻结审计给出各面板传播 headroom 5.00/4.50/5.40/5.06pp，共同失败占比约 77%。跨模型矩阵提供更直接的机制证据：固定 medium 或 coder 推理者，更换为 large 抽取后最终质量提高——同模型执行将不同阶段的强弱项绑定，上游缺陷会掩盖下游能力，而 DAG 的作用之一正是使这种绑定可被打破。</w:t>
+        <w:t xml:space="preserve">本章围绕四个问题组织，而不是复述实验结果：分解为什么不是免费的；条件能力为什么不能直接代表传播能力；Dynamic 为什么不能创造候选之外的能力；多模型 DAG 协同何时有效。四个问题的答案共同收敛到中心命题的三个条件。</w:t>
       </w:r>
     </w:p>
     <w:p>
       <w:pPr>
-        <w:pStyle w:val="BodyText"/>
-      </w:pPr>
-      <w:r>
-        <w:t xml:space="preserve">由此得到两个方法论结论。其一，能力画像、条件 Oracle 与传播链质量是三个不同层级的测量，不可直接拼接；用不同任务集上的条件 Oracle 与传播 Oracle 之差估计</w:t>
-      </w:r>
-      <w:r>
-        <w:t xml:space="preserve">“</w:t>
-      </w:r>
-      <w:r>
-        <w:t xml:space="preserve">抽取噪声</w:t>
-      </w:r>
-      <w:r>
-        <w:t xml:space="preserve">”</w:t>
-      </w:r>
-      <w:r>
-        <w:t xml:space="preserve">的因果效应没有依据。其二，单模型成功可预测（传播画像中 ROC-AUC 0.75–0.84）不等于最优模型可路由：多个模型往往同时在简单任务成功、在复杂任务失败，这给单模型分类器提供了明显信号，却不给模型切换提供收益——AUC 对跨任务排序敏感，而路由收益取决于同任务候选差异、评分可比性与切换错误的代价。节点确认面板上类型先验与冻结节点路由质量相同，提示当前可稳定利用的结构主要是阶段差异，而非细粒度实例表示。</w:t>
-      </w:r>
-    </w:p>
-    <w:p>
-      <w:pPr>
         <w:pStyle w:val="Heading3"/>
       </w:pPr>
-      <w:bookmarkStart w:id="54" w:name="为什么动态适应不能创造能力"/>
-      <w:r>
-        <w:t xml:space="preserve">5.3 为什么动态适应不能创造能力</w:t>
+      <w:bookmarkStart w:id="54" w:name="为什么分解不是免费的"/>
+      <w:r>
+        <w:t xml:space="preserve">5.1 为什么分解不是免费的</w:t>
       </w:r>
       <w:bookmarkEnd w:id="54"/>
     </w:p>
@@ -15544,19 +15889,19 @@
         <w:pStyle w:val="FirstParagraph"/>
       </w:pPr>
       <w:r>
-        <w:t xml:space="preserve">路由和恢复都只能在候选执行结果之间选择：对于给定模型、提示、输入与动作集合，如果所有候选都失败，改进选择本身不能产生其中不存在的正确答案。这是固定候选集合的上限，不是对整个任务可解性的判断。真实失败集合中四个动作的成功并集仅为 8/116（6.90%），局部子图重规划新增覆盖为零（NO-GO）——当前剩余限制不能简单归因于</w:t>
+        <w:t xml:space="preserve">分解在暴露中间接口的同时，也引入三类成本：接口成本（中间产物必须可解析、可传递，任何格式或语义丢失都会成为新失败点）、传播成本（上游输出质量直接约束下游，上游错误不再有机会被整题推理的冗余纠正）与调度成本（节点数与切换次数增加，预算与时间开销上升）。严格配对基准把这三类成本与收益分开计量：同模型拆分本身在 TAT-QA 上显著有害（−21.0pp），在 MultiHiertt 上为不显著的正向信号（+6.0pp）；异构分工追回 +5.0pp，但总体仍未完全抵消（DAG-L/M 31.7% vs Mono-L 38.7%）。因此</w:t>
       </w:r>
       <w:r>
         <w:t xml:space="preserve">“</w:t>
       </w:r>
       <w:r>
-        <w:t xml:space="preserve">动作选得不够好</w:t>
+        <w:t xml:space="preserve">拆分总提高性能</w:t>
       </w:r>
       <w:r>
         <w:t xml:space="preserve">”</w:t>
       </w:r>
       <w:r>
-        <w:t xml:space="preserve">，而是动作集合里确实缺少成功输出。结构解析诊断进一步提示，找到数值并不等于理解其关系：必要操作数出现在候选证据中，仍可能伴随实体绑定、期间对齐和表达式构造错误。</w:t>
+        <w:t xml:space="preserve">的直觉不成立，DAG 的正确定位是能力解耦接口，而不是精度加速器。</w:t>
       </w:r>
     </w:p>
     <w:p>
@@ -15564,30 +15909,130 @@
         <w:pStyle w:val="BodyText"/>
       </w:pPr>
       <w:r>
-        <w:t xml:space="preserve">这一上限在归因消融中同样成立。四节点 DAG 面板上动态相对静态的 +20.0pp 中，Static-Matched 臂（保持静态语义、仅把恢复目标换成升级目标）单独取得 +18.3pp，策略逻辑超出目标选择的贡献仅 +1.7pp（不显著）——该面板的主要质量增益来自</w:t>
+        <w:t xml:space="preserve">TAT-QA 上 56 个 Harm 的逐题分类进一步说明分解税的成分：真分解失败 31 例（推理在 gold facts 下仍错），接口损失 25 例（解析/执行失败与 6 例事实顺序/符号错位）。值得强调的反事实是：即便将全部接口损失修正，配对差仍为 −8.5pp 且区间不含零——该域的分解损失以真实推理退化为主，不能归因于实现 bug。复杂度分层同时给出</w:t>
       </w:r>
       <w:r>
         <w:t xml:space="preserve">“</w:t>
       </w:r>
       <w:r>
-        <w:t xml:space="preserve">失败节点升级至最强未试模型</w:t>
+        <w:t xml:space="preserve">何时值得拆</w:t>
       </w:r>
       <w:r>
         <w:t xml:space="preserve">”</w:t>
       </w:r>
       <w:r>
-        <w:t xml:space="preserve">这一动作本身，而这一动作之所以有效，正是因为候选集合中存在更强的未试模型。动态框架的可确证价值在于以选择性更新（933 次适配调用全部限于失败节点及其后代闭包、分支隔离零违例）与预算约束安全地承载该动作，而不是凭空创造能力。反过来，当候选集合被接口表达力封顶（数学域两类接口族均塌缩）或动作集合覆盖不足（8/116）时，任何调度策略都无法突破该上限。能力覆盖与动作选择因此是两个不同层级的上限，本文的贡献定位是后者。</w:t>
+        <w:t xml:space="preserve">的初步形状：TAT-QA 上分解效应随推导步数单调上升（−27.1 → +21.1 → +50.0pp），简单任务承担了绝大部分分解税。这提示分解决策是任务复杂度依赖的，但 3 步以上子层样本很小，本文只把它作为描述性机制证据，不给出</w:t>
+      </w:r>
+      <w:r>
+        <w:t xml:space="preserve">“</w:t>
+      </w:r>
+      <w:r>
+        <w:t xml:space="preserve">超过某步数必须拆分</w:t>
+      </w:r>
+      <w:r>
+        <w:t xml:space="preserve">”</w:t>
+      </w:r>
+      <w:r>
+        <w:t xml:space="preserve">的规则。</w:t>
       </w:r>
     </w:p>
     <w:p>
       <w:pPr>
         <w:pStyle w:val="Heading3"/>
       </w:pPr>
-      <w:bookmarkStart w:id="55" w:name="多模型有向无环图协同何时有效"/>
+      <w:bookmarkStart w:id="55" w:name="为什么条件能力不能直接代表传播能力"/>
+      <w:r>
+        <w:t xml:space="preserve">5.2 为什么条件能力不能直接代表传播能力</w:t>
+      </w:r>
+      <w:bookmarkEnd w:id="55"/>
+    </w:p>
+    <w:p>
+      <w:pPr>
+        <w:pStyle w:val="FirstParagraph"/>
+      </w:pPr>
+      <w:r>
+        <w:t xml:space="preserve">阶段评测揭示的是给定输入条件下的模型表现。条件化推理任务提供标准事实，使推理者主要承担关系识别与表达式构造；实际传播链还要求上游正确识别数值、实体、期间与单位。即使推理模型本身不变，输入来源变化也会改变其可解任务集合。因此条件节点 Oracle 是能力分析工具，不能直接作为完整执行的可达质量——条件口径的最佳固定质量为 0.31、逐任务推理 Oracle 为 0.41，而传播口径的同模型链最佳为 0.18、Oracle 为 0.23；冻结审计给出各面板传播 headroom 5.00/4.50/5.40/5.06pp，共同失败占比约 77%。跨模型矩阵提供更直接的机制证据：固定 medium 或 coder 推理者，更换为 large 抽取后最终质量提高——同模型执行将不同阶段的强弱项绑定，上游缺陷会掩盖下游能力，而 DAG 的作用之一正是使这种绑定可被打破。</w:t>
+      </w:r>
+    </w:p>
+    <w:p>
+      <w:pPr>
+        <w:pStyle w:val="BodyText"/>
+      </w:pPr>
+      <w:r>
+        <w:t xml:space="preserve">由此得到两个方法论结论。其一，能力画像、条件 Oracle 与传播链质量是三个不同层级的测量，不可直接拼接；用不同任务集上的条件 Oracle 与传播 Oracle 之差估计</w:t>
+      </w:r>
+      <w:r>
+        <w:t xml:space="preserve">“</w:t>
+      </w:r>
+      <w:r>
+        <w:t xml:space="preserve">抽取噪声</w:t>
+      </w:r>
+      <w:r>
+        <w:t xml:space="preserve">”</w:t>
+      </w:r>
+      <w:r>
+        <w:t xml:space="preserve">的因果效应没有依据。其二，单模型成功可预测（传播画像中 ROC-AUC 0.75–0.84）不等于最优模型可路由：多个模型往往同时在简单任务成功、在复杂任务失败，这给单模型分类器提供了明显信号，却不给模型切换提供收益——AUC 对跨任务排序敏感，而路由收益取决于同任务候选差异、评分可比性与切换错误的代价。节点确认面板上类型先验与冻结节点路由质量相同，提示当前可稳定利用的结构主要是阶段差异，而非细粒度实例表示。</w:t>
+      </w:r>
+    </w:p>
+    <w:p>
+      <w:pPr>
+        <w:pStyle w:val="Heading3"/>
+      </w:pPr>
+      <w:bookmarkStart w:id="56" w:name="为什么动态适应不能创造能力"/>
+      <w:r>
+        <w:t xml:space="preserve">5.3 为什么动态适应不能创造能力</w:t>
+      </w:r>
+      <w:bookmarkEnd w:id="56"/>
+    </w:p>
+    <w:p>
+      <w:pPr>
+        <w:pStyle w:val="FirstParagraph"/>
+      </w:pPr>
+      <w:r>
+        <w:t xml:space="preserve">路由和恢复都只能在候选执行结果之间选择：对于给定模型、提示、输入与动作集合，如果所有候选都失败，改进选择本身不能产生其中不存在的正确答案。这是固定候选集合的上限，不是对整个任务可解性的判断。真实失败集合中四个动作的成功并集仅为 8/116（6.90%），局部子图重规划新增覆盖为零（NO-GO）——当前剩余限制不能简单归因于</w:t>
+      </w:r>
+      <w:r>
+        <w:t xml:space="preserve">“</w:t>
+      </w:r>
+      <w:r>
+        <w:t xml:space="preserve">动作选得不够好</w:t>
+      </w:r>
+      <w:r>
+        <w:t xml:space="preserve">”</w:t>
+      </w:r>
+      <w:r>
+        <w:t xml:space="preserve">，而是动作集合里确实缺少成功输出。结构解析诊断进一步提示，找到数值并不等于理解其关系：必要操作数出现在候选证据中，仍可能伴随实体绑定、期间对齐和表达式构造错误。</w:t>
+      </w:r>
+    </w:p>
+    <w:p>
+      <w:pPr>
+        <w:pStyle w:val="BodyText"/>
+      </w:pPr>
+      <w:r>
+        <w:t xml:space="preserve">这一上限在归因消融中同样成立。四节点 DAG 面板上动态相对静态的 +20.0pp 中，Static-Matched 臂（保持静态语义、仅把恢复目标换成升级目标）单独取得 +18.3pp，策略逻辑超出目标选择的贡献仅 +1.7pp（不显著）——该面板的主要质量增益来自</w:t>
+      </w:r>
+      <w:r>
+        <w:t xml:space="preserve">“</w:t>
+      </w:r>
+      <w:r>
+        <w:t xml:space="preserve">失败节点升级至最强未试模型</w:t>
+      </w:r>
+      <w:r>
+        <w:t xml:space="preserve">”</w:t>
+      </w:r>
+      <w:r>
+        <w:t xml:space="preserve">这一动作本身，而这一动作之所以有效，正是因为候选集合中存在更强的未试模型。动态框架的可确证价值在于以选择性更新（933 次适配调用全部限于失败节点及其后代闭包、分支隔离零违例）与预算约束安全地承载该动作，而不是凭空创造能力。反过来，当候选集合被接口表达力封顶（数学域两类接口族均塌缩）或动作集合覆盖不足（8/116）时，任何调度策略都无法突破该上限。能力覆盖与动作选择因此是两个不同层级的上限，本文的贡献定位是后者。</w:t>
+      </w:r>
+    </w:p>
+    <w:p>
+      <w:pPr>
+        <w:pStyle w:val="Heading3"/>
+      </w:pPr>
+      <w:bookmarkStart w:id="57" w:name="多模型有向无环图协同何时有效"/>
       <w:r>
         <w:t xml:space="preserve">5.4 多模型有向无环图协同何时有效</w:t>
       </w:r>
-      <w:bookmarkEnd w:id="55"/>
+      <w:bookmarkEnd w:id="57"/>
     </w:p>
     <w:p>
       <w:pPr>
@@ -15666,11 +16111,11 @@
       <w:pPr>
         <w:pStyle w:val="Heading3"/>
       </w:pPr>
-      <w:bookmarkStart w:id="56" w:name="非支配机会为何不等于动态优化机会"/>
+      <w:bookmarkStart w:id="58" w:name="非支配机会为何不等于动态优化机会"/>
       <w:r>
         <w:t xml:space="preserve">5.5 非支配机会为何不等于动态优化机会</w:t>
       </w:r>
-      <w:bookmarkEnd w:id="56"/>
+      <w:bookmarkEnd w:id="58"/>
     </w:p>
     <w:p>
       <w:pPr>
@@ -15750,7 +16195,7 @@
                     </pic:cNvPicPr>
                   </pic:nvPicPr>
                   <pic:blipFill>
-                    <a:blip r:embed="rId57"/>
+                    <a:blip r:embed="rId59"/>
                     <a:stretch>
                       <a:fillRect/>
                     </a:stretch>
@@ -15789,11 +16234,11 @@
       <w:pPr>
         <w:pStyle w:val="Heading2"/>
       </w:pPr>
-      <w:bookmarkStart w:id="58" w:name="结论"/>
+      <w:bookmarkStart w:id="60" w:name="结论"/>
       <w:r>
         <w:t xml:space="preserve">6 结论</w:t>
       </w:r>
-      <w:bookmarkEnd w:id="58"/>
+      <w:bookmarkEnd w:id="60"/>
     </w:p>
     <w:p>
       <w:pPr>
@@ -15876,11 +16321,11 @@
       <w:pPr>
         <w:pStyle w:val="Heading2"/>
       </w:pPr>
-      <w:bookmarkStart w:id="59" w:name="参考文献"/>
+      <w:bookmarkStart w:id="61" w:name="参考文献"/>
       <w:r>
         <w:t xml:space="preserve">参考文献</w:t>
       </w:r>
-      <w:bookmarkEnd w:id="59"/>
+      <w:bookmarkEnd w:id="61"/>
     </w:p>
     <w:p>
       <w:pPr>
@@ -15888,50 +16333,6 @@
       </w:pPr>
       <w:r>
         <w:t xml:space="preserve">[1] Ong, I., et al. RouteLLM: Learning to Route LLMs with Preference Data. 2024. arXiv:2406.18665.</w:t>
-      </w:r>
-      <w:r>
-        <w:t xml:space="preserve"> </w:t>
-      </w:r>
-      <w:hyperlink r:id="rId60">
-        <w:r>
-          <w:rPr>
-            <w:rStyle w:val="Hyperlink"/>
-          </w:rPr>
-          <w:t xml:space="preserve">原文</w:t>
-        </w:r>
-      </w:hyperlink>
-      <w:r>
-        <w:t xml:space="preserve">.</w:t>
-      </w:r>
-    </w:p>
-    <w:p>
-      <w:pPr>
-        <w:pStyle w:val="BodyText"/>
-      </w:pPr>
-      <w:r>
-        <w:t xml:space="preserve">[2] Chen, L., Zaharia, M., and Zou, J. FrugalGPT: How to Use Large Language Models While Reducing Cost and Improving Performance. 2023. arXiv:2305.05176.</w:t>
-      </w:r>
-      <w:r>
-        <w:t xml:space="preserve"> </w:t>
-      </w:r>
-      <w:hyperlink r:id="rId61">
-        <w:r>
-          <w:rPr>
-            <w:rStyle w:val="Hyperlink"/>
-          </w:rPr>
-          <w:t xml:space="preserve">原文</w:t>
-        </w:r>
-      </w:hyperlink>
-      <w:r>
-        <w:t xml:space="preserve">.</w:t>
-      </w:r>
-    </w:p>
-    <w:p>
-      <w:pPr>
-        <w:pStyle w:val="BodyText"/>
-      </w:pPr>
-      <w:r>
-        <w:t xml:space="preserve">[3] Kim, S., et al. An LLM Compiler for Parallel Function Calling. 2024 年修订版，arXiv:2312.04511v3.</w:t>
       </w:r>
       <w:r>
         <w:t xml:space="preserve"> </w:t>
@@ -15953,7 +16354,7 @@
         <w:pStyle w:val="BodyText"/>
       </w:pPr>
       <w:r>
-        <w:t xml:space="preserve">[4] Madaan, A., et al. Self-Refine: Iterative Refinement with Self-Feedback. 2023. arXiv:2303.17651.</w:t>
+        <w:t xml:space="preserve">[2] Chen, L., Zaharia, M., and Zou, J. FrugalGPT: How to Use Large Language Models While Reducing Cost and Improving Performance. 2023. arXiv:2305.05176.</w:t>
       </w:r>
       <w:r>
         <w:t xml:space="preserve"> </w:t>
@@ -15975,7 +16376,7 @@
         <w:pStyle w:val="BodyText"/>
       </w:pPr>
       <w:r>
-        <w:t xml:space="preserve">[5] Wang, Z. Z., Mao, J., Fried, D., and Neubig, G. Agent Workflow Memory. 2024. arXiv:2409.07429.</w:t>
+        <w:t xml:space="preserve">[3] Kim, S., et al. An LLM Compiler for Parallel Function Calling. 2024 年修订版，arXiv:2312.04511v3.</w:t>
       </w:r>
       <w:r>
         <w:t xml:space="preserve"> </w:t>
@@ -15997,7 +16398,7 @@
         <w:pStyle w:val="BodyText"/>
       </w:pPr>
       <w:r>
-        <w:t xml:space="preserve">[6] MultiHiertt: Numerical Reasoning over Multi Hierarchical Tabular and Textual Data. ACL 2022.</w:t>
+        <w:t xml:space="preserve">[4] Madaan, A., et al. Self-Refine: Iterative Refinement with Self-Feedback. 2023. arXiv:2303.17651.</w:t>
       </w:r>
       <w:r>
         <w:t xml:space="preserve"> </w:t>
@@ -16007,7 +16408,7 @@
           <w:rPr>
             <w:rStyle w:val="Hyperlink"/>
           </w:rPr>
-          <w:t xml:space="preserve">正式论文页面</w:t>
+          <w:t xml:space="preserve">原文</w:t>
         </w:r>
       </w:hyperlink>
       <w:r>
@@ -16019,7 +16420,7 @@
         <w:pStyle w:val="BodyText"/>
       </w:pPr>
       <w:r>
-        <w:t xml:space="preserve">[7] TAT-QA: A Question Answering Benchmark on a Hybrid of Tabular and Textual Content in Finance. ACL-IJCNLP 2021.</w:t>
+        <w:t xml:space="preserve">[5] Wang, Z. Z., Mao, J., Fried, D., and Neubig, G. Agent Workflow Memory. 2024. arXiv:2409.07429.</w:t>
       </w:r>
       <w:r>
         <w:t xml:space="preserve"> </w:t>
@@ -16029,7 +16430,7 @@
           <w:rPr>
             <w:rStyle w:val="Hyperlink"/>
           </w:rPr>
-          <w:t xml:space="preserve">正式论文页面</w:t>
+          <w:t xml:space="preserve">原文</w:t>
         </w:r>
       </w:hyperlink>
       <w:r>
@@ -16041,7 +16442,7 @@
         <w:pStyle w:val="BodyText"/>
       </w:pPr>
       <w:r>
-        <w:t xml:space="preserve">[8] Hendrycks, D., Burns, C., Kadavath, S., Arora, A., Basart, S., Tang, E., Song, D., and Steinhardt, J. Measuring Mathematical Problem Solving With the MATH Dataset. NeurIPS 2021.</w:t>
+        <w:t xml:space="preserve">[6] MultiHiertt: Numerical Reasoning over Multi Hierarchical Tabular and Textual Data. ACL 2022.</w:t>
       </w:r>
       <w:r>
         <w:t xml:space="preserve"> </w:t>
@@ -16063,7 +16464,7 @@
         <w:pStyle w:val="BodyText"/>
       </w:pPr>
       <w:r>
-        <w:t xml:space="preserve">[9] Lightman, H., Kosaraju, V., Burda, Y., Edwards, H., Baker, B., Leike, J., Schulman, J., Sutskever, I., and Cobbe, K. Let’s Verify Step by Step. ICLR 2024.</w:t>
+        <w:t xml:space="preserve">[7] TAT-QA: A Question Answering Benchmark on a Hybrid of Tabular and Textual Content in Finance. ACL-IJCNLP 2021.</w:t>
       </w:r>
       <w:r>
         <w:t xml:space="preserve"> </w:t>
@@ -16077,7 +16478,7 @@
         </w:r>
       </w:hyperlink>
       <w:r>
-        <w:t xml:space="preserve">.（MATH-500 子集由该工作引入）</w:t>
+        <w:t xml:space="preserve">.</w:t>
       </w:r>
     </w:p>
     <w:p>
@@ -16085,7 +16486,7 @@
         <w:pStyle w:val="BodyText"/>
       </w:pPr>
       <w:r>
-        <w:t xml:space="preserve">[10] Austin, J., Odena, A., Nye, M., Bosma, M., Michalewski, H., Dohan, D., Jiang, E., Cai, C., Terry, M., Le, Q., and Sutton, C. Program Synthesis with Large Language Models. TMLR 2021.</w:t>
+        <w:t xml:space="preserve">[8] Hendrycks, D., Burns, C., Kadavath, S., Arora, A., Basart, S., Tang, E., Song, D., and Steinhardt, J. Measuring Mathematical Problem Solving With the MATH Dataset. NeurIPS 2021.</w:t>
       </w:r>
       <w:r>
         <w:t xml:space="preserve"> </w:t>
@@ -16099,7 +16500,7 @@
         </w:r>
       </w:hyperlink>
       <w:r>
-        <w:t xml:space="preserve">.（MBPP 974 任务及测试划分）</w:t>
+        <w:t xml:space="preserve">.</w:t>
       </w:r>
     </w:p>
     <w:p>
@@ -16107,12 +16508,56 @@
         <w:pStyle w:val="BodyText"/>
       </w:pPr>
       <w:r>
+        <w:t xml:space="preserve">[9] Lightman, H., Kosaraju, V., Burda, Y., Edwards, H., Baker, B., Leike, J., Schulman, J., Sutskever, I., and Cobbe, K. Let’s Verify Step by Step. ICLR 2024.</w:t>
+      </w:r>
+      <w:r>
+        <w:t xml:space="preserve"> </w:t>
+      </w:r>
+      <w:hyperlink r:id="rId70">
+        <w:r>
+          <w:rPr>
+            <w:rStyle w:val="Hyperlink"/>
+          </w:rPr>
+          <w:t xml:space="preserve">正式论文页面</w:t>
+        </w:r>
+      </w:hyperlink>
+      <w:r>
+        <w:t xml:space="preserve">.（MATH-500 子集由该工作引入）</w:t>
+      </w:r>
+    </w:p>
+    <w:p>
+      <w:pPr>
+        <w:pStyle w:val="BodyText"/>
+      </w:pPr>
+      <w:r>
+        <w:t xml:space="preserve">[10] Austin, J., Odena, A., Nye, M., Bosma, M., Michalewski, H., Dohan, D., Jiang, E., Cai, C., Terry, M., Le, Q., and Sutton, C. Program Synthesis with Large Language Models. TMLR 2021.</w:t>
+      </w:r>
+      <w:r>
+        <w:t xml:space="preserve"> </w:t>
+      </w:r>
+      <w:hyperlink r:id="rId71">
+        <w:r>
+          <w:rPr>
+            <w:rStyle w:val="Hyperlink"/>
+          </w:rPr>
+          <w:t xml:space="preserve">正式论文页面</w:t>
+        </w:r>
+      </w:hyperlink>
+      <w:r>
+        <w:t xml:space="preserve">.（MBPP 974 任务及测试划分）</w:t>
+      </w:r>
+    </w:p>
+    <w:p>
+      <w:pPr>
+        <w:pStyle w:val="BodyText"/>
+      </w:pPr>
+      <w:r>
         <w:t xml:space="preserve">[11] Kwon, W., Li, Z., Zhuang, S., Sheng, Y., Zheng, L., Yu, C. H., Gonzalez, J. E., Zhang, H., and Stoica, I. Efficient Memory Management for Large Language Model Serving with PagedAttention (vLLM). SOSP 2023.</w:t>
       </w:r>
       <w:r>
         <w:t xml:space="preserve"> </w:t>
       </w:r>
-      <w:hyperlink r:id="rId70">
+      <w:hyperlink r:id="rId72">
         <w:r>
           <w:rPr>
             <w:rStyle w:val="Hyperlink"/>

</xml_diff>

<commit_message>
reposition paper as multi-agent collaborative scheduling + multi-objective optimization: abstract rewritten (from failure-recovery to collaborative scheduling framing), conclusion rewritten (three-pillar evidence chain), experiment titles updated (4.2 strategy space, 4.4 multi-objective scheduling, 4.5 cross-domain boundary), all copies synced; checks green (5 exp, 5 disc, 11 method, 19 tables, 27 pages)
</commit_message>
<xml_diff>
--- a/r3_own_pool/paper_method_feedback_aware_dag/最终整合_20260921/论文完整草稿.docx
+++ b/r3_own_pool/paper_method_feedback_aware_dag/最终整合_20260921/论文完整草稿.docx
@@ -35,28 +35,7 @@
         <w:pStyle w:val="FirstParagraph"/>
       </w:pPr>
       <w:r>
-        <w:t xml:space="preserve">复杂任务包含信息抽取、关系推理和结果验证等不同能力需求，针对完整查询选择单一模型难以利用执行阶段间的模型互补。本文提出反馈感知的自适应有向无环图路由框架，将能力画像、节点级模型分配、静态执行与反馈条件化的后继适应相结合，并以选择性干预、预算约束和历史图复用组织多模型协同。财务复杂任务实验表明，冻结节点路由相对查询路由的条件化节点质量提高约 6.9 个百分点，主要收益来自阶段粒度；严格配对的三臂分解基准（300 任务、一次统一会话）进一步表明，同模型拆分本身在 TAT-QA 上显著有害（−21.0pp）、在 MultiHiertt 上不显著，而拆分后的异构阶段分工带来总体 +5.0pp 的显著增益、但未完全抵消分解损耗——DAG 的核心作用是解除阶段能力绑定、使异构能力分配成为可能，而非普遍提高推理精度。在含分支与汇合的四节点真实 DAG 面板上，选择性动态适应显著优于静态执行（+20.0pp），对照消融显示主要增益来自</w:t>
-      </w:r>
-      <w:r>
-        <w:t xml:space="preserve">“</w:t>
-      </w:r>
-      <w:r>
-        <w:t xml:space="preserve">失败节点升级至最强未试模型</w:t>
-      </w:r>
-      <w:r>
-        <w:t xml:space="preserve">”</w:t>
-      </w:r>
-      <w:r>
-        <w:t xml:space="preserve">这一动作本身，部署可得信号可保留 91.7% 的增益——Dynamic 的作用是在反馈和预算约束下选择性调用已有能力，而非凭空创造能力。跨域与外部方法比较进一步划定适用边界：代码域中单元测试反馈驱动的动态适应相对静态提升 6.0pp（bootstrap 区间不含零、精确 McNemar p=0.070 未达显著，属支持性证据），数学域中冻结的阶段分配先验与验证接口同时失配、DAG 全面劣于单体；同池同面板同评分器下，答案级迭代精修在代码域点估计最高但与本文方法的配对差异未达显著。统一命题为：</w:t>
-      </w:r>
-      <w:r>
-        <w:rPr>
-          <w:b/>
-        </w:rPr>
-        <w:t xml:space="preserve">多模型 DAG 协同并非天然带来性能提升，其有效性取决于阶段能力匹配、节点接口表达能力和运行反馈可诊断性</w:t>
-      </w:r>
-      <w:r>
-        <w:t xml:space="preserve">；本文方法的贡献定位于节点级、依赖感知、局部且可审计的动态执行机制，而非所有任务域的原始准确率领先。</w:t>
+        <w:t xml:space="preserve">复杂任务包含信息抽取、关系推理和结果验证等不同能力需求，针对完整查询选择单一模型难以利用执行阶段间的模型互补。本文将异构大型语言模型视为智能体执行单元，提出面向复杂任务的多智能体 DAG 协同调度框架，将能力画像、节点级智能体分配、反馈驱动的动态执行与质量—成本—时延多目标调度相结合。实验表明：不同执行阶段存在可利用的异构能力差异，节点级分配比查询级路由提高条件化节点质量约 6.9 个百分点，但路由机会不等价于可学习的路由信号，条件能力也不等价于传播能力。严格配对三臂分解基准（300 任务）显示，同模型拆分在 TAT-QA 上显著有害（−21.0 个百分点），异构分工追回 +5.0 个百分点但未完全抵消分解损耗——分解的价值在于解除阶段能力绑定，而非普遍提高推理精度。四节点 DAG 面板上反馈驱动的动态执行显著优于静态执行（+20.0 个百分点），归因消融显示主要增益来自恢复动作本身。选择性分解门控在 5 折交叉拟合中超过单体基线 +3.3 个百分点，同时超过强制分解 +10.3 个百分点，在多目标策略选择比较中实现最小 Oracle Gap（6.0 个百分点）。跨域验证（财务、数学、代码）与外部方法比较划定适用边界：多智能体 DAG 协同并非天然带来性能提升，其有效性取决于阶段能力匹配、节点接口表达能力和运行反馈可诊断性——静态非支配权衡的存在也不保证动态优化收益。本文的贡献定位于多智能体协同调度的机制刻画与优化边界分析，而非普适的质量提升方法。</w:t>
       </w:r>
     </w:p>
     <w:p>
@@ -73,7 +52,7 @@
         <w:t xml:space="preserve"> </w:t>
       </w:r>
       <w:r>
-        <w:t xml:space="preserve">大模型路由；多模型协同；任务有向无环图；反馈适应；选择性路由；预算约束</w:t>
+        <w:t xml:space="preserve">多智能体协同调度；异构大语言模型；任务有向无环图；多目标优化；反馈驱动执行；适用边界</w:t>
       </w:r>
     </w:p>
     <w:p>
@@ -4396,9 +4375,9 @@
       <w:pPr>
         <w:pStyle w:val="Heading3"/>
       </w:pPr>
-      <w:bookmarkStart w:id="47" w:name="阶段能力异质性与节点级分配"/>
-      <w:r>
-        <w:t xml:space="preserve">4.2 阶段能力异质性与节点级分配</w:t>
+      <w:bookmarkStart w:id="47" w:name="执行策略空间构建与协同决策粒度分析"/>
+      <w:r>
+        <w:t xml:space="preserve">4.2 执行策略空间构建与协同决策粒度分析</w:t>
       </w:r>
       <w:bookmarkEnd w:id="47"/>
     </w:p>
@@ -13281,9 +13260,9 @@
       <w:pPr>
         <w:pStyle w:val="Heading3"/>
       </w:pPr>
-      <w:bookmarkStart w:id="49" w:name="多目标优化空间与动态收益条件"/>
-      <w:r>
-        <w:t xml:space="preserve">4.4 多目标优化空间与动态收益条件</w:t>
+      <w:bookmarkStart w:id="49" w:name="pareto-感知的多目标协同调度"/>
+      <w:r>
+        <w:t xml:space="preserve">4.4 Pareto 感知的多目标协同调度</w:t>
       </w:r>
       <w:bookmarkEnd w:id="49"/>
     </w:p>
@@ -13626,9 +13605,9 @@
       <w:pPr>
         <w:pStyle w:val="Heading3"/>
       </w:pPr>
-      <w:bookmarkStart w:id="50" w:name="跨域适用边界与外部方法比较"/>
-      <w:r>
-        <w:t xml:space="preserve">4.5 跨域适用边界与外部方法比较</w:t>
+      <w:bookmarkStart w:id="50" w:name="跨域适用边界分析"/>
+      <w:r>
+        <w:t xml:space="preserve">4.5 跨域适用边界分析</w:t>
       </w:r>
       <w:bookmarkEnd w:id="50"/>
     </w:p>
@@ -16245,7 +16224,7 @@
         <w:pStyle w:val="FirstParagraph"/>
       </w:pPr>
       <w:r>
-        <w:t xml:space="preserve">本文研究复杂任务中的异构大模型协同执行，提出反馈感知的自适应 DAG 路由框架，以能力画像支持节点级分配，以反馈条件化的后继适应连接静态执行与动态调整，并通过剩余预算控制和历史图复用约束额外开销。动态适应不以修改拓扑为必要条件；模型重新分配、受影响后继更新与有限恢复均属于其执行范围。</w:t>
+        <w:t xml:space="preserve">本文将异构大型语言模型视为智能体执行单元，提出面向复杂任务的多智能体 DAG 协同调度框架，以能力画像支持节点级智能体分配，以反馈条件化的后继适应连接静态与动态执行，以质量—成本—时延多目标形式化刻画执行策略选择，并通过剩余预算控制和选择性分解门控约束额外开销。</w:t>
       </w:r>
     </w:p>
     <w:p>
@@ -16259,7 +16238,7 @@
         <w:rPr>
           <w:b/>
         </w:rPr>
-        <w:t xml:space="preserve">多模型 DAG 协同并非天然带来性能提升，其有效性取决于阶段能力匹配、节点接口表达能力和运行反馈可诊断性</w:t>
+        <w:t xml:space="preserve">多智能体 DAG 协同并非天然带来性能提升，其有效性取决于阶段能力匹配、节点接口表达能力和运行反馈可诊断性</w:t>
       </w:r>
       <w:r>
         <w:t xml:space="preserve">。三组证据共同支持这一命题。</w:t>
@@ -16270,7 +16249,7 @@
         <w:pStyle w:val="BodyText"/>
       </w:pPr>
       <w:r>
-        <w:t xml:space="preserve">其一，严格配对分解基准显示同模型拆分本身在 TAT-QA 上显著有害（−21.0pp）、在 MultiHiertt 上为不显著正向信号（+6.0pp），异构阶段分工追回总体 +5.0pp 但未完全抵消分解损耗（DAG-L/M 31.7% 对 Mono-L 38.7%）——DAG 的核心作用是解除阶段能力绑定，而非提高推理精度。</w:t>
+        <w:t xml:space="preserve">其一，严格配对分解基准显示同模型拆分在 TAT-QA 上显著有害（−21.0 个百分点），异构分工追回 +5.0 个百分点但未完全抵消——DAG 的核心作用是解除阶段能力绑定而非提高推理精度。损失归因消融进一步表明，21.0 个百分点分解损失以推理退化为主（约 17.5 个百分点残余），接口信息丢失次之。选择性分解门控在 5 折交叉拟合中超过单体 +3.3 个百分点、超过强制分解 +10.3 个百分点，并在多目标策略选择比较中实现最小 Oracle Gap（6.0 个百分点），证实分解价值在于对哪些任务拆分而非是否拆分。</w:t>
       </w:r>
     </w:p>
     <w:p>
@@ -16278,19 +16257,7 @@
         <w:pStyle w:val="BodyText"/>
       </w:pPr>
       <w:r>
-        <w:t xml:space="preserve">其二，反馈驱动的动态适应呈现结构依赖的梯度：两节点链上为方向一致但未确证的小幅正信号；四节点真实 DAG 上选择性动态适应显著优于静态（+20.0pp，CI 不含零），但 Static-Matched 消融把归因说清——主要增益来自</w:t>
-      </w:r>
-      <w:r>
-        <w:t xml:space="preserve">“</w:t>
-      </w:r>
-      <w:r>
-        <w:t xml:space="preserve">失败节点升级至最强未试模型</w:t>
-      </w:r>
-      <w:r>
-        <w:t xml:space="preserve">”</w:t>
-      </w:r>
-      <w:r>
-        <w:t xml:space="preserve">这一动作本身（+18.3pp），动态框架的可确证价值在于以选择性更新与预算约束安全地承载该动作（933 次适配调用全部限于受影响后代、分支隔离零违例、预算违规为零），且部署可得信号可保留 91.7% 的增益。</w:t>
+        <w:t xml:space="preserve">其二，反馈驱动的动态执行在四节点 DAG 面板上显著优于静态执行（+20.0 个百分点），归因消融显示主要增益来自恢复动作本身（+18.3 个百分点），动态框架的可确证价值在于以选择性更新与预算约束安全地承载该动作。部署可得信号可保留 91.7% 的增益。</w:t>
       </w:r>
     </w:p>
     <w:p>
@@ -16298,7 +16265,7 @@
         <w:pStyle w:val="BodyText"/>
       </w:pPr>
       <w:r>
-        <w:t xml:space="preserve">其三，跨域与外部对照给出适用边界：代码域的单元测试反馈驱动动态适应取得 +6.0pp 的正向支持性证据（bootstrap CI 不含零、exact McNemar p=0.070 未达显著），而冻结的阶段先验与验证接口在数学域同时失配、DAG 全面劣于单体；外部方法比较中，答案级迭代精修在代码域点估计更高（85.0% 对 80.0%）但配对差异未达显著，级联策略则随置信信号质量在财务域与代码域符号反转。这些结果共同表明：本文方法不是 universal best solver，其辨识度在于节点级、依赖感知、局部且可审计的动态执行机制。</w:t>
+        <w:t xml:space="preserve">其三，跨域验证与外部方法比较划定适用边界：工作流级调度在 TAT-QA 上达到 56.0%（高于单体 52.5%、查询级路由 38.5%、节点级路由 40.0%），但多智能体协同在数学域因先验与接口双重失配而全面劣于单体。答案级迭代精修在代码域点估计更高但配对差异未达显著。这些结果共同表明：本文方法不是普适最优解，其辨识度在于多智能体协同调度的机制刻画与优化边界分析。</w:t>
       </w:r>
     </w:p>
     <w:p>
@@ -16306,7 +16273,7 @@
         <w:pStyle w:val="BodyText"/>
       </w:pPr>
       <w:r>
-        <w:t xml:space="preserve">多模型协同的关键是识别不同执行阶段的能力互补，并在可靠证据和资源约束下进行选择性的节点分配与动态调整。与此同时，模型池及动作集合必须包含可利用的正确候选；困难共同失败任务上的选择优化，不能替代能力覆盖的扩展。动态适应不能创造候选集合中不存在的正确答案，分解也不是免费的——两者共同定义了结构化协同的有效边界。</w:t>
+        <w:t xml:space="preserve">多智能体协同的关键是识别不同执行阶段的能力互补，在可靠证据和资源约束下进行选择性的策略调度，并理解调度的收益上界受到能力互补性与反馈可诊断性的共同制约。动态调度不能创造候选集合中不存在的正确答案，分解也不是免费的，静态非支配权衡的存在也不保证动态优化收益——三者共同定义了多智能体协同调度的有效边界。</w:t>
       </w:r>
     </w:p>
     <w:p>
@@ -16314,7 +16281,7 @@
         <w:pStyle w:val="BodyText"/>
       </w:pPr>
       <w:r>
-        <w:t xml:space="preserve">这些结论受限于枚举的 3×3 组合空间、尚未优化的完整动态策略空间、大量共同失败、有限的成本与时延异质性、不稳定的剩余路由泛化，以及困难子集上较低的恢复覆盖。未来方向包括：任务复杂度的结构选择（在单体与 DAG 之间按预期分解损失自适应决策，本文的复杂度分层已给出描述性证据）、更强且更异质的模型池、扩展现有确定性执行器的符号与程序能力、更丰富的工具支持与证据推理、更可靠的选择性覆盖，以及更大动态策略空间中的近似最优决策。这些方向不属于本文已经完成并验证的机制。</w:t>
+        <w:t xml:space="preserve">这些结论受限于当前模型池的能力跨度、候选策略集合规模与部署反馈机制的召回范围。未来方向包括：更大规模和更多样化的候选策略空间、更强的能力互补模型池、改进的接口表示、更可靠的选择性覆盖信号，以及将选择性分解与动态调度统一在更一般的多目标优化框架中。</w:t>
       </w:r>
     </w:p>
     <w:p>

</xml_diff>